<commit_message>
Rebuild Word/PDF copies of the docs for 2326950 (worked examples, 339 tests)
</commit_message>
<xml_diff>
--- a/docs/eosc-basic-compliance-analysis-workflow.docx
+++ b/docs/eosc-basic-compliance-analysis-workflow.docx
@@ -31,7 +31,7 @@
         <w:pStyle w:val="Date"/>
       </w:pPr>
       <w:r>
-        <w:t xml:space="preserve">26 September 2026, documentation commit 0cc33c2</w:t>
+        <w:t xml:space="preserve">26 September 2026, documentation commit 2326950</w:t>
       </w:r>
     </w:p>
     <w:bookmarkStart w:id="9" w:name="contents"/>
@@ -12387,7 +12387,76 @@
         <w:t xml:space="preserve"> </w:t>
       </w:r>
       <w:r>
-        <w:t xml:space="preserve">and</w:t>
+        <w:rPr>
+          <w:rStyle w:val="VerbatimChar"/>
+        </w:rPr>
+        <w:t xml:space="preserve">url_mismatch</w:t>
+      </w:r>
+      <w:r>
+        <w:t xml:space="preserve"> </w:t>
+      </w:r>
+      <w:r>
+        <w:t xml:space="preserve">(present only when some node's evidence was collected from a URL</w:t>
+      </w:r>
+      <w:r>
+        <w:t xml:space="preserve"> </w:t>
+      </w:r>
+      <w:r>
+        <w:t xml:space="preserve">other than the one now configured:</w:t>
+      </w:r>
+      <w:r>
+        <w:t xml:space="preserve"> </w:t>
+      </w:r>
+      <w:r>
+        <w:rPr>
+          <w:rStyle w:val="VerbatimChar"/>
+        </w:rPr>
+        <w:t xml:space="preserve">id</w:t>
+      </w:r>
+      <w:r>
+        <w:t xml:space="preserve">,</w:t>
+      </w:r>
+      <w:r>
+        <w:t xml:space="preserve"> </w:t>
+      </w:r>
+      <w:r>
+        <w:rPr>
+          <w:rStyle w:val="VerbatimChar"/>
+        </w:rPr>
+        <w:t xml:space="preserve">configured_url</w:t>
+      </w:r>
+      <w:r>
+        <w:t xml:space="preserve">,</w:t>
+      </w:r>
+      <w:r>
+        <w:t xml:space="preserve"> </w:t>
+      </w:r>
+      <w:r>
+        <w:rPr>
+          <w:rStyle w:val="VerbatimChar"/>
+        </w:rPr>
+        <w:t xml:space="preserve">evidence_url</w:t>
+      </w:r>
+      <w:r>
+        <w:t xml:space="preserve">,</w:t>
+      </w:r>
+      <w:r>
+        <w:t xml:space="preserve"> </w:t>
+      </w:r>
+      <w:r>
+        <w:rPr>
+          <w:rStyle w:val="VerbatimChar"/>
+        </w:rPr>
+        <w:t xml:space="preserve">fetched_at</w:t>
+      </w:r>
+      <w:r>
+        <w:t xml:space="preserve">; the reports then carry an "Evidence from a different URL"</w:t>
+      </w:r>
+      <w:r>
+        <w:t xml:space="preserve"> </w:t>
+      </w:r>
+      <w:r>
+        <w:t xml:space="preserve">banner), and</w:t>
       </w:r>
       <w:r>
         <w:t xml:space="preserve"> </w:t>
@@ -12590,7 +12659,28 @@
         <w:t xml:space="preserve"> </w:t>
       </w:r>
       <w:r>
-        <w:t xml:space="preserve">(the checklist</w:t>
+        <w:t xml:space="preserve">(named after the</w:t>
+      </w:r>
+      <w:r>
+        <w:t xml:space="preserve"> </w:t>
+      </w:r>
+      <w:r>
+        <w:t xml:space="preserve">revision applied, so</w:t>
+      </w:r>
+      <w:r>
+        <w:t xml:space="preserve"> </w:t>
+      </w:r>
+      <w:r>
+        <w:rPr>
+          <w:rStyle w:val="VerbatimChar"/>
+        </w:rPr>
+        <w:t xml:space="preserve">checklist-v3.1.html</w:t>
+      </w:r>
+      <w:r>
+        <w:t xml:space="preserve"> </w:t>
+      </w:r>
+      <w:r>
+        <w:t xml:space="preserve">after a switch; the checklist</w:t>
       </w:r>
       <w:r>
         <w:t xml:space="preserve"> </w:t>

</xml_diff>

<commit_message>
Docs: Word/PDF copies rebuilt from 4c5dea7 (--update-nlp); verification commit references updated
</commit_message>
<xml_diff>
--- a/docs/eosc-basic-compliance-analysis-workflow.docx
+++ b/docs/eosc-basic-compliance-analysis-workflow.docx
@@ -31,7 +31,7 @@
         <w:pStyle w:val="Date"/>
       </w:pPr>
       <w:r>
-        <w:t xml:space="preserve">26 September 2026, documentation commit 44261dd</w:t>
+        <w:t xml:space="preserve">26 September 2026, documentation commit 4c5dea7</w:t>
       </w:r>
     </w:p>
     <w:bookmarkStart w:id="9" w:name="contents"/>
@@ -14984,7 +14984,65 @@
         <w:t xml:space="preserve"> </w:t>
       </w:r>
       <w:r>
-        <w:t xml:space="preserve">traced:</w:t>
+        <w:t xml:space="preserve">traced.</w:t>
+      </w:r>
+      <w:r>
+        <w:t xml:space="preserve"> </w:t>
+      </w:r>
+      <w:r>
+        <w:rPr>
+          <w:rStyle w:val="VerbatimChar"/>
+        </w:rPr>
+        <w:t xml:space="preserve">--update-nlp</w:t>
+      </w:r>
+      <w:r>
+        <w:t xml:space="preserve"> </w:t>
+      </w:r>
+      <w:r>
+        <w:t xml:space="preserve">makes both edits and changes nothing else (it contacts no</w:t>
+      </w:r>
+      <w:r>
+        <w:t xml:space="preserve"> </w:t>
+      </w:r>
+      <w:r>
+        <w:t xml:space="preserve">site and commits nothing):</w:t>
+      </w:r>
+    </w:p>
+    <w:p>
+      <w:pPr>
+        <w:pStyle w:val="SourceCode"/>
+      </w:pPr>
+      <w:r>
+        <w:rPr>
+          <w:rStyle w:val="ExtensionTok"/>
+        </w:rPr>
+        <w:t xml:space="preserve">uv</w:t>
+      </w:r>
+      <w:r>
+        <w:rPr>
+          <w:rStyle w:val="NormalTok"/>
+        </w:rPr>
+        <w:t xml:space="preserve"> run basic-check </w:t>
+      </w:r>
+      <w:r>
+        <w:rPr>
+          <w:rStyle w:val="AttributeTok"/>
+        </w:rPr>
+        <w:t xml:space="preserve">--update-nlp</w:t>
+      </w:r>
+      <w:r>
+        <w:rPr>
+          <w:rStyle w:val="NormalTok"/>
+        </w:rPr>
+        <w:t xml:space="preserve"> bbmri-eric https://new.example.org/eosc-node/</w:t>
+      </w:r>
+    </w:p>
+    <w:p>
+      <w:pPr>
+        <w:pStyle w:val="FirstParagraph"/>
+      </w:pPr>
+      <w:r>
+        <w:t xml:space="preserve">Done by hand, the entry looks like this:</w:t>
       </w:r>
     </w:p>
     <w:p>

</xml_diff>

<commit_message>
Rebuild Word/PDF guides at 7ed46dd (--update-results-for-node, 412 tests)
</commit_message>
<xml_diff>
--- a/docs/eosc-basic-compliance-analysis-workflow.docx
+++ b/docs/eosc-basic-compliance-analysis-workflow.docx
@@ -31,7 +31,7 @@
         <w:pStyle w:val="Date"/>
       </w:pPr>
       <w:r>
-        <w:t xml:space="preserve">26 September 2026, documentation commit 4c5dea7</w:t>
+        <w:t xml:space="preserve">26 September 2026, documentation commit 7ed46dd</w:t>
       </w:r>
     </w:p>
     <w:bookmarkStart w:id="9" w:name="contents"/>
@@ -15499,19 +15499,40 @@
           <w:b/>
           <w:bCs/>
         </w:rPr>
-        <w:t xml:space="preserve">Step 3: replace that node's evidence in the published run.</w:t>
-      </w:r>
-      <w:r>
-        <w:t xml:space="preserve"> </w:t>
-      </w:r>
-      <w:r>
-        <w:t xml:space="preserve">Reuse the trial</w:t>
-      </w:r>
-      <w:r>
-        <w:t xml:space="preserve"> </w:t>
-      </w:r>
-      <w:r>
-        <w:t xml:space="preserve">evidence rather than fetching the page again:</w:t>
+        <w:t xml:space="preserve">Step 3: update that node's row in the published run.</w:t>
+      </w:r>
+      <w:r>
+        <w:t xml:space="preserve"> </w:t>
+      </w:r>
+      <w:r>
+        <w:t xml:space="preserve">Only BBMRI-ERIC is</w:t>
+      </w:r>
+      <w:r>
+        <w:t xml:space="preserve"> </w:t>
+      </w:r>
+      <w:r>
+        <w:t xml:space="preserve">fetched again; the other rows are copied from</w:t>
+      </w:r>
+      <w:r>
+        <w:t xml:space="preserve"> </w:t>
+      </w:r>
+      <w:r>
+        <w:rPr>
+          <w:rStyle w:val="VerbatimChar"/>
+        </w:rPr>
+        <w:t xml:space="preserve">results/results.json</w:t>
+      </w:r>
+      <w:r>
+        <w:t xml:space="preserve"> </w:t>
+      </w:r>
+      <w:r>
+        <w:t xml:space="preserve">as they</w:t>
+      </w:r>
+      <w:r>
+        <w:t xml:space="preserve"> </w:t>
+      </w:r>
+      <w:r>
+        <w:t xml:space="preserve">are, neither re-fetched nor re-judged:</w:t>
       </w:r>
     </w:p>
     <w:p>
@@ -15520,96 +15541,27 @@
       </w:pPr>
       <w:r>
         <w:rPr>
-          <w:rStyle w:val="FunctionTok"/>
-        </w:rPr>
-        <w:t xml:space="preserve">cp</w:t>
+          <w:rStyle w:val="ExtensionTok"/>
+        </w:rPr>
+        <w:t xml:space="preserve">uv</w:t>
       </w:r>
       <w:r>
         <w:rPr>
           <w:rStyle w:val="NormalTok"/>
         </w:rPr>
-        <w:t xml:space="preserve"> /tmp/trial/evidence/bbmri-eric.json results/evidence/</w:t>
-      </w:r>
-      <w:r>
-        <w:br/>
-      </w:r>
-      <w:r>
-        <w:rPr>
-          <w:rStyle w:val="FunctionTok"/>
-        </w:rPr>
-        <w:t xml:space="preserve">cp</w:t>
+        <w:t xml:space="preserve"> run basic-check run </w:t>
+      </w:r>
+      <w:r>
+        <w:rPr>
+          <w:rStyle w:val="AttributeTok"/>
+        </w:rPr>
+        <w:t xml:space="preserve">--update-results-for-node</w:t>
       </w:r>
       <w:r>
         <w:rPr>
           <w:rStyle w:val="NormalTok"/>
         </w:rPr>
-        <w:t xml:space="preserve"> /tmp/trial/evidence/screenshots/bbmri-eric.png results/evidence/screenshots/</w:t>
-      </w:r>
-      <w:r>
-        <w:br/>
-      </w:r>
-      <w:r>
-        <w:rPr>
-          <w:rStyle w:val="ExtensionTok"/>
-        </w:rPr>
-        <w:t xml:space="preserve">uv</w:t>
-      </w:r>
-      <w:r>
-        <w:rPr>
-          <w:rStyle w:val="NormalTok"/>
-        </w:rPr>
-        <w:t xml:space="preserve"> run basic-check assess </w:t>
-      </w:r>
-      <w:r>
-        <w:rPr>
-          <w:rStyle w:val="AttributeTok"/>
-        </w:rPr>
-        <w:t xml:space="preserve">--only</w:t>
-      </w:r>
-      <w:r>
-        <w:rPr>
-          <w:rStyle w:val="NormalTok"/>
-        </w:rPr>
-        <w:t xml:space="preserve"> bbmri-eric </w:t>
-      </w:r>
-      <w:r>
-        <w:rPr>
-          <w:rStyle w:val="AttributeTok"/>
-        </w:rPr>
-        <w:t xml:space="preserve">--skip</w:t>
-      </w:r>
-      <w:r>
-        <w:rPr>
-          <w:rStyle w:val="NormalTok"/>
-        </w:rPr>
-        <w:t xml:space="preserve"> Italy </w:t>
-      </w:r>
-      <w:r>
-        <w:rPr>
-          <w:rStyle w:val="DataTypeTok"/>
-        </w:rPr>
-        <w:t xml:space="preserve">\</w:t>
-      </w:r>
-      <w:r>
-        <w:br/>
-      </w:r>
-      <w:r>
-        <w:rPr>
-          <w:rStyle w:val="NormalTok"/>
-        </w:rPr>
-        <w:t xml:space="preserve">    </w:t>
-      </w:r>
-      <w:r>
-        <w:rPr>
-          <w:rStyle w:val="AttributeTok"/>
-        </w:rPr>
-        <w:t xml:space="preserve">--run</w:t>
-      </w:r>
-      <w:r>
-        <w:rPr>
-          <w:rStyle w:val="NormalTok"/>
-        </w:rPr>
-        <w:t xml:space="preserve"> live-2026-10-01-new-bbmri-url</w:t>
+        <w:t xml:space="preserve"> bbmri-eric</w:t>
       </w:r>
     </w:p>
     <w:p>
@@ -15617,34 +15569,94 @@
         <w:pStyle w:val="FirstParagraph"/>
       </w:pPr>
       <w:r>
-        <w:t xml:space="preserve">If the new capture has no screenshot, because the page could not be rendered,</w:t>
-      </w:r>
-      <w:r>
-        <w:t xml:space="preserve"> </w:t>
-      </w:r>
-      <w:r>
-        <w:t xml:space="preserve">delete</w:t>
-      </w:r>
-      <w:r>
-        <w:t xml:space="preserve"> </w:t>
-      </w:r>
-      <w:r>
-        <w:rPr>
-          <w:rStyle w:val="VerbatimChar"/>
-        </w:rPr>
-        <w:t xml:space="preserve">results/evidence/screenshots/bbmri-eric.png</w:t>
-      </w:r>
-      <w:r>
-        <w:t xml:space="preserve"> </w:t>
-      </w:r>
-      <w:r>
-        <w:t xml:space="preserve">rather than keep the old</w:t>
-      </w:r>
-      <w:r>
-        <w:t xml:space="preserve"> </w:t>
-      </w:r>
-      <w:r>
-        <w:t xml:space="preserve">page's image. The report covers every node, with a</w:t>
+        <w:t xml:space="preserve">That fetches the one page into a scratch directory, and only if the page loaded</w:t>
+      </w:r>
+      <w:r>
+        <w:t xml:space="preserve"> </w:t>
+      </w:r>
+      <w:r>
+        <w:t xml:space="preserve">does it replace</w:t>
+      </w:r>
+      <w:r>
+        <w:t xml:space="preserve"> </w:t>
+      </w:r>
+      <w:r>
+        <w:rPr>
+          <w:rStyle w:val="VerbatimChar"/>
+        </w:rPr>
+        <w:t xml:space="preserve">bbmri-eric</w:t>
+      </w:r>
+      <w:r>
+        <w:t xml:space="preserve">'s evidence, screenshot and row, then rebuild</w:t>
+      </w:r>
+      <w:r>
+        <w:t xml:space="preserve"> </w:t>
+      </w:r>
+      <w:r>
+        <w:rPr>
+          <w:rStyle w:val="VerbatimChar"/>
+        </w:rPr>
+        <w:t xml:space="preserve">results.md</w:t>
+      </w:r>
+      <w:r>
+        <w:t xml:space="preserve">,</w:t>
+      </w:r>
+      <w:r>
+        <w:t xml:space="preserve"> </w:t>
+      </w:r>
+      <w:r>
+        <w:rPr>
+          <w:rStyle w:val="VerbatimChar"/>
+        </w:rPr>
+        <w:t xml:space="preserve">index.html</w:t>
+      </w:r>
+      <w:r>
+        <w:t xml:space="preserve"> </w:t>
+      </w:r>
+      <w:r>
+        <w:t xml:space="preserve">and</w:t>
+      </w:r>
+      <w:r>
+        <w:t xml:space="preserve"> </w:t>
+      </w:r>
+      <w:r>
+        <w:rPr>
+          <w:rStyle w:val="VerbatimChar"/>
+        </w:rPr>
+        <w:t xml:space="preserve">results.csv</w:t>
+      </w:r>
+      <w:r>
+        <w:t xml:space="preserve"> </w:t>
+      </w:r>
+      <w:r>
+        <w:t xml:space="preserve">from the stored rows. A failed</w:t>
+      </w:r>
+      <w:r>
+        <w:t xml:space="preserve"> </w:t>
+      </w:r>
+      <w:r>
+        <w:t xml:space="preserve">fetch changes nothing (add</w:t>
+      </w:r>
+      <w:r>
+        <w:t xml:space="preserve"> </w:t>
+      </w:r>
+      <w:r>
+        <w:rPr>
+          <w:rStyle w:val="VerbatimChar"/>
+        </w:rPr>
+        <w:t xml:space="preserve">--accept-error</w:t>
+      </w:r>
+      <w:r>
+        <w:t xml:space="preserve"> </w:t>
+      </w:r>
+      <w:r>
+        <w:t xml:space="preserve">to record it anyway). It prints each</w:t>
+      </w:r>
+      <w:r>
+        <w:t xml:space="preserve"> </w:t>
+      </w:r>
+      <w:r>
+        <w:t xml:space="preserve">point's old and new verdict, and both reports gain an</w:t>
       </w:r>
       <w:r>
         <w:t xml:space="preserve"> </w:t>
@@ -15654,7 +15666,7 @@
           <w:b/>
           <w:bCs/>
         </w:rPr>
-        <w:t xml:space="preserve">Mixed freshness</w:t>
+        <w:t xml:space="preserve">Updated rows</w:t>
       </w:r>
       <w:r>
         <w:t xml:space="preserve"> </w:t>
@@ -15666,28 +15678,91 @@
         <w:t xml:space="preserve"> </w:t>
       </w:r>
       <w:r>
-        <w:t xml:space="preserve">naming</w:t>
-      </w:r>
-      <w:r>
-        <w:t xml:space="preserve"> </w:t>
-      </w:r>
-      <w:r>
-        <w:rPr>
-          <w:rStyle w:val="VerbatimChar"/>
-        </w:rPr>
-        <w:t xml:space="preserve">bbmri-eric</w:t>
-      </w:r>
-      <w:r>
-        <w:t xml:space="preserve"> </w:t>
-      </w:r>
-      <w:r>
-        <w:t xml:space="preserve">as the only row fetched again. For a completely fresh table</w:t>
-      </w:r>
-      <w:r>
-        <w:t xml:space="preserve"> </w:t>
-      </w:r>
-      <w:r>
-        <w:t xml:space="preserve">instead, follow path B of example 1 step 4.</w:t>
+        <w:t xml:space="preserve">naming the node, the date and the previous URL. The run id and time in the</w:t>
+      </w:r>
+      <w:r>
+        <w:t xml:space="preserve"> </w:t>
+      </w:r>
+      <w:r>
+        <w:t xml:space="preserve">header stay those of the original run. To reuse the evidence from step 2</w:t>
+      </w:r>
+      <w:r>
+        <w:t xml:space="preserve"> </w:t>
+      </w:r>
+      <w:r>
+        <w:t xml:space="preserve">instead of fetching again, copy it into</w:t>
+      </w:r>
+      <w:r>
+        <w:t xml:space="preserve"> </w:t>
+      </w:r>
+      <w:r>
+        <w:rPr>
+          <w:rStyle w:val="VerbatimChar"/>
+        </w:rPr>
+        <w:t xml:space="preserve">results/evidence/</w:t>
+      </w:r>
+      <w:r>
+        <w:t xml:space="preserve"> </w:t>
+      </w:r>
+      <w:r>
+        <w:t xml:space="preserve">and run</w:t>
+      </w:r>
+      <w:r>
+        <w:t xml:space="preserve"> </w:t>
+      </w:r>
+      <w:r>
+        <w:rPr>
+          <w:rStyle w:val="VerbatimChar"/>
+        </w:rPr>
+        <w:t xml:space="preserve">uv run basic-check assess --update-results-for-node bbmri-eric</w:t>
+      </w:r>
+      <w:r>
+        <w:t xml:space="preserve">, which is</w:t>
+      </w:r>
+      <w:r>
+        <w:t xml:space="preserve"> </w:t>
+      </w:r>
+      <w:r>
+        <w:t xml:space="preserve">offline. To see the outcome before touching the reviewed run, try it on a copy</w:t>
+      </w:r>
+      <w:r>
+        <w:t xml:space="preserve"> </w:t>
+      </w:r>
+      <w:r>
+        <w:t xml:space="preserve">first:</w:t>
+      </w:r>
+      <w:r>
+        <w:t xml:space="preserve"> </w:t>
+      </w:r>
+      <w:r>
+        <w:rPr>
+          <w:rStyle w:val="VerbatimChar"/>
+        </w:rPr>
+        <w:t xml:space="preserve">cp -r results /tmp/copy</w:t>
+      </w:r>
+      <w:r>
+        <w:t xml:space="preserve"> </w:t>
+      </w:r>
+      <w:r>
+        <w:t xml:space="preserve">and add</w:t>
+      </w:r>
+      <w:r>
+        <w:t xml:space="preserve"> </w:t>
+      </w:r>
+      <w:r>
+        <w:rPr>
+          <w:rStyle w:val="VerbatimChar"/>
+        </w:rPr>
+        <w:t xml:space="preserve">--results /tmp/copy</w:t>
+      </w:r>
+      <w:r>
+        <w:t xml:space="preserve">. For a completely</w:t>
+      </w:r>
+      <w:r>
+        <w:t xml:space="preserve"> </w:t>
+      </w:r>
+      <w:r>
+        <w:t xml:space="preserve">fresh table instead, follow path B of example 1 step 4.</w:t>
       </w:r>
     </w:p>
     <w:p>

</xml_diff>

<commit_message>
Docs: rebuild Word/PDF with the phases diagram and tables (commit 616262f)
</commit_message>
<xml_diff>
--- a/docs/eosc-basic-compliance-analysis-workflow.docx
+++ b/docs/eosc-basic-compliance-analysis-workflow.docx
@@ -31,7 +31,7 @@
         <w:pStyle w:val="Date"/>
       </w:pPr>
       <w:r>
-        <w:t xml:space="preserve">26 September 2026, documentation commit 7ed46dd</w:t>
+        <w:t xml:space="preserve">26 September 2026, documentation commit 616262f</w:t>
       </w:r>
     </w:p>
     <w:bookmarkStart w:id="9" w:name="contents"/>
@@ -257,7 +257,7 @@
       </w:r>
     </w:p>
     <w:bookmarkEnd w:id="9"/>
-    <w:bookmarkStart w:id="10" w:name="the-three-stages"/>
+    <w:bookmarkStart w:id="14" w:name="the-three-stages"/>
     <w:p>
       <w:pPr>
         <w:pStyle w:val="Heading2"/>
@@ -813,6 +813,2601 @@
         <w:t xml:space="preserve">, no check can use it — see section 3.</w:t>
       </w:r>
     </w:p>
+    <w:bookmarkStart w:id="13" w:name="Xfc66290f0c5177f1908cc0639df18c8282368f6"/>
+    <w:p>
+      <w:pPr>
+        <w:pStyle w:val="Heading3"/>
+      </w:pPr>
+      <w:r>
+        <w:t xml:space="preserve">The phases in time, their options, and what to re-run</w:t>
+      </w:r>
+    </w:p>
+    <w:p>
+      <w:pPr>
+        <w:pStyle w:val="CaptionedFigure"/>
+      </w:pPr>
+      <w:r>
+        <w:drawing>
+          <wp:inline>
+            <wp:extent cx="4846320" cy="6057899"/>
+            <wp:effectExtent b="0" l="0" r="0" t="0"/>
+            <wp:docPr descr="Figure 1. The three phases in execution order: collect contacts the nodes, assess and report work offline, and run performs all three." title="" id="11" name="Picture"/>
+            <a:graphic>
+              <a:graphicData uri="http://schemas.openxmlformats.org/drawingml/2006/picture">
+                <pic:pic>
+                  <pic:nvPicPr>
+                    <pic:cNvPr descr="/home/user/workspace/eosc-basic-compliance/docs/img/phases.png" id="12" name="Picture"/>
+                    <pic:cNvPicPr>
+                      <a:picLocks noChangeArrowheads="1" noChangeAspect="1"/>
+                    </pic:cNvPicPr>
+                  </pic:nvPicPr>
+                  <pic:blipFill>
+                    <a:blip r:embed="rId10"/>
+                    <a:stretch>
+                      <a:fillRect/>
+                    </a:stretch>
+                  </pic:blipFill>
+                  <pic:spPr bwMode="auto">
+                    <a:xfrm>
+                      <a:off x="0" y="0"/>
+                      <a:ext cx="4846320" cy="6057899"/>
+                    </a:xfrm>
+                    <a:prstGeom prst="rect">
+                      <a:avLst/>
+                    </a:prstGeom>
+                    <a:noFill/>
+                    <a:ln w="9525">
+                      <a:noFill/>
+                      <a:headEnd/>
+                      <a:tailEnd/>
+                    </a:ln>
+                  </pic:spPr>
+                </pic:pic>
+              </a:graphicData>
+            </a:graphic>
+          </wp:inline>
+        </w:drawing>
+      </w:r>
+    </w:p>
+    <w:p>
+      <w:pPr>
+        <w:pStyle w:val="ImageCaption"/>
+      </w:pPr>
+      <w:r>
+        <w:t xml:space="preserve">Figure 1. The three phases in execution order: collect contacts the nodes, assess and report work offline, and run performs all three.</w:t>
+      </w:r>
+    </w:p>
+    <w:p>
+      <w:pPr>
+        <w:pStyle w:val="BodyText"/>
+      </w:pPr>
+      <w:r>
+        <w:t xml:space="preserve">The phases run strictly in this order, and each one reads only what the one</w:t>
+      </w:r>
+      <w:r>
+        <w:t xml:space="preserve"> </w:t>
+      </w:r>
+      <w:r>
+        <w:t xml:space="preserve">before it wrote to disk.</w:t>
+      </w:r>
+      <w:r>
+        <w:t xml:space="preserve"> </w:t>
+      </w:r>
+      <w:r>
+        <w:rPr>
+          <w:b/>
+          <w:bCs/>
+        </w:rPr>
+        <w:t xml:space="preserve">Collect</w:t>
+      </w:r>
+      <w:r>
+        <w:t xml:space="preserve"> </w:t>
+      </w:r>
+      <w:r>
+        <w:t xml:space="preserve">is the only phase that contacts the nodes.</w:t>
+      </w:r>
+      <w:r>
+        <w:t xml:space="preserve"> </w:t>
+      </w:r>
+      <w:r>
+        <w:t xml:space="preserve">It reads</w:t>
+      </w:r>
+      <w:r>
+        <w:t xml:space="preserve"> </w:t>
+      </w:r>
+      <w:r>
+        <w:rPr>
+          <w:rStyle w:val="VerbatimChar"/>
+        </w:rPr>
+        <w:t xml:space="preserve">nodes.yaml</w:t>
+      </w:r>
+      <w:r>
+        <w:t xml:space="preserve"> </w:t>
+      </w:r>
+      <w:r>
+        <w:t xml:space="preserve">and writes</w:t>
+      </w:r>
+      <w:r>
+        <w:t xml:space="preserve"> </w:t>
+      </w:r>
+      <w:r>
+        <w:rPr>
+          <w:rStyle w:val="VerbatimChar"/>
+        </w:rPr>
+        <w:t xml:space="preserve">evidence/&lt;node&gt;.json</w:t>
+      </w:r>
+      <w:r>
+        <w:t xml:space="preserve"> </w:t>
+      </w:r>
+      <w:r>
+        <w:t xml:space="preserve">and a screenshot per</w:t>
+      </w:r>
+      <w:r>
+        <w:t xml:space="preserve"> </w:t>
+      </w:r>
+      <w:r>
+        <w:t xml:space="preserve">node.</w:t>
+      </w:r>
+      <w:r>
+        <w:t xml:space="preserve"> </w:t>
+      </w:r>
+      <w:r>
+        <w:rPr>
+          <w:b/>
+          <w:bCs/>
+        </w:rPr>
+        <w:t xml:space="preserve">Assess</w:t>
+      </w:r>
+      <w:r>
+        <w:t xml:space="preserve"> </w:t>
+      </w:r>
+      <w:r>
+        <w:t xml:space="preserve">reads that evidence, the checklist and the approved-name list,</w:t>
+      </w:r>
+      <w:r>
+        <w:t xml:space="preserve"> </w:t>
+      </w:r>
+      <w:r>
+        <w:t xml:space="preserve">and sends no request.</w:t>
+      </w:r>
+      <w:r>
+        <w:t xml:space="preserve"> </w:t>
+      </w:r>
+      <w:r>
+        <w:rPr>
+          <w:b/>
+          <w:bCs/>
+        </w:rPr>
+        <w:t xml:space="preserve">Report</w:t>
+      </w:r>
+      <w:r>
+        <w:t xml:space="preserve"> </w:t>
+      </w:r>
+      <w:r>
+        <w:t xml:space="preserve">is the last step of</w:t>
+      </w:r>
+      <w:r>
+        <w:t xml:space="preserve"> </w:t>
+      </w:r>
+      <w:r>
+        <w:rPr>
+          <w:rStyle w:val="VerbatimChar"/>
+        </w:rPr>
+        <w:t xml:space="preserve">assess</w:t>
+      </w:r>
+      <w:r>
+        <w:t xml:space="preserve">: it writes</w:t>
+      </w:r>
+      <w:r>
+        <w:t xml:space="preserve"> </w:t>
+      </w:r>
+      <w:r>
+        <w:rPr>
+          <w:rStyle w:val="VerbatimChar"/>
+        </w:rPr>
+        <w:t xml:space="preserve">results.json</w:t>
+      </w:r>
+      <w:r>
+        <w:t xml:space="preserve">,</w:t>
+      </w:r>
+      <w:r>
+        <w:t xml:space="preserve"> </w:t>
+      </w:r>
+      <w:r>
+        <w:rPr>
+          <w:rStyle w:val="VerbatimChar"/>
+        </w:rPr>
+        <w:t xml:space="preserve">results.md</w:t>
+      </w:r>
+      <w:r>
+        <w:t xml:space="preserve">,</w:t>
+      </w:r>
+      <w:r>
+        <w:t xml:space="preserve"> </w:t>
+      </w:r>
+      <w:r>
+        <w:rPr>
+          <w:rStyle w:val="VerbatimChar"/>
+        </w:rPr>
+        <w:t xml:space="preserve">index.html</w:t>
+      </w:r>
+      <w:r>
+        <w:t xml:space="preserve">,</w:t>
+      </w:r>
+      <w:r>
+        <w:t xml:space="preserve"> </w:t>
+      </w:r>
+      <w:r>
+        <w:rPr>
+          <w:rStyle w:val="VerbatimChar"/>
+        </w:rPr>
+        <w:t xml:space="preserve">results.csv</w:t>
+      </w:r>
+      <w:r>
+        <w:t xml:space="preserve"> </w:t>
+      </w:r>
+      <w:r>
+        <w:t xml:space="preserve">and</w:t>
+      </w:r>
+      <w:r>
+        <w:t xml:space="preserve"> </w:t>
+      </w:r>
+      <w:r>
+        <w:rPr>
+          <w:rStyle w:val="VerbatimChar"/>
+        </w:rPr>
+        <w:t xml:space="preserve">checklist-v3.0.html</w:t>
+      </w:r>
+      <w:r>
+        <w:t xml:space="preserve">.</w:t>
+      </w:r>
+      <w:r>
+        <w:t xml:space="preserve"> </w:t>
+      </w:r>
+      <w:r>
+        <w:rPr>
+          <w:rStyle w:val="VerbatimChar"/>
+        </w:rPr>
+        <w:t xml:space="preserve">run</w:t>
+      </w:r>
+      <w:r>
+        <w:t xml:space="preserve"> </w:t>
+      </w:r>
+      <w:r>
+        <w:t xml:space="preserve">performs the three in one invocation. With</w:t>
+      </w:r>
+      <w:r>
+        <w:t xml:space="preserve"> </w:t>
+      </w:r>
+      <w:r>
+        <w:rPr>
+          <w:rStyle w:val="VerbatimChar"/>
+        </w:rPr>
+        <w:t xml:space="preserve">--update-results-for-node</w:t>
+      </w:r>
+      <w:r>
+        <w:t xml:space="preserve">,</w:t>
+      </w:r>
+      <w:r>
+        <w:t xml:space="preserve"> </w:t>
+      </w:r>
+      <w:r>
+        <w:rPr>
+          <w:rStyle w:val="VerbatimChar"/>
+        </w:rPr>
+        <w:t xml:space="preserve">run</w:t>
+      </w:r>
+      <w:r>
+        <w:t xml:space="preserve"> </w:t>
+      </w:r>
+      <w:r>
+        <w:t xml:space="preserve">does the same for one node only, and</w:t>
+      </w:r>
+      <w:r>
+        <w:t xml:space="preserve"> </w:t>
+      </w:r>
+      <w:r>
+        <w:rPr>
+          <w:rStyle w:val="VerbatimChar"/>
+        </w:rPr>
+        <w:t xml:space="preserve">results.json</w:t>
+      </w:r>
+      <w:r>
+        <w:t xml:space="preserve"> </w:t>
+      </w:r>
+      <w:r>
+        <w:t xml:space="preserve">supplies every other row unchanged.</w:t>
+      </w:r>
+      <w:r>
+        <w:t xml:space="preserve"> </w:t>
+      </w:r>
+      <w:r>
+        <w:rPr>
+          <w:rStyle w:val="VerbatimChar"/>
+        </w:rPr>
+        <w:t xml:space="preserve">points</w:t>
+      </w:r>
+      <w:r>
+        <w:t xml:space="preserve"> </w:t>
+      </w:r>
+      <w:r>
+        <w:t xml:space="preserve">and</w:t>
+      </w:r>
+      <w:r>
+        <w:t xml:space="preserve"> </w:t>
+      </w:r>
+      <w:r>
+        <w:rPr>
+          <w:rStyle w:val="VerbatimChar"/>
+        </w:rPr>
+        <w:t xml:space="preserve">show</w:t>
+      </w:r>
+      <w:r>
+        <w:t xml:space="preserve"> </w:t>
+      </w:r>
+      <w:r>
+        <w:t xml:space="preserve">only</w:t>
+      </w:r>
+      <w:r>
+        <w:t xml:space="preserve"> </w:t>
+      </w:r>
+      <w:r>
+        <w:t xml:space="preserve">read, so they never need re-running.</w:t>
+      </w:r>
+    </w:p>
+    <w:p>
+      <w:pPr>
+        <w:pStyle w:val="BodyText"/>
+      </w:pPr>
+      <w:r>
+        <w:rPr>
+          <w:b/>
+          <w:bCs/>
+        </w:rPr>
+        <w:t xml:space="preserve">Options of each phase.</w:t>
+      </w:r>
+      <w:r>
+        <w:t xml:space="preserve"> </w:t>
+      </w:r>
+      <w:r>
+        <w:t xml:space="preserve">✓ means the command accepts the option. Every</w:t>
+      </w:r>
+      <w:r>
+        <w:t xml:space="preserve"> </w:t>
+      </w:r>
+      <w:r>
+        <w:t xml:space="preserve">command also takes</w:t>
+      </w:r>
+      <w:r>
+        <w:t xml:space="preserve"> </w:t>
+      </w:r>
+      <w:r>
+        <w:rPr>
+          <w:rStyle w:val="VerbatimChar"/>
+        </w:rPr>
+        <w:t xml:space="preserve">--help</w:t>
+      </w:r>
+      <w:r>
+        <w:t xml:space="preserve">.</w:t>
+      </w:r>
+    </w:p>
+    <w:tbl>
+      <w:tblPr>
+        <w:tblStyle w:val="Table"/>
+        <w:tblW w:type="pct" w:w="5000"/>
+        <w:tblLayout w:type="fixed"/>
+        <w:tblLook w:firstRow="1" w:lastRow="0" w:firstColumn="0" w:lastColumn="0" w:noHBand="0" w:noVBand="0" w:val="0020"/>
+      </w:tblPr>
+      <w:tblGrid>
+        <w:gridCol w:w="2026"/>
+        <w:gridCol w:w="736"/>
+        <w:gridCol w:w="736"/>
+        <w:gridCol w:w="736"/>
+        <w:gridCol w:w="3683"/>
+      </w:tblGrid>
+      <w:tr>
+        <w:trPr>
+          <w:cantSplit/>
+          <w:tblHeader w:val="on"/>
+        </w:trPr>
+        <w:tc>
+          <w:tcPr/>
+          <w:p>
+            <w:pPr>
+              <w:pStyle w:val="Compact"/>
+            </w:pPr>
+            <w:r>
+              <w:t xml:space="preserve">Option</w:t>
+            </w:r>
+          </w:p>
+        </w:tc>
+        <w:tc>
+          <w:tcPr/>
+          <w:p>
+            <w:pPr>
+              <w:pStyle w:val="Compact"/>
+              <w:jc w:val="center"/>
+            </w:pPr>
+            <w:r>
+              <w:rPr>
+                <w:rStyle w:val="VerbatimChar"/>
+              </w:rPr>
+              <w:t xml:space="preserve">collect</w:t>
+            </w:r>
+          </w:p>
+        </w:tc>
+        <w:tc>
+          <w:tcPr/>
+          <w:p>
+            <w:pPr>
+              <w:pStyle w:val="Compact"/>
+              <w:jc w:val="center"/>
+            </w:pPr>
+            <w:r>
+              <w:rPr>
+                <w:rStyle w:val="VerbatimChar"/>
+              </w:rPr>
+              <w:t xml:space="preserve">assess</w:t>
+            </w:r>
+          </w:p>
+        </w:tc>
+        <w:tc>
+          <w:tcPr/>
+          <w:p>
+            <w:pPr>
+              <w:pStyle w:val="Compact"/>
+              <w:jc w:val="center"/>
+            </w:pPr>
+            <w:r>
+              <w:rPr>
+                <w:rStyle w:val="VerbatimChar"/>
+              </w:rPr>
+              <w:t xml:space="preserve">run</w:t>
+            </w:r>
+          </w:p>
+        </w:tc>
+        <w:tc>
+          <w:tcPr/>
+          <w:p>
+            <w:pPr>
+              <w:pStyle w:val="Compact"/>
+            </w:pPr>
+            <w:r>
+              <w:t xml:space="preserve">What it does</w:t>
+            </w:r>
+          </w:p>
+        </w:tc>
+      </w:tr>
+      <w:tr>
+        <w:trPr>
+          <w:cantSplit/>
+        </w:trPr>
+        <w:tc>
+          <w:tcPr/>
+          <w:p>
+            <w:pPr>
+              <w:pStyle w:val="Compact"/>
+            </w:pPr>
+            <w:r>
+              <w:rPr>
+                <w:rStyle w:val="VerbatimChar"/>
+              </w:rPr>
+              <w:t xml:space="preserve">--nodes</w:t>
+            </w:r>
+            <w:r>
+              <w:t xml:space="preserve">,</w:t>
+            </w:r>
+            <w:r>
+              <w:t xml:space="preserve"> </w:t>
+            </w:r>
+            <w:r>
+              <w:rPr>
+                <w:rStyle w:val="VerbatimChar"/>
+              </w:rPr>
+              <w:t xml:space="preserve">-n &lt;file&gt;</w:t>
+            </w:r>
+          </w:p>
+        </w:tc>
+        <w:tc>
+          <w:tcPr/>
+          <w:p>
+            <w:pPr>
+              <w:pStyle w:val="Compact"/>
+              <w:jc w:val="center"/>
+            </w:pPr>
+            <w:r>
+              <w:t xml:space="preserve">✓</w:t>
+            </w:r>
+          </w:p>
+        </w:tc>
+        <w:tc>
+          <w:tcPr/>
+          <w:p>
+            <w:pPr>
+              <w:pStyle w:val="Compact"/>
+              <w:jc w:val="center"/>
+            </w:pPr>
+            <w:r>
+              <w:t xml:space="preserve">✓</w:t>
+            </w:r>
+          </w:p>
+        </w:tc>
+        <w:tc>
+          <w:tcPr/>
+          <w:p>
+            <w:pPr>
+              <w:pStyle w:val="Compact"/>
+              <w:jc w:val="center"/>
+            </w:pPr>
+            <w:r>
+              <w:t xml:space="preserve">✓</w:t>
+            </w:r>
+          </w:p>
+        </w:tc>
+        <w:tc>
+          <w:tcPr/>
+          <w:p>
+            <w:pPr>
+              <w:pStyle w:val="Compact"/>
+            </w:pPr>
+            <w:r>
+              <w:t xml:space="preserve">Node list to use instead of</w:t>
+            </w:r>
+            <w:r>
+              <w:t xml:space="preserve"> </w:t>
+            </w:r>
+            <w:r>
+              <w:rPr>
+                <w:rStyle w:val="VerbatimChar"/>
+              </w:rPr>
+              <w:t xml:space="preserve">nodes.yaml</w:t>
+            </w:r>
+          </w:p>
+        </w:tc>
+      </w:tr>
+      <w:tr>
+        <w:trPr>
+          <w:cantSplit/>
+        </w:trPr>
+        <w:tc>
+          <w:tcPr/>
+          <w:p>
+            <w:pPr>
+              <w:pStyle w:val="Compact"/>
+            </w:pPr>
+            <w:r>
+              <w:rPr>
+                <w:rStyle w:val="VerbatimChar"/>
+              </w:rPr>
+              <w:t xml:space="preserve">--results &lt;dir&gt;</w:t>
+            </w:r>
+          </w:p>
+        </w:tc>
+        <w:tc>
+          <w:tcPr/>
+          <w:p>
+            <w:pPr>
+              <w:pStyle w:val="Compact"/>
+              <w:jc w:val="center"/>
+            </w:pPr>
+            <w:r>
+              <w:t xml:space="preserve">✓</w:t>
+            </w:r>
+          </w:p>
+        </w:tc>
+        <w:tc>
+          <w:tcPr/>
+          <w:p>
+            <w:pPr>
+              <w:pStyle w:val="Compact"/>
+              <w:jc w:val="center"/>
+            </w:pPr>
+            <w:r>
+              <w:t xml:space="preserve">✓</w:t>
+            </w:r>
+          </w:p>
+        </w:tc>
+        <w:tc>
+          <w:tcPr/>
+          <w:p>
+            <w:pPr>
+              <w:pStyle w:val="Compact"/>
+              <w:jc w:val="center"/>
+            </w:pPr>
+            <w:r>
+              <w:t xml:space="preserve">✓</w:t>
+            </w:r>
+          </w:p>
+        </w:tc>
+        <w:tc>
+          <w:tcPr/>
+          <w:p>
+            <w:pPr>
+              <w:pStyle w:val="Compact"/>
+            </w:pPr>
+            <w:r>
+              <w:t xml:space="preserve">Folder to write to or read from instead of</w:t>
+            </w:r>
+            <w:r>
+              <w:t xml:space="preserve"> </w:t>
+            </w:r>
+            <w:r>
+              <w:rPr>
+                <w:rStyle w:val="VerbatimChar"/>
+              </w:rPr>
+              <w:t xml:space="preserve">results/</w:t>
+            </w:r>
+          </w:p>
+        </w:tc>
+      </w:tr>
+      <w:tr>
+        <w:trPr>
+          <w:cantSplit/>
+        </w:trPr>
+        <w:tc>
+          <w:tcPr/>
+          <w:p>
+            <w:pPr>
+              <w:pStyle w:val="Compact"/>
+            </w:pPr>
+            <w:r>
+              <w:rPr>
+                <w:rStyle w:val="VerbatimChar"/>
+              </w:rPr>
+              <w:t xml:space="preserve">--only &lt;ids&gt;</w:t>
+            </w:r>
+          </w:p>
+        </w:tc>
+        <w:tc>
+          <w:tcPr/>
+          <w:p>
+            <w:pPr>
+              <w:pStyle w:val="Compact"/>
+              <w:jc w:val="center"/>
+            </w:pPr>
+            <w:r>
+              <w:t xml:space="preserve">✓</w:t>
+            </w:r>
+          </w:p>
+        </w:tc>
+        <w:tc>
+          <w:tcPr/>
+          <w:p>
+            <w:pPr>
+              <w:pStyle w:val="Compact"/>
+              <w:jc w:val="center"/>
+            </w:pPr>
+            <w:r>
+              <w:t xml:space="preserve">✓</w:t>
+            </w:r>
+          </w:p>
+        </w:tc>
+        <w:tc>
+          <w:tcPr/>
+          <w:p>
+            <w:pPr>
+              <w:pStyle w:val="Compact"/>
+              <w:jc w:val="center"/>
+            </w:pPr>
+            <w:r>
+              <w:t xml:space="preserve">✓</w:t>
+            </w:r>
+          </w:p>
+        </w:tc>
+        <w:tc>
+          <w:tcPr/>
+          <w:p>
+            <w:pPr>
+              <w:pStyle w:val="Compact"/>
+            </w:pPr>
+            <w:r>
+              <w:t xml:space="preserve">Fetch only these node ids</w:t>
+            </w:r>
+          </w:p>
+        </w:tc>
+      </w:tr>
+      <w:tr>
+        <w:trPr>
+          <w:cantSplit/>
+        </w:trPr>
+        <w:tc>
+          <w:tcPr/>
+          <w:p>
+            <w:pPr>
+              <w:pStyle w:val="Compact"/>
+            </w:pPr>
+            <w:r>
+              <w:rPr>
+                <w:rStyle w:val="VerbatimChar"/>
+              </w:rPr>
+              <w:t xml:space="preserve">--skip &lt;ids or names&gt;</w:t>
+            </w:r>
+          </w:p>
+        </w:tc>
+        <w:tc>
+          <w:tcPr/>
+          <w:p>
+            <w:pPr>
+              <w:pStyle w:val="Compact"/>
+              <w:jc w:val="center"/>
+            </w:pPr>
+            <w:r>
+              <w:t xml:space="preserve">✓</w:t>
+            </w:r>
+          </w:p>
+        </w:tc>
+        <w:tc>
+          <w:tcPr/>
+          <w:p>
+            <w:pPr>
+              <w:pStyle w:val="Compact"/>
+              <w:jc w:val="center"/>
+            </w:pPr>
+            <w:r>
+              <w:t xml:space="preserve">✓</w:t>
+            </w:r>
+          </w:p>
+        </w:tc>
+        <w:tc>
+          <w:tcPr/>
+          <w:p>
+            <w:pPr>
+              <w:pStyle w:val="Compact"/>
+              <w:jc w:val="center"/>
+            </w:pPr>
+            <w:r>
+              <w:t xml:space="preserve">✓</w:t>
+            </w:r>
+          </w:p>
+        </w:tc>
+        <w:tc>
+          <w:tcPr/>
+          <w:p>
+            <w:pPr>
+              <w:pStyle w:val="Compact"/>
+            </w:pPr>
+            <w:r>
+              <w:t xml:space="preserve">Leave these nodes out entirely; the report says so</w:t>
+            </w:r>
+          </w:p>
+        </w:tc>
+      </w:tr>
+      <w:tr>
+        <w:trPr>
+          <w:cantSplit/>
+        </w:trPr>
+        <w:tc>
+          <w:tcPr/>
+          <w:p>
+            <w:pPr>
+              <w:pStyle w:val="Compact"/>
+            </w:pPr>
+            <w:r>
+              <w:rPr>
+                <w:rStyle w:val="VerbatimChar"/>
+              </w:rPr>
+              <w:t xml:space="preserve">--url &lt;url&gt;</w:t>
+            </w:r>
+          </w:p>
+        </w:tc>
+        <w:tc>
+          <w:tcPr/>
+          <w:p>
+            <w:pPr>
+              <w:pStyle w:val="Compact"/>
+              <w:jc w:val="center"/>
+            </w:pPr>
+            <w:r>
+              <w:t xml:space="preserve">✓</w:t>
+            </w:r>
+          </w:p>
+        </w:tc>
+        <w:tc>
+          <w:tcPr/>
+          <w:p>
+            <w:pPr>
+              <w:pStyle w:val="Compact"/>
+              <w:jc w:val="center"/>
+            </w:pPr>
+            <w:r>
+              <w:t xml:space="preserve">✓</w:t>
+            </w:r>
+          </w:p>
+        </w:tc>
+        <w:tc>
+          <w:tcPr/>
+          <w:p>
+            <w:pPr>
+              <w:pStyle w:val="Compact"/>
+              <w:jc w:val="center"/>
+            </w:pPr>
+            <w:r>
+              <w:t xml:space="preserve">✓</w:t>
+            </w:r>
+          </w:p>
+        </w:tc>
+        <w:tc>
+          <w:tcPr/>
+          <w:p>
+            <w:pPr>
+              <w:pStyle w:val="Compact"/>
+            </w:pPr>
+            <w:r>
+              <w:t xml:space="preserve">Check a page not in</w:t>
+            </w:r>
+            <w:r>
+              <w:t xml:space="preserve"> </w:t>
+            </w:r>
+            <w:r>
+              <w:rPr>
+                <w:rStyle w:val="VerbatimChar"/>
+              </w:rPr>
+              <w:t xml:space="preserve">nodes.yaml</w:t>
+            </w:r>
+            <w:r>
+              <w:t xml:space="preserve"> </w:t>
+            </w:r>
+            <w:r>
+              <w:t xml:space="preserve">(writes to</w:t>
+            </w:r>
+            <w:r>
+              <w:t xml:space="preserve"> </w:t>
+            </w:r>
+            <w:r>
+              <w:rPr>
+                <w:rStyle w:val="VerbatimChar"/>
+              </w:rPr>
+              <w:t xml:space="preserve">results/one-off/</w:t>
+            </w:r>
+            <w:r>
+              <w:t xml:space="preserve">)</w:t>
+            </w:r>
+          </w:p>
+        </w:tc>
+      </w:tr>
+      <w:tr>
+        <w:trPr>
+          <w:cantSplit/>
+        </w:trPr>
+        <w:tc>
+          <w:tcPr/>
+          <w:p>
+            <w:pPr>
+              <w:pStyle w:val="Compact"/>
+            </w:pPr>
+            <w:r>
+              <w:rPr>
+                <w:rStyle w:val="VerbatimChar"/>
+              </w:rPr>
+              <w:t xml:space="preserve">--eosc-page &lt;url&gt;</w:t>
+            </w:r>
+          </w:p>
+        </w:tc>
+        <w:tc>
+          <w:tcPr/>
+          <w:p>
+            <w:pPr>
+              <w:pStyle w:val="Compact"/>
+              <w:jc w:val="center"/>
+            </w:pPr>
+            <w:r>
+              <w:t xml:space="preserve">✓</w:t>
+            </w:r>
+          </w:p>
+        </w:tc>
+        <w:tc>
+          <w:tcPr/>
+          <w:p>
+            <w:pPr>
+              <w:pStyle w:val="Compact"/>
+              <w:jc w:val="center"/>
+            </w:pPr>
+            <w:r>
+              <w:t xml:space="preserve">✓</w:t>
+            </w:r>
+          </w:p>
+        </w:tc>
+        <w:tc>
+          <w:tcPr/>
+          <w:p>
+            <w:pPr>
+              <w:pStyle w:val="Compact"/>
+              <w:jc w:val="center"/>
+            </w:pPr>
+            <w:r>
+              <w:t xml:space="preserve">✓</w:t>
+            </w:r>
+          </w:p>
+        </w:tc>
+        <w:tc>
+          <w:tcPr/>
+          <w:p>
+            <w:pPr>
+              <w:pStyle w:val="Compact"/>
+            </w:pPr>
+            <w:r>
+              <w:t xml:space="preserve">With one</w:t>
+            </w:r>
+            <w:r>
+              <w:t xml:space="preserve"> </w:t>
+            </w:r>
+            <w:r>
+              <w:rPr>
+                <w:rStyle w:val="VerbatimChar"/>
+              </w:rPr>
+              <w:t xml:space="preserve">--url</w:t>
+            </w:r>
+            <w:r>
+              <w:t xml:space="preserve">: that node's own</w:t>
+            </w:r>
+            <w:r>
+              <w:t xml:space="preserve"> </w:t>
+            </w:r>
+            <w:r>
+              <w:rPr>
+                <w:rStyle w:val="VerbatimChar"/>
+              </w:rPr>
+              <w:t xml:space="preserve">eosc.eu</w:t>
+            </w:r>
+            <w:r>
+              <w:t xml:space="preserve"> </w:t>
+            </w:r>
+            <w:r>
+              <w:t xml:space="preserve">page, for point 4</w:t>
+            </w:r>
+          </w:p>
+        </w:tc>
+      </w:tr>
+      <w:tr>
+        <w:trPr>
+          <w:cantSplit/>
+        </w:trPr>
+        <w:tc>
+          <w:tcPr/>
+          <w:p>
+            <w:pPr>
+              <w:pStyle w:val="Compact"/>
+            </w:pPr>
+            <w:r>
+              <w:rPr>
+                <w:rStyle w:val="VerbatimChar"/>
+              </w:rPr>
+              <w:t xml:space="preserve">--node &lt;id or name&gt;</w:t>
+            </w:r>
+          </w:p>
+        </w:tc>
+        <w:tc>
+          <w:tcPr/>
+          <w:p>
+            <w:pPr>
+              <w:pStyle w:val="Compact"/>
+              <w:jc w:val="center"/>
+            </w:pPr>
+            <w:r>
+              <w:t xml:space="preserve">✓</w:t>
+            </w:r>
+          </w:p>
+        </w:tc>
+        <w:tc>
+          <w:tcPr/>
+          <w:p>
+            <w:pPr>
+              <w:pStyle w:val="Compact"/>
+              <w:jc w:val="center"/>
+            </w:pPr>
+            <w:r>
+              <w:t xml:space="preserve">✓</w:t>
+            </w:r>
+          </w:p>
+        </w:tc>
+        <w:tc>
+          <w:tcPr/>
+          <w:p>
+            <w:pPr>
+              <w:pStyle w:val="Compact"/>
+              <w:jc w:val="center"/>
+            </w:pPr>
+            <w:r>
+              <w:t xml:space="preserve">✓</w:t>
+            </w:r>
+          </w:p>
+        </w:tc>
+        <w:tc>
+          <w:tcPr/>
+          <w:p>
+            <w:pPr>
+              <w:pStyle w:val="Compact"/>
+            </w:pPr>
+            <w:r>
+              <w:t xml:space="preserve">One configured node at the alternative page given with</w:t>
+            </w:r>
+            <w:r>
+              <w:t xml:space="preserve"> </w:t>
+            </w:r>
+            <w:r>
+              <w:rPr>
+                <w:rStyle w:val="VerbatimChar"/>
+              </w:rPr>
+              <w:t xml:space="preserve">--url</w:t>
+            </w:r>
+          </w:p>
+        </w:tc>
+      </w:tr>
+      <w:tr>
+        <w:trPr>
+          <w:cantSplit/>
+        </w:trPr>
+        <w:tc>
+          <w:tcPr/>
+          <w:p>
+            <w:pPr>
+              <w:pStyle w:val="Compact"/>
+            </w:pPr>
+            <w:r>
+              <w:rPr>
+                <w:rStyle w:val="VerbatimChar"/>
+              </w:rPr>
+              <w:t xml:space="preserve">--delay &lt;s&gt;</w:t>
+            </w:r>
+          </w:p>
+        </w:tc>
+        <w:tc>
+          <w:tcPr/>
+          <w:p>
+            <w:pPr>
+              <w:pStyle w:val="Compact"/>
+              <w:jc w:val="center"/>
+            </w:pPr>
+            <w:r>
+              <w:t xml:space="preserve">✓</w:t>
+            </w:r>
+          </w:p>
+        </w:tc>
+        <w:tc>
+          <w:tcPr/>
+          <w:p>
+            <w:pPr>
+              <w:pStyle w:val="Compact"/>
+              <w:jc w:val="center"/>
+            </w:pPr>
+            <w:r>
+              <w:t xml:space="preserve">—</w:t>
+            </w:r>
+          </w:p>
+        </w:tc>
+        <w:tc>
+          <w:tcPr/>
+          <w:p>
+            <w:pPr>
+              <w:pStyle w:val="Compact"/>
+              <w:jc w:val="center"/>
+            </w:pPr>
+            <w:r>
+              <w:t xml:space="preserve">✓</w:t>
+            </w:r>
+          </w:p>
+        </w:tc>
+        <w:tc>
+          <w:tcPr/>
+          <w:p>
+            <w:pPr>
+              <w:pStyle w:val="Compact"/>
+            </w:pPr>
+            <w:r>
+              <w:t xml:space="preserve">Seconds between hosts (default 2.0)</w:t>
+            </w:r>
+          </w:p>
+        </w:tc>
+      </w:tr>
+      <w:tr>
+        <w:trPr>
+          <w:cantSplit/>
+        </w:trPr>
+        <w:tc>
+          <w:tcPr/>
+          <w:p>
+            <w:pPr>
+              <w:pStyle w:val="Compact"/>
+            </w:pPr>
+            <w:r>
+              <w:rPr>
+                <w:rStyle w:val="VerbatimChar"/>
+              </w:rPr>
+              <w:t xml:space="preserve">--depth 0/1/2</w:t>
+            </w:r>
+          </w:p>
+        </w:tc>
+        <w:tc>
+          <w:tcPr/>
+          <w:p>
+            <w:pPr>
+              <w:pStyle w:val="Compact"/>
+              <w:jc w:val="center"/>
+            </w:pPr>
+            <w:r>
+              <w:t xml:space="preserve">✓</w:t>
+            </w:r>
+          </w:p>
+        </w:tc>
+        <w:tc>
+          <w:tcPr/>
+          <w:p>
+            <w:pPr>
+              <w:pStyle w:val="Compact"/>
+              <w:jc w:val="center"/>
+            </w:pPr>
+            <w:r>
+              <w:t xml:space="preserve">—</w:t>
+            </w:r>
+          </w:p>
+        </w:tc>
+        <w:tc>
+          <w:tcPr/>
+          <w:p>
+            <w:pPr>
+              <w:pStyle w:val="Compact"/>
+              <w:jc w:val="center"/>
+            </w:pPr>
+            <w:r>
+              <w:t xml:space="preserve">✓</w:t>
+            </w:r>
+          </w:p>
+        </w:tc>
+        <w:tc>
+          <w:tcPr/>
+          <w:p>
+            <w:pPr>
+              <w:pStyle w:val="Compact"/>
+            </w:pPr>
+            <w:r>
+              <w:t xml:space="preserve">How far to follow links (default 1)</w:t>
+            </w:r>
+          </w:p>
+        </w:tc>
+      </w:tr>
+      <w:tr>
+        <w:trPr>
+          <w:cantSplit/>
+        </w:trPr>
+        <w:tc>
+          <w:tcPr/>
+          <w:p>
+            <w:pPr>
+              <w:pStyle w:val="Compact"/>
+            </w:pPr>
+            <w:r>
+              <w:rPr>
+                <w:rStyle w:val="VerbatimChar"/>
+              </w:rPr>
+              <w:t xml:space="preserve">--max-children &lt;n&gt;</w:t>
+            </w:r>
+          </w:p>
+        </w:tc>
+        <w:tc>
+          <w:tcPr/>
+          <w:p>
+            <w:pPr>
+              <w:pStyle w:val="Compact"/>
+              <w:jc w:val="center"/>
+            </w:pPr>
+            <w:r>
+              <w:t xml:space="preserve">✓</w:t>
+            </w:r>
+          </w:p>
+        </w:tc>
+        <w:tc>
+          <w:tcPr/>
+          <w:p>
+            <w:pPr>
+              <w:pStyle w:val="Compact"/>
+              <w:jc w:val="center"/>
+            </w:pPr>
+            <w:r>
+              <w:t xml:space="preserve">—</w:t>
+            </w:r>
+          </w:p>
+        </w:tc>
+        <w:tc>
+          <w:tcPr/>
+          <w:p>
+            <w:pPr>
+              <w:pStyle w:val="Compact"/>
+              <w:jc w:val="center"/>
+            </w:pPr>
+            <w:r>
+              <w:t xml:space="preserve">—</w:t>
+            </w:r>
+          </w:p>
+        </w:tc>
+        <w:tc>
+          <w:tcPr/>
+          <w:p>
+            <w:pPr>
+              <w:pStyle w:val="Compact"/>
+            </w:pPr>
+            <w:r>
+              <w:t xml:space="preserve">Linked pages followed per node at depth 1 (default 8;</w:t>
+            </w:r>
+            <w:r>
+              <w:t xml:space="preserve"> </w:t>
+            </w:r>
+            <w:r>
+              <w:rPr>
+                <w:rStyle w:val="VerbatimChar"/>
+              </w:rPr>
+              <w:t xml:space="preserve">run</w:t>
+            </w:r>
+            <w:r>
+              <w:t xml:space="preserve"> </w:t>
+            </w:r>
+            <w:r>
+              <w:t xml:space="preserve">always uses 8)</w:t>
+            </w:r>
+          </w:p>
+        </w:tc>
+      </w:tr>
+      <w:tr>
+        <w:trPr>
+          <w:cantSplit/>
+        </w:trPr>
+        <w:tc>
+          <w:tcPr/>
+          <w:p>
+            <w:pPr>
+              <w:pStyle w:val="Compact"/>
+            </w:pPr>
+            <w:r>
+              <w:rPr>
+                <w:rStyle w:val="VerbatimChar"/>
+              </w:rPr>
+              <w:t xml:space="preserve">--fetch-budget &lt;n&gt;</w:t>
+            </w:r>
+          </w:p>
+        </w:tc>
+        <w:tc>
+          <w:tcPr/>
+          <w:p>
+            <w:pPr>
+              <w:pStyle w:val="Compact"/>
+              <w:jc w:val="center"/>
+            </w:pPr>
+            <w:r>
+              <w:t xml:space="preserve">✓</w:t>
+            </w:r>
+          </w:p>
+        </w:tc>
+        <w:tc>
+          <w:tcPr/>
+          <w:p>
+            <w:pPr>
+              <w:pStyle w:val="Compact"/>
+              <w:jc w:val="center"/>
+            </w:pPr>
+            <w:r>
+              <w:t xml:space="preserve">—</w:t>
+            </w:r>
+          </w:p>
+        </w:tc>
+        <w:tc>
+          <w:tcPr/>
+          <w:p>
+            <w:pPr>
+              <w:pStyle w:val="Compact"/>
+              <w:jc w:val="center"/>
+            </w:pPr>
+            <w:r>
+              <w:t xml:space="preserve">✓</w:t>
+            </w:r>
+          </w:p>
+        </w:tc>
+        <w:tc>
+          <w:tcPr/>
+          <w:p>
+            <w:pPr>
+              <w:pStyle w:val="Compact"/>
+            </w:pPr>
+            <w:r>
+              <w:t xml:space="preserve">Depth 2 only: ceiling on second-hop requests (default 60)</w:t>
+            </w:r>
+          </w:p>
+        </w:tc>
+      </w:tr>
+      <w:tr>
+        <w:trPr>
+          <w:cantSplit/>
+        </w:trPr>
+        <w:tc>
+          <w:tcPr/>
+          <w:p>
+            <w:pPr>
+              <w:pStyle w:val="Compact"/>
+            </w:pPr>
+            <w:r>
+              <w:rPr>
+                <w:rStyle w:val="VerbatimChar"/>
+              </w:rPr>
+              <w:t xml:space="preserve">--checklist</w:t>
+            </w:r>
+            <w:r>
+              <w:t xml:space="preserve">,</w:t>
+            </w:r>
+            <w:r>
+              <w:t xml:space="preserve"> </w:t>
+            </w:r>
+            <w:r>
+              <w:rPr>
+                <w:rStyle w:val="VerbatimChar"/>
+              </w:rPr>
+              <w:t xml:space="preserve">-c &lt;file&gt;</w:t>
+            </w:r>
+          </w:p>
+        </w:tc>
+        <w:tc>
+          <w:tcPr/>
+          <w:p>
+            <w:pPr>
+              <w:pStyle w:val="Compact"/>
+              <w:jc w:val="center"/>
+            </w:pPr>
+            <w:r>
+              <w:t xml:space="preserve">—</w:t>
+            </w:r>
+          </w:p>
+        </w:tc>
+        <w:tc>
+          <w:tcPr/>
+          <w:p>
+            <w:pPr>
+              <w:pStyle w:val="Compact"/>
+              <w:jc w:val="center"/>
+            </w:pPr>
+            <w:r>
+              <w:t xml:space="preserve">✓</w:t>
+            </w:r>
+          </w:p>
+        </w:tc>
+        <w:tc>
+          <w:tcPr/>
+          <w:p>
+            <w:pPr>
+              <w:pStyle w:val="Compact"/>
+              <w:jc w:val="center"/>
+            </w:pPr>
+            <w:r>
+              <w:t xml:space="preserve">✓</w:t>
+            </w:r>
+          </w:p>
+        </w:tc>
+        <w:tc>
+          <w:tcPr/>
+          <w:p>
+            <w:pPr>
+              <w:pStyle w:val="Compact"/>
+            </w:pPr>
+            <w:r>
+              <w:t xml:space="preserve">Checklist revision to apply (default</w:t>
+            </w:r>
+            <w:r>
+              <w:t xml:space="preserve"> </w:t>
+            </w:r>
+            <w:r>
+              <w:rPr>
+                <w:rStyle w:val="VerbatimChar"/>
+              </w:rPr>
+              <w:t xml:space="preserve">checklist/v3.0.yaml</w:t>
+            </w:r>
+            <w:r>
+              <w:t xml:space="preserve">)</w:t>
+            </w:r>
+          </w:p>
+        </w:tc>
+      </w:tr>
+      <w:tr>
+        <w:trPr>
+          <w:cantSplit/>
+        </w:trPr>
+        <w:tc>
+          <w:tcPr/>
+          <w:p>
+            <w:pPr>
+              <w:pStyle w:val="Compact"/>
+            </w:pPr>
+            <w:r>
+              <w:rPr>
+                <w:rStyle w:val="VerbatimChar"/>
+              </w:rPr>
+              <w:t xml:space="preserve">--approved-names &lt;file&gt;</w:t>
+            </w:r>
+          </w:p>
+        </w:tc>
+        <w:tc>
+          <w:tcPr/>
+          <w:p>
+            <w:pPr>
+              <w:pStyle w:val="Compact"/>
+              <w:jc w:val="center"/>
+            </w:pPr>
+            <w:r>
+              <w:t xml:space="preserve">—</w:t>
+            </w:r>
+          </w:p>
+        </w:tc>
+        <w:tc>
+          <w:tcPr/>
+          <w:p>
+            <w:pPr>
+              <w:pStyle w:val="Compact"/>
+              <w:jc w:val="center"/>
+            </w:pPr>
+            <w:r>
+              <w:t xml:space="preserve">✓</w:t>
+            </w:r>
+          </w:p>
+        </w:tc>
+        <w:tc>
+          <w:tcPr/>
+          <w:p>
+            <w:pPr>
+              <w:pStyle w:val="Compact"/>
+              <w:jc w:val="center"/>
+            </w:pPr>
+            <w:r>
+              <w:t xml:space="preserve">✓</w:t>
+            </w:r>
+          </w:p>
+        </w:tc>
+        <w:tc>
+          <w:tcPr/>
+          <w:p>
+            <w:pPr>
+              <w:pStyle w:val="Compact"/>
+            </w:pPr>
+            <w:r>
+              <w:t xml:space="preserve">Approved-name list for point 3 (default</w:t>
+            </w:r>
+            <w:r>
+              <w:t xml:space="preserve"> </w:t>
+            </w:r>
+            <w:r>
+              <w:rPr>
+                <w:rStyle w:val="VerbatimChar"/>
+              </w:rPr>
+              <w:t xml:space="preserve">checklist/approved-names.txt</w:t>
+            </w:r>
+            <w:r>
+              <w:t xml:space="preserve">)</w:t>
+            </w:r>
+          </w:p>
+        </w:tc>
+      </w:tr>
+      <w:tr>
+        <w:trPr>
+          <w:cantSplit/>
+        </w:trPr>
+        <w:tc>
+          <w:tcPr/>
+          <w:p>
+            <w:pPr>
+              <w:pStyle w:val="Compact"/>
+            </w:pPr>
+            <w:r>
+              <w:rPr>
+                <w:rStyle w:val="VerbatimChar"/>
+              </w:rPr>
+              <w:t xml:space="preserve">--no-approved-names</w:t>
+            </w:r>
+          </w:p>
+        </w:tc>
+        <w:tc>
+          <w:tcPr/>
+          <w:p>
+            <w:pPr>
+              <w:pStyle w:val="Compact"/>
+              <w:jc w:val="center"/>
+            </w:pPr>
+            <w:r>
+              <w:t xml:space="preserve">—</w:t>
+            </w:r>
+          </w:p>
+        </w:tc>
+        <w:tc>
+          <w:tcPr/>
+          <w:p>
+            <w:pPr>
+              <w:pStyle w:val="Compact"/>
+              <w:jc w:val="center"/>
+            </w:pPr>
+            <w:r>
+              <w:t xml:space="preserve">✓</w:t>
+            </w:r>
+          </w:p>
+        </w:tc>
+        <w:tc>
+          <w:tcPr/>
+          <w:p>
+            <w:pPr>
+              <w:pStyle w:val="Compact"/>
+              <w:jc w:val="center"/>
+            </w:pPr>
+            <w:r>
+              <w:t xml:space="preserve">✓</w:t>
+            </w:r>
+          </w:p>
+        </w:tc>
+        <w:tc>
+          <w:tcPr/>
+          <w:p>
+            <w:pPr>
+              <w:pStyle w:val="Compact"/>
+            </w:pPr>
+            <w:r>
+              <w:t xml:space="preserve">Use no name list at all</w:t>
+            </w:r>
+          </w:p>
+        </w:tc>
+      </w:tr>
+      <w:tr>
+        <w:trPr>
+          <w:cantSplit/>
+        </w:trPr>
+        <w:tc>
+          <w:tcPr/>
+          <w:p>
+            <w:pPr>
+              <w:pStyle w:val="Compact"/>
+            </w:pPr>
+            <w:r>
+              <w:rPr>
+                <w:rStyle w:val="VerbatimChar"/>
+              </w:rPr>
+              <w:t xml:space="preserve">--strict-separators</w:t>
+            </w:r>
+          </w:p>
+        </w:tc>
+        <w:tc>
+          <w:tcPr/>
+          <w:p>
+            <w:pPr>
+              <w:pStyle w:val="Compact"/>
+              <w:jc w:val="center"/>
+            </w:pPr>
+            <w:r>
+              <w:t xml:space="preserve">—</w:t>
+            </w:r>
+          </w:p>
+        </w:tc>
+        <w:tc>
+          <w:tcPr/>
+          <w:p>
+            <w:pPr>
+              <w:pStyle w:val="Compact"/>
+              <w:jc w:val="center"/>
+            </w:pPr>
+            <w:r>
+              <w:t xml:space="preserve">✓</w:t>
+            </w:r>
+          </w:p>
+        </w:tc>
+        <w:tc>
+          <w:tcPr/>
+          <w:p>
+            <w:pPr>
+              <w:pStyle w:val="Compact"/>
+              <w:jc w:val="center"/>
+            </w:pPr>
+            <w:r>
+              <w:t xml:space="preserve">✓</w:t>
+            </w:r>
+          </w:p>
+        </w:tc>
+        <w:tc>
+          <w:tcPr/>
+          <w:p>
+            <w:pPr>
+              <w:pStyle w:val="Compact"/>
+            </w:pPr>
+            <w:r>
+              <w:t xml:space="preserve">Match separators in approved names literally</w:t>
+            </w:r>
+          </w:p>
+        </w:tc>
+      </w:tr>
+      <w:tr>
+        <w:trPr>
+          <w:cantSplit/>
+        </w:trPr>
+        <w:tc>
+          <w:tcPr/>
+          <w:p>
+            <w:pPr>
+              <w:pStyle w:val="Compact"/>
+            </w:pPr>
+            <w:r>
+              <w:rPr>
+                <w:rStyle w:val="VerbatimChar"/>
+              </w:rPr>
+              <w:t xml:space="preserve">--run &lt;label&gt;</w:t>
+            </w:r>
+          </w:p>
+        </w:tc>
+        <w:tc>
+          <w:tcPr/>
+          <w:p>
+            <w:pPr>
+              <w:pStyle w:val="Compact"/>
+              <w:jc w:val="center"/>
+            </w:pPr>
+            <w:r>
+              <w:t xml:space="preserve">—</w:t>
+            </w:r>
+          </w:p>
+        </w:tc>
+        <w:tc>
+          <w:tcPr/>
+          <w:p>
+            <w:pPr>
+              <w:pStyle w:val="Compact"/>
+              <w:jc w:val="center"/>
+            </w:pPr>
+            <w:r>
+              <w:t xml:space="preserve">✓</w:t>
+            </w:r>
+          </w:p>
+        </w:tc>
+        <w:tc>
+          <w:tcPr/>
+          <w:p>
+            <w:pPr>
+              <w:pStyle w:val="Compact"/>
+              <w:jc w:val="center"/>
+            </w:pPr>
+            <w:r>
+              <w:t xml:space="preserve">✓</w:t>
+            </w:r>
+          </w:p>
+        </w:tc>
+        <w:tc>
+          <w:tcPr/>
+          <w:p>
+            <w:pPr>
+              <w:pStyle w:val="Compact"/>
+            </w:pPr>
+            <w:r>
+              <w:t xml:space="preserve">Label recorded in every report (default: UTC time)</w:t>
+            </w:r>
+          </w:p>
+        </w:tc>
+      </w:tr>
+      <w:tr>
+        <w:trPr>
+          <w:cantSplit/>
+        </w:trPr>
+        <w:tc>
+          <w:tcPr/>
+          <w:p>
+            <w:pPr>
+              <w:pStyle w:val="Compact"/>
+            </w:pPr>
+            <w:r>
+              <w:rPr>
+                <w:rStyle w:val="VerbatimChar"/>
+              </w:rPr>
+              <w:t xml:space="preserve">--update-results-for-node &lt;node&gt;</w:t>
+            </w:r>
+          </w:p>
+        </w:tc>
+        <w:tc>
+          <w:tcPr/>
+          <w:p>
+            <w:pPr>
+              <w:pStyle w:val="Compact"/>
+              <w:jc w:val="center"/>
+            </w:pPr>
+            <w:r>
+              <w:t xml:space="preserve">—</w:t>
+            </w:r>
+          </w:p>
+        </w:tc>
+        <w:tc>
+          <w:tcPr/>
+          <w:p>
+            <w:pPr>
+              <w:pStyle w:val="Compact"/>
+              <w:jc w:val="center"/>
+            </w:pPr>
+            <w:r>
+              <w:t xml:space="preserve">✓</w:t>
+            </w:r>
+          </w:p>
+        </w:tc>
+        <w:tc>
+          <w:tcPr/>
+          <w:p>
+            <w:pPr>
+              <w:pStyle w:val="Compact"/>
+              <w:jc w:val="center"/>
+            </w:pPr>
+            <w:r>
+              <w:t xml:space="preserve">✓</w:t>
+            </w:r>
+          </w:p>
+        </w:tc>
+        <w:tc>
+          <w:tcPr/>
+          <w:p>
+            <w:pPr>
+              <w:pStyle w:val="Compact"/>
+            </w:pPr>
+            <w:r>
+              <w:t xml:space="preserve">Update only that node's row in the stored results;</w:t>
+            </w:r>
+            <w:r>
+              <w:t xml:space="preserve"> </w:t>
+            </w:r>
+            <w:r>
+              <w:rPr>
+                <w:rStyle w:val="VerbatimChar"/>
+              </w:rPr>
+              <w:t xml:space="preserve">assess</w:t>
+            </w:r>
+            <w:r>
+              <w:t xml:space="preserve"> </w:t>
+            </w:r>
+            <w:r>
+              <w:t xml:space="preserve">re-judges its saved evidence,</w:t>
+            </w:r>
+            <w:r>
+              <w:t xml:space="preserve"> </w:t>
+            </w:r>
+            <w:r>
+              <w:rPr>
+                <w:rStyle w:val="VerbatimChar"/>
+              </w:rPr>
+              <w:t xml:space="preserve">run</w:t>
+            </w:r>
+            <w:r>
+              <w:t xml:space="preserve"> </w:t>
+            </w:r>
+            <w:r>
+              <w:t xml:space="preserve">fetches it again</w:t>
+            </w:r>
+          </w:p>
+        </w:tc>
+      </w:tr>
+      <w:tr>
+        <w:trPr>
+          <w:cantSplit/>
+        </w:trPr>
+        <w:tc>
+          <w:tcPr/>
+          <w:p>
+            <w:pPr>
+              <w:pStyle w:val="Compact"/>
+            </w:pPr>
+            <w:r>
+              <w:rPr>
+                <w:rStyle w:val="VerbatimChar"/>
+              </w:rPr>
+              <w:t xml:space="preserve">--accept-error</w:t>
+            </w:r>
+          </w:p>
+        </w:tc>
+        <w:tc>
+          <w:tcPr/>
+          <w:p>
+            <w:pPr>
+              <w:pStyle w:val="Compact"/>
+              <w:jc w:val="center"/>
+            </w:pPr>
+            <w:r>
+              <w:t xml:space="preserve">—</w:t>
+            </w:r>
+          </w:p>
+        </w:tc>
+        <w:tc>
+          <w:tcPr/>
+          <w:p>
+            <w:pPr>
+              <w:pStyle w:val="Compact"/>
+              <w:jc w:val="center"/>
+            </w:pPr>
+            <w:r>
+              <w:t xml:space="preserve">—</w:t>
+            </w:r>
+          </w:p>
+        </w:tc>
+        <w:tc>
+          <w:tcPr/>
+          <w:p>
+            <w:pPr>
+              <w:pStyle w:val="Compact"/>
+              <w:jc w:val="center"/>
+            </w:pPr>
+            <w:r>
+              <w:t xml:space="preserve">✓</w:t>
+            </w:r>
+          </w:p>
+        </w:tc>
+        <w:tc>
+          <w:tcPr/>
+          <w:p>
+            <w:pPr>
+              <w:pStyle w:val="Compact"/>
+            </w:pPr>
+            <w:r>
+              <w:t xml:space="preserve">With</w:t>
+            </w:r>
+            <w:r>
+              <w:t xml:space="preserve"> </w:t>
+            </w:r>
+            <w:r>
+              <w:rPr>
+                <w:rStyle w:val="VerbatimChar"/>
+              </w:rPr>
+              <w:t xml:space="preserve">--update-results-for-node</w:t>
+            </w:r>
+            <w:r>
+              <w:t xml:space="preserve">: merge the row even if the fetch failed</w:t>
+            </w:r>
+          </w:p>
+        </w:tc>
+      </w:tr>
+    </w:tbl>
+    <w:p>
+      <w:pPr>
+        <w:pStyle w:val="BodyText"/>
+      </w:pPr>
+      <w:r>
+        <w:rPr>
+          <w:b/>
+          <w:bCs/>
+        </w:rPr>
+        <w:t xml:space="preserve">What to launch again after a change.</w:t>
+      </w:r>
+      <w:r>
+        <w:t xml:space="preserve"> </w:t>
+      </w:r>
+      <w:r>
+        <w:t xml:space="preserve">Which phase has to be repeated depends</w:t>
+      </w:r>
+      <w:r>
+        <w:t xml:space="preserve"> </w:t>
+      </w:r>
+      <w:r>
+        <w:t xml:space="preserve">on which input changed. A change to</w:t>
+      </w:r>
+      <w:r>
+        <w:t xml:space="preserve"> </w:t>
+      </w:r>
+      <w:r>
+        <w:rPr>
+          <w:rStyle w:val="VerbatimChar"/>
+        </w:rPr>
+        <w:t xml:space="preserve">nodes.yaml</w:t>
+      </w:r>
+      <w:r>
+        <w:t xml:space="preserve"> </w:t>
+      </w:r>
+      <w:r>
+        <w:t xml:space="preserve">needs a new collection for the</w:t>
+      </w:r>
+      <w:r>
+        <w:t xml:space="preserve"> </w:t>
+      </w:r>
+      <w:r>
+        <w:t xml:space="preserve">nodes concerned. A change to the checklist or to the name list needs only a new</w:t>
+      </w:r>
+      <w:r>
+        <w:t xml:space="preserve"> </w:t>
+      </w:r>
+      <w:r>
+        <w:t xml:space="preserve">assessment, which is offline.</w:t>
+      </w:r>
+      <w:r>
+        <w:t xml:space="preserve"> </w:t>
+      </w:r>
+      <w:r>
+        <w:rPr>
+          <w:rStyle w:val="VerbatimChar"/>
+        </w:rPr>
+        <w:t xml:space="preserve">--update-results-for-node</w:t>
+      </w:r>
+      <w:r>
+        <w:t xml:space="preserve"> </w:t>
+      </w:r>
+      <w:r>
+        <w:t xml:space="preserve">refuses when the</w:t>
+      </w:r>
+      <w:r>
+        <w:t xml:space="preserve"> </w:t>
+      </w:r>
+      <w:r>
+        <w:t xml:space="preserve">checklist or the approved-name list differs from the stored results', because</w:t>
+      </w:r>
+      <w:r>
+        <w:t xml:space="preserve"> </w:t>
+      </w:r>
+      <w:r>
+        <w:t xml:space="preserve">a row judged by other rules would not be comparable with the others. In those</w:t>
+      </w:r>
+      <w:r>
+        <w:t xml:space="preserve"> </w:t>
+      </w:r>
+      <w:r>
+        <w:t xml:space="preserve">cases, every row is assessed again from its stored evidence.</w:t>
+      </w:r>
+    </w:p>
+    <w:tbl>
+      <w:tblPr>
+        <w:tblStyle w:val="Table"/>
+        <w:tblW w:type="pct" w:w="5000"/>
+        <w:tblLayout w:type="fixed"/>
+        <w:tblLook w:firstRow="1" w:lastRow="0" w:firstColumn="0" w:lastColumn="0" w:noHBand="0" w:noVBand="0" w:val="0020"/>
+      </w:tblPr>
+      <w:tblGrid>
+        <w:gridCol w:w="2262"/>
+        <w:gridCol w:w="2262"/>
+        <w:gridCol w:w="1131"/>
+        <w:gridCol w:w="2262"/>
+      </w:tblGrid>
+      <w:tr>
+        <w:trPr>
+          <w:cantSplit/>
+          <w:tblHeader w:val="on"/>
+        </w:trPr>
+        <w:tc>
+          <w:tcPr/>
+          <w:p>
+            <w:pPr>
+              <w:pStyle w:val="Compact"/>
+            </w:pPr>
+            <w:r>
+              <w:t xml:space="preserve">You change</w:t>
+            </w:r>
+          </w:p>
+        </w:tc>
+        <w:tc>
+          <w:tcPr/>
+          <w:p>
+            <w:pPr>
+              <w:pStyle w:val="Compact"/>
+            </w:pPr>
+            <w:r>
+              <w:t xml:space="preserve">Launch again</w:t>
+            </w:r>
+          </w:p>
+        </w:tc>
+        <w:tc>
+          <w:tcPr/>
+          <w:p>
+            <w:pPr>
+              <w:pStyle w:val="Compact"/>
+            </w:pPr>
+            <w:r>
+              <w:t xml:space="preserve">Sites contacted</w:t>
+            </w:r>
+          </w:p>
+        </w:tc>
+        <w:tc>
+          <w:tcPr/>
+          <w:p>
+            <w:pPr>
+              <w:pStyle w:val="Compact"/>
+            </w:pPr>
+            <w:r>
+              <w:t xml:space="preserve">The other nodes' rows</w:t>
+            </w:r>
+          </w:p>
+        </w:tc>
+      </w:tr>
+      <w:tr>
+        <w:trPr>
+          <w:cantSplit/>
+        </w:trPr>
+        <w:tc>
+          <w:tcPr/>
+          <w:p>
+            <w:pPr>
+              <w:pStyle w:val="Compact"/>
+            </w:pPr>
+            <w:r>
+              <w:rPr>
+                <w:b/>
+                <w:bCs/>
+              </w:rPr>
+              <w:t xml:space="preserve">Add a node</w:t>
+            </w:r>
+            <w:r>
+              <w:t xml:space="preserve">: an entry in</w:t>
+            </w:r>
+            <w:r>
+              <w:t xml:space="preserve"> </w:t>
+            </w:r>
+            <w:r>
+              <w:rPr>
+                <w:rStyle w:val="VerbatimChar"/>
+              </w:rPr>
+              <w:t xml:space="preserve">nodes.yaml</w:t>
+            </w:r>
+            <w:r>
+              <w:t xml:space="preserve"> </w:t>
+            </w:r>
+            <w:r>
+              <w:t xml:space="preserve">and its approved name in</w:t>
+            </w:r>
+            <w:r>
+              <w:t xml:space="preserve"> </w:t>
+            </w:r>
+            <w:r>
+              <w:rPr>
+                <w:rStyle w:val="VerbatimChar"/>
+              </w:rPr>
+              <w:t xml:space="preserve">checklist/approved-names.txt</w:t>
+            </w:r>
+            <w:r>
+              <w:t xml:space="preserve"> </w:t>
+            </w:r>
+            <w:r>
+              <w:t xml:space="preserve">(and</w:t>
+            </w:r>
+            <w:r>
+              <w:t xml:space="preserve"> </w:t>
+            </w:r>
+            <w:r>
+              <w:rPr>
+                <w:rStyle w:val="VerbatimChar"/>
+              </w:rPr>
+              <w:t xml:space="preserve">-scoped.txt</w:t>
+            </w:r>
+            <w:r>
+              <w:t xml:space="preserve">)</w:t>
+            </w:r>
+          </w:p>
+        </w:tc>
+        <w:tc>
+          <w:tcPr/>
+          <w:p>
+            <w:pPr>
+              <w:pStyle w:val="Compact"/>
+            </w:pPr>
+            <w:r>
+              <w:rPr>
+                <w:rStyle w:val="VerbatimChar"/>
+              </w:rPr>
+              <w:t xml:space="preserve">collect --only &lt;new id&gt;</w:t>
+            </w:r>
+            <w:r>
+              <w:t xml:space="preserve">, then</w:t>
+            </w:r>
+            <w:r>
+              <w:t xml:space="preserve"> </w:t>
+            </w:r>
+            <w:r>
+              <w:rPr>
+                <w:rStyle w:val="VerbatimChar"/>
+              </w:rPr>
+              <w:t xml:space="preserve">assess</w:t>
+            </w:r>
+            <w:r>
+              <w:t xml:space="preserve"> </w:t>
+            </w:r>
+            <w:r>
+              <w:t xml:space="preserve">without</w:t>
+            </w:r>
+            <w:r>
+              <w:t xml:space="preserve"> </w:t>
+            </w:r>
+            <w:r>
+              <w:rPr>
+                <w:rStyle w:val="VerbatimChar"/>
+              </w:rPr>
+              <w:t xml:space="preserve">--only</w:t>
+            </w:r>
+          </w:p>
+        </w:tc>
+        <w:tc>
+          <w:tcPr/>
+          <w:p>
+            <w:pPr>
+              <w:pStyle w:val="Compact"/>
+            </w:pPr>
+            <w:r>
+              <w:t xml:space="preserve">the new node only</w:t>
+            </w:r>
+          </w:p>
+        </w:tc>
+        <w:tc>
+          <w:tcPr/>
+          <w:p>
+            <w:pPr>
+              <w:pStyle w:val="Compact"/>
+            </w:pPr>
+            <w:r>
+              <w:t xml:space="preserve">Re-judged, offline, from their stored evidence, because the approved-name list used for point 3 changed</w:t>
+            </w:r>
+          </w:p>
+        </w:tc>
+      </w:tr>
+      <w:tr>
+        <w:trPr>
+          <w:cantSplit/>
+        </w:trPr>
+        <w:tc>
+          <w:tcPr/>
+          <w:p>
+            <w:pPr>
+              <w:pStyle w:val="Compact"/>
+            </w:pPr>
+            <w:r>
+              <w:rPr>
+                <w:b/>
+                <w:bCs/>
+              </w:rPr>
+              <w:t xml:space="preserve">Add a node</w:t>
+            </w:r>
+            <w:r>
+              <w:t xml:space="preserve"> </w:t>
+            </w:r>
+            <w:r>
+              <w:t xml:space="preserve">whose approved name is already in</w:t>
+            </w:r>
+            <w:r>
+              <w:t xml:space="preserve"> </w:t>
+            </w:r>
+            <w:r>
+              <w:rPr>
+                <w:rStyle w:val="VerbatimChar"/>
+              </w:rPr>
+              <w:t xml:space="preserve">checklist/approved-names.txt</w:t>
+            </w:r>
+          </w:p>
+        </w:tc>
+        <w:tc>
+          <w:tcPr/>
+          <w:p>
+            <w:pPr>
+              <w:pStyle w:val="Compact"/>
+            </w:pPr>
+            <w:r>
+              <w:rPr>
+                <w:rStyle w:val="VerbatimChar"/>
+              </w:rPr>
+              <w:t xml:space="preserve">run --update-results-for-node &lt;new id&gt;</w:t>
+            </w:r>
+          </w:p>
+        </w:tc>
+        <w:tc>
+          <w:tcPr/>
+          <w:p>
+            <w:pPr>
+              <w:pStyle w:val="Compact"/>
+            </w:pPr>
+            <w:r>
+              <w:t xml:space="preserve">the new node only</w:t>
+            </w:r>
+          </w:p>
+        </w:tc>
+        <w:tc>
+          <w:tcPr/>
+          <w:p>
+            <w:pPr>
+              <w:pStyle w:val="Compact"/>
+            </w:pPr>
+            <w:r>
+              <w:t xml:space="preserve">Kept unchanged; the new row is inserted in</w:t>
+            </w:r>
+            <w:r>
+              <w:t xml:space="preserve"> </w:t>
+            </w:r>
+            <w:r>
+              <w:rPr>
+                <w:rStyle w:val="VerbatimChar"/>
+              </w:rPr>
+              <w:t xml:space="preserve">nodes.yaml</w:t>
+            </w:r>
+            <w:r>
+              <w:t xml:space="preserve"> </w:t>
+            </w:r>
+            <w:r>
+              <w:t xml:space="preserve">order</w:t>
+            </w:r>
+          </w:p>
+        </w:tc>
+      </w:tr>
+      <w:tr>
+        <w:trPr>
+          <w:cantSplit/>
+        </w:trPr>
+        <w:tc>
+          <w:tcPr/>
+          <w:p>
+            <w:pPr>
+              <w:pStyle w:val="Compact"/>
+            </w:pPr>
+            <w:r>
+              <w:rPr>
+                <w:b/>
+                <w:bCs/>
+              </w:rPr>
+              <w:t xml:space="preserve">Change a node's landing page URL</w:t>
+            </w:r>
+            <w:r>
+              <w:t xml:space="preserve"> </w:t>
+            </w:r>
+            <w:r>
+              <w:t xml:space="preserve">(</w:t>
+            </w:r>
+            <w:r>
+              <w:rPr>
+                <w:rStyle w:val="VerbatimChar"/>
+              </w:rPr>
+              <w:t xml:space="preserve">basic-check --update-nlp &lt;id&gt; &lt;URL&gt;</w:t>
+            </w:r>
+            <w:r>
+              <w:t xml:space="preserve">, or by hand)</w:t>
+            </w:r>
+          </w:p>
+        </w:tc>
+        <w:tc>
+          <w:tcPr/>
+          <w:p>
+            <w:pPr>
+              <w:pStyle w:val="Compact"/>
+            </w:pPr>
+            <w:r>
+              <w:rPr>
+                <w:rStyle w:val="VerbatimChar"/>
+              </w:rPr>
+              <w:t xml:space="preserve">run --update-results-for-node &lt;id&gt;</w:t>
+            </w:r>
+          </w:p>
+        </w:tc>
+        <w:tc>
+          <w:tcPr/>
+          <w:p>
+            <w:pPr>
+              <w:pStyle w:val="Compact"/>
+            </w:pPr>
+            <w:r>
+              <w:t xml:space="preserve">that node only</w:t>
+            </w:r>
+          </w:p>
+        </w:tc>
+        <w:tc>
+          <w:tcPr/>
+          <w:p>
+            <w:pPr>
+              <w:pStyle w:val="Compact"/>
+            </w:pPr>
+            <w:r>
+              <w:t xml:space="preserve">Kept unchanged</w:t>
+            </w:r>
+          </w:p>
+        </w:tc>
+      </w:tr>
+      <w:tr>
+        <w:trPr>
+          <w:cantSplit/>
+        </w:trPr>
+        <w:tc>
+          <w:tcPr/>
+          <w:p>
+            <w:pPr>
+              <w:pStyle w:val="Compact"/>
+            </w:pPr>
+            <w:r>
+              <w:rPr>
+                <w:b/>
+                <w:bCs/>
+              </w:rPr>
+              <w:t xml:space="preserve">Change the reference checklist</w:t>
+            </w:r>
+            <w:r>
+              <w:t xml:space="preserve"> </w:t>
+            </w:r>
+            <w:r>
+              <w:t xml:space="preserve">(a new</w:t>
+            </w:r>
+            <w:r>
+              <w:t xml:space="preserve"> </w:t>
+            </w:r>
+            <w:r>
+              <w:rPr>
+                <w:rStyle w:val="VerbatimChar"/>
+              </w:rPr>
+              <w:t xml:space="preserve">checklist/vX.Y.yaml</w:t>
+            </w:r>
+            <w:r>
+              <w:t xml:space="preserve">, made the default in</w:t>
+            </w:r>
+            <w:r>
+              <w:t xml:space="preserve"> </w:t>
+            </w:r>
+            <w:r>
+              <w:rPr>
+                <w:rStyle w:val="VerbatimChar"/>
+              </w:rPr>
+              <w:t xml:space="preserve">DEFAULT_CHECKLIST</w:t>
+            </w:r>
+            <w:r>
+              <w:t xml:space="preserve"> </w:t>
+            </w:r>
+            <w:r>
+              <w:t xml:space="preserve">or passed with</w:t>
+            </w:r>
+            <w:r>
+              <w:t xml:space="preserve"> </w:t>
+            </w:r>
+            <w:r>
+              <w:rPr>
+                <w:rStyle w:val="VerbatimChar"/>
+              </w:rPr>
+              <w:t xml:space="preserve">-c</w:t>
+            </w:r>
+            <w:r>
+              <w:t xml:space="preserve">)</w:t>
+            </w:r>
+          </w:p>
+        </w:tc>
+        <w:tc>
+          <w:tcPr/>
+          <w:p>
+            <w:pPr>
+              <w:pStyle w:val="Compact"/>
+            </w:pPr>
+            <w:r>
+              <w:rPr>
+                <w:rStyle w:val="VerbatimChar"/>
+              </w:rPr>
+              <w:t xml:space="preserve">assess</w:t>
+            </w:r>
+          </w:p>
+        </w:tc>
+        <w:tc>
+          <w:tcPr/>
+          <w:p>
+            <w:pPr>
+              <w:pStyle w:val="Compact"/>
+            </w:pPr>
+            <w:r>
+              <w:t xml:space="preserve">none</w:t>
+            </w:r>
+          </w:p>
+        </w:tc>
+        <w:tc>
+          <w:tcPr/>
+          <w:p>
+            <w:pPr>
+              <w:pStyle w:val="Compact"/>
+            </w:pPr>
+            <w:r>
+              <w:t xml:space="preserve">All re-judged, offline, from the stored evidence</w:t>
+            </w:r>
+          </w:p>
+        </w:tc>
+      </w:tr>
+    </w:tbl>
+    <w:p>
+      <w:pPr>
+        <w:pStyle w:val="BodyText"/>
+      </w:pPr>
+      <w:r>
+        <w:rPr>
+          <w:rStyle w:val="VerbatimChar"/>
+        </w:rPr>
+        <w:t xml:space="preserve">assess</w:t>
+      </w:r>
+      <w:r>
+        <w:t xml:space="preserve"> </w:t>
+      </w:r>
+      <w:r>
+        <w:t xml:space="preserve">alone is not enough after a URL change. The node's evidence still</w:t>
+      </w:r>
+      <w:r>
+        <w:t xml:space="preserve"> </w:t>
+      </w:r>
+      <w:r>
+        <w:t xml:space="preserve">comes from the old page, so</w:t>
+      </w:r>
+      <w:r>
+        <w:t xml:space="preserve"> </w:t>
+      </w:r>
+      <w:r>
+        <w:rPr>
+          <w:rStyle w:val="VerbatimChar"/>
+        </w:rPr>
+        <w:t xml:space="preserve">assess</w:t>
+      </w:r>
+      <w:r>
+        <w:t xml:space="preserve"> </w:t>
+      </w:r>
+      <w:r>
+        <w:t xml:space="preserve">warns and both reports carry an</w:t>
+      </w:r>
+      <w:r>
+        <w:t xml:space="preserve"> </w:t>
+      </w:r>
+      <w:r>
+        <w:rPr>
+          <w:b/>
+          <w:bCs/>
+        </w:rPr>
+        <w:t xml:space="preserve">Evidence</w:t>
+      </w:r>
+      <w:r>
+        <w:rPr>
+          <w:b/>
+          <w:bCs/>
+        </w:rPr>
+        <w:t xml:space="preserve"> </w:t>
+      </w:r>
+      <w:r>
+        <w:rPr>
+          <w:b/>
+          <w:bCs/>
+        </w:rPr>
+        <w:t xml:space="preserve">from a different URL</w:t>
+      </w:r>
+      <w:r>
+        <w:t xml:space="preserve"> </w:t>
+      </w:r>
+      <w:r>
+        <w:t xml:space="preserve">banner. After a checklist change, a new</w:t>
+      </w:r>
+      <w:r>
+        <w:t xml:space="preserve"> </w:t>
+      </w:r>
+      <w:r>
+        <w:rPr>
+          <w:rStyle w:val="VerbatimChar"/>
+        </w:rPr>
+        <w:t xml:space="preserve">collect</w:t>
+      </w:r>
+      <w:r>
+        <w:t xml:space="preserve"> </w:t>
+      </w:r>
+      <w:r>
+        <w:t xml:space="preserve">(or a</w:t>
+      </w:r>
+      <w:r>
+        <w:t xml:space="preserve"> </w:t>
+      </w:r>
+      <w:r>
+        <w:t xml:space="preserve">full</w:t>
+      </w:r>
+      <w:r>
+        <w:t xml:space="preserve"> </w:t>
+      </w:r>
+      <w:r>
+        <w:rPr>
+          <w:rStyle w:val="VerbatimChar"/>
+        </w:rPr>
+        <w:t xml:space="preserve">run</w:t>
+      </w:r>
+      <w:r>
+        <w:t xml:space="preserve">) is needed only if the new revision asks for something the collector</w:t>
+      </w:r>
+      <w:r>
+        <w:t xml:space="preserve"> </w:t>
+      </w:r>
+      <w:r>
+        <w:t xml:space="preserve">does not record (section 3), or if you want a fresh</w:t>
+      </w:r>
+      <w:r>
+        <w:t xml:space="preserve"> </w:t>
+      </w:r>
+      <w:r>
+        <w:t xml:space="preserve">capture date. For the full procedure of each case, with every file and</w:t>
+      </w:r>
+      <w:r>
+        <w:t xml:space="preserve"> </w:t>
+      </w:r>
+      <w:r>
+        <w:t xml:space="preserve">command, see the worked examples in section 8. Each command writes to</w:t>
+      </w:r>
+      <w:r>
+        <w:t xml:space="preserve"> </w:t>
+      </w:r>
+      <w:r>
+        <w:rPr>
+          <w:rStyle w:val="VerbatimChar"/>
+        </w:rPr>
+        <w:t xml:space="preserve">results/</w:t>
+      </w:r>
+      <w:r>
+        <w:t xml:space="preserve">, the reviewed run, by default. Add</w:t>
+      </w:r>
+      <w:r>
+        <w:t xml:space="preserve"> </w:t>
+      </w:r>
+      <w:r>
+        <w:rPr>
+          <w:rStyle w:val="VerbatimChar"/>
+        </w:rPr>
+        <w:t xml:space="preserve">--results /tmp/copy</w:t>
+      </w:r>
+      <w:r>
+        <w:t xml:space="preserve"> </w:t>
+      </w:r>
+      <w:r>
+        <w:t xml:space="preserve">to work on</w:t>
+      </w:r>
+      <w:r>
+        <w:t xml:space="preserve"> </w:t>
+      </w:r>
+      <w:r>
+        <w:t xml:space="preserve">a copy first, and keep</w:t>
+      </w:r>
+      <w:r>
+        <w:t xml:space="preserve"> </w:t>
+      </w:r>
+      <w:r>
+        <w:rPr>
+          <w:rStyle w:val="VerbatimChar"/>
+        </w:rPr>
+        <w:t xml:space="preserve">--skip Italy</w:t>
+      </w:r>
+      <w:r>
+        <w:t xml:space="preserve"> </w:t>
+      </w:r>
+      <w:r>
+        <w:t xml:space="preserve">for the same scope as the published run.</w:t>
+      </w:r>
+      <w:r>
+        <w:t xml:space="preserve"> </w:t>
+      </w:r>
+      <w:r>
+        <w:t xml:space="preserve">With an explicit</w:t>
+      </w:r>
+      <w:r>
+        <w:t xml:space="preserve"> </w:t>
+      </w:r>
+      <w:r>
+        <w:rPr>
+          <w:rStyle w:val="VerbatimChar"/>
+        </w:rPr>
+        <w:t xml:space="preserve">--results</w:t>
+      </w:r>
+      <w:r>
+        <w:t xml:space="preserve">,</w:t>
+      </w:r>
+      <w:r>
+        <w:t xml:space="preserve"> </w:t>
+      </w:r>
+      <w:r>
+        <w:rPr>
+          <w:rStyle w:val="VerbatimChar"/>
+        </w:rPr>
+        <w:t xml:space="preserve">--only</w:t>
+      </w:r>
+      <w:r>
+        <w:t xml:space="preserve"> </w:t>
+      </w:r>
+      <w:r>
+        <w:t xml:space="preserve">also narrows the report to those nodes,</w:t>
+      </w:r>
+      <w:r>
+        <w:t xml:space="preserve"> </w:t>
+      </w:r>
+      <w:r>
+        <w:t xml:space="preserve">which is why the table runs</w:t>
+      </w:r>
+      <w:r>
+        <w:t xml:space="preserve"> </w:t>
+      </w:r>
+      <w:r>
+        <w:rPr>
+          <w:rStyle w:val="VerbatimChar"/>
+        </w:rPr>
+        <w:t xml:space="preserve">assess</w:t>
+      </w:r>
+      <w:r>
+        <w:t xml:space="preserve"> </w:t>
+      </w:r>
+      <w:r>
+        <w:t xml:space="preserve">without it.</w:t>
+      </w:r>
+    </w:p>
     <w:p>
       <w:r>
         <w:pict>
@@ -820,8 +3415,9 @@
         </w:pict>
       </w:r>
     </w:p>
-    <w:bookmarkEnd w:id="10"/>
-    <w:bookmarkStart w:id="11" w:name="stage-1-collection"/>
+    <w:bookmarkEnd w:id="13"/>
+    <w:bookmarkEnd w:id="14"/>
+    <w:bookmarkStart w:id="15" w:name="stage-1-collection"/>
     <w:p>
       <w:pPr>
         <w:pStyle w:val="Heading2"/>
@@ -2502,8 +5098,8 @@
         </w:pict>
       </w:r>
     </w:p>
-    <w:bookmarkEnd w:id="11"/>
-    <w:bookmarkStart w:id="12" w:name="X918652c513cf24a1b30a731e09106c31c6d2955"/>
+    <w:bookmarkEnd w:id="15"/>
+    <w:bookmarkStart w:id="16" w:name="X918652c513cf24a1b30a731e09106c31c6d2955"/>
     <w:p>
       <w:pPr>
         <w:pStyle w:val="Heading2"/>
@@ -3311,8 +5907,8 @@
         </w:pict>
       </w:r>
     </w:p>
-    <w:bookmarkEnd w:id="12"/>
-    <w:bookmarkStart w:id="17" w:name="stage-2-the-assessment-machinery"/>
+    <w:bookmarkEnd w:id="16"/>
+    <w:bookmarkStart w:id="21" w:name="stage-2-the-assessment-machinery"/>
     <w:p>
       <w:pPr>
         <w:pStyle w:val="Heading2"/>
@@ -3481,7 +6077,7 @@
         <w:t xml:space="preserve">.</w:t>
       </w:r>
     </w:p>
-    <w:bookmarkStart w:id="13" w:name="the-verdict-vocabulary"/>
+    <w:bookmarkStart w:id="17" w:name="the-verdict-vocabulary"/>
     <w:p>
       <w:pPr>
         <w:pStyle w:val="Heading3"/>
@@ -3736,8 +6332,8 @@
         <w:t xml:space="preserve">says so and hands over the evidence.</w:t>
       </w:r>
     </w:p>
-    <w:bookmarkEnd w:id="13"/>
-    <w:bookmarkStart w:id="14" w:name="the-first-step-of-every-check"/>
+    <w:bookmarkEnd w:id="17"/>
+    <w:bookmarkStart w:id="18" w:name="the-first-step-of-every-check"/>
     <w:p>
       <w:pPr>
         <w:pStyle w:val="Heading3"/>
@@ -3788,8 +6384,8 @@
         <w:t xml:space="preserve">cells, never a mix of passes and a failure.</w:t>
       </w:r>
     </w:p>
-    <w:bookmarkEnd w:id="14"/>
-    <w:bookmarkStart w:id="15" w:name="shared-helpers"/>
+    <w:bookmarkEnd w:id="18"/>
+    <w:bookmarkStart w:id="19" w:name="shared-helpers"/>
     <w:p>
       <w:pPr>
         <w:pStyle w:val="Heading3"/>
@@ -4298,8 +6894,8 @@
         </w:tc>
       </w:tr>
     </w:tbl>
-    <w:bookmarkEnd w:id="15"/>
-    <w:bookmarkStart w:id="16" w:name="Xb01f761edf526ca820d10c97270181bdb8dc3d6"/>
+    <w:bookmarkEnd w:id="19"/>
+    <w:bookmarkStart w:id="20" w:name="Xb01f761edf526ca820d10c97270181bdb8dc3d6"/>
     <w:p>
       <w:pPr>
         <w:pStyle w:val="Heading3"/>
@@ -4665,9 +7261,9 @@
         </w:pict>
       </w:r>
     </w:p>
-    <w:bookmarkEnd w:id="16"/>
-    <w:bookmarkEnd w:id="17"/>
-    <w:bookmarkStart w:id="27" w:name="per-point-decision-procedures"/>
+    <w:bookmarkEnd w:id="20"/>
+    <w:bookmarkEnd w:id="21"/>
+    <w:bookmarkStart w:id="31" w:name="per-point-decision-procedures"/>
     <w:p>
       <w:pPr>
         <w:pStyle w:val="Heading2"/>
@@ -4697,7 +7293,7 @@
         </w:pict>
       </w:r>
     </w:p>
-    <w:bookmarkStart w:id="18" w:name="Xcae13acec6153e7753360c0a42e9f41f8127de1"/>
+    <w:bookmarkStart w:id="22" w:name="Xcae13acec6153e7753360c0a42e9f41f8127de1"/>
     <w:p>
       <w:pPr>
         <w:pStyle w:val="Heading3"/>
@@ -5402,8 +7998,8 @@
         </w:pict>
       </w:r>
     </w:p>
-    <w:bookmarkEnd w:id="18"/>
-    <w:bookmarkStart w:id="19" w:name="X65eeb449093892fbb5dff0c5d69deaaa9d5097c"/>
+    <w:bookmarkEnd w:id="22"/>
+    <w:bookmarkStart w:id="23" w:name="X65eeb449093892fbb5dff0c5d69deaaa9d5097c"/>
     <w:p>
       <w:pPr>
         <w:pStyle w:val="Heading3"/>
@@ -5735,8 +8331,8 @@
         </w:pict>
       </w:r>
     </w:p>
-    <w:bookmarkEnd w:id="19"/>
-    <w:bookmarkStart w:id="20" w:name="X02a1476bd519f6d4b30af4c8067ea09411a400c"/>
+    <w:bookmarkEnd w:id="23"/>
+    <w:bookmarkStart w:id="24" w:name="X02a1476bd519f6d4b30af4c8067ea09411a400c"/>
     <w:p>
       <w:pPr>
         <w:pStyle w:val="Heading3"/>
@@ -6211,8 +8807,8 @@
         </w:pict>
       </w:r>
     </w:p>
-    <w:bookmarkEnd w:id="20"/>
-    <w:bookmarkStart w:id="21" w:name="X0ec2f8dcb622cc700711bf5bc7eecc4efbc502f"/>
+    <w:bookmarkEnd w:id="24"/>
+    <w:bookmarkStart w:id="25" w:name="X0ec2f8dcb622cc700711bf5bc7eecc4efbc502f"/>
     <w:p>
       <w:pPr>
         <w:pStyle w:val="Heading3"/>
@@ -7402,8 +9998,8 @@
         </w:pict>
       </w:r>
     </w:p>
-    <w:bookmarkEnd w:id="21"/>
-    <w:bookmarkStart w:id="22" w:name="X1de70407ff9b9199cdda9f82cdc8a13763c9626"/>
+    <w:bookmarkEnd w:id="25"/>
+    <w:bookmarkStart w:id="26" w:name="X1de70407ff9b9199cdda9f82cdc8a13763c9626"/>
     <w:p>
       <w:pPr>
         <w:pStyle w:val="Heading3"/>
@@ -8347,8 +10943,8 @@
         </w:pict>
       </w:r>
     </w:p>
-    <w:bookmarkEnd w:id="22"/>
-    <w:bookmarkStart w:id="23" w:name="Xaecf80c799f590b4c6844140320ac9f3fbf5dc2"/>
+    <w:bookmarkEnd w:id="26"/>
+    <w:bookmarkStart w:id="27" w:name="Xaecf80c799f590b4c6844140320ac9f3fbf5dc2"/>
     <w:p>
       <w:pPr>
         <w:pStyle w:val="Heading3"/>
@@ -8479,8 +11075,8 @@
         </w:pict>
       </w:r>
     </w:p>
-    <w:bookmarkEnd w:id="23"/>
-    <w:bookmarkStart w:id="24" w:name="points-5b-and-5c-aup-and-uap-accessible"/>
+    <w:bookmarkEnd w:id="27"/>
+    <w:bookmarkStart w:id="28" w:name="points-5b-and-5c-aup-and-uap-accessible"/>
     <w:p>
       <w:pPr>
         <w:pStyle w:val="Heading3"/>
@@ -9402,8 +11998,8 @@
         </w:pict>
       </w:r>
     </w:p>
-    <w:bookmarkEnd w:id="24"/>
-    <w:bookmarkStart w:id="25" w:name="X0ae168f20938494fe77fb5723f6a69e35f983f8"/>
+    <w:bookmarkEnd w:id="28"/>
+    <w:bookmarkStart w:id="29" w:name="X0ae168f20938494fe77fb5723f6a69e35f983f8"/>
     <w:p>
       <w:pPr>
         <w:pStyle w:val="Heading3"/>
@@ -10199,8 +12795,8 @@
         </w:pict>
       </w:r>
     </w:p>
-    <w:bookmarkEnd w:id="25"/>
-    <w:bookmarkStart w:id="26" w:name="point-7-the-page-is-in-english"/>
+    <w:bookmarkEnd w:id="29"/>
+    <w:bookmarkStart w:id="30" w:name="point-7-the-page-is-in-english"/>
     <w:p>
       <w:pPr>
         <w:pStyle w:val="Heading3"/>
@@ -10770,9 +13366,9 @@
         </w:pict>
       </w:r>
     </w:p>
-    <w:bookmarkEnd w:id="26"/>
-    <w:bookmarkEnd w:id="27"/>
-    <w:bookmarkStart w:id="28" w:name="where-this-workflow-is-known-to-be-wrong"/>
+    <w:bookmarkEnd w:id="30"/>
+    <w:bookmarkEnd w:id="31"/>
+    <w:bookmarkStart w:id="32" w:name="where-this-workflow-is-known-to-be-wrong"/>
     <w:p>
       <w:pPr>
         <w:pStyle w:val="Heading2"/>
@@ -12203,8 +14799,8 @@
         </w:pict>
       </w:r>
     </w:p>
-    <w:bookmarkEnd w:id="28"/>
-    <w:bookmarkStart w:id="29" w:name="reading-the-output"/>
+    <w:bookmarkEnd w:id="32"/>
+    <w:bookmarkStart w:id="33" w:name="reading-the-output"/>
     <w:p>
       <w:pPr>
         <w:pStyle w:val="Heading2"/>
@@ -12795,8 +15391,8 @@
         <w:t xml:space="preserve">PASS or FAIL on every line would look more useful and be worth considerably less.</w:t>
       </w:r>
     </w:p>
-    <w:bookmarkEnd w:id="29"/>
-    <w:bookmarkStart w:id="36" w:name="worked-examples"/>
+    <w:bookmarkEnd w:id="33"/>
+    <w:bookmarkStart w:id="40" w:name="worked-examples"/>
     <w:p>
       <w:pPr>
         <w:pStyle w:val="Heading2"/>
@@ -13063,7 +15659,7 @@
       <w:r>
         <w:t xml:space="preserve"> </w:t>
       </w:r>
-      <w:hyperlink r:id="rId30">
+      <w:hyperlink r:id="rId34">
         <w:r>
           <w:rPr>
             <w:rStyle w:val="Hyperlink"/>
@@ -13171,7 +15767,7 @@
         <w:t xml:space="preserve">own run.</w:t>
       </w:r>
     </w:p>
-    <w:bookmarkStart w:id="32" w:name="X6b9c9d2e59e13da41f347184ca67a475fa8b7ce"/>
+    <w:bookmarkStart w:id="36" w:name="X6b9c9d2e59e13da41f347184ca67a475fa8b7ce"/>
     <w:p>
       <w:pPr>
         <w:pStyle w:val="Heading3"/>
@@ -13294,7 +15890,7 @@
       <w:r>
         <w:t xml:space="preserve"> </w:t>
       </w:r>
-      <w:hyperlink r:id="rId31">
+      <w:hyperlink r:id="rId35">
         <w:r>
           <w:rPr>
             <w:rStyle w:val="Hyperlink"/>
@@ -13554,7 +16150,7 @@
       <w:r>
         <w:t xml:space="preserve"> </w:t>
       </w:r>
-      <w:hyperlink r:id="rId30">
+      <w:hyperlink r:id="rId34">
         <w:r>
           <w:rPr>
             <w:rStyle w:val="Hyperlink"/>
@@ -14879,8 +17475,8 @@
         <w:t xml:space="preserve"> push</w:t>
       </w:r>
     </w:p>
-    <w:bookmarkEnd w:id="32"/>
-    <w:bookmarkStart w:id="33" w:name="X5431a82e20a06edfb102374e037ce7ea9ce6896"/>
+    <w:bookmarkEnd w:id="36"/>
+    <w:bookmarkStart w:id="37" w:name="X5431a82e20a06edfb102374e037ce7ea9ce6896"/>
     <w:p>
       <w:pPr>
         <w:pStyle w:val="Heading3"/>
@@ -16126,8 +18722,8 @@
         <w:t xml:space="preserve">the documents together.</w:t>
       </w:r>
     </w:p>
-    <w:bookmarkEnd w:id="33"/>
-    <w:bookmarkStart w:id="35" w:name="Xbb3e2d317a0d811066009804bfa0a222a6197de"/>
+    <w:bookmarkEnd w:id="37"/>
+    <w:bookmarkStart w:id="39" w:name="Xbb3e2d317a0d811066009804bfa0a222a6197de"/>
     <w:p>
       <w:pPr>
         <w:pStyle w:val="Heading3"/>
@@ -18244,7 +20840,7 @@
         </w:rPr>
         <w:t xml:space="preserve"> </w:t>
       </w:r>
-      <w:hyperlink r:id="rId34">
+      <w:hyperlink r:id="rId38">
         <w:r>
           <w:rPr>
             <w:rStyle w:val="Hyperlink"/>
@@ -18262,8 +20858,8 @@
         <w:t xml:space="preserve">.</w:t>
       </w:r>
     </w:p>
-    <w:bookmarkEnd w:id="35"/>
-    <w:bookmarkEnd w:id="36"/>
+    <w:bookmarkEnd w:id="39"/>
+    <w:bookmarkEnd w:id="40"/>
     <w:sectPr>
       <w:footnotePr>
         <w:numRestart w:val="eachSect"/>

</xml_diff>

<commit_message>
Docs: rebuild Word/PDF for --restore-default-config (commit 3003661)
</commit_message>
<xml_diff>
--- a/docs/eosc-basic-compliance-analysis-workflow.docx
+++ b/docs/eosc-basic-compliance-analysis-workflow.docx
@@ -31,7 +31,7 @@
         <w:pStyle w:val="Date"/>
       </w:pPr>
       <w:r>
-        <w:t xml:space="preserve">26 September 2026, documentation commit 616262f</w:t>
+        <w:t xml:space="preserve">26 September 2026, documentation commit 3003661</w:t>
       </w:r>
     </w:p>
     <w:bookmarkStart w:id="9" w:name="contents"/>
@@ -3100,6 +3100,107 @@
                 <w:b/>
                 <w:bCs/>
               </w:rPr>
+              <w:t xml:space="preserve">Go back to the node list as downloaded</w:t>
+            </w:r>
+            <w:r>
+              <w:t xml:space="preserve"> </w:t>
+            </w:r>
+            <w:r>
+              <w:t xml:space="preserve">(</w:t>
+            </w:r>
+            <w:r>
+              <w:rPr>
+                <w:rStyle w:val="VerbatimChar"/>
+              </w:rPr>
+              <w:t xml:space="preserve">basic-check --restore-default-config</w:t>
+            </w:r>
+            <w:r>
+              <w:t xml:space="preserve">)</w:t>
+            </w:r>
+          </w:p>
+        </w:tc>
+        <w:tc>
+          <w:tcPr/>
+          <w:p>
+            <w:pPr>
+              <w:pStyle w:val="Compact"/>
+            </w:pPr>
+            <w:r>
+              <w:t xml:space="preserve">For each node it lists as</w:t>
+            </w:r>
+            <w:r>
+              <w:t xml:space="preserve"> </w:t>
+            </w:r>
+            <w:r>
+              <w:rPr>
+                <w:rStyle w:val="VerbatimChar"/>
+              </w:rPr>
+              <w:t xml:space="preserve">URL restored</w:t>
+            </w:r>
+            <w:r>
+              <w:t xml:space="preserve">:</w:t>
+            </w:r>
+            <w:r>
+              <w:t xml:space="preserve"> </w:t>
+            </w:r>
+            <w:r>
+              <w:rPr>
+                <w:rStyle w:val="VerbatimChar"/>
+              </w:rPr>
+              <w:t xml:space="preserve">run --update-results-for-node &lt;id&gt;</w:t>
+            </w:r>
+            <w:r>
+              <w:t xml:space="preserve">. If it lists nodes added back or removed:</w:t>
+            </w:r>
+            <w:r>
+              <w:t xml:space="preserve"> </w:t>
+            </w:r>
+            <w:r>
+              <w:rPr>
+                <w:rStyle w:val="VerbatimChar"/>
+              </w:rPr>
+              <w:t xml:space="preserve">assess</w:t>
+            </w:r>
+          </w:p>
+        </w:tc>
+        <w:tc>
+          <w:tcPr/>
+          <w:p>
+            <w:pPr>
+              <w:pStyle w:val="Compact"/>
+            </w:pPr>
+            <w:r>
+              <w:t xml:space="preserve">the restored nodes only</w:t>
+            </w:r>
+          </w:p>
+        </w:tc>
+        <w:tc>
+          <w:tcPr/>
+          <w:p>
+            <w:pPr>
+              <w:pStyle w:val="Compact"/>
+            </w:pPr>
+            <w:r>
+              <w:t xml:space="preserve">Kept unchanged; re-judged offline if nodes were added back or removed</w:t>
+            </w:r>
+          </w:p>
+        </w:tc>
+      </w:tr>
+      <w:tr>
+        <w:trPr>
+          <w:cantSplit/>
+        </w:trPr>
+        <w:tc>
+          <w:tcPr/>
+          <w:p>
+            <w:pPr>
+              <w:pStyle w:val="Compact"/>
+            </w:pPr>
+            <w:r>
+              <w:rPr>
+                <w:b/>
+                <w:bCs/>
+              </w:rPr>
               <w:t xml:space="preserve">Change the reference checklist</w:t>
             </w:r>
             <w:r>
@@ -17636,6 +17737,62 @@
     <w:p>
       <w:pPr>
         <w:pStyle w:val="FirstParagraph"/>
+      </w:pPr>
+      <w:r>
+        <w:t xml:space="preserve">To go back,</w:t>
+      </w:r>
+      <w:r>
+        <w:t xml:space="preserve"> </w:t>
+      </w:r>
+      <w:r>
+        <w:rPr>
+          <w:rStyle w:val="VerbatimChar"/>
+        </w:rPr>
+        <w:t xml:space="preserve">uv run basic-check --restore-default-config</w:t>
+      </w:r>
+      <w:r>
+        <w:t xml:space="preserve"> </w:t>
+      </w:r>
+      <w:r>
+        <w:t xml:space="preserve">puts</w:t>
+      </w:r>
+      <w:r>
+        <w:t xml:space="preserve"> </w:t>
+      </w:r>
+      <w:r>
+        <w:rPr>
+          <w:rStyle w:val="VerbatimChar"/>
+        </w:rPr>
+        <w:t xml:space="preserve">nodes.yaml</w:t>
+      </w:r>
+      <w:r>
+        <w:t xml:space="preserve"> </w:t>
+      </w:r>
+      <w:r>
+        <w:t xml:space="preserve">back</w:t>
+      </w:r>
+      <w:r>
+        <w:t xml:space="preserve"> </w:t>
+      </w:r>
+      <w:r>
+        <w:t xml:space="preserve">as it was downloaded from GitHub and keeps the replaced file as</w:t>
+      </w:r>
+      <w:r>
+        <w:t xml:space="preserve"> </w:t>
+      </w:r>
+      <w:r>
+        <w:rPr>
+          <w:rStyle w:val="VerbatimChar"/>
+        </w:rPr>
+        <w:t xml:space="preserve">nodes.yaml.&lt;date-time&gt;.bak</w:t>
+      </w:r>
+      <w:r>
+        <w:t xml:space="preserve">.</w:t>
+      </w:r>
+    </w:p>
+    <w:p>
+      <w:pPr>
+        <w:pStyle w:val="BodyText"/>
       </w:pPr>
       <w:r>
         <w:t xml:space="preserve">Done by hand, the entry looks like this:</w:t>

</xml_diff>

<commit_message>
Docs: rebuild Word/PDF at 778709e (BBMRI-ERIC URL set back to www.)
</commit_message>
<xml_diff>
--- a/docs/eosc-basic-compliance-analysis-workflow.docx
+++ b/docs/eosc-basic-compliance-analysis-workflow.docx
@@ -31,7 +31,7 @@
         <w:pStyle w:val="Date"/>
       </w:pPr>
       <w:r>
-        <w:t xml:space="preserve">26 September 2026, documentation commit 3003661</w:t>
+        <w:t xml:space="preserve">26 September 2026, documentation commit 778709e</w:t>
       </w:r>
     </w:p>
     <w:bookmarkStart w:id="9" w:name="contents"/>
@@ -17091,7 +17091,7 @@
         <w:t xml:space="preserve"> </w:t>
       </w:r>
       <w:r>
-        <w:t xml:space="preserve">case for BBMRI-ERIC as of 25 September 2026:</w:t>
+        <w:t xml:space="preserve">case for BBMRI-ERIC from 25 to 26 September 2026, when</w:t>
       </w:r>
       <w:r>
         <w:t xml:space="preserve"> </w:t>
@@ -17106,7 +17106,7 @@
         <w:t xml:space="preserve"> </w:t>
       </w:r>
       <w:r>
-        <w:t xml:space="preserve">has the</w:t>
+        <w:t xml:space="preserve">had the</w:t>
       </w:r>
       <w:r>
         <w:t xml:space="preserve"> </w:t>
@@ -17121,7 +17121,22 @@
         <w:t xml:space="preserve"> </w:t>
       </w:r>
       <w:r>
-        <w:t xml:space="preserve">address, but the published evidence is from the old one. The warning also</w:t>
+        <w:t xml:space="preserve">address but the published evidence was from the</w:t>
+      </w:r>
+      <w:r>
+        <w:t xml:space="preserve"> </w:t>
+      </w:r>
+      <w:r>
+        <w:rPr>
+          <w:rStyle w:val="VerbatimChar"/>
+        </w:rPr>
+        <w:t xml:space="preserve">www.</w:t>
+      </w:r>
+      <w:r>
+        <w:t xml:space="preserve"> </w:t>
+      </w:r>
+      <w:r>
+        <w:t xml:space="preserve">one. The warning also</w:t>
       </w:r>
       <w:r>
         <w:t xml:space="preserve"> </w:t>
@@ -17624,7 +17639,73 @@
         <w:t xml:space="preserve">https://dev3.bbmri-eric.eu/eosc-node-bbmri-eric/</w:t>
       </w:r>
       <w:r>
-        <w:t xml:space="preserve">.</w:t>
+        <w:t xml:space="preserve">. It was set back on 26</w:t>
+      </w:r>
+      <w:r>
+        <w:t xml:space="preserve"> </w:t>
+      </w:r>
+      <w:r>
+        <w:t xml:space="preserve">September, because the</w:t>
+      </w:r>
+      <w:r>
+        <w:t xml:space="preserve"> </w:t>
+      </w:r>
+      <w:r>
+        <w:rPr>
+          <w:rStyle w:val="VerbatimChar"/>
+        </w:rPr>
+        <w:t xml:space="preserve">dev3.</w:t>
+      </w:r>
+      <w:r>
+        <w:t xml:space="preserve"> </w:t>
+      </w:r>
+      <w:r>
+        <w:t xml:space="preserve">host's</w:t>
+      </w:r>
+      <w:r>
+        <w:t xml:space="preserve"> </w:t>
+      </w:r>
+      <w:r>
+        <w:rPr>
+          <w:rStyle w:val="VerbatimChar"/>
+        </w:rPr>
+        <w:t xml:space="preserve">robots.txt</w:t>
+      </w:r>
+      <w:r>
+        <w:t xml:space="preserve"> </w:t>
+      </w:r>
+      <w:r>
+        <w:t xml:space="preserve">excludes the checker, so</w:t>
+      </w:r>
+      <w:r>
+        <w:t xml:space="preserve"> </w:t>
+      </w:r>
+      <w:r>
+        <w:rPr>
+          <w:rStyle w:val="VerbatimChar"/>
+        </w:rPr>
+        <w:t xml:space="preserve">nodes.yaml</w:t>
+      </w:r>
+      <w:r>
+        <w:t xml:space="preserve"> </w:t>
+      </w:r>
+      <w:r>
+        <w:t xml:space="preserve">has the</w:t>
+      </w:r>
+      <w:r>
+        <w:t xml:space="preserve"> </w:t>
+      </w:r>
+      <w:r>
+        <w:rPr>
+          <w:rStyle w:val="VerbatimChar"/>
+        </w:rPr>
+        <w:t xml:space="preserve">www.</w:t>
+      </w:r>
+      <w:r>
+        <w:t xml:space="preserve"> </w:t>
+      </w:r>
+      <w:r>
+        <w:t xml:space="preserve">address again.</w:t>
       </w:r>
     </w:p>
     <w:p>

</xml_diff>

<commit_message>
Docs: rebuild Word/PDF at 141cebd (EOSC Node Italy URL)
</commit_message>
<xml_diff>
--- a/docs/eosc-basic-compliance-analysis-workflow.docx
+++ b/docs/eosc-basic-compliance-analysis-workflow.docx
@@ -31,7 +31,7 @@
         <w:pStyle w:val="Date"/>
       </w:pPr>
       <w:r>
-        <w:t xml:space="preserve">26 September 2026, documentation commit 778709e</w:t>
+        <w:t xml:space="preserve">26 September 2026, documentation commit 141cebd</w:t>
       </w:r>
     </w:p>
     <w:bookmarkStart w:id="9" w:name="contents"/>
@@ -16761,7 +16761,49 @@
         <w:t xml:space="preserve"> </w:t>
       </w:r>
       <w:r>
-        <w:t xml:space="preserve">run; drop it once Italy's page can be collected.</w:t>
+        <w:t xml:space="preserve">run. Italy's URL changed on 26 September to</w:t>
+      </w:r>
+      <w:r>
+        <w:t xml:space="preserve"> </w:t>
+      </w:r>
+      <w:r>
+        <w:rPr>
+          <w:rStyle w:val="VerbatimChar"/>
+        </w:rPr>
+        <w:t xml:space="preserve">https://eoscnode-it.d4science.org/</w:t>
+      </w:r>
+      <w:r>
+        <w:t xml:space="preserve">; drop</w:t>
+      </w:r>
+      <w:r>
+        <w:t xml:space="preserve"> </w:t>
+      </w:r>
+      <w:r>
+        <w:rPr>
+          <w:rStyle w:val="VerbatimChar"/>
+        </w:rPr>
+        <w:t xml:space="preserve">--skip Italy</w:t>
+      </w:r>
+      <w:r>
+        <w:t xml:space="preserve"> </w:t>
+      </w:r>
+      <w:r>
+        <w:t xml:space="preserve">once a trial</w:t>
+      </w:r>
+      <w:r>
+        <w:t xml:space="preserve"> </w:t>
+      </w:r>
+      <w:r>
+        <w:t xml:space="preserve">collection (</w:t>
+      </w:r>
+      <w:r>
+        <w:rPr>
+          <w:rStyle w:val="VerbatimChar"/>
+        </w:rPr>
+        <w:t xml:space="preserve">collect --only eosc-it --results /tmp/trial</w:t>
+      </w:r>
+      <w:r>
+        <w:t xml:space="preserve">) shows the page loads.</w:t>
       </w:r>
     </w:p>
     <w:p>

</xml_diff>

<commit_message>
Rebuild Word and PDF documents at 3769a3e (run web-4 published)
Guide, test-suite and analysis-workflow copies regenerated from the Markdown sources after the results/ replacement; README points to the new documentation commit.
</commit_message>
<xml_diff>
--- a/docs/eosc-basic-compliance-analysis-workflow.docx
+++ b/docs/eosc-basic-compliance-analysis-workflow.docx
@@ -31,7 +31,7 @@
         <w:pStyle w:val="Date"/>
       </w:pPr>
       <w:r>
-        <w:t xml:space="preserve">26 September 2026, documentation commit 141cebd</w:t>
+        <w:t xml:space="preserve">26 September 2026, documentation commit 3769a3e</w:t>
       </w:r>
     </w:p>
     <w:bookmarkStart w:id="9" w:name="contents"/>
@@ -3416,7 +3416,7 @@
         <w:t xml:space="preserve">results/</w:t>
       </w:r>
       <w:r>
-        <w:t xml:space="preserve">, the reviewed run, by default. Add</w:t>
+        <w:t xml:space="preserve">, the published run, by default. Add</w:t>
       </w:r>
       <w:r>
         <w:t xml:space="preserve"> </w:t>
@@ -3437,22 +3437,28 @@
         <w:t xml:space="preserve"> </w:t>
       </w:r>
       <w:r>
-        <w:t xml:space="preserve">a copy first, and keep</w:t>
-      </w:r>
-      <w:r>
-        <w:t xml:space="preserve"> </w:t>
-      </w:r>
-      <w:r>
-        <w:rPr>
-          <w:rStyle w:val="VerbatimChar"/>
-        </w:rPr>
-        <w:t xml:space="preserve">--skip Italy</w:t>
-      </w:r>
-      <w:r>
-        <w:t xml:space="preserve"> </w:t>
-      </w:r>
-      <w:r>
-        <w:t xml:space="preserve">for the same scope as the published run.</w:t>
+        <w:t xml:space="preserve">a copy first. The published run covers all thirteen nodes, so no</w:t>
+      </w:r>
+      <w:r>
+        <w:t xml:space="preserve"> </w:t>
+      </w:r>
+      <w:r>
+        <w:rPr>
+          <w:rStyle w:val="VerbatimChar"/>
+        </w:rPr>
+        <w:t xml:space="preserve">--skip</w:t>
+      </w:r>
+      <w:r>
+        <w:t xml:space="preserve"> </w:t>
+      </w:r>
+      <w:r>
+        <w:t xml:space="preserve">is</w:t>
+      </w:r>
+      <w:r>
+        <w:t xml:space="preserve"> </w:t>
+      </w:r>
+      <w:r>
+        <w:t xml:space="preserve">needed for the same scope.</w:t>
       </w:r>
       <w:r>
         <w:t xml:space="preserve"> </w:t>
@@ -5944,13 +5950,13 @@
         <w:t xml:space="preserve"> </w:t>
       </w:r>
       <w:r>
-        <w:t xml:space="preserve">gave the same verdict in all 120 cells, and the published run has been masked</w:t>
-      </w:r>
-      <w:r>
-        <w:t xml:space="preserve"> </w:t>
-      </w:r>
-      <w:r>
-        <w:t xml:space="preserve">this way since commit</w:t>
+        <w:t xml:space="preserve">gave the same verdict in all 120 cells, and that run was masked this way at</w:t>
+      </w:r>
+      <w:r>
+        <w:t xml:space="preserve"> </w:t>
+      </w:r>
+      <w:r>
+        <w:t xml:space="preserve">commit</w:t>
       </w:r>
       <w:r>
         <w:t xml:space="preserve"> </w:t>
@@ -5962,7 +5968,25 @@
         <w:t xml:space="preserve">ada1b4a</w:t>
       </w:r>
       <w:r>
-        <w:t xml:space="preserve">. The reports are masked a second time as they</w:t>
+        <w:t xml:space="preserve">. Run</w:t>
+      </w:r>
+      <w:r>
+        <w:t xml:space="preserve"> </w:t>
+      </w:r>
+      <w:r>
+        <w:rPr>
+          <w:rStyle w:val="VerbatimChar"/>
+        </w:rPr>
+        <w:t xml:space="preserve">web-4</w:t>
+      </w:r>
+      <w:r>
+        <w:t xml:space="preserve">, which replaced it as the published run on 26</w:t>
+      </w:r>
+      <w:r>
+        <w:t xml:space="preserve"> </w:t>
+      </w:r>
+      <w:r>
+        <w:t xml:space="preserve">September, was masked as it was collected. The reports are masked a second time as they</w:t>
       </w:r>
       <w:r>
         <w:t xml:space="preserve"> </w:t>
@@ -14224,6 +14248,33 @@
         <w:t xml:space="preserve"> </w:t>
       </w:r>
       <w:r>
+        <w:t xml:space="preserve">matches none. The published run of 26 September gives</w:t>
+      </w:r>
+      <w:r>
+        <w:t xml:space="preserve"> </w:t>
+      </w:r>
+      <w:r>
+        <w:t xml:space="preserve">the same agreement on thirteen: both lists match four (GÉANT's page was blocked</w:t>
+      </w:r>
+      <w:r>
+        <w:t xml:space="preserve"> </w:t>
+      </w:r>
+      <w:r>
+        <w:t xml:space="preserve">that day), and</w:t>
+      </w:r>
+      <w:r>
+        <w:t xml:space="preserve"> </w:t>
+      </w:r>
+      <w:r>
+        <w:rPr>
+          <w:rStyle w:val="VerbatimChar"/>
+        </w:rPr>
+        <w:t xml:space="preserve">--strict-separators</w:t>
+      </w:r>
+      <w:r>
+        <w:t xml:space="preserve"> </w:t>
+      </w:r>
+      <w:r>
         <w:t xml:space="preserve">matches none. The residual weakness is no longer the matching but the mapping —</w:t>
       </w:r>
       <w:r>
@@ -15784,7 +15835,7 @@
         <w:t xml:space="preserve"> </w:t>
       </w:r>
       <w:r>
-        <w:t xml:space="preserve">does for the current run, and commit only then.</w:t>
+        <w:t xml:space="preserve">does for the 24 September run, and commit only then.</w:t>
       </w:r>
     </w:p>
     <w:p>
@@ -17415,19 +17466,58 @@
         <w:t xml:space="preserve"> </w:t>
       </w:r>
       <w:r>
-        <w:t xml:space="preserve">which nodes display their approved name (five, for the 24 September run). If</w:t>
-      </w:r>
-      <w:r>
-        <w:t xml:space="preserve"> </w:t>
-      </w:r>
-      <w:r>
-        <w:t xml:space="preserve">the new page shows its name, add its id to the expected set and update the</w:t>
-      </w:r>
-      <w:r>
-        <w:t xml:space="preserve"> </w:t>
-      </w:r>
-      <w:r>
-        <w:t xml:space="preserve">docstring to say why.</w:t>
+        <w:t xml:space="preserve">which nodes display their approved name (four for the 26 September run; five</w:t>
+      </w:r>
+      <w:r>
+        <w:t xml:space="preserve"> </w:t>
+      </w:r>
+      <w:r>
+        <w:t xml:space="preserve">on 24 September, when GÉANT's page was served). If the new page shows its</w:t>
+      </w:r>
+      <w:r>
+        <w:t xml:space="preserve"> </w:t>
+      </w:r>
+      <w:r>
+        <w:t xml:space="preserve">name, add its id to the expected set and update the docstring to say why.</w:t>
+      </w:r>
+    </w:p>
+    <w:p>
+      <w:pPr>
+        <w:pStyle w:val="Compact"/>
+        <w:numPr>
+          <w:ilvl w:val="0"/>
+          <w:numId w:val="1015"/>
+        </w:numPr>
+      </w:pPr>
+      <w:r>
+        <w:rPr>
+          <w:rStyle w:val="VerbatimChar"/>
+        </w:rPr>
+        <w:t xml:space="preserve">test_update_row.py::test_published_results_are_the_run_these_tests_copy</w:t>
+      </w:r>
+      <w:r>
+        <w:t xml:space="preserve"> </w:t>
+      </w:r>
+      <w:r>
+        <w:t xml:space="preserve">pins how many nodes the run has and which were skipped (13 and none, for</w:t>
+      </w:r>
+      <w:r>
+        <w:t xml:space="preserve"> </w:t>
+      </w:r>
+      <w:r>
+        <w:t xml:space="preserve">run</w:t>
+      </w:r>
+      <w:r>
+        <w:t xml:space="preserve"> </w:t>
+      </w:r>
+      <w:r>
+        <w:rPr>
+          <w:rStyle w:val="VerbatimChar"/>
+        </w:rPr>
+        <w:t xml:space="preserve">web-4</w:t>
+      </w:r>
+      <w:r>
+        <w:t xml:space="preserve">). Update it to the new run's shape.</w:t>
       </w:r>
     </w:p>
     <w:p>
@@ -17505,7 +17595,7 @@
         <w:t xml:space="preserve"> </w:t>
       </w:r>
       <w:r>
-        <w:t xml:space="preserve">("120 cells: 44 PASS · 6 FAIL · 70 review");</w:t>
+        <w:t xml:space="preserve">("130 cells: 45 PASS · 8 FAIL · 77 review");</w:t>
       </w:r>
     </w:p>
     <w:p>
@@ -18599,7 +18689,7 @@
         <w:t xml:space="preserve"> </w:t>
       </w:r>
       <w:r>
-        <w:t xml:space="preserve">offline. To see the outcome before touching the reviewed run, try it on a copy</w:t>
+        <w:t xml:space="preserve">offline. To see the outcome before touching the published run, try it on a copy</w:t>
       </w:r>
       <w:r>
         <w:t xml:space="preserve"> </w:t>
@@ -18808,13 +18898,25 @@
         <w:pStyle w:val="BodyText"/>
       </w:pPr>
       <w:r>
-        <w:t xml:space="preserve">To rebuild the old published run instead, without the warning, use the node</w:t>
-      </w:r>
-      <w:r>
-        <w:t xml:space="preserve"> </w:t>
-      </w:r>
-      <w:r>
-        <w:t xml:space="preserve">list it was collected with. This reproduces the committed</w:t>
+        <w:t xml:space="preserve">To rebuild a run collected with an older node list, without the warning, use</w:t>
+      </w:r>
+      <w:r>
+        <w:t xml:space="preserve"> </w:t>
+      </w:r>
+      <w:r>
+        <w:t xml:space="preserve">that list. For the reviewed run of 24 September (in the git history at</w:t>
+      </w:r>
+      <w:r>
+        <w:t xml:space="preserve"> </w:t>
+      </w:r>
+      <w:r>
+        <w:rPr>
+          <w:rStyle w:val="VerbatimChar"/>
+        </w:rPr>
+        <w:t xml:space="preserve">800d632</w:t>
+      </w:r>
+      <w:r>
+        <w:t xml:space="preserve">), assessed in a scratch copy of its</w:t>
       </w:r>
       <w:r>
         <w:t xml:space="preserve"> </w:t>
@@ -18826,16 +18928,7 @@
         <w:t xml:space="preserve">results/</w:t>
       </w:r>
       <w:r>
-        <w:t xml:space="preserve"> </w:t>
-      </w:r>
-      <w:r>
-        <w:t xml:space="preserve">exactly,</w:t>
-      </w:r>
-      <w:r>
-        <w:t xml:space="preserve"> </w:t>
-      </w:r>
-      <w:r>
-        <w:t xml:space="preserve">apart from the generation time:</w:t>
+        <w:t xml:space="preserve">:</w:t>
       </w:r>
     </w:p>
     <w:p>

</xml_diff>

<commit_message>
Rebuild the Word and PDF guides for checklist v3.1 and run web-5 (built from ee12687)
</commit_message>
<xml_diff>
--- a/docs/eosc-basic-compliance-analysis-workflow.docx
+++ b/docs/eosc-basic-compliance-analysis-workflow.docx
@@ -31,7 +31,7 @@
         <w:pStyle w:val="Date"/>
       </w:pPr>
       <w:r>
-        <w:t xml:space="preserve">26 September 2026, documentation commit 3769a3e</w:t>
+        <w:t xml:space="preserve">26 September 2026, documentation commit ee12687</w:t>
       </w:r>
     </w:p>
     <w:bookmarkStart w:id="9" w:name="contents"/>
@@ -128,7 +128,7 @@
           <w:b/>
           <w:bCs/>
         </w:rPr>
-        <w:t xml:space="preserve">Node Landing Page Verification Checklist v3.0</w:t>
+        <w:t xml:space="preserve">Node Landing Page Verification Checklist v3.1</w:t>
       </w:r>
       <w:r>
         <w:t xml:space="preserve">.</w:t>
@@ -511,7 +511,7 @@
               <w:rPr>
                 <w:rStyle w:val="VerbatimChar"/>
               </w:rPr>
-              <w:t xml:space="preserve">checklist/v3.0.yaml</w:t>
+              <w:t xml:space="preserve">checklist/v3.1.yaml</w:t>
             </w:r>
           </w:p>
         </w:tc>
@@ -640,7 +640,7 @@
               <w:rPr>
                 <w:rStyle w:val="VerbatimChar"/>
               </w:rPr>
-              <w:t xml:space="preserve">checklist-v3.0.html</w:t>
+              <w:t xml:space="preserve">checklist-v3.1.html</w:t>
             </w:r>
           </w:p>
         </w:tc>
@@ -1056,7 +1056,7 @@
         <w:rPr>
           <w:rStyle w:val="VerbatimChar"/>
         </w:rPr>
-        <w:t xml:space="preserve">checklist-v3.0.html</w:t>
+        <w:t xml:space="preserve">checklist-v3.1.html</w:t>
       </w:r>
       <w:r>
         <w:t xml:space="preserve">.</w:t>
@@ -2194,7 +2194,7 @@
               <w:rPr>
                 <w:rStyle w:val="VerbatimChar"/>
               </w:rPr>
-              <w:t xml:space="preserve">checklist/v3.0.yaml</w:t>
+              <w:t xml:space="preserve">checklist/v3.1.yaml</w:t>
             </w:r>
             <w:r>
               <w:t xml:space="preserve">)</w:t>
@@ -5968,7 +5968,7 @@
         <w:t xml:space="preserve">ada1b4a</w:t>
       </w:r>
       <w:r>
-        <w:t xml:space="preserve">. Run</w:t>
+        <w:t xml:space="preserve">. Runs</w:t>
       </w:r>
       <w:r>
         <w:t xml:space="preserve"> </w:t>
@@ -5980,13 +5980,28 @@
         <w:t xml:space="preserve">web-4</w:t>
       </w:r>
       <w:r>
+        <w:t xml:space="preserve"> </w:t>
+      </w:r>
+      <w:r>
+        <w:t xml:space="preserve">and</w:t>
+      </w:r>
+      <w:r>
+        <w:t xml:space="preserve"> </w:t>
+      </w:r>
+      <w:r>
+        <w:rPr>
+          <w:rStyle w:val="VerbatimChar"/>
+        </w:rPr>
+        <w:t xml:space="preserve">web-5</w:t>
+      </w:r>
+      <w:r>
         <w:t xml:space="preserve">, which replaced it as the published run on 26</w:t>
       </w:r>
       <w:r>
         <w:t xml:space="preserve"> </w:t>
       </w:r>
       <w:r>
-        <w:t xml:space="preserve">September, was masked as it was collected. The reports are masked a second time as they</w:t>
+        <w:t xml:space="preserve">September, were masked as they were collected. The reports are masked a second time as they</w:t>
       </w:r>
       <w:r>
         <w:t xml:space="preserve"> </w:t>
@@ -6391,13 +6406,13 @@
         <w:t xml:space="preserve"> </w:t>
       </w:r>
       <w:r>
-        <w:t xml:space="preserve">like "clearly state", or quantify over "all research resources offered by the</w:t>
-      </w:r>
-      <w:r>
-        <w:t xml:space="preserve"> </w:t>
-      </w:r>
-      <w:r>
-        <w:t xml:space="preserve">Node". Neither is settleable by inspecting one page, and emitting</w:t>
+        <w:t xml:space="preserve">like "clearly state", or quantify over "all Node Exchange research resources</w:t>
+      </w:r>
+      <w:r>
+        <w:t xml:space="preserve"> </w:t>
+      </w:r>
+      <w:r>
+        <w:t xml:space="preserve">offered by the Node". Neither is settleable by inspecting one page, and emitting</w:t>
       </w:r>
       <w:r>
         <w:t xml:space="preserve"> </w:t>
@@ -8422,19 +8437,31 @@
         <w:pStyle w:val="FirstParagraph"/>
       </w:pPr>
       <w:r>
-        <w:t xml:space="preserve">The point quantifies over every resource reachable through the landing page,</w:t>
-      </w:r>
-      <w:r>
-        <w:t xml:space="preserve"> </w:t>
-      </w:r>
-      <w:r>
-        <w:t xml:space="preserve">including through intermediate pages, and whether a given login is genuinely</w:t>
-      </w:r>
-      <w:r>
-        <w:t xml:space="preserve"> </w:t>
-      </w:r>
-      <w:r>
-        <w:t xml:space="preserve">EOSC AAI compliant is settled during EEN enrolment rather than by reading HTML.</w:t>
+        <w:t xml:space="preserve">The point quantifies over every Node Exchange resource reachable through the</w:t>
+      </w:r>
+      <w:r>
+        <w:t xml:space="preserve"> </w:t>
+      </w:r>
+      <w:r>
+        <w:t xml:space="preserve">landing page, including through intermediate pages, and whether a given login is</w:t>
+      </w:r>
+      <w:r>
+        <w:t xml:space="preserve"> </w:t>
+      </w:r>
+      <w:r>
+        <w:t xml:space="preserve">genuinely EOSC AAI compliant is settled under requirement [P.2] of the</w:t>
+      </w:r>
+      <w:r>
+        <w:t xml:space="preserve"> </w:t>
+      </w:r>
+      <w:r>
+        <w:t xml:space="preserve">Production 1.0 Checklist for EOSC Nodes rather than by reading HTML. A script</w:t>
+      </w:r>
+      <w:r>
+        <w:t xml:space="preserve"> </w:t>
+      </w:r>
+      <w:r>
+        <w:t xml:space="preserve">cannot tell which linked resources are Node Exchange resources either.</w:t>
       </w:r>
       <w:r>
         <w:t xml:space="preserve"> </w:t>
@@ -11166,13 +11193,13 @@
         <w:t xml:space="preserve">main_text</w:t>
       </w:r>
       <w:r>
-        <w:t xml:space="preserve">. The point quantifies over "all research resources offered by the</w:t>
-      </w:r>
-      <w:r>
-        <w:t xml:space="preserve"> </w:t>
-      </w:r>
-      <w:r>
-        <w:t xml:space="preserve">Node", which cannot be enumerated from the landing page, and the checklist</w:t>
+        <w:t xml:space="preserve">. The point quantifies over "all Node Exchange research resources</w:t>
+      </w:r>
+      <w:r>
+        <w:t xml:space="preserve"> </w:t>
+      </w:r>
+      <w:r>
+        <w:t xml:space="preserve">offered by the Node", which cannot be enumerated from the landing page, and the checklist</w:t>
       </w:r>
       <w:r>
         <w:t xml:space="preserve"> </w:t>
@@ -15421,7 +15448,7 @@
         <w:rPr>
           <w:rStyle w:val="VerbatimChar"/>
         </w:rPr>
-        <w:t xml:space="preserve">checklist-v3.0.html</w:t>
+        <w:t xml:space="preserve">checklist-v3.1.html</w:t>
       </w:r>
       <w:r>
         <w:t xml:space="preserve"> </w:t>
@@ -15442,13 +15469,13 @@
         <w:rPr>
           <w:rStyle w:val="VerbatimChar"/>
         </w:rPr>
-        <w:t xml:space="preserve">checklist-v3.1.html</w:t>
-      </w:r>
-      <w:r>
-        <w:t xml:space="preserve"> </w:t>
-      </w:r>
-      <w:r>
-        <w:t xml:space="preserve">after a switch; the checklist</w:t>
+        <w:t xml:space="preserve">checklist-v3.2.html</w:t>
+      </w:r>
+      <w:r>
+        <w:t xml:space="preserve"> </w:t>
+      </w:r>
+      <w:r>
+        <w:t xml:space="preserve">after a future switch; the checklist</w:t>
       </w:r>
       <w:r>
         <w:t xml:space="preserve"> </w:t>
@@ -17514,7 +17541,7 @@
         <w:rPr>
           <w:rStyle w:val="VerbatimChar"/>
         </w:rPr>
-        <w:t xml:space="preserve">web-4</w:t>
+        <w:t xml:space="preserve">web-5</w:t>
       </w:r>
       <w:r>
         <w:t xml:space="preserve">). Update it to the new run's shape.</w:t>
@@ -19212,7 +19239,7 @@
               <w:rPr>
                 <w:rStyle w:val="VerbatimChar"/>
               </w:rPr>
-              <w:t xml:space="preserve">DEFAULT_CHECKLIST = ROOT / "checklist" / "v3.0.yaml"</w:t>
+              <w:t xml:space="preserve">DEFAULT_CHECKLIST = ROOT / "checklist" / "v3.1.yaml"</w:t>
             </w:r>
           </w:p>
         </w:tc>
@@ -19457,7 +19484,7 @@
         <w:rPr>
           <w:rStyle w:val="VerbatimChar"/>
         </w:rPr>
-        <w:t xml:space="preserve">v3.0.yaml</w:t>
+        <w:t xml:space="preserve">v3.1.yaml</w:t>
       </w:r>
       <w:r>
         <w:t xml:space="preserve"> </w:t>
@@ -19477,13 +19504,40 @@
         <w:pStyle w:val="BodyText"/>
       </w:pPr>
       <w:r>
-        <w:t xml:space="preserve">The example assumes a v3.1 dated 15 October 2026. Use the real version, date</w:t>
-      </w:r>
-      <w:r>
-        <w:t xml:space="preserve"> </w:t>
-      </w:r>
-      <w:r>
-        <w:t xml:space="preserve">and filenames.</w:t>
+        <w:t xml:space="preserve">The example assumes a v3.2 dated 15 October 2026. Use the real version, date</w:t>
+      </w:r>
+      <w:r>
+        <w:t xml:space="preserve"> </w:t>
+      </w:r>
+      <w:r>
+        <w:t xml:space="preserve">and filenames. This procedure was last applied on 26 September 2026, to move</w:t>
+      </w:r>
+      <w:r>
+        <w:t xml:space="preserve"> </w:t>
+      </w:r>
+      <w:r>
+        <w:t xml:space="preserve">from v3.0 to v3.1; the header of</w:t>
+      </w:r>
+      <w:r>
+        <w:t xml:space="preserve"> </w:t>
+      </w:r>
+      <w:r>
+        <w:rPr>
+          <w:rStyle w:val="VerbatimChar"/>
+        </w:rPr>
+        <w:t xml:space="preserve">checklist/v3.1.yaml</w:t>
+      </w:r>
+      <w:r>
+        <w:t xml:space="preserve"> </w:t>
+      </w:r>
+      <w:r>
+        <w:t xml:space="preserve">records what changed,</w:t>
+      </w:r>
+      <w:r>
+        <w:t xml:space="preserve"> </w:t>
+      </w:r>
+      <w:r>
+        <w:t xml:space="preserve">point by point.</w:t>
       </w:r>
     </w:p>
     <w:p>
@@ -19512,7 +19566,7 @@
         <w:rPr>
           <w:rStyle w:val="NormalTok"/>
         </w:rPr>
-        <w:t xml:space="preserve"> ~/Downloads/20261015_Node_Landing_Page_Verification_Checklist_v3.1.pdf checklist/</w:t>
+        <w:t xml:space="preserve"> ~/Downloads/20261015_Node_Landing_Page_Verification_Checklist_v3.2.pdf checklist/</w:t>
       </w:r>
       <w:r>
         <w:br/>
@@ -19527,7 +19581,7 @@
         <w:rPr>
           <w:rStyle w:val="NormalTok"/>
         </w:rPr>
-        <w:t xml:space="preserve"> checklist/20261015_Node_Landing_Page_Verification_Checklist_v3.1.pdf</w:t>
+        <w:t xml:space="preserve"> checklist/20261015_Node_Landing_Page_Verification_Checklist_v3.2.pdf</w:t>
       </w:r>
       <w:r>
         <w:br/>
@@ -19536,7 +19590,7 @@
         <w:rPr>
           <w:rStyle w:val="CommentTok"/>
         </w:rPr>
-        <w:t xml:space="preserve"># on macOS: shasum -a 256 checklist/20261015_Node_Landing_Page_Verification_Checklist_v3.1.pdf</w:t>
+        <w:t xml:space="preserve"># on macOS: shasum -a 256 checklist/20261015_Node_Landing_Page_Verification_Checklist_v3.2.pdf</w:t>
       </w:r>
     </w:p>
     <w:p>
@@ -19544,7 +19598,7 @@
         <w:pStyle w:val="FirstParagraph"/>
       </w:pPr>
       <w:r>
-        <w:t xml:space="preserve">The committed v3.0 file is a PDF rendering of the circulated</w:t>
+        <w:t xml:space="preserve">The committed v3.1 file is a PDF rendering of the circulated</w:t>
       </w:r>
       <w:r>
         <w:t xml:space="preserve"> </w:t>
@@ -19621,7 +19675,7 @@
         <w:rPr>
           <w:rStyle w:val="NormalTok"/>
         </w:rPr>
-        <w:t xml:space="preserve"> checklist/v3.0.yaml checklist/v3.1.yaml</w:t>
+        <w:t xml:space="preserve"> checklist/v3.1.yaml checklist/v3.2.yaml</w:t>
       </w:r>
     </w:p>
     <w:p>
@@ -19638,7 +19692,7 @@
         <w:rPr>
           <w:rStyle w:val="VerbatimChar"/>
         </w:rPr>
-        <w:t xml:space="preserve">checklist/v3.1.yaml</w:t>
+        <w:t xml:space="preserve">checklist/v3.2.yaml</w:t>
       </w:r>
       <w:r>
         <w:t xml:space="preserve">, change the header:</w:t>
@@ -19670,7 +19724,7 @@
         <w:rPr>
           <w:rStyle w:val="StringTok"/>
         </w:rPr>
-        <w:t xml:space="preserve">"3.1"</w:t>
+        <w:t xml:space="preserve">"3.2"</w:t>
       </w:r>
       <w:r>
         <w:br/>
@@ -19718,7 +19772,7 @@
         <w:rPr>
           <w:rStyle w:val="AttributeTok"/>
         </w:rPr>
-        <w:t xml:space="preserve"> 20261015_Node_Landing_Page_Verification_Checklist_v3.1.docx</w:t>
+        <w:t xml:space="preserve"> 20261015_Node_Landing_Page_Verification_Checklist_v3.2.docx</w:t>
       </w:r>
       <w:r>
         <w:br/>
@@ -19739,7 +19793,7 @@
         <w:rPr>
           <w:rStyle w:val="AttributeTok"/>
         </w:rPr>
-        <w:t xml:space="preserve"> 20261015_Node_Landing_Page_Verification_Checklist_v3.1.pdf</w:t>
+        <w:t xml:space="preserve"> 20261015_Node_Landing_Page_Verification_Checklist_v3.2.pdf</w:t>
       </w:r>
       <w:r>
         <w:br/>
@@ -19774,7 +19828,7 @@
         <w:rPr>
           <w:rStyle w:val="VerbatimChar"/>
         </w:rPr>
-        <w:t xml:space="preserve">v3.1.yaml</w:t>
+        <w:t xml:space="preserve">v3.2.yaml</w:t>
       </w:r>
       <w:r>
         <w:t xml:space="preserve"> </w:t>
@@ -19789,7 +19843,7 @@
         <w:rPr>
           <w:rStyle w:val="VerbatimChar"/>
         </w:rPr>
-        <w:t xml:space="preserve">"3.1"</w:t>
+        <w:t xml:space="preserve">"3.2"</w:t>
       </w:r>
       <w:r>
         <w:t xml:space="preserve">); a test</w:t>
@@ -19831,7 +19885,7 @@
         <w:rPr>
           <w:rStyle w:val="VerbatimChar"/>
         </w:rPr>
-        <w:t xml:space="preserve">v3.1.yaml</w:t>
+        <w:t xml:space="preserve">v3.2.yaml</w:t>
       </w:r>
       <w:r>
         <w:t xml:space="preserve">:</w:t>
@@ -20165,7 +20219,7 @@
         <w:rPr>
           <w:rStyle w:val="NormalTok"/>
         </w:rPr>
-        <w:t xml:space="preserve"> checklist/v3.1.yaml</w:t>
+        <w:t xml:space="preserve"> checklist/v3.2.yaml</w:t>
       </w:r>
       <w:r>
         <w:br/>
@@ -20192,7 +20246,7 @@
         <w:rPr>
           <w:rStyle w:val="NormalTok"/>
         </w:rPr>
-        <w:t xml:space="preserve"> /tmp/v31 </w:t>
+        <w:t xml:space="preserve"> /tmp/v32 </w:t>
       </w:r>
       <w:r>
         <w:rPr>
@@ -20228,165 +20282,147 @@
         <w:rPr>
           <w:rStyle w:val="NormalTok"/>
         </w:rPr>
-        <w:t xml:space="preserve"> results/evidence /tmp/v31/</w:t>
+        <w:t xml:space="preserve"> results/evidence /tmp/v32/</w:t>
       </w:r>
       <w:r>
         <w:br/>
       </w:r>
       <w:r>
         <w:rPr>
-          <w:rStyle w:val="FunctionTok"/>
-        </w:rPr>
-        <w:t xml:space="preserve">git</w:t>
+          <w:rStyle w:val="ExtensionTok"/>
+        </w:rPr>
+        <w:t xml:space="preserve">uv</w:t>
       </w:r>
       <w:r>
         <w:rPr>
           <w:rStyle w:val="NormalTok"/>
         </w:rPr>
-        <w:t xml:space="preserve"> show 53081f6:nodes.yaml </w:t>
-      </w:r>
-      <w:r>
-        <w:rPr>
-          <w:rStyle w:val="OperatorTok"/>
-        </w:rPr>
-        <w:t xml:space="preserve">&gt;</w:t>
+        <w:t xml:space="preserve"> run basic-check assess </w:t>
+      </w:r>
+      <w:r>
+        <w:rPr>
+          <w:rStyle w:val="AttributeTok"/>
+        </w:rPr>
+        <w:t xml:space="preserve">-c</w:t>
       </w:r>
       <w:r>
         <w:rPr>
           <w:rStyle w:val="NormalTok"/>
         </w:rPr>
-        <w:t xml:space="preserve"> /tmp/nodes-2026-09-24.yaml</w:t>
-      </w:r>
-      <w:r>
-        <w:br/>
-      </w:r>
-      <w:r>
-        <w:rPr>
-          <w:rStyle w:val="ExtensionTok"/>
-        </w:rPr>
-        <w:t xml:space="preserve">uv</w:t>
+        <w:t xml:space="preserve"> checklist/v3.2.yaml </w:t>
+      </w:r>
+      <w:r>
+        <w:rPr>
+          <w:rStyle w:val="AttributeTok"/>
+        </w:rPr>
+        <w:t xml:space="preserve">--results</w:t>
       </w:r>
       <w:r>
         <w:rPr>
           <w:rStyle w:val="NormalTok"/>
         </w:rPr>
-        <w:t xml:space="preserve"> run basic-check assess </w:t>
+        <w:t xml:space="preserve"> /tmp/v32 </w:t>
       </w:r>
       <w:r>
         <w:rPr>
           <w:rStyle w:val="AttributeTok"/>
         </w:rPr>
-        <w:t xml:space="preserve">-c</w:t>
+        <w:t xml:space="preserve">--run</w:t>
       </w:r>
       <w:r>
         <w:rPr>
           <w:rStyle w:val="NormalTok"/>
         </w:rPr>
-        <w:t xml:space="preserve"> checklist/v3.1.yaml </w:t>
-      </w:r>
-      <w:r>
-        <w:rPr>
-          <w:rStyle w:val="AttributeTok"/>
-        </w:rPr>
-        <w:t xml:space="preserve">--results</w:t>
-      </w:r>
-      <w:r>
-        <w:rPr>
-          <w:rStyle w:val="NormalTok"/>
-        </w:rPr>
-        <w:t xml:space="preserve"> /tmp/v31 </w:t>
-      </w:r>
-      <w:r>
-        <w:rPr>
-          <w:rStyle w:val="DataTypeTok"/>
-        </w:rPr>
-        <w:t xml:space="preserve">\</w:t>
-      </w:r>
-      <w:r>
-        <w:br/>
-      </w:r>
-      <w:r>
-        <w:rPr>
-          <w:rStyle w:val="NormalTok"/>
-        </w:rPr>
-        <w:t xml:space="preserve">    </w:t>
-      </w:r>
-      <w:r>
-        <w:rPr>
-          <w:rStyle w:val="AttributeTok"/>
+        <w:t xml:space="preserve"> trial-v3.2</w:t>
+      </w:r>
+    </w:p>
+    <w:p>
+      <w:pPr>
+        <w:pStyle w:val="FirstParagraph"/>
+      </w:pPr>
+      <w:r>
+        <w:t xml:space="preserve">Compare</w:t>
+      </w:r>
+      <w:r>
+        <w:t xml:space="preserve"> </w:t>
+      </w:r>
+      <w:r>
+        <w:rPr>
+          <w:rStyle w:val="VerbatimChar"/>
+        </w:rPr>
+        <w:t xml:space="preserve">/tmp/v32/results.md</w:t>
+      </w:r>
+      <w:r>
+        <w:t xml:space="preserve"> </w:t>
+      </w:r>
+      <w:r>
+        <w:t xml:space="preserve">with</w:t>
+      </w:r>
+      <w:r>
+        <w:t xml:space="preserve"> </w:t>
+      </w:r>
+      <w:r>
+        <w:rPr>
+          <w:rStyle w:val="VerbatimChar"/>
+        </w:rPr>
+        <w:t xml:space="preserve">results/results.md</w:t>
+      </w:r>
+      <w:r>
+        <w:t xml:space="preserve">. Any difference comes</w:t>
+      </w:r>
+      <w:r>
+        <w:t xml:space="preserve"> </w:t>
+      </w:r>
+      <w:r>
+        <w:t xml:space="preserve">from the new rules alone, since the evidence is the same. If the published run</w:t>
+      </w:r>
+      <w:r>
+        <w:t xml:space="preserve"> </w:t>
+      </w:r>
+      <w:r>
+        <w:t xml:space="preserve">skipped a node or used an older</w:t>
+      </w:r>
+      <w:r>
+        <w:t xml:space="preserve"> </w:t>
+      </w:r>
+      <w:r>
+        <w:rPr>
+          <w:rStyle w:val="VerbatimChar"/>
+        </w:rPr>
+        <w:t xml:space="preserve">nodes.yaml</w:t>
+      </w:r>
+      <w:r>
+        <w:t xml:space="preserve">, pass the same</w:t>
+      </w:r>
+      <w:r>
+        <w:t xml:space="preserve"> </w:t>
+      </w:r>
+      <w:r>
+        <w:rPr>
+          <w:rStyle w:val="VerbatimChar"/>
+        </w:rPr>
+        <w:t xml:space="preserve">--skip</w:t>
+      </w:r>
+      <w:r>
+        <w:t xml:space="preserve"> </w:t>
+      </w:r>
+      <w:r>
+        <w:t xml:space="preserve">and</w:t>
+      </w:r>
+      <w:r>
+        <w:t xml:space="preserve"> </w:t>
+      </w:r>
+      <w:r>
+        <w:rPr>
+          <w:rStyle w:val="VerbatimChar"/>
         </w:rPr>
         <w:t xml:space="preserve">--nodes</w:t>
       </w:r>
       <w:r>
-        <w:rPr>
-          <w:rStyle w:val="NormalTok"/>
-        </w:rPr>
-        <w:t xml:space="preserve"> /tmp/nodes-2026-09-24.yaml </w:t>
-      </w:r>
-      <w:r>
-        <w:rPr>
-          <w:rStyle w:val="AttributeTok"/>
-        </w:rPr>
-        <w:t xml:space="preserve">--skip</w:t>
-      </w:r>
-      <w:r>
-        <w:rPr>
-          <w:rStyle w:val="NormalTok"/>
-        </w:rPr>
-        <w:t xml:space="preserve"> Italy </w:t>
-      </w:r>
-      <w:r>
-        <w:rPr>
-          <w:rStyle w:val="AttributeTok"/>
-        </w:rPr>
-        <w:t xml:space="preserve">--run</w:t>
-      </w:r>
-      <w:r>
-        <w:rPr>
-          <w:rStyle w:val="NormalTok"/>
-        </w:rPr>
-        <w:t xml:space="preserve"> trial-v3.1</w:t>
-      </w:r>
-    </w:p>
-    <w:p>
-      <w:pPr>
-        <w:pStyle w:val="FirstParagraph"/>
-      </w:pPr>
-      <w:r>
-        <w:t xml:space="preserve">Compare</w:t>
-      </w:r>
-      <w:r>
-        <w:t xml:space="preserve"> </w:t>
-      </w:r>
-      <w:r>
-        <w:rPr>
-          <w:rStyle w:val="VerbatimChar"/>
-        </w:rPr>
-        <w:t xml:space="preserve">/tmp/v31/results.md</w:t>
-      </w:r>
-      <w:r>
-        <w:t xml:space="preserve"> </w:t>
-      </w:r>
-      <w:r>
-        <w:t xml:space="preserve">with</w:t>
-      </w:r>
-      <w:r>
-        <w:t xml:space="preserve"> </w:t>
-      </w:r>
-      <w:r>
-        <w:rPr>
-          <w:rStyle w:val="VerbatimChar"/>
-        </w:rPr>
-        <w:t xml:space="preserve">results/results.md</w:t>
-      </w:r>
-      <w:r>
-        <w:t xml:space="preserve">. Any difference comes</w:t>
-      </w:r>
-      <w:r>
-        <w:t xml:space="preserve"> </w:t>
-      </w:r>
-      <w:r>
-        <w:t xml:space="preserve">from the new rules alone, since the evidence is the same.</w:t>
+        <w:t xml:space="preserve"> </w:t>
+      </w:r>
+      <w:r>
+        <w:t xml:space="preserve">here.</w:t>
       </w:r>
     </w:p>
     <w:p>
@@ -20481,7 +20517,7 @@
         <w:rPr>
           <w:rStyle w:val="StringTok"/>
         </w:rPr>
-        <w:t xml:space="preserve">"v3.1.yaml"</w:t>
+        <w:t xml:space="preserve">"v3.2.yaml"</w:t>
       </w:r>
     </w:p>
     <w:p>
@@ -20537,7 +20573,7 @@
         <w:rPr>
           <w:rStyle w:val="CommentTok"/>
         </w:rPr>
-        <w:t xml:space="preserve"># now says "against checklist v3.1"</w:t>
+        <w:t xml:space="preserve"># now says "against checklist v3.2"</w:t>
       </w:r>
     </w:p>
     <w:p>
@@ -20581,7 +20617,7 @@
         <w:rPr>
           <w:rStyle w:val="VerbatimChar"/>
         </w:rPr>
-        <w:t xml:space="preserve">v3.0.yaml</w:t>
+        <w:t xml:space="preserve">v3.1.yaml</w:t>
       </w:r>
       <w:r>
         <w:t xml:space="preserve"> </w:t>
@@ -20602,7 +20638,7 @@
         <w:rPr>
           <w:rStyle w:val="VerbatimChar"/>
         </w:rPr>
-        <w:t xml:space="preserve">-c checklist/v3.0.yaml</w:t>
+        <w:t xml:space="preserve">-c checklist/v3.1.yaml</w:t>
       </w:r>
       <w:r>
         <w:t xml:space="preserve">. What</w:t>
@@ -20635,7 +20671,7 @@
         <w:t xml:space="preserve"> </w:t>
       </w:r>
       <w:r>
-        <w:t xml:space="preserve">v3.1, so no</w:t>
+        <w:t xml:space="preserve">v3.2, so no</w:t>
       </w:r>
       <w:r>
         <w:t xml:space="preserve"> </w:t>
@@ -20682,55 +20718,223 @@
         <w:rPr>
           <w:rStyle w:val="AttributeTok"/>
         </w:rPr>
-        <w:t xml:space="preserve">--skip</w:t>
+        <w:t xml:space="preserve">--results</w:t>
       </w:r>
       <w:r>
         <w:rPr>
           <w:rStyle w:val="NormalTok"/>
         </w:rPr>
-        <w:t xml:space="preserve"> Italy </w:t>
+        <w:t xml:space="preserve"> /tmp/new-run </w:t>
       </w:r>
       <w:r>
         <w:rPr>
           <w:rStyle w:val="AttributeTok"/>
         </w:rPr>
-        <w:t xml:space="preserve">--results</w:t>
+        <w:t xml:space="preserve">--run</w:t>
       </w:r>
       <w:r>
         <w:rPr>
           <w:rStyle w:val="NormalTok"/>
         </w:rPr>
-        <w:t xml:space="preserve"> /tmp/new-run </w:t>
+        <w:t xml:space="preserve"> live-2026-10-20-v3.2</w:t>
+      </w:r>
+      <w:r>
+        <w:br/>
+      </w:r>
+      <w:r>
+        <w:rPr>
+          <w:rStyle w:val="CommentTok"/>
+        </w:rPr>
+        <w:t xml:space="preserve"># review, then:</w:t>
+      </w:r>
+      <w:r>
+        <w:br/>
+      </w:r>
+      <w:r>
+        <w:rPr>
+          <w:rStyle w:val="FunctionTok"/>
+        </w:rPr>
+        <w:t xml:space="preserve">rm</w:t>
+      </w:r>
+      <w:r>
+        <w:rPr>
+          <w:rStyle w:val="NormalTok"/>
+        </w:rPr>
+        <w:t xml:space="preserve"> </w:t>
       </w:r>
       <w:r>
         <w:rPr>
           <w:rStyle w:val="AttributeTok"/>
         </w:rPr>
+        <w:t xml:space="preserve">-rf</w:t>
+      </w:r>
+      <w:r>
+        <w:rPr>
+          <w:rStyle w:val="NormalTok"/>
+        </w:rPr>
+        <w:t xml:space="preserve"> results/evidence </w:t>
+      </w:r>
+      <w:r>
+        <w:rPr>
+          <w:rStyle w:val="KeywordTok"/>
+        </w:rPr>
+        <w:t xml:space="preserve">&amp;&amp;</w:t>
+      </w:r>
+      <w:r>
+        <w:rPr>
+          <w:rStyle w:val="NormalTok"/>
+        </w:rPr>
+        <w:t xml:space="preserve"> </w:t>
+      </w:r>
+      <w:r>
+        <w:rPr>
+          <w:rStyle w:val="FunctionTok"/>
+        </w:rPr>
+        <w:t xml:space="preserve">cp</w:t>
+      </w:r>
+      <w:r>
+        <w:rPr>
+          <w:rStyle w:val="NormalTok"/>
+        </w:rPr>
+        <w:t xml:space="preserve"> </w:t>
+      </w:r>
+      <w:r>
+        <w:rPr>
+          <w:rStyle w:val="AttributeTok"/>
+        </w:rPr>
+        <w:t xml:space="preserve">-r</w:t>
+      </w:r>
+      <w:r>
+        <w:rPr>
+          <w:rStyle w:val="NormalTok"/>
+        </w:rPr>
+        <w:t xml:space="preserve"> /tmp/new-run/evidence results/evidence</w:t>
+      </w:r>
+      <w:r>
+        <w:br/>
+      </w:r>
+      <w:r>
+        <w:rPr>
+          <w:rStyle w:val="ExtensionTok"/>
+        </w:rPr>
+        <w:t xml:space="preserve">uv</w:t>
+      </w:r>
+      <w:r>
+        <w:rPr>
+          <w:rStyle w:val="NormalTok"/>
+        </w:rPr>
+        <w:t xml:space="preserve"> run basic-check assess </w:t>
+      </w:r>
+      <w:r>
+        <w:rPr>
+          <w:rStyle w:val="AttributeTok"/>
+        </w:rPr>
         <w:t xml:space="preserve">--run</w:t>
       </w:r>
       <w:r>
         <w:rPr>
           <w:rStyle w:val="NormalTok"/>
         </w:rPr>
-        <w:t xml:space="preserve"> live-2026-10-20-v3.1</w:t>
+        <w:t xml:space="preserve"> live-2026-10-20-v3.2</w:t>
+      </w:r>
+    </w:p>
+    <w:p>
+      <w:pPr>
+        <w:pStyle w:val="FirstParagraph"/>
+      </w:pPr>
+      <w:r>
+        <w:t xml:space="preserve">Alternatively, re-score the published evidence against v3.2 without contacting</w:t>
+      </w:r>
+      <w:r>
+        <w:t xml:space="preserve"> </w:t>
+      </w:r>
+      <w:r>
+        <w:t xml:space="preserve">anyone, as in step 4 but writing to</w:t>
+      </w:r>
+      <w:r>
+        <w:t xml:space="preserve"> </w:t>
+      </w:r>
+      <w:r>
+        <w:rPr>
+          <w:rStyle w:val="VerbatimChar"/>
+        </w:rPr>
+        <w:t xml:space="preserve">results/</w:t>
+      </w:r>
+      <w:r>
+        <w:t xml:space="preserve">. The report then says v3.2,</w:t>
+      </w:r>
+      <w:r>
+        <w:t xml:space="preserve"> </w:t>
+      </w:r>
+      <w:r>
+        <w:t xml:space="preserve">while the capture date is still that of the evidence.</w:t>
+      </w:r>
+    </w:p>
+    <w:p>
+      <w:pPr>
+        <w:pStyle w:val="BodyText"/>
+      </w:pPr>
+      <w:r>
+        <w:t xml:space="preserve">The reports now link to</w:t>
+      </w:r>
+      <w:r>
+        <w:t xml:space="preserve"> </w:t>
+      </w:r>
+      <w:r>
+        <w:rPr>
+          <w:rStyle w:val="VerbatimChar"/>
+        </w:rPr>
+        <w:t xml:space="preserve">results/checklist-v3.2.html</w:t>
+      </w:r>
+      <w:r>
+        <w:t xml:space="preserve">. The old</w:t>
+      </w:r>
+      <w:r>
+        <w:t xml:space="preserve"> </w:t>
+      </w:r>
+      <w:r>
+        <w:rPr>
+          <w:rStyle w:val="VerbatimChar"/>
+        </w:rPr>
+        <w:t xml:space="preserve">results/checklist-v3.1.html</w:t>
+      </w:r>
+      <w:r>
+        <w:t xml:space="preserve"> </w:t>
+      </w:r>
+      <w:r>
+        <w:t xml:space="preserve">stays behind; remove it, and update the places</w:t>
+      </w:r>
+      <w:r>
+        <w:t xml:space="preserve"> </w:t>
+      </w:r>
+      <w:r>
+        <w:t xml:space="preserve">that name v3.1 in prose or links:</w:t>
+      </w:r>
+    </w:p>
+    <w:p>
+      <w:pPr>
+        <w:pStyle w:val="SourceCode"/>
+      </w:pPr>
+      <w:r>
+        <w:rPr>
+          <w:rStyle w:val="FunctionTok"/>
+        </w:rPr>
+        <w:t xml:space="preserve">git</w:t>
+      </w:r>
+      <w:r>
+        <w:rPr>
+          <w:rStyle w:val="NormalTok"/>
+        </w:rPr>
+        <w:t xml:space="preserve"> rm results/checklist-v3.1.html</w:t>
       </w:r>
       <w:r>
         <w:br/>
       </w:r>
       <w:r>
         <w:rPr>
-          <w:rStyle w:val="CommentTok"/>
-        </w:rPr>
-        <w:t xml:space="preserve"># review, then:</w:t>
-      </w:r>
-      <w:r>
-        <w:br/>
-      </w:r>
-      <w:r>
-        <w:rPr>
-          <w:rStyle w:val="FunctionTok"/>
-        </w:rPr>
-        <w:t xml:space="preserve">rm</w:t>
+          <w:rStyle w:val="ExtensionTok"/>
+        </w:rPr>
+        <w:t xml:space="preserve">rg</w:t>
       </w:r>
       <w:r>
         <w:rPr>
@@ -20742,88 +20946,25 @@
         <w:rPr>
           <w:rStyle w:val="AttributeTok"/>
         </w:rPr>
-        <w:t xml:space="preserve">-rf</w:t>
+        <w:t xml:space="preserve">-n</w:t>
       </w:r>
       <w:r>
         <w:rPr>
           <w:rStyle w:val="NormalTok"/>
         </w:rPr>
-        <w:t xml:space="preserve"> results/evidence </w:t>
-      </w:r>
-      <w:r>
-        <w:rPr>
-          <w:rStyle w:val="KeywordTok"/>
-        </w:rPr>
-        <w:t xml:space="preserve">&amp;&amp;</w:t>
+        <w:t xml:space="preserve"> </w:t>
+      </w:r>
+      <w:r>
+        <w:rPr>
+          <w:rStyle w:val="StringTok"/>
+        </w:rPr>
+        <w:t xml:space="preserve">"v3\.1"</w:t>
       </w:r>
       <w:r>
         <w:rPr>
           <w:rStyle w:val="NormalTok"/>
         </w:rPr>
-        <w:t xml:space="preserve"> </w:t>
-      </w:r>
-      <w:r>
-        <w:rPr>
-          <w:rStyle w:val="FunctionTok"/>
-        </w:rPr>
-        <w:t xml:space="preserve">cp</w:t>
-      </w:r>
-      <w:r>
-        <w:rPr>
-          <w:rStyle w:val="NormalTok"/>
-        </w:rPr>
-        <w:t xml:space="preserve"> </w:t>
-      </w:r>
-      <w:r>
-        <w:rPr>
-          <w:rStyle w:val="AttributeTok"/>
-        </w:rPr>
-        <w:t xml:space="preserve">-r</w:t>
-      </w:r>
-      <w:r>
-        <w:rPr>
-          <w:rStyle w:val="NormalTok"/>
-        </w:rPr>
-        <w:t xml:space="preserve"> /tmp/new-run/evidence results/evidence</w:t>
-      </w:r>
-      <w:r>
-        <w:br/>
-      </w:r>
-      <w:r>
-        <w:rPr>
-          <w:rStyle w:val="ExtensionTok"/>
-        </w:rPr>
-        <w:t xml:space="preserve">uv</w:t>
-      </w:r>
-      <w:r>
-        <w:rPr>
-          <w:rStyle w:val="NormalTok"/>
-        </w:rPr>
-        <w:t xml:space="preserve"> run basic-check assess </w:t>
-      </w:r>
-      <w:r>
-        <w:rPr>
-          <w:rStyle w:val="AttributeTok"/>
-        </w:rPr>
-        <w:t xml:space="preserve">--skip</w:t>
-      </w:r>
-      <w:r>
-        <w:rPr>
-          <w:rStyle w:val="NormalTok"/>
-        </w:rPr>
-        <w:t xml:space="preserve"> Italy </w:t>
-      </w:r>
-      <w:r>
-        <w:rPr>
-          <w:rStyle w:val="AttributeTok"/>
-        </w:rPr>
-        <w:t xml:space="preserve">--run</w:t>
-      </w:r>
-      <w:r>
-        <w:rPr>
-          <w:rStyle w:val="NormalTok"/>
-        </w:rPr>
-        <w:t xml:space="preserve"> live-2026-10-20-v3.1</w:t>
+        <w:t xml:space="preserve"> README.md docs checklist/README.md .github</w:t>
       </w:r>
     </w:p>
     <w:p>
@@ -20831,135 +20972,6 @@
         <w:pStyle w:val="FirstParagraph"/>
       </w:pPr>
       <w:r>
-        <w:t xml:space="preserve">Alternatively, re-score the published evidence against v3.1 without contacting</w:t>
-      </w:r>
-      <w:r>
-        <w:t xml:space="preserve"> </w:t>
-      </w:r>
-      <w:r>
-        <w:t xml:space="preserve">anyone, as in step 4 but writing to</w:t>
-      </w:r>
-      <w:r>
-        <w:t xml:space="preserve"> </w:t>
-      </w:r>
-      <w:r>
-        <w:rPr>
-          <w:rStyle w:val="VerbatimChar"/>
-        </w:rPr>
-        <w:t xml:space="preserve">results/</w:t>
-      </w:r>
-      <w:r>
-        <w:t xml:space="preserve">. The report then says v3.1,</w:t>
-      </w:r>
-      <w:r>
-        <w:t xml:space="preserve"> </w:t>
-      </w:r>
-      <w:r>
-        <w:t xml:space="preserve">while the capture date is still that of the evidence.</w:t>
-      </w:r>
-    </w:p>
-    <w:p>
-      <w:pPr>
-        <w:pStyle w:val="BodyText"/>
-      </w:pPr>
-      <w:r>
-        <w:t xml:space="preserve">The reports now link to</w:t>
-      </w:r>
-      <w:r>
-        <w:t xml:space="preserve"> </w:t>
-      </w:r>
-      <w:r>
-        <w:rPr>
-          <w:rStyle w:val="VerbatimChar"/>
-        </w:rPr>
-        <w:t xml:space="preserve">results/checklist-v3.1.html</w:t>
-      </w:r>
-      <w:r>
-        <w:t xml:space="preserve">. The old</w:t>
-      </w:r>
-      <w:r>
-        <w:t xml:space="preserve"> </w:t>
-      </w:r>
-      <w:r>
-        <w:rPr>
-          <w:rStyle w:val="VerbatimChar"/>
-        </w:rPr>
-        <w:t xml:space="preserve">results/checklist-v3.0.html</w:t>
-      </w:r>
-      <w:r>
-        <w:t xml:space="preserve"> </w:t>
-      </w:r>
-      <w:r>
-        <w:t xml:space="preserve">stays behind; remove it, and update the places</w:t>
-      </w:r>
-      <w:r>
-        <w:t xml:space="preserve"> </w:t>
-      </w:r>
-      <w:r>
-        <w:t xml:space="preserve">that name v3.0 in prose or links:</w:t>
-      </w:r>
-    </w:p>
-    <w:p>
-      <w:pPr>
-        <w:pStyle w:val="SourceCode"/>
-      </w:pPr>
-      <w:r>
-        <w:rPr>
-          <w:rStyle w:val="FunctionTok"/>
-        </w:rPr>
-        <w:t xml:space="preserve">git</w:t>
-      </w:r>
-      <w:r>
-        <w:rPr>
-          <w:rStyle w:val="NormalTok"/>
-        </w:rPr>
-        <w:t xml:space="preserve"> rm results/checklist-v3.0.html</w:t>
-      </w:r>
-      <w:r>
-        <w:br/>
-      </w:r>
-      <w:r>
-        <w:rPr>
-          <w:rStyle w:val="ExtensionTok"/>
-        </w:rPr>
-        <w:t xml:space="preserve">rg</w:t>
-      </w:r>
-      <w:r>
-        <w:rPr>
-          <w:rStyle w:val="NormalTok"/>
-        </w:rPr>
-        <w:t xml:space="preserve"> </w:t>
-      </w:r>
-      <w:r>
-        <w:rPr>
-          <w:rStyle w:val="AttributeTok"/>
-        </w:rPr>
-        <w:t xml:space="preserve">-n</w:t>
-      </w:r>
-      <w:r>
-        <w:rPr>
-          <w:rStyle w:val="NormalTok"/>
-        </w:rPr>
-        <w:t xml:space="preserve"> </w:t>
-      </w:r>
-      <w:r>
-        <w:rPr>
-          <w:rStyle w:val="StringTok"/>
-        </w:rPr>
-        <w:t xml:space="preserve">"v3\.0"</w:t>
-      </w:r>
-      <w:r>
-        <w:rPr>
-          <w:rStyle w:val="NormalTok"/>
-        </w:rPr>
-        <w:t xml:space="preserve"> README.md docs checklist/README.md .github</w:t>
-      </w:r>
-    </w:p>
-    <w:p>
-      <w:pPr>
-        <w:pStyle w:val="FirstParagraph"/>
-      </w:pPr>
-      <w:r>
         <w:t xml:space="preserve">In</w:t>
       </w:r>
       <w:r>
@@ -20981,7 +20993,7 @@
         <w:rPr>
           <w:rStyle w:val="VerbatimChar"/>
         </w:rPr>
-        <w:t xml:space="preserve">results/checklist-v3.0.html#p…</w:t>
+        <w:t xml:space="preserve">results/checklist-v3.1.html#p…</w:t>
       </w:r>
       <w:r>
         <w:t xml:space="preserve">. Those links break once the file is removed,</w:t>
@@ -20999,7 +21011,7 @@
         <w:rPr>
           <w:rStyle w:val="VerbatimChar"/>
         </w:rPr>
-        <w:t xml:space="preserve">v3.1</w:t>
+        <w:t xml:space="preserve">v3.2</w:t>
       </w:r>
       <w:r>
         <w:t xml:space="preserve">.</w:t>
@@ -21056,7 +21068,7 @@
         <w:rPr>
           <w:rStyle w:val="VerbatimChar"/>
         </w:rPr>
-        <w:t xml:space="preserve">checklist/v3.1.yaml</w:t>
+        <w:t xml:space="preserve">checklist/v3.2.yaml</w:t>
       </w:r>
       <w:r>
         <w:t xml:space="preserve">,</w:t>
@@ -21111,7 +21123,7 @@
           <w:i/>
           <w:iCs/>
         </w:rPr>
-        <w:t xml:space="preserve">Source checklist: Node Landing Page Verification Checklist v3.0, 15 September</w:t>
+        <w:t xml:space="preserve">Source checklist: Node Landing Page Verification Checklist v3.1, 15 September</w:t>
       </w:r>
       <w:r>
         <w:rPr>
@@ -21140,7 +21152,7 @@
           <w:i/>
           <w:iCs/>
         </w:rPr>
-        <w:t xml:space="preserve">checklist/v3.0.yaml</w:t>
+        <w:t xml:space="preserve">checklist/v3.1.yaml</w:t>
       </w:r>
       <w:r>
         <w:rPr>

</xml_diff>

<commit_message>
Docs: page numbers in the Word/PDF guides, phases figure updated to checklist v3.1, Word/PDF rebuilt for run web-8 (Markdown at 678b75e)
</commit_message>
<xml_diff>
--- a/docs/eosc-basic-compliance-analysis-workflow.docx
+++ b/docs/eosc-basic-compliance-analysis-workflow.docx
@@ -31,7 +31,7 @@
         <w:pStyle w:val="Date"/>
       </w:pPr>
       <w:r>
-        <w:t xml:space="preserve">26 September 2026, documentation commit ee12687</w:t>
+        <w:t xml:space="preserve">26 September 2026, documentation commit 678b75e</w:t>
       </w:r>
     </w:p>
     <w:bookmarkStart w:id="9" w:name="contents"/>
@@ -5980,6 +5980,30 @@
         <w:t xml:space="preserve">web-4</w:t>
       </w:r>
       <w:r>
+        <w:t xml:space="preserve">,</w:t>
+      </w:r>
+      <w:r>
+        <w:t xml:space="preserve"> </w:t>
+      </w:r>
+      <w:r>
+        <w:rPr>
+          <w:rStyle w:val="VerbatimChar"/>
+        </w:rPr>
+        <w:t xml:space="preserve">web-5</w:t>
+      </w:r>
+      <w:r>
+        <w:t xml:space="preserve">,</w:t>
+      </w:r>
+      <w:r>
+        <w:t xml:space="preserve"> </w:t>
+      </w:r>
+      <w:r>
+        <w:rPr>
+          <w:rStyle w:val="VerbatimChar"/>
+        </w:rPr>
+        <w:t xml:space="preserve">web-6</w:t>
+      </w:r>
+      <w:r>
         <w:t xml:space="preserve"> </w:t>
       </w:r>
       <w:r>
@@ -5992,7 +6016,7 @@
         <w:rPr>
           <w:rStyle w:val="VerbatimChar"/>
         </w:rPr>
-        <w:t xml:space="preserve">web-5</w:t>
+        <w:t xml:space="preserve">web-8</w:t>
       </w:r>
       <w:r>
         <w:t xml:space="preserve">, which replaced it as the published run on 26</w:t>
@@ -17541,7 +17565,7 @@
         <w:rPr>
           <w:rStyle w:val="VerbatimChar"/>
         </w:rPr>
-        <w:t xml:space="preserve">web-5</w:t>
+        <w:t xml:space="preserve">web-8</w:t>
       </w:r>
       <w:r>
         <w:t xml:space="preserve">). Update it to the new run's shape.</w:t>
@@ -21246,6 +21270,7 @@
     <w:bookmarkEnd w:id="39"/>
     <w:bookmarkEnd w:id="40"/>
     <w:sectPr>
+      <w:footerReference w:type="default" r:id="rId9"/>
       <w:footnotePr>
         <w:numRestart w:val="eachSect"/>
       </w:footnotePr>
@@ -21256,6 +21281,104 @@
 
 <file path=word/comments.xml><?xml version="1.0" encoding="utf-8"?>
 <w:comments xmlns:w="http://schemas.openxmlformats.org/wordprocessingml/2006/main" xmlns:m="http://schemas.openxmlformats.org/officeDocument/2006/math" xmlns:r="http://schemas.openxmlformats.org/officeDocument/2006/relationships" xmlns:o="urn:schemas-microsoft-com:office:office" xmlns:v="urn:schemas-microsoft-com:vml" xmlns:w10="urn:schemas-microsoft-com:office:word" xmlns:a="http://schemas.openxmlformats.org/drawingml/2006/main" xmlns:pic="http://schemas.openxmlformats.org/drawingml/2006/picture" xmlns:wp="http://schemas.openxmlformats.org/drawingml/2006/wordprocessingDrawing"/>
+</file>
+
+<file path=word/footer1.xml><?xml version="1.0" encoding="utf-8"?>
+<w:ftr xmlns:m="http://schemas.openxmlformats.org/officeDocument/2006/math" xmlns:mc="http://schemas.openxmlformats.org/markup-compatibility/2006" xmlns:mo="http://schemas.microsoft.com/office/mac/office/2008/main" xmlns:mv="urn:schemas-microsoft-com:mac:vml" xmlns:o="urn:schemas-microsoft-com:office:office" xmlns:r="http://schemas.openxmlformats.org/officeDocument/2006/relationships" xmlns:v="urn:schemas-microsoft-com:vml" xmlns:w10="urn:schemas-microsoft-com:office:word" xmlns:w14="http://schemas.microsoft.com/office/word/2010/wordml" xmlns:w="http://schemas.openxmlformats.org/wordprocessingml/2006/main" xmlns:wne="http://schemas.microsoft.com/office/word/2006/wordml" xmlns:wp14="http://schemas.microsoft.com/office/word/2010/wordprocessingDrawing" xmlns:wp="http://schemas.openxmlformats.org/drawingml/2006/wordprocessingDrawing" xmlns:wpc="http://schemas.microsoft.com/office/word/2010/wordprocessingCanvas" xmlns:wpg="http://schemas.microsoft.com/office/word/2010/wordprocessingGroup" xmlns:wpi="http://schemas.microsoft.com/office/word/2010/wordprocessingInk" xmlns:wps="http://schemas.microsoft.com/office/word/2010/wordprocessingShape" mc:Ignorable="w14 wp14">
+  <w:p>
+    <w:pPr>
+      <w:pStyle w:val="Footer"/>
+      <w:jc w:val="center"/>
+    </w:pPr>
+    <w:r/>
+    <w:r>
+      <w:rPr>
+        <w:color w:val="7A7974"/>
+        <w:sz w:val="18"/>
+      </w:rPr>
+      <w:t xml:space="preserve">Page </w:t>
+    </w:r>
+    <w:r/>
+    <w:r>
+      <w:rPr>
+        <w:color w:val="7A7974"/>
+        <w:sz w:val="18"/>
+      </w:rPr>
+      <w:fldChar w:fldCharType="begin"/>
+    </w:r>
+    <w:r>
+      <w:rPr>
+        <w:color w:val="7A7974"/>
+        <w:sz w:val="18"/>
+      </w:rPr>
+      <w:instrText xml:space="preserve"> PAGE </w:instrText>
+    </w:r>
+    <w:r>
+      <w:rPr>
+        <w:color w:val="7A7974"/>
+        <w:sz w:val="18"/>
+      </w:rPr>
+      <w:fldChar w:fldCharType="separate"/>
+    </w:r>
+    <w:r>
+      <w:rPr>
+        <w:color w:val="7A7974"/>
+        <w:sz w:val="18"/>
+      </w:rPr>
+      <w:t>1</w:t>
+    </w:r>
+    <w:r>
+      <w:rPr>
+        <w:color w:val="7A7974"/>
+        <w:sz w:val="18"/>
+      </w:rPr>
+      <w:fldChar w:fldCharType="end"/>
+    </w:r>
+    <w:r>
+      <w:rPr>
+        <w:color w:val="7A7974"/>
+        <w:sz w:val="18"/>
+      </w:rPr>
+      <w:t xml:space="preserve"> of </w:t>
+    </w:r>
+    <w:r/>
+    <w:r>
+      <w:rPr>
+        <w:color w:val="7A7974"/>
+        <w:sz w:val="18"/>
+      </w:rPr>
+      <w:fldChar w:fldCharType="begin"/>
+    </w:r>
+    <w:r>
+      <w:rPr>
+        <w:color w:val="7A7974"/>
+        <w:sz w:val="18"/>
+      </w:rPr>
+      <w:instrText xml:space="preserve"> NUMPAGES </w:instrText>
+    </w:r>
+    <w:r>
+      <w:rPr>
+        <w:color w:val="7A7974"/>
+        <w:sz w:val="18"/>
+      </w:rPr>
+      <w:fldChar w:fldCharType="separate"/>
+    </w:r>
+    <w:r>
+      <w:rPr>
+        <w:color w:val="7A7974"/>
+        <w:sz w:val="18"/>
+      </w:rPr>
+      <w:t>1</w:t>
+    </w:r>
+    <w:r>
+      <w:rPr>
+        <w:color w:val="7A7974"/>
+        <w:sz w:val="18"/>
+      </w:rPr>
+      <w:fldChar w:fldCharType="end"/>
+    </w:r>
+  </w:p>
+</w:ftr>
 </file>
 
 <file path=word/footnotes.xml><?xml version="1.0" encoding="utf-8"?>

</xml_diff>

<commit_message>
Remove personal names, addresses and phone numbers from guides, code comments and tests (placeholders only); rebuild Word/PDF guides
</commit_message>
<xml_diff>
--- a/docs/eosc-basic-compliance-analysis-workflow.docx
+++ b/docs/eosc-basic-compliance-analysis-workflow.docx
@@ -23,7 +23,7 @@
         <w:pStyle w:val="Author"/>
       </w:pPr>
       <w:r>
-        <w:t xml:space="preserve">Mario Reale</w:t>
+        <w:t xml:space="preserve">Repository: github.com/marioreale/eosc-basic-compliance</w:t>
       </w:r>
     </w:p>
     <w:p>
@@ -31,7 +31,7 @@
         <w:pStyle w:val="Date"/>
       </w:pPr>
       <w:r>
-        <w:t xml:space="preserve">26 September 2026, documentation commit 678b75e</w:t>
+        <w:t xml:space="preserve">27 September 2026 — built from the Markdown guides in the same commit</w:t>
       </w:r>
     </w:p>
     <w:bookmarkStart w:id="9" w:name="contents"/>
@@ -6004,6 +6004,18 @@
         <w:t xml:space="preserve">web-6</w:t>
       </w:r>
       <w:r>
+        <w:t xml:space="preserve">,</w:t>
+      </w:r>
+      <w:r>
+        <w:t xml:space="preserve"> </w:t>
+      </w:r>
+      <w:r>
+        <w:rPr>
+          <w:rStyle w:val="VerbatimChar"/>
+        </w:rPr>
+        <w:t xml:space="preserve">web-8</w:t>
+      </w:r>
+      <w:r>
         <w:t xml:space="preserve"> </w:t>
       </w:r>
       <w:r>
@@ -6016,7 +6028,7 @@
         <w:rPr>
           <w:rStyle w:val="VerbatimChar"/>
         </w:rPr>
-        <w:t xml:space="preserve">web-8</w:t>
+        <w:t xml:space="preserve">web-9</w:t>
       </w:r>
       <w:r>
         <w:t xml:space="preserve">, which replaced it as the published run on 26</w:t>
@@ -17565,7 +17577,7 @@
         <w:rPr>
           <w:rStyle w:val="VerbatimChar"/>
         </w:rPr>
-        <w:t xml:space="preserve">web-8</w:t>
+        <w:t xml:space="preserve">web-9</w:t>
       </w:r>
       <w:r>
         <w:t xml:space="preserve">). Update it to the new run's shape.</w:t>

</xml_diff>

<commit_message>
Publish run web-10 (GitHub workflow, 28 Sep 2026, checklist v3.1): first run with EOSC Node Poland, other twelve rows unchanged; docs and Word/PDF guides updated
</commit_message>
<xml_diff>
--- a/docs/eosc-basic-compliance-analysis-workflow.docx
+++ b/docs/eosc-basic-compliance-analysis-workflow.docx
@@ -31,7 +31,7 @@
         <w:pStyle w:val="Date"/>
       </w:pPr>
       <w:r>
-        <w:t xml:space="preserve">27 September 2026 — built from the Markdown guides in the same commit</w:t>
+        <w:t xml:space="preserve">28 September 2026 — built from the Markdown guides in the same commit</w:t>
       </w:r>
     </w:p>
     <w:bookmarkStart w:id="9" w:name="contents"/>
@@ -5980,55 +5980,19 @@
         <w:t xml:space="preserve">web-4</w:t>
       </w:r>
       <w:r>
-        <w:t xml:space="preserve">,</w:t>
-      </w:r>
-      <w:r>
-        <w:t xml:space="preserve"> </w:t>
-      </w:r>
-      <w:r>
-        <w:rPr>
-          <w:rStyle w:val="VerbatimChar"/>
-        </w:rPr>
-        <w:t xml:space="preserve">web-5</w:t>
-      </w:r>
-      <w:r>
-        <w:t xml:space="preserve">,</w:t>
-      </w:r>
-      <w:r>
-        <w:t xml:space="preserve"> </w:t>
-      </w:r>
-      <w:r>
-        <w:rPr>
-          <w:rStyle w:val="VerbatimChar"/>
-        </w:rPr>
-        <w:t xml:space="preserve">web-6</w:t>
-      </w:r>
-      <w:r>
-        <w:t xml:space="preserve">,</w:t>
-      </w:r>
-      <w:r>
-        <w:t xml:space="preserve"> </w:t>
-      </w:r>
-      <w:r>
-        <w:rPr>
-          <w:rStyle w:val="VerbatimChar"/>
-        </w:rPr>
-        <w:t xml:space="preserve">web-8</w:t>
-      </w:r>
-      <w:r>
-        <w:t xml:space="preserve"> </w:t>
-      </w:r>
-      <w:r>
-        <w:t xml:space="preserve">and</w:t>
-      </w:r>
-      <w:r>
-        <w:t xml:space="preserve"> </w:t>
-      </w:r>
-      <w:r>
-        <w:rPr>
-          <w:rStyle w:val="VerbatimChar"/>
-        </w:rPr>
-        <w:t xml:space="preserve">web-9</w:t>
+        <w:t xml:space="preserve"> </w:t>
+      </w:r>
+      <w:r>
+        <w:t xml:space="preserve">to</w:t>
+      </w:r>
+      <w:r>
+        <w:t xml:space="preserve"> </w:t>
+      </w:r>
+      <w:r>
+        <w:rPr>
+          <w:rStyle w:val="VerbatimChar"/>
+        </w:rPr>
+        <w:t xml:space="preserve">web-10</w:t>
       </w:r>
       <w:r>
         <w:t xml:space="preserve">, which replaced it as the published run on 26</w:t>
@@ -12225,7 +12189,7 @@
         <w:t xml:space="preserve"> </w:t>
       </w:r>
       <w:r>
-        <w:t xml:space="preserve">service (EBRAINS) and a service overview (BBMRI-ERIC), and all three had passed.</w:t>
+        <w:t xml:space="preserve">service (on the page of a node that was listed by mistake and was replaced by EOSC Node Poland on 28 September 2026) and a service overview (BBMRI-ERIC), and all three had passed.</w:t>
       </w:r>
     </w:p>
     <w:p>
@@ -14311,7 +14275,7 @@
         <w:t xml:space="preserve"> </w:t>
       </w:r>
       <w:r>
-        <w:t xml:space="preserve">matches none. The published run of 26 September gives</w:t>
+        <w:t xml:space="preserve">matches none. The published runs of 26 and 28 September give</w:t>
       </w:r>
       <w:r>
         <w:t xml:space="preserve"> </w:t>
@@ -14323,7 +14287,7 @@
         <w:t xml:space="preserve"> </w:t>
       </w:r>
       <w:r>
-        <w:t xml:space="preserve">that day), and</w:t>
+        <w:t xml:space="preserve">both days), and</w:t>
       </w:r>
       <w:r>
         <w:t xml:space="preserve"> </w:t>
@@ -17577,7 +17541,7 @@
         <w:rPr>
           <w:rStyle w:val="VerbatimChar"/>
         </w:rPr>
-        <w:t xml:space="preserve">web-9</w:t>
+        <w:t xml:space="preserve">web-10</w:t>
       </w:r>
       <w:r>
         <w:t xml:space="preserve">). Update it to the new run's shape.</w:t>
@@ -17658,7 +17622,7 @@
         <w:t xml:space="preserve"> </w:t>
       </w:r>
       <w:r>
-        <w:t xml:space="preserve">("130 cells: 45 PASS · 8 FAIL · 77 review");</w:t>
+        <w:t xml:space="preserve">("130 cells: 47 PASS · 8 FAIL · 75 review");</w:t>
       </w:r>
     </w:p>
     <w:p>

</xml_diff>

<commit_message>
Publish run web-11 (GitHub workflow, 28 Sep 2026, checklist v3.1): first run with CERN's new landing page https://eosc.cern/; two personal names removed from the evidence; docs and Word/PDF guides updated
</commit_message>
<xml_diff>
--- a/docs/eosc-basic-compliance-analysis-workflow.docx
+++ b/docs/eosc-basic-compliance-analysis-workflow.docx
@@ -5992,7 +5992,7 @@
         <w:rPr>
           <w:rStyle w:val="VerbatimChar"/>
         </w:rPr>
-        <w:t xml:space="preserve">web-10</w:t>
+        <w:t xml:space="preserve">web-11</w:t>
       </w:r>
       <w:r>
         <w:t xml:space="preserve">, which replaced it as the published run on 26</w:t>
@@ -17541,7 +17541,7 @@
         <w:rPr>
           <w:rStyle w:val="VerbatimChar"/>
         </w:rPr>
-        <w:t xml:space="preserve">web-10</w:t>
+        <w:t xml:space="preserve">web-11</w:t>
       </w:r>
       <w:r>
         <w:t xml:space="preserve">). Update it to the new run's shape.</w:t>
@@ -17622,7 +17622,7 @@
         <w:t xml:space="preserve"> </w:t>
       </w:r>
       <w:r>
-        <w:t xml:space="preserve">("130 cells: 47 PASS · 8 FAIL · 75 review");</w:t>
+        <w:t xml:space="preserve">("130 cells: 49 PASS · 8 FAIL · 73 review");</w:t>
       </w:r>
     </w:p>
     <w:p>

</xml_diff>

<commit_message>
Publish run web-12 (first collection under checklist v3.2, 49/14/67, same verdicts as web-11-v3.2); mask EGI coordinator name in a link address; docs and Word/PDF guides updated
</commit_message>
<xml_diff>
--- a/docs/eosc-basic-compliance-analysis-workflow.docx
+++ b/docs/eosc-basic-compliance-analysis-workflow.docx
@@ -6016,7 +6016,7 @@
         <w:rPr>
           <w:rStyle w:val="VerbatimChar"/>
         </w:rPr>
-        <w:t xml:space="preserve">web-11</w:t>
+        <w:t xml:space="preserve">web-12</w:t>
       </w:r>
       <w:r>
         <w:t xml:space="preserve">, which replaced it as the published run on 26</w:t>
@@ -13106,7 +13106,25 @@
         <w:t xml:space="preserve"> </w:t>
       </w:r>
       <w:r>
-        <w:t xml:space="preserve">as both, and GÉANT's page was not served (branch 8).</w:t>
+        <w:t xml:space="preserve">as both, and GÉANT's page was not served (branch 8). Run</w:t>
+      </w:r>
+      <w:r>
+        <w:t xml:space="preserve"> </w:t>
+      </w:r>
+      <w:r>
+        <w:rPr>
+          <w:rStyle w:val="VerbatimChar"/>
+        </w:rPr>
+        <w:t xml:space="preserve">web-12</w:t>
+      </w:r>
+      <w:r>
+        <w:t xml:space="preserve">, the first</w:t>
+      </w:r>
+      <w:r>
+        <w:t xml:space="preserve"> </w:t>
+      </w:r>
+      <w:r>
+        <w:t xml:space="preserve">collected under v3.2, gave the same verdicts in all 130 cells.</w:t>
       </w:r>
     </w:p>
     <w:p>
@@ -18513,7 +18531,7 @@
         <w:rPr>
           <w:rStyle w:val="VerbatimChar"/>
         </w:rPr>
-        <w:t xml:space="preserve">web-11-v3.2</w:t>
+        <w:t xml:space="preserve">web-12</w:t>
       </w:r>
       <w:r>
         <w:t xml:space="preserve">). Update it to the new run's shape.</w:t>

</xml_diff>

<commit_message>
Publish run web-13 (depth 2, checklist v3.2, 49/14/67 at both depths, no verdict changed by the second hop); mask a personal name found on a second-hop page; docs and Word/PDF guides updated
</commit_message>
<xml_diff>
--- a/docs/eosc-basic-compliance-analysis-workflow.docx
+++ b/docs/eosc-basic-compliance-analysis-workflow.docx
@@ -6016,7 +6016,7 @@
         <w:rPr>
           <w:rStyle w:val="VerbatimChar"/>
         </w:rPr>
-        <w:t xml:space="preserve">web-12</w:t>
+        <w:t xml:space="preserve">web-13</w:t>
       </w:r>
       <w:r>
         <w:t xml:space="preserve">, which replaced it as the published run on 26</w:t>
@@ -13124,7 +13124,34 @@
         <w:t xml:space="preserve"> </w:t>
       </w:r>
       <w:r>
-        <w:t xml:space="preserve">collected under v3.2, gave the same verdicts in all 130 cells.</w:t>
+        <w:t xml:space="preserve">collected under v3.2, gave the same verdicts in all 130 cells, and so did</w:t>
+      </w:r>
+      <w:r>
+        <w:t xml:space="preserve"> </w:t>
+      </w:r>
+      <w:r>
+        <w:rPr>
+          <w:rStyle w:val="VerbatimChar"/>
+        </w:rPr>
+        <w:t xml:space="preserve">web-13</w:t>
+      </w:r>
+      <w:r>
+        <w:t xml:space="preserve"> </w:t>
+      </w:r>
+      <w:r>
+        <w:t xml:space="preserve">at</w:t>
+      </w:r>
+      <w:r>
+        <w:t xml:space="preserve"> </w:t>
+      </w:r>
+      <w:r>
+        <w:rPr>
+          <w:rStyle w:val="VerbatimChar"/>
+        </w:rPr>
+        <w:t xml:space="preserve">--depth 2</w:t>
+      </w:r>
+      <w:r>
+        <w:t xml:space="preserve">, at both depths.</w:t>
       </w:r>
     </w:p>
     <w:p>
@@ -18531,7 +18558,7 @@
         <w:rPr>
           <w:rStyle w:val="VerbatimChar"/>
         </w:rPr>
-        <w:t xml:space="preserve">web-12</w:t>
+        <w:t xml:space="preserve">web-13</w:t>
       </w:r>
       <w:r>
         <w:t xml:space="preserve">). Update it to the new run's shape.</w:t>

</xml_diff>

<commit_message>
Checklist v3.2 re-issued: AUP/UAP may be on the NLP or on pages it links to; follow policies/services pages for item 5; re-score web-13 offline (50/8/72, no 5b/5c FAIL); docs and Word/PDF guides updated
</commit_message>
<xml_diff>
--- a/docs/eosc-basic-compliance-analysis-workflow.docx
+++ b/docs/eosc-basic-compliance-analysis-workflow.docx
@@ -4928,7 +4928,118 @@
           </w:p>
         </w:tc>
       </w:tr>
+      <w:tr>
+        <w:trPr>
+          <w:cantSplit/>
+        </w:trPr>
+        <w:tc>
+          <w:tcPr/>
+          <w:p>
+            <w:pPr>
+              <w:pStyle w:val="Compact"/>
+            </w:pPr>
+            <w:r>
+              <w:t xml:space="preserve">5</w:t>
+            </w:r>
+          </w:p>
+        </w:tc>
+        <w:tc>
+          <w:tcPr/>
+          <w:p>
+            <w:pPr>
+              <w:pStyle w:val="Compact"/>
+            </w:pPr>
+            <w:r>
+              <w:t xml:space="preserve">5p</w:t>
+            </w:r>
+          </w:p>
+        </w:tc>
+        <w:tc>
+          <w:tcPr/>
+          <w:p>
+            <w:pPr>
+              <w:pStyle w:val="Compact"/>
+            </w:pPr>
+            <w:r>
+              <w:t xml:space="preserve">policy/policies (not privacy, cookie or "policy makers"), legal, terms</w:t>
+            </w:r>
+          </w:p>
+        </w:tc>
+      </w:tr>
+      <w:tr>
+        <w:trPr>
+          <w:cantSplit/>
+        </w:trPr>
+        <w:tc>
+          <w:tcPr/>
+          <w:p>
+            <w:pPr>
+              <w:pStyle w:val="Compact"/>
+            </w:pPr>
+            <w:r>
+              <w:t xml:space="preserve">6</w:t>
+            </w:r>
+          </w:p>
+        </w:tc>
+        <w:tc>
+          <w:tcPr/>
+          <w:p>
+            <w:pPr>
+              <w:pStyle w:val="Compact"/>
+            </w:pPr>
+            <w:r>
+              <w:t xml:space="preserve">5s</w:t>
+            </w:r>
+          </w:p>
+        </w:tc>
+        <w:tc>
+          <w:tcPr/>
+          <w:p>
+            <w:pPr>
+              <w:pStyle w:val="Compact"/>
+            </w:pPr>
+            <w:r>
+              <w:t xml:space="preserve">service/services, catalog/catalogue, resource/resources</w:t>
+            </w:r>
+          </w:p>
+        </w:tc>
+      </w:tr>
     </w:tbl>
+    <w:p>
+      <w:pPr>
+        <w:numPr>
+          <w:ilvl w:val="0"/>
+          <w:numId w:val="1000"/>
+        </w:numPr>
+      </w:pPr>
+      <w:r>
+        <w:t xml:space="preserve">Purposes 5p and 5s are not checklist points. They exist because v3.2 accepts</w:t>
+      </w:r>
+      <w:r>
+        <w:t xml:space="preserve"> </w:t>
+      </w:r>
+      <w:r>
+        <w:t xml:space="preserve">the AUP and UAP "via intermediate web pages linked by the NLP": a page</w:t>
+      </w:r>
+      <w:r>
+        <w:t xml:space="preserve"> </w:t>
+      </w:r>
+      <w:r>
+        <w:t xml:space="preserve">fetched for them is read by 5b and 5c for policy links. They come last, so a</w:t>
+      </w:r>
+      <w:r>
+        <w:t xml:space="preserve"> </w:t>
+      </w:r>
+      <w:r>
+        <w:t xml:space="preserve">per-node cap drops them before a link that settles a point, and a link</w:t>
+      </w:r>
+      <w:r>
+        <w:t xml:space="preserve"> </w:t>
+      </w:r>
+      <w:r>
+        <w:t xml:space="preserve">already chosen for another purpose is not tagged with them.</w:t>
+      </w:r>
+    </w:p>
     <w:p>
       <w:pPr>
         <w:numPr>
@@ -11167,31 +11278,49 @@
         <w:t xml:space="preserve"> </w:t>
       </w:r>
       <w:r>
-        <w:t xml:space="preserve">Catalogue". Under v3.2 they must be accessible "both directly on the NLP</w:t>
-      </w:r>
-      <w:r>
-        <w:t xml:space="preserve"> </w:t>
-      </w:r>
-      <w:r>
-        <w:t xml:space="preserve">presenting the resource to the users and via the link to the resource's entry</w:t>
-      </w:r>
-      <w:r>
-        <w:t xml:space="preserve"> </w:t>
-      </w:r>
-      <w:r>
-        <w:t xml:space="preserve">in the EOSC Catalogue", which the document spells out as: present "for each</w:t>
-      </w:r>
-      <w:r>
-        <w:t xml:space="preserve"> </w:t>
-      </w:r>
-      <w:r>
-        <w:t xml:space="preserve">resource in the EOSC Exchange, both on the NLP itself and in the Metadata about</w:t>
-      </w:r>
-      <w:r>
-        <w:t xml:space="preserve"> </w:t>
-      </w:r>
-      <w:r>
-        <w:t xml:space="preserve">the Resource in the Node Catalogue".</w:t>
+        <w:t xml:space="preserve">Catalogue". Under v3.2 they must be accessible "both on the NLP presenting the</w:t>
+      </w:r>
+      <w:r>
+        <w:t xml:space="preserve"> </w:t>
+      </w:r>
+      <w:r>
+        <w:t xml:space="preserve">resource to the users (directly on the NLP itself or via intermediate web pages</w:t>
+      </w:r>
+      <w:r>
+        <w:t xml:space="preserve"> </w:t>
+      </w:r>
+      <w:r>
+        <w:t xml:space="preserve">linked by the NLP) and via the link to the resource's entry in the EOSC</w:t>
+      </w:r>
+      <w:r>
+        <w:t xml:space="preserve"> </w:t>
+      </w:r>
+      <w:r>
+        <w:t xml:space="preserve">Catalogue", which the document spells out as: present "for each resource in the</w:t>
+      </w:r>
+      <w:r>
+        <w:t xml:space="preserve"> </w:t>
+      </w:r>
+      <w:r>
+        <w:t xml:space="preserve">EOSC Exchange, both on the NLP itself (or on pages linked by the NLP web page)</w:t>
+      </w:r>
+      <w:r>
+        <w:t xml:space="preserve"> </w:t>
+      </w:r>
+      <w:r>
+        <w:t xml:space="preserve">and in the Metadata about the Resource in the Node Catalogue". This is the</w:t>
+      </w:r>
+      <w:r>
+        <w:t xml:space="preserve"> </w:t>
+      </w:r>
+      <w:r>
+        <w:t xml:space="preserve">wording of v3.2 as re-issued on 29 September 2026; the first copy said</w:t>
+      </w:r>
+      <w:r>
+        <w:t xml:space="preserve"> </w:t>
+      </w:r>
+      <w:r>
+        <w:t xml:space="preserve">"directly on the NLP" only, and is discarded.</w:t>
       </w:r>
     </w:p>
     <w:p>
@@ -11527,13 +11656,13 @@
         <w:t xml:space="preserve"> </w:t>
       </w:r>
       <w:r>
-        <w:t xml:space="preserve">under v3.2 it says the description must be both on the NLP and in the</w:t>
-      </w:r>
-      <w:r>
-        <w:t xml:space="preserve"> </w:t>
-      </w:r>
-      <w:r>
-        <w:t xml:space="preserve">Catalogue metadata, and the reviewer action asks for both. There is no branch on</w:t>
+        <w:t xml:space="preserve">under v3.2 it says the description must be both on the NLP (directly or on a</w:t>
+      </w:r>
+      <w:r>
+        <w:t xml:space="preserve"> </w:t>
+      </w:r>
+      <w:r>
+        <w:t xml:space="preserve">page it links to) and in the Catalogue metadata, and the reviewer action asks for both. There is no branch on</w:t>
       </w:r>
       <w:r>
         <w:t xml:space="preserve"> </w:t>
@@ -12400,7 +12529,19 @@
         <w:t xml:space="preserve"> </w:t>
       </w:r>
       <w:r>
-        <w:t xml:space="preserve">true), in this order:</w:t>
+        <w:t xml:space="preserve">true), in this order. "Linked pages read" are the</w:t>
+      </w:r>
+      <w:r>
+        <w:t xml:space="preserve"> </w:t>
+      </w:r>
+      <w:r>
+        <w:t xml:space="preserve">child pages (depth 1 and 2) that returned 2xx, whatever purpose they were</w:t>
+      </w:r>
+      <w:r>
+        <w:t xml:space="preserve"> </w:t>
+      </w:r>
+      <w:r>
+        <w:t xml:space="preserve">fetched for:</w:t>
       </w:r>
     </w:p>
     <w:tbl>
@@ -12465,18 +12606,112 @@
               <w:pStyle w:val="Compact"/>
             </w:pPr>
             <w:r>
-              <w:t xml:space="preserve">6</w:t>
-            </w:r>
-          </w:p>
-        </w:tc>
-        <w:tc>
-          <w:tcPr/>
-          <w:p>
-            <w:pPr>
-              <w:pStyle w:val="Compact"/>
-            </w:pPr>
-            <w:r>
-              <w:t xml:space="preserve">The page links to the</w:t>
+              <w:t xml:space="preserve">6a</w:t>
+            </w:r>
+          </w:p>
+        </w:tc>
+        <w:tc>
+          <w:tcPr/>
+          <w:p>
+            <w:pPr>
+              <w:pStyle w:val="Compact"/>
+            </w:pPr>
+            <w:r>
+              <w:t xml:space="preserve">A linked page read links to the policy (or is itself titled as the policy and reads like one), and that link, if fetched, is broken</w:t>
+            </w:r>
+          </w:p>
+        </w:tc>
+        <w:tc>
+          <w:tcPr/>
+          <w:p>
+            <w:pPr>
+              <w:pStyle w:val="Compact"/>
+            </w:pPr>
+            <w:r>
+              <w:rPr>
+                <w:rStyle w:val="VerbatimChar"/>
+              </w:rPr>
+              <w:t xml:space="preserve">FAIL</w:t>
+            </w:r>
+            <w:r>
+              <w:t xml:space="preserve"> </w:t>
+            </w:r>
+            <w:r>
+              <w:t xml:space="preserve">— the policy is not accessible</w:t>
+            </w:r>
+          </w:p>
+        </w:tc>
+      </w:tr>
+      <w:tr>
+        <w:trPr>
+          <w:cantSplit/>
+        </w:trPr>
+        <w:tc>
+          <w:tcPr/>
+          <w:p>
+            <w:pPr>
+              <w:pStyle w:val="Compact"/>
+            </w:pPr>
+            <w:r>
+              <w:t xml:space="preserve">6b</w:t>
+            </w:r>
+          </w:p>
+        </w:tc>
+        <w:tc>
+          <w:tcPr/>
+          <w:p>
+            <w:pPr>
+              <w:pStyle w:val="Compact"/>
+            </w:pPr>
+            <w:r>
+              <w:t xml:space="preserve">A linked page read links to the policy (or is itself the policy)</w:t>
+            </w:r>
+          </w:p>
+        </w:tc>
+        <w:tc>
+          <w:tcPr/>
+          <w:p>
+            <w:pPr>
+              <w:pStyle w:val="Compact"/>
+            </w:pPr>
+            <w:r>
+              <w:rPr>
+                <w:rStyle w:val="VerbatimChar"/>
+              </w:rPr>
+              <w:t xml:space="preserve">PASS</w:t>
+            </w:r>
+            <w:r>
+              <w:t xml:space="preserve"> </w:t>
+            </w:r>
+            <w:r>
+              <w:t xml:space="preserve">— "via intermediate web pages linked by the NLP"; the evidence names the intermediate page, and the message says whether the policy page itself was fetched</w:t>
+            </w:r>
+          </w:p>
+        </w:tc>
+      </w:tr>
+      <w:tr>
+        <w:trPr>
+          <w:cantSplit/>
+        </w:trPr>
+        <w:tc>
+          <w:tcPr/>
+          <w:p>
+            <w:pPr>
+              <w:pStyle w:val="Compact"/>
+            </w:pPr>
+            <w:r>
+              <w:t xml:space="preserve">7</w:t>
+            </w:r>
+          </w:p>
+        </w:tc>
+        <w:tc>
+          <w:tcPr/>
+          <w:p>
+            <w:pPr>
+              <w:pStyle w:val="Compact"/>
+            </w:pPr>
+            <w:r>
+              <w:t xml:space="preserve">The landing page or a linked page read links to the</w:t>
             </w:r>
             <w:r>
               <w:t xml:space="preserve"> </w:t>
@@ -12528,18 +12763,18 @@
               <w:pStyle w:val="Compact"/>
             </w:pPr>
             <w:r>
-              <w:t xml:space="preserve">7</w:t>
-            </w:r>
-          </w:p>
-        </w:tc>
-        <w:tc>
-          <w:tcPr/>
-          <w:p>
-            <w:pPr>
-              <w:pStyle w:val="Compact"/>
-            </w:pPr>
-            <w:r>
-              <w:t xml:space="preserve">The page links to a</w:t>
+              <w:t xml:space="preserve">8</w:t>
+            </w:r>
+          </w:p>
+        </w:tc>
+        <w:tc>
+          <w:tcPr/>
+          <w:p>
+            <w:pPr>
+              <w:pStyle w:val="Compact"/>
+            </w:pPr>
+            <w:r>
+              <w:t xml:space="preserve">The landing page links to a</w:t>
             </w:r>
             <w:r>
               <w:t xml:space="preserve"> </w:t>
@@ -12600,7 +12835,7 @@
               <w:pStyle w:val="Compact"/>
             </w:pPr>
             <w:r>
-              <w:t xml:space="preserve">8</w:t>
+              <w:t xml:space="preserve">9</w:t>
             </w:r>
           </w:p>
         </w:tc>
@@ -12656,7 +12891,85 @@
               <w:pStyle w:val="Compact"/>
             </w:pPr>
             <w:r>
-              <w:t xml:space="preserve">9</w:t>
+              <w:t xml:space="preserve">10</w:t>
+            </w:r>
+          </w:p>
+        </w:tc>
+        <w:tc>
+          <w:tcPr/>
+          <w:p>
+            <w:pPr>
+              <w:pStyle w:val="Compact"/>
+            </w:pPr>
+            <w:r>
+              <w:t xml:space="preserve">The landing page links, on its own site, to a policies, legal, terms, services, catalogue or resources page (</w:t>
+            </w:r>
+            <w:r>
+              <w:rPr>
+                <w:rStyle w:val="VerbatimChar"/>
+              </w:rPr>
+              <w:t xml:space="preserve">POLICY_INDEX_PATTERNS</w:t>
+            </w:r>
+            <w:r>
+              <w:t xml:space="preserve">,</w:t>
+            </w:r>
+            <w:r>
+              <w:t xml:space="preserve"> </w:t>
+            </w:r>
+            <w:r>
+              <w:rPr>
+                <w:rStyle w:val="VerbatimChar"/>
+              </w:rPr>
+              <w:t xml:space="preserve">SERVICE_INDEX_PATTERNS</w:t>
+            </w:r>
+            <w:r>
+              <w:t xml:space="preserve">) that was</w:t>
+            </w:r>
+            <w:r>
+              <w:t xml:space="preserve"> </w:t>
+            </w:r>
+            <w:r>
+              <w:rPr>
+                <w:b/>
+                <w:bCs/>
+              </w:rPr>
+              <w:t xml:space="preserve">not read</w:t>
+            </w:r>
+          </w:p>
+        </w:tc>
+        <w:tc>
+          <w:tcPr/>
+          <w:p>
+            <w:pPr>
+              <w:pStyle w:val="Compact"/>
+            </w:pPr>
+            <w:r>
+              <w:rPr>
+                <w:rStyle w:val="VerbatimChar"/>
+              </w:rPr>
+              <w:t xml:space="preserve">MANUAL_REVIEW</w:t>
+            </w:r>
+            <w:r>
+              <w:t xml:space="preserve"> </w:t>
+            </w:r>
+            <w:r>
+              <w:t xml:space="preserve">— the pointers may be there; the evidence lists up to three such links as "not read"</w:t>
+            </w:r>
+          </w:p>
+        </w:tc>
+      </w:tr>
+      <w:tr>
+        <w:trPr>
+          <w:cantSplit/>
+        </w:trPr>
+        <w:tc>
+          <w:tcPr/>
+          <w:p>
+            <w:pPr>
+              <w:pStyle w:val="Compact"/>
+            </w:pPr>
+            <w:r>
+              <w:t xml:space="preserve">11</w:t>
             </w:r>
           </w:p>
         </w:tc>
@@ -12689,7 +13002,7 @@
               <w:t xml:space="preserve"> </w:t>
             </w:r>
             <w:r>
-              <w:t xml:space="preserve">— no pointer to the policy on the NLP. If the page names the policy in its text without a link, the message says so and the mention is kept in the evidence, but it is still a</w:t>
+              <w:t xml:space="preserve">— no pointer on the landing page nor on any linked page read, and no candidate page left unread. If the page names the policy in its text without a link, the message says so and the mention is kept in the evidence, but it is still a</w:t>
             </w:r>
             <w:r>
               <w:t xml:space="preserve"> </w:t>
@@ -12701,7 +13014,7 @@
               <w:t xml:space="preserve">FAIL</w:t>
             </w:r>
             <w:r>
-              <w:t xml:space="preserve">: naming a document does not make it accessible from the NLP</w:t>
+              <w:t xml:space="preserve">: naming a document does not make it accessible</w:t>
             </w:r>
           </w:p>
         </w:tc>
@@ -12712,6 +13025,53 @@
         <w:pStyle w:val="BodyText"/>
       </w:pPr>
       <w:r>
+        <w:t xml:space="preserve">Branch 10 is what keeps the new rule honest. The checklist accepts any page the</w:t>
+      </w:r>
+      <w:r>
+        <w:t xml:space="preserve"> </w:t>
+      </w:r>
+      <w:r>
+        <w:t xml:space="preserve">NLP links to, and the tool reads at most eight; a</w:t>
+      </w:r>
+      <w:r>
+        <w:t xml:space="preserve"> </w:t>
+      </w:r>
+      <w:r>
+        <w:rPr>
+          <w:rStyle w:val="VerbatimChar"/>
+        </w:rPr>
+        <w:t xml:space="preserve">FAIL</w:t>
+      </w:r>
+      <w:r>
+        <w:t xml:space="preserve"> </w:t>
+      </w:r>
+      <w:r>
+        <w:t xml:space="preserve">asserts that the</w:t>
+      </w:r>
+      <w:r>
+        <w:t xml:space="preserve"> </w:t>
+      </w:r>
+      <w:r>
+        <w:t xml:space="preserve">policy is nowhere the tool could reasonably look, so an unread policies or</w:t>
+      </w:r>
+      <w:r>
+        <w:t xml:space="preserve"> </w:t>
+      </w:r>
+      <w:r>
+        <w:t xml:space="preserve">services page makes it review. Pages on other sites are not candidates, as for</w:t>
+      </w:r>
+      <w:r>
+        <w:t xml:space="preserve"> </w:t>
+      </w:r>
+      <w:r>
+        <w:t xml:space="preserve">the crawl.</w:t>
+      </w:r>
+    </w:p>
+    <w:p>
+      <w:pPr>
+        <w:pStyle w:val="BodyText"/>
+      </w:pPr>
+      <w:r>
         <w:t xml:space="preserve">Branch 1 is weaker than it looks, and the message says so: a link labelled</w:t>
       </w:r>
       <w:r>
@@ -12984,13 +13344,13 @@
         <w:t xml:space="preserve"> </w:t>
       </w:r>
       <w:r>
-        <w:t xml:space="preserve">(v3.2 branch 9).</w:t>
-      </w:r>
-      <w:r>
-        <w:t xml:space="preserve"> </w:t>
-      </w:r>
-      <w:r>
-        <w:t xml:space="preserve">The exceptions in v3.2 branches 6 and 7 come from the checklist's own notes; they</w:t>
+        <w:t xml:space="preserve">(v3.2 branch 11).</w:t>
+      </w:r>
+      <w:r>
+        <w:t xml:space="preserve"> </w:t>
+      </w:r>
+      <w:r>
+        <w:t xml:space="preserve">The exceptions in v3.2 branches 7 and 8 come from the checklist's own notes; they</w:t>
       </w:r>
       <w:r>
         <w:t xml:space="preserve"> </w:t>
@@ -13020,13 +13380,13 @@
         <w:t xml:space="preserve"> </w:t>
       </w:r>
       <w:r>
-        <w:t xml:space="preserve">unique per service" is why a single policy linked from the NLP satisfies the NLP</w:t>
-      </w:r>
-      <w:r>
-        <w:t xml:space="preserve"> </w:t>
-      </w:r>
-      <w:r>
-        <w:t xml:space="preserve">half for every resource: the tool does not ask for one link per resource.</w:t>
+        <w:t xml:space="preserve">unique per service" is why a single policy linked from the NLP, or from a page it</w:t>
+      </w:r>
+      <w:r>
+        <w:t xml:space="preserve"> </w:t>
+      </w:r>
+      <w:r>
+        <w:t xml:space="preserve">links to, satisfies the NLP half for every resource: the tool does not ask for one link per resource.</w:t>
       </w:r>
     </w:p>
     <w:p>
@@ -13034,25 +13394,13 @@
         <w:pStyle w:val="BodyText"/>
       </w:pPr>
       <w:r>
-        <w:t xml:space="preserve">What the stricter rule changed on the published evidence (run</w:t>
-      </w:r>
-      <w:r>
-        <w:t xml:space="preserve"> </w:t>
-      </w:r>
-      <w:r>
-        <w:rPr>
-          <w:rStyle w:val="VerbatimChar"/>
-        </w:rPr>
-        <w:t xml:space="preserve">web-11</w:t>
-      </w:r>
-      <w:r>
-        <w:t xml:space="preserve">, re-scored</w:t>
-      </w:r>
-      <w:r>
-        <w:t xml:space="preserve"> </w:t>
-      </w:r>
-      <w:r>
-        <w:t xml:space="preserve">without contacting any node): 5b and 5c moved from</w:t>
+        <w:t xml:space="preserve">What the rule changed on the published evidence. Under the first copy of v3.2</w:t>
+      </w:r>
+      <w:r>
+        <w:t xml:space="preserve"> </w:t>
+      </w:r>
+      <w:r>
+        <w:t xml:space="preserve">("directly on the NLP"), 5b and 5c moved from</w:t>
       </w:r>
       <w:r>
         <w:t xml:space="preserve"> </w:t>
@@ -13088,25 +13436,13 @@
         <w:t xml:space="preserve"> </w:t>
       </w:r>
       <w:r>
-        <w:t xml:space="preserve">CERN, Data Terra and PaNOSC, whose landing pages link to neither policy nor to a</w:t>
-      </w:r>
-      <w:r>
-        <w:t xml:space="preserve"> </w:t>
-      </w:r>
-      <w:r>
-        <w:t xml:space="preserve">licence. Every other cell is unchanged: eight nodes link one of the two policies</w:t>
-      </w:r>
-      <w:r>
-        <w:t xml:space="preserve"> </w:t>
-      </w:r>
-      <w:r>
-        <w:t xml:space="preserve">and get review on the other (v3.2 branch 6), Slovakia links one document labelled</w:t>
-      </w:r>
-      <w:r>
-        <w:t xml:space="preserve"> </w:t>
-      </w:r>
-      <w:r>
-        <w:t xml:space="preserve">as both, and GÉANT's page was not served (branch 8). Run</w:t>
+        <w:t xml:space="preserve">CERN, Data Terra and PaNOSC, whose landing pages link to neither policy nor a</w:t>
+      </w:r>
+      <w:r>
+        <w:t xml:space="preserve"> </w:t>
+      </w:r>
+      <w:r>
+        <w:t xml:space="preserve">licence; runs</w:t>
       </w:r>
       <w:r>
         <w:t xml:space="preserve"> </w:t>
@@ -13118,13 +13454,10 @@
         <w:t xml:space="preserve">web-12</w:t>
       </w:r>
       <w:r>
-        <w:t xml:space="preserve">, the first</w:t>
-      </w:r>
-      <w:r>
-        <w:t xml:space="preserve"> </w:t>
-      </w:r>
-      <w:r>
-        <w:t xml:space="preserve">collected under v3.2, gave the same verdicts in all 130 cells, and so did</w:t>
+        <w:t xml:space="preserve"> </w:t>
+      </w:r>
+      <w:r>
+        <w:t xml:space="preserve">and</w:t>
       </w:r>
       <w:r>
         <w:t xml:space="preserve"> </w:t>
@@ -13139,19 +13472,109 @@
         <w:t xml:space="preserve"> </w:t>
       </w:r>
       <w:r>
-        <w:t xml:space="preserve">at</w:t>
-      </w:r>
-      <w:r>
-        <w:t xml:space="preserve"> </w:t>
-      </w:r>
-      <w:r>
-        <w:rPr>
-          <w:rStyle w:val="VerbatimChar"/>
-        </w:rPr>
-        <w:t xml:space="preserve">--depth 2</w:t>
-      </w:r>
-      <w:r>
-        <w:t xml:space="preserve">, at both depths.</w:t>
+        <w:t xml:space="preserve">confirmed it. Under the re-issued v3.2</w:t>
+      </w:r>
+      <w:r>
+        <w:t xml:space="preserve"> </w:t>
+      </w:r>
+      <w:r>
+        <w:t xml:space="preserve">(</w:t>
+      </w:r>
+      <w:r>
+        <w:rPr>
+          <w:rStyle w:val="VerbatimChar"/>
+        </w:rPr>
+        <w:t xml:space="preserve">web-13</w:t>
+      </w:r>
+      <w:r>
+        <w:t xml:space="preserve"> </w:t>
+      </w:r>
+      <w:r>
+        <w:t xml:space="preserve">re-scored as</w:t>
+      </w:r>
+      <w:r>
+        <w:t xml:space="preserve"> </w:t>
+      </w:r>
+      <w:r>
+        <w:rPr>
+          <w:rStyle w:val="VerbatimChar"/>
+        </w:rPr>
+        <w:t xml:space="preserve">web-13-rescored</w:t>
+      </w:r>
+      <w:r>
+        <w:t xml:space="preserve">, without contacting any node), those</w:t>
+      </w:r>
+      <w:r>
+        <w:t xml:space="preserve"> </w:t>
+      </w:r>
+      <w:r>
+        <w:t xml:space="preserve">six cells are review again, now by branch 10: each landing page links to a</w:t>
+      </w:r>
+      <w:r>
+        <w:t xml:space="preserve"> </w:t>
+      </w:r>
+      <w:r>
+        <w:t xml:space="preserve">services or policies page that</w:t>
+      </w:r>
+      <w:r>
+        <w:t xml:space="preserve"> </w:t>
+      </w:r>
+      <w:r>
+        <w:rPr>
+          <w:rStyle w:val="VerbatimChar"/>
+        </w:rPr>
+        <w:t xml:space="preserve">web-13</w:t>
+      </w:r>
+      <w:r>
+        <w:t xml:space="preserve"> </w:t>
+      </w:r>
+      <w:r>
+        <w:t xml:space="preserve">did not read (CERN's "Services" and</w:t>
+      </w:r>
+      <w:r>
+        <w:t xml:space="preserve"> </w:t>
+      </w:r>
+      <w:r>
+        <w:t xml:space="preserve">"Policies", for instance). BBMRI-ERIC's 5b moved from review to</w:t>
+      </w:r>
+      <w:r>
+        <w:t xml:space="preserve"> </w:t>
+      </w:r>
+      <w:r>
+        <w:rPr>
+          <w:rStyle w:val="VerbatimChar"/>
+        </w:rPr>
+        <w:t xml:space="preserve">PASS</w:t>
+      </w:r>
+      <w:r>
+        <w:t xml:space="preserve"> </w:t>
+      </w:r>
+      <w:r>
+        <w:t xml:space="preserve">by branch</w:t>
+      </w:r>
+      <w:r>
+        <w:t xml:space="preserve"> </w:t>
+      </w:r>
+      <w:r>
+        <w:t xml:space="preserve">6b: its Access Policies page links the "Acceptable Use Policy of BBMRI-ERIC</w:t>
+      </w:r>
+      <w:r>
+        <w:t xml:space="preserve"> </w:t>
+      </w:r>
+      <w:r>
+        <w:t xml:space="preserve">Services". Every other cell is unchanged: seven nodes link one of the two</w:t>
+      </w:r>
+      <w:r>
+        <w:t xml:space="preserve"> </w:t>
+      </w:r>
+      <w:r>
+        <w:t xml:space="preserve">policies and get review on the other (branch 7), Slovakia links one document</w:t>
+      </w:r>
+      <w:r>
+        <w:t xml:space="preserve"> </w:t>
+      </w:r>
+      <w:r>
+        <w:t xml:space="preserve">labelled as both, and GÉANT's page was not served (branch 9).</w:t>
       </w:r>
     </w:p>
     <w:p>
@@ -18639,7 +19062,7 @@
         <w:t xml:space="preserve"> </w:t>
       </w:r>
       <w:r>
-        <w:t xml:space="preserve">("130 cells: 49 PASS · 14 FAIL · 67 review");</w:t>
+        <w:t xml:space="preserve">("130 cells: 50 PASS · 8 FAIL · 72 review");</w:t>
       </w:r>
     </w:p>
     <w:p>

</xml_diff>

<commit_message>
Publish run web-14 (depth 2, re-issued checklist v3.2, 52/10/68 at both depths; CERN passes 5b/5c via its Policies page, Data Terra fails them); crawler: exclude hyphenated privacy/cookie policy addresses, look for intermediate item-5 pages on the landing page only; mask personal names and citation author lists; docs and Word/PDF guides updated
</commit_message>
<xml_diff>
--- a/docs/eosc-basic-compliance-analysis-workflow.docx
+++ b/docs/eosc-basic-compliance-analysis-workflow.docx
@@ -5037,7 +5037,40 @@
         <w:t xml:space="preserve"> </w:t>
       </w:r>
       <w:r>
-        <w:t xml:space="preserve">already chosen for another purpose is not tagged with them.</w:t>
+        <w:t xml:space="preserve">already chosen for another purpose is not tagged with them. They are looked</w:t>
+      </w:r>
+      <w:r>
+        <w:t xml:space="preserve"> </w:t>
+      </w:r>
+      <w:r>
+        <w:t xml:space="preserve">for on the landing page only, never at depth 2: in run</w:t>
+      </w:r>
+      <w:r>
+        <w:t xml:space="preserve"> </w:t>
+      </w:r>
+      <w:r>
+        <w:rPr>
+          <w:rStyle w:val="VerbatimChar"/>
+        </w:rPr>
+        <w:t xml:space="preserve">web-14</w:t>
+      </w:r>
+      <w:r>
+        <w:t xml:space="preserve"> </w:t>
+      </w:r>
+      <w:r>
+        <w:t xml:space="preserve">looking for</w:t>
+      </w:r>
+      <w:r>
+        <w:t xml:space="preserve"> </w:t>
+      </w:r>
+      <w:r>
+        <w:t xml:space="preserve">them at the second hop too used the whole fetch budget. A link is excluded</w:t>
+      </w:r>
+      <w:r>
+        <w:t xml:space="preserve"> </w:t>
+      </w:r>
+      <w:r>
+        <w:t xml:space="preserve">from 5p when its label or address mentions privacy or cookies.</w:t>
       </w:r>
     </w:p>
     <w:p>
@@ -13574,7 +13607,55 @@
         <w:t xml:space="preserve"> </w:t>
       </w:r>
       <w:r>
-        <w:t xml:space="preserve">labelled as both, and GÉANT's page was not served (branch 9).</w:t>
+        <w:t xml:space="preserve">labelled as both, and GÉANT's page was not served (branch 9). Run</w:t>
+      </w:r>
+      <w:r>
+        <w:t xml:space="preserve"> </w:t>
+      </w:r>
+      <w:r>
+        <w:rPr>
+          <w:rStyle w:val="VerbatimChar"/>
+        </w:rPr>
+        <w:t xml:space="preserve">web-14</w:t>
+      </w:r>
+      <w:r>
+        <w:t xml:space="preserve">,</w:t>
+      </w:r>
+      <w:r>
+        <w:t xml:space="preserve"> </w:t>
+      </w:r>
+      <w:r>
+        <w:t xml:space="preserve">the first collection under the re-issued v3.2, read those pages: CERN's 5b and</w:t>
+      </w:r>
+      <w:r>
+        <w:t xml:space="preserve"> </w:t>
+      </w:r>
+      <w:r>
+        <w:t xml:space="preserve">5c pass by branch 6b (its "Policies" page links both policies, which were</w:t>
+      </w:r>
+      <w:r>
+        <w:t xml:space="preserve"> </w:t>
+      </w:r>
+      <w:r>
+        <w:t xml:space="preserve">fetched), Data Terra's fail by branch 11 (its two services pages were read and</w:t>
+      </w:r>
+      <w:r>
+        <w:t xml:space="preserve"> </w:t>
+      </w:r>
+      <w:r>
+        <w:t xml:space="preserve">link neither; they are in French, which the English vocabulary does not</w:t>
+      </w:r>
+      <w:r>
+        <w:t xml:space="preserve"> </w:t>
+      </w:r>
+      <w:r>
+        <w:t xml:space="preserve">cover), and PaNOSC's stay review by branch 10 (its services site was not</w:t>
+      </w:r>
+      <w:r>
+        <w:t xml:space="preserve"> </w:t>
+      </w:r>
+      <w:r>
+        <w:t xml:space="preserve">read).</w:t>
       </w:r>
     </w:p>
     <w:p>
@@ -19062,7 +19143,7 @@
         <w:t xml:space="preserve"> </w:t>
       </w:r>
       <w:r>
-        <w:t xml:space="preserve">("130 cells: 50 PASS · 8 FAIL · 72 review");</w:t>
+        <w:t xml:space="preserve">("130 cells: 52 PASS · 10 FAIL · 68 review");</w:t>
       </w:r>
     </w:p>
     <w:p>

</xml_diff>

<commit_message>
Publish run web-15 (depth 2, re-issued checklist v3.2, 53/9/68 at both depths, 95 requests; EGI point 4 now passes); names and CERN screenshot masked as in web-14; update-row test no longer assumes EGI's published verdict; docs and Word/PDF guides updated
</commit_message>
<xml_diff>
--- a/docs/eosc-basic-compliance-analysis-workflow.docx
+++ b/docs/eosc-basic-compliance-analysis-workflow.docx
@@ -13655,7 +13655,25 @@
         <w:t xml:space="preserve"> </w:t>
       </w:r>
       <w:r>
-        <w:t xml:space="preserve">read).</w:t>
+        <w:t xml:space="preserve">read). Run</w:t>
+      </w:r>
+      <w:r>
+        <w:t xml:space="preserve"> </w:t>
+      </w:r>
+      <w:r>
+        <w:rPr>
+          <w:rStyle w:val="VerbatimChar"/>
+        </w:rPr>
+        <w:t xml:space="preserve">web-15</w:t>
+      </w:r>
+      <w:r>
+        <w:t xml:space="preserve">, with the second hop no longer looking for services</w:t>
+      </w:r>
+      <w:r>
+        <w:t xml:space="preserve"> </w:t>
+      </w:r>
+      <w:r>
+        <w:t xml:space="preserve">pages, kept all three.</w:t>
       </w:r>
     </w:p>
     <w:p>
@@ -19143,7 +19161,7 @@
         <w:t xml:space="preserve"> </w:t>
       </w:r>
       <w:r>
-        <w:t xml:space="preserve">("130 cells: 52 PASS · 10 FAIL · 68 review");</w:t>
+        <w:t xml:space="preserve">("130 cells: 53 PASS · 9 FAIL · 68 review");</w:t>
       </w:r>
     </w:p>
     <w:p>

</xml_diff>

<commit_message>
Publish run web-16 (depth 2, re-issued checklist v3.2, 57/6/67 at both depths, 109 requests): GÉANT served again (1, 4, 5b, 6 pass), Czechia 4 and 5c and EGI 5c pass, Italy HTTP 503 (all review, also on a single-node retry); about 120 GÉANT names masked; names test expects GÉANT's match; docs and Word/PDF guides updated
</commit_message>
<xml_diff>
--- a/docs/eosc-basic-compliance-analysis-workflow.docx
+++ b/docs/eosc-basic-compliance-analysis-workflow.docx
@@ -13673,7 +13673,19 @@
         <w:t xml:space="preserve"> </w:t>
       </w:r>
       <w:r>
-        <w:t xml:space="preserve">pages, kept all three.</w:t>
+        <w:t xml:space="preserve">pages, kept all three, and so did</w:t>
+      </w:r>
+      <w:r>
+        <w:t xml:space="preserve"> </w:t>
+      </w:r>
+      <w:r>
+        <w:rPr>
+          <w:rStyle w:val="VerbatimChar"/>
+        </w:rPr>
+        <w:t xml:space="preserve">web-16</w:t>
+      </w:r>
+      <w:r>
+        <w:t xml:space="preserve">.</w:t>
       </w:r>
     </w:p>
     <w:p>
@@ -19161,7 +19173,7 @@
         <w:t xml:space="preserve"> </w:t>
       </w:r>
       <w:r>
-        <w:t xml:space="preserve">("130 cells: 53 PASS · 9 FAIL · 68 review");</w:t>
+        <w:t xml:space="preserve">("130 cells: 57 PASS · 6 FAIL · 67 review");</w:t>
       </w:r>
     </w:p>
     <w:p>

</xml_diff>

<commit_message>
Publish run web-18 (depth 2, re-issued checklist v3.2, 60/6/64 at both depths, 96 requests): Italy read at https://eosc.it/ for the first time (6 PASS), BBMRI-ERIC row from a single-node run at the www. address (dev3 disallowed by robots.txt), scored with the 5b/5c broken-link fix; GÉANT HTTP 403 again; EOSC DTO 5c passes; names masked; names test expects Italy's match; docs and Word/PDF guides updated
</commit_message>
<xml_diff>
--- a/docs/eosc-basic-compliance-analysis-workflow.docx
+++ b/docs/eosc-basic-compliance-analysis-workflow.docx
@@ -31,7 +31,7 @@
         <w:pStyle w:val="Date"/>
       </w:pPr>
       <w:r>
-        <w:t xml:space="preserve">29 September 2026 (checklist v3.2) — built from the Markdown guides in the same commit</w:t>
+        <w:t xml:space="preserve">1 October 2026 (checklist v3.2) — built from the Markdown guides in the same commit</w:t>
       </w:r>
     </w:p>
     <w:bookmarkStart w:id="9" w:name="contents"/>
@@ -12086,7 +12086,7 @@
               <w:t xml:space="preserve"> </w:t>
             </w:r>
             <w:r>
-              <w:t xml:space="preserve">— the policy is not accessible</w:t>
+              <w:t xml:space="preserve">— the policy is not accessible; but if the page has other links to the policy, pointing elsewhere, branch 1 applies to them and the evidence reports the broken one</w:t>
             </w:r>
           </w:p>
         </w:tc>
@@ -12650,7 +12650,7 @@
               <w:pStyle w:val="Compact"/>
             </w:pPr>
             <w:r>
-              <w:t xml:space="preserve">A linked page read links to the policy (or is itself titled as the policy and reads like one), and that link, if fetched, is broken</w:t>
+              <w:t xml:space="preserve">A linked page read links to the policy (or is itself titled as the policy and reads like one), and every such link that was fetched is broken, with no other left</w:t>
             </w:r>
           </w:p>
         </w:tc>
@@ -13171,6 +13171,56 @@
         <w:pStyle w:val="BodyText"/>
       </w:pPr>
       <w:r>
+        <w:t xml:space="preserve">Branches 2 and 6a fail only when the broken link is the only way to the policy</w:t>
+      </w:r>
+      <w:r>
+        <w:t xml:space="preserve"> </w:t>
+      </w:r>
+      <w:r>
+        <w:t xml:space="preserve">(since 1 October 2026, commit</w:t>
+      </w:r>
+      <w:r>
+        <w:t xml:space="preserve"> </w:t>
+      </w:r>
+      <w:r>
+        <w:rPr>
+          <w:rStyle w:val="VerbatimChar"/>
+        </w:rPr>
+        <w:t xml:space="preserve">1418f05</w:t>
+      </w:r>
+      <w:r>
+        <w:t xml:space="preserve">). EOSC Node Italy linked "Infrastructure</w:t>
+      </w:r>
+      <w:r>
+        <w:t xml:space="preserve"> </w:t>
+      </w:r>
+      <w:r>
+        <w:t xml:space="preserve">AUP/UAP" to a working policy page and "Review resource access conditions" to a</w:t>
+      </w:r>
+      <w:r>
+        <w:t xml:space="preserve"> </w:t>
+      </w:r>
+      <w:r>
+        <w:t xml:space="preserve">404; the tool followed the second and had failed 5c, though the policy was</w:t>
+      </w:r>
+      <w:r>
+        <w:t xml:space="preserve"> </w:t>
+      </w:r>
+      <w:r>
+        <w:t xml:space="preserve">linked. A broken link next to a working one is a defect to report, not an</w:t>
+      </w:r>
+      <w:r>
+        <w:t xml:space="preserve"> </w:t>
+      </w:r>
+      <w:r>
+        <w:t xml:space="preserve">absence.</w:t>
+      </w:r>
+    </w:p>
+    <w:p>
+      <w:pPr>
+        <w:pStyle w:val="BodyText"/>
+      </w:pPr>
+      <w:r>
         <w:t xml:space="preserve">Branch 4's "policy wording" test is</w:t>
       </w:r>
       <w:r>
@@ -13683,6 +13733,21 @@
           <w:rStyle w:val="VerbatimChar"/>
         </w:rPr>
         <w:t xml:space="preserve">web-16</w:t>
+      </w:r>
+      <w:r>
+        <w:t xml:space="preserve"> </w:t>
+      </w:r>
+      <w:r>
+        <w:t xml:space="preserve">and</w:t>
+      </w:r>
+      <w:r>
+        <w:t xml:space="preserve"> </w:t>
+      </w:r>
+      <w:r>
+        <w:rPr>
+          <w:rStyle w:val="VerbatimChar"/>
+        </w:rPr>
+        <w:t xml:space="preserve">web-18</w:t>
       </w:r>
       <w:r>
         <w:t xml:space="preserve">.</w:t>
@@ -18369,70 +18434,58 @@
         <w:t xml:space="preserve"> </w:t>
       </w:r>
       <w:r>
-        <w:t xml:space="preserve">capture, with its date.</w:t>
-      </w:r>
-      <w:r>
-        <w:t xml:space="preserve"> </w:t>
-      </w:r>
-      <w:r>
-        <w:rPr>
-          <w:rStyle w:val="VerbatimChar"/>
-        </w:rPr>
-        <w:t xml:space="preserve">--skip Italy</w:t>
-      </w:r>
-      <w:r>
-        <w:t xml:space="preserve"> </w:t>
-      </w:r>
-      <w:r>
-        <w:t xml:space="preserve">keeps the same scope as the published</w:t>
-      </w:r>
-      <w:r>
-        <w:t xml:space="preserve"> </w:t>
-      </w:r>
-      <w:r>
-        <w:t xml:space="preserve">run. Italy's URL changed on 26 September to</w:t>
-      </w:r>
-      <w:r>
-        <w:t xml:space="preserve"> </w:t>
-      </w:r>
-      <w:r>
-        <w:rPr>
-          <w:rStyle w:val="VerbatimChar"/>
-        </w:rPr>
-        <w:t xml:space="preserve">https://eoscnode-it.d4science.org/</w:t>
-      </w:r>
-      <w:r>
-        <w:t xml:space="preserve">; drop</w:t>
-      </w:r>
-      <w:r>
-        <w:t xml:space="preserve"> </w:t>
-      </w:r>
-      <w:r>
-        <w:rPr>
-          <w:rStyle w:val="VerbatimChar"/>
-        </w:rPr>
-        <w:t xml:space="preserve">--skip Italy</w:t>
-      </w:r>
-      <w:r>
-        <w:t xml:space="preserve"> </w:t>
-      </w:r>
-      <w:r>
-        <w:t xml:space="preserve">once a trial</w:t>
-      </w:r>
-      <w:r>
-        <w:t xml:space="preserve"> </w:t>
-      </w:r>
-      <w:r>
-        <w:t xml:space="preserve">collection (</w:t>
-      </w:r>
-      <w:r>
-        <w:rPr>
-          <w:rStyle w:val="VerbatimChar"/>
-        </w:rPr>
-        <w:t xml:space="preserve">collect --only eosc-it --results /tmp/trial</w:t>
-      </w:r>
-      <w:r>
-        <w:t xml:space="preserve">) shows the page loads.</w:t>
+        <w:t xml:space="preserve">capture, with its date. The published run includes Italy, read at</w:t>
+      </w:r>
+      <w:r>
+        <w:t xml:space="preserve"> </w:t>
+      </w:r>
+      <w:r>
+        <w:rPr>
+          <w:rStyle w:val="VerbatimChar"/>
+        </w:rPr>
+        <w:t xml:space="preserve">https://eosc.it/</w:t>
+      </w:r>
+      <w:r>
+        <w:t xml:space="preserve"> </w:t>
+      </w:r>
+      <w:r>
+        <w:t xml:space="preserve">since 1 October 2026, so no</w:t>
+      </w:r>
+      <w:r>
+        <w:t xml:space="preserve"> </w:t>
+      </w:r>
+      <w:r>
+        <w:rPr>
+          <w:rStyle w:val="VerbatimChar"/>
+        </w:rPr>
+        <w:t xml:space="preserve">--skip</w:t>
+      </w:r>
+      <w:r>
+        <w:t xml:space="preserve"> </w:t>
+      </w:r>
+      <w:r>
+        <w:t xml:space="preserve">is needed; skip a node</w:t>
+      </w:r>
+      <w:r>
+        <w:t xml:space="preserve"> </w:t>
+      </w:r>
+      <w:r>
+        <w:t xml:space="preserve">only while a trial collection (</w:t>
+      </w:r>
+      <w:r>
+        <w:rPr>
+          <w:rStyle w:val="VerbatimChar"/>
+        </w:rPr>
+        <w:t xml:space="preserve">collect --only &lt;id&gt; --results /tmp/trial</w:t>
+      </w:r>
+      <w:r>
+        <w:t xml:space="preserve">)</w:t>
+      </w:r>
+      <w:r>
+        <w:t xml:space="preserve"> </w:t>
+      </w:r>
+      <w:r>
+        <w:t xml:space="preserve">shows its page does not load.</w:t>
       </w:r>
     </w:p>
     <w:p>
@@ -19173,7 +19226,7 @@
         <w:t xml:space="preserve"> </w:t>
       </w:r>
       <w:r>
-        <w:t xml:space="preserve">("130 cells: 57 PASS · 6 FAIL · 67 review");</w:t>
+        <w:t xml:space="preserve">("130 cells: 60 PASS · 6 FAIL · 64 review");</w:t>
       </w:r>
     </w:p>
     <w:p>

</xml_diff>

<commit_message>
Publish run web-21 (depth 2, re-issued checklist v3.2, 63/3/64 at both depths, 98 requests): Data Terra read at https://www.earth-data.eu/ for the first time (4, 5b, 6 pass; 5c review); no other row changed; one image-credit name masked; names test expects Data Terra's match; docs and Word/PDF guides updated
</commit_message>
<xml_diff>
--- a/docs/eosc-basic-compliance-analysis-workflow.docx
+++ b/docs/eosc-basic-compliance-analysis-workflow.docx
@@ -13750,7 +13750,34 @@
         <w:t xml:space="preserve">web-18</w:t>
       </w:r>
       <w:r>
-        <w:t xml:space="preserve">.</w:t>
+        <w:t xml:space="preserve">. In</w:t>
+      </w:r>
+      <w:r>
+        <w:t xml:space="preserve"> </w:t>
+      </w:r>
+      <w:r>
+        <w:rPr>
+          <w:rStyle w:val="VerbatimChar"/>
+        </w:rPr>
+        <w:t xml:space="preserve">web-21</w:t>
+      </w:r>
+      <w:r>
+        <w:t xml:space="preserve"> </w:t>
+      </w:r>
+      <w:r>
+        <w:t xml:space="preserve">Data Terra was read at its new address,</w:t>
+      </w:r>
+      <w:r>
+        <w:t xml:space="preserve"> </w:t>
+      </w:r>
+      <w:r>
+        <w:rPr>
+          <w:rStyle w:val="VerbatimChar"/>
+        </w:rPr>
+        <w:t xml:space="preserve">www.earth-data.eu</w:t>
+      </w:r>
+      <w:r>
+        <w:t xml:space="preserve">, which links an AUP: 5b passes by branch 1 and 5c is review by branch 7.</w:t>
       </w:r>
     </w:p>
     <w:p>
@@ -19226,7 +19253,7 @@
         <w:t xml:space="preserve"> </w:t>
       </w:r>
       <w:r>
-        <w:t xml:space="preserve">("130 cells: 60 PASS · 6 FAIL · 64 review");</w:t>
+        <w:t xml:space="preserve">("130 cells: 63 PASS · 3 FAIL · 64 review");</w:t>
       </w:r>
     </w:p>
     <w:p>

</xml_diff>

<commit_message>
Publish run web-22 (depth 2, re-issued checklist v3.2, 68/3/59 at both depths, 118 requests): GÉANT served (1, 4, 5b, 6 pass); PaNOSC 5c and 6 pass; EUDAT 6 to review (helpdesk link gone from its redesigned page); GÉANT, EUDAT and image-credit names masked; names test expects GÉANT's match; docs and Word/PDF guides updated
</commit_message>
<xml_diff>
--- a/docs/eosc-basic-compliance-analysis-workflow.docx
+++ b/docs/eosc-basic-compliance-analysis-workflow.docx
@@ -31,7 +31,7 @@
         <w:pStyle w:val="Date"/>
       </w:pPr>
       <w:r>
-        <w:t xml:space="preserve">1 October 2026 (checklist v3.2) — built from the Markdown guides in the same commit</w:t>
+        <w:t xml:space="preserve">2 October 2026 (checklist v3.2) — built from the Markdown guides in the same commit</w:t>
       </w:r>
     </w:p>
     <w:bookmarkStart w:id="9" w:name="contents"/>
@@ -13777,7 +13777,22 @@
         <w:t xml:space="preserve">www.earth-data.eu</w:t>
       </w:r>
       <w:r>
-        <w:t xml:space="preserve">, which links an AUP: 5b passes by branch 1 and 5c is review by branch 7.</w:t>
+        <w:t xml:space="preserve">, which links an AUP: 5b passes by branch 1 and 5c is review by branch 7. In</w:t>
+      </w:r>
+      <w:r>
+        <w:t xml:space="preserve"> </w:t>
+      </w:r>
+      <w:r>
+        <w:rPr>
+          <w:rStyle w:val="VerbatimChar"/>
+        </w:rPr>
+        <w:t xml:space="preserve">web-22</w:t>
+      </w:r>
+      <w:r>
+        <w:t xml:space="preserve"> </w:t>
+      </w:r>
+      <w:r>
+        <w:t xml:space="preserve">PaNOSC links "Acceptable User Policy and User Access Policy" to a user-policies page: 5c passes by branch 5, and 5b is review by branch 7, because "Acceptable User Policy" does not match the AUP vocabulary.</w:t>
       </w:r>
     </w:p>
     <w:p>
@@ -19253,7 +19268,7 @@
         <w:t xml:space="preserve"> </w:t>
       </w:r>
       <w:r>
-        <w:t xml:space="preserve">("130 cells: 63 PASS · 3 FAIL · 64 review");</w:t>
+        <w:t xml:space="preserve">("130 cells: 68 PASS · 3 FAIL · 59 review");</w:t>
       </w:r>
     </w:p>
     <w:p>

</xml_diff>

<commit_message>
Publish run web-23 (depth 2, re-issued checklist v3.2, 66/1/63 at both depths, 102 requests): PaNOSC and Poland now link their eosc.eu entries (point 4 passes), EOSC Finland point 4 is the only FAIL; GÉANT behind the Cloudflare challenge again (1, 4, 5b, 6 to review); names masked as before; names test expects Poland's match; docs and Word/PDF guides updated
</commit_message>
<xml_diff>
--- a/docs/eosc-basic-compliance-analysis-workflow.docx
+++ b/docs/eosc-basic-compliance-analysis-workflow.docx
@@ -31,7 +31,7 @@
         <w:pStyle w:val="Date"/>
       </w:pPr>
       <w:r>
-        <w:t xml:space="preserve">2 October 2026 (checklist v3.2) — built from the Markdown guides in the same commit</w:t>
+        <w:t xml:space="preserve">2 October 2026, evening (checklist v3.2) — built from the Markdown guides in the same commit</w:t>
       </w:r>
     </w:p>
     <w:bookmarkStart w:id="9" w:name="contents"/>
@@ -19268,7 +19268,7 @@
         <w:t xml:space="preserve"> </w:t>
       </w:r>
       <w:r>
-        <w:t xml:space="preserve">("130 cells: 68 PASS · 3 FAIL · 59 review");</w:t>
+        <w:t xml:space="preserve">("130 cells: 66 PASS · 1 FAIL · 63 review");</w:t>
       </w:r>
     </w:p>
     <w:p>

</xml_diff>

<commit_message>
Publish run web-24 (depth 2, re-issued checklist v3.2, 60/1/59/10 at both depths, 94 requests): BBMRI-ERIC collected from its new default https://dev3.bbmri-eric.eu/eosc-node-bbmri-eric/, still disallowed by robots.txt, so its ten points are ERROR; Czechia 5c to review, EUDAT 5c to PASS; EOSC Finland point 4 the only FAIL; GÉANT behind the Cloudflare challenge; names masked as before; tests pinned to the new evidence; docs and Word/PDF guides updated
</commit_message>
<xml_diff>
--- a/docs/eosc-basic-compliance-analysis-workflow.docx
+++ b/docs/eosc-basic-compliance-analysis-workflow.docx
@@ -34,82 +34,9 @@
         <w:t xml:space="preserve">2 October 2026, evening (checklist v3.2) — built from the Markdown guides in the same commit</w:t>
       </w:r>
     </w:p>
-    <w:bookmarkStart w:id="9" w:name="contents"/>
-    <w:p>
-      <w:pPr>
-        <w:pStyle w:val="Heading2"/>
-      </w:pPr>
-      <w:r>
-        <w:t xml:space="preserve">Contents</w:t>
-      </w:r>
-    </w:p>
     <w:p>
       <w:pPr>
         <w:pStyle w:val="FirstParagraph"/>
-      </w:pPr>
-      <w:r>
-        <w:t xml:space="preserve">1. The three stages</w:t>
-      </w:r>
-    </w:p>
-    <w:p>
-      <w:pPr>
-        <w:pStyle w:val="BodyText"/>
-      </w:pPr>
-      <w:r>
-        <w:t xml:space="preserve">2. Stage 1 — collection</w:t>
-      </w:r>
-    </w:p>
-    <w:p>
-      <w:pPr>
-        <w:pStyle w:val="BodyText"/>
-      </w:pPr>
-      <w:r>
-        <w:t xml:space="preserve">3. What the evidence contains — and what it does not</w:t>
-      </w:r>
-    </w:p>
-    <w:p>
-      <w:pPr>
-        <w:pStyle w:val="BodyText"/>
-      </w:pPr>
-      <w:r>
-        <w:t xml:space="preserve">4. Stage 2 — the assessment machinery</w:t>
-      </w:r>
-    </w:p>
-    <w:p>
-      <w:pPr>
-        <w:pStyle w:val="BodyText"/>
-      </w:pPr>
-      <w:r>
-        <w:t xml:space="preserve">5. Per-point decision procedures — points 1, 1R, 2, 3, 4, 5a, 5b, 5c, 6, 7</w:t>
-      </w:r>
-    </w:p>
-    <w:p>
-      <w:pPr>
-        <w:pStyle w:val="BodyText"/>
-      </w:pPr>
-      <w:r>
-        <w:t xml:space="preserve">6. Where this workflow is known to be wrong</w:t>
-      </w:r>
-    </w:p>
-    <w:p>
-      <w:pPr>
-        <w:pStyle w:val="BodyText"/>
-      </w:pPr>
-      <w:r>
-        <w:t xml:space="preserve">7. Reading the output</w:t>
-      </w:r>
-    </w:p>
-    <w:p>
-      <w:pPr>
-        <w:pStyle w:val="BodyText"/>
-      </w:pPr>
-      <w:r>
-        <w:t xml:space="preserve">8. Worked examples — adding a node, changing a URL, a new checklist revision</w:t>
-      </w:r>
-    </w:p>
-    <w:p>
-      <w:pPr>
-        <w:pStyle w:val="BodyText"/>
       </w:pPr>
       <w:r>
         <w:t xml:space="preserve">What the test suite actually does, step by step, when it assesses a node against</w:t>
@@ -270,7 +197,7 @@
         <w:t xml:space="preserve"> </w:t>
       </w:r>
       <w:r>
-        <w:t xml:space="preserve">node's URL, and moving to a new checklist revision — with every command.</w:t>
+        <w:t xml:space="preserve">node’s URL, and moving to a new checklist revision — with every command.</w:t>
       </w:r>
     </w:p>
     <w:p>
@@ -280,8 +207,7 @@
         </w:pict>
       </w:r>
     </w:p>
-    <w:bookmarkEnd w:id="9"/>
-    <w:bookmarkStart w:id="14" w:name="the-three-stages"/>
+    <w:bookmarkStart w:id="13" w:name="the-three-stages"/>
     <w:p>
       <w:pPr>
         <w:pStyle w:val="Heading2"/>
@@ -347,7 +273,6 @@
       </w:tblGrid>
       <w:tr>
         <w:trPr>
-          <w:cantSplit/>
           <w:tblHeader w:val="on"/>
         </w:trPr>
         <w:tc>
@@ -407,9 +332,6 @@
         </w:tc>
       </w:tr>
       <w:tr>
-        <w:trPr>
-          <w:cantSplit/>
-        </w:trPr>
         <w:tc>
           <w:tcPr/>
           <w:p>
@@ -491,9 +413,6 @@
         </w:tc>
       </w:tr>
       <w:tr>
-        <w:trPr>
-          <w:cantSplit/>
-        </w:trPr>
         <w:tc>
           <w:tcPr/>
           <w:p>
@@ -570,9 +489,6 @@
         </w:tc>
       </w:tr>
       <w:tr>
-        <w:trPr>
-          <w:cantSplit/>
-        </w:trPr>
         <w:tc>
           <w:tcPr/>
           <w:p>
@@ -755,7 +671,7 @@
           <w:b/>
           <w:bCs/>
         </w:rPr>
-        <w:t xml:space="preserve">A verdict can be re-derived without touching the node's server.</w:t>
+        <w:t xml:space="preserve">A verdict can be re-derived without touching the node’s server.</w:t>
       </w:r>
       <w:r>
         <w:t xml:space="preserve"> </w:t>
@@ -837,7 +753,7 @@
         <w:t xml:space="preserve">, no check can use it — see section 3.</w:t>
       </w:r>
     </w:p>
-    <w:bookmarkStart w:id="13" w:name="Xfc66290f0c5177f1908cc0639df18c8282368f6"/>
+    <w:bookmarkStart w:id="12" w:name="Xfc66290f0c5177f1908cc0639df18c8282368f6"/>
     <w:p>
       <w:pPr>
         <w:pStyle w:val="Heading3"/>
@@ -855,18 +771,18 @@
           <wp:inline>
             <wp:extent cx="4846320" cy="6057899"/>
             <wp:effectExtent b="0" l="0" r="0" t="0"/>
-            <wp:docPr descr="Figure 1. The three phases in execution order: collect contacts the nodes, assess and report work offline, and run performs all three." title="" id="11" name="Picture"/>
+            <wp:docPr descr="Figure 1. The three phases in execution order: collect contacts the nodes, assess and report work offline, and run performs all three." title="" id="10" name="Picture"/>
             <a:graphic>
               <a:graphicData uri="http://schemas.openxmlformats.org/drawingml/2006/picture">
                 <pic:pic>
                   <pic:nvPicPr>
-                    <pic:cNvPr descr="/home/user/workspace/eosc-basic-compliance/docs/img/phases.png" id="12" name="Picture"/>
+                    <pic:cNvPr descr="/home/user/workspace/eosc-basic-compliance/docs/img/phases.png" id="11" name="Picture"/>
                     <pic:cNvPicPr>
                       <a:picLocks noChangeArrowheads="1" noChangeAspect="1"/>
                     </pic:cNvPicPr>
                   </pic:nvPicPr>
                   <pic:blipFill>
-                    <a:blip r:embed="rId10"/>
+                    <a:blip r:embed="rId9"/>
                     <a:stretch>
                       <a:fillRect/>
                     </a:stretch>
@@ -1231,7 +1147,6 @@
       </w:tblGrid>
       <w:tr>
         <w:trPr>
-          <w:cantSplit/>
           <w:tblHeader w:val="on"/>
         </w:trPr>
         <w:tc>
@@ -1303,9 +1218,6 @@
         </w:tc>
       </w:tr>
       <w:tr>
-        <w:trPr>
-          <w:cantSplit/>
-        </w:trPr>
         <w:tc>
           <w:tcPr/>
           <w:p>
@@ -1390,9 +1302,6 @@
         </w:tc>
       </w:tr>
       <w:tr>
-        <w:trPr>
-          <w:cantSplit/>
-        </w:trPr>
         <w:tc>
           <w:tcPr/>
           <w:p>
@@ -1465,9 +1374,6 @@
         </w:tc>
       </w:tr>
       <w:tr>
-        <w:trPr>
-          <w:cantSplit/>
-        </w:trPr>
         <w:tc>
           <w:tcPr/>
           <w:p>
@@ -1531,9 +1437,6 @@
         </w:tc>
       </w:tr>
       <w:tr>
-        <w:trPr>
-          <w:cantSplit/>
-        </w:trPr>
         <w:tc>
           <w:tcPr/>
           <w:p>
@@ -1597,9 +1500,6 @@
         </w:tc>
       </w:tr>
       <w:tr>
-        <w:trPr>
-          <w:cantSplit/>
-        </w:trPr>
         <w:tc>
           <w:tcPr/>
           <w:p>
@@ -1690,9 +1590,6 @@
         </w:tc>
       </w:tr>
       <w:tr>
-        <w:trPr>
-          <w:cantSplit/>
-        </w:trPr>
         <w:tc>
           <w:tcPr/>
           <w:p>
@@ -1762,7 +1659,7 @@
               <w:t xml:space="preserve">--url</w:t>
             </w:r>
             <w:r>
-              <w:t xml:space="preserve">: that node's own</w:t>
+              <w:t xml:space="preserve">: that node’s own</w:t>
             </w:r>
             <w:r>
               <w:t xml:space="preserve"> </w:t>
@@ -1783,9 +1680,6 @@
         </w:tc>
       </w:tr>
       <w:tr>
-        <w:trPr>
-          <w:cantSplit/>
-        </w:trPr>
         <w:tc>
           <w:tcPr/>
           <w:p>
@@ -1858,9 +1752,6 @@
         </w:tc>
       </w:tr>
       <w:tr>
-        <w:trPr>
-          <w:cantSplit/>
-        </w:trPr>
         <w:tc>
           <w:tcPr/>
           <w:p>
@@ -1924,9 +1815,6 @@
         </w:tc>
       </w:tr>
       <w:tr>
-        <w:trPr>
-          <w:cantSplit/>
-        </w:trPr>
         <w:tc>
           <w:tcPr/>
           <w:p>
@@ -1990,9 +1878,6 @@
         </w:tc>
       </w:tr>
       <w:tr>
-        <w:trPr>
-          <w:cantSplit/>
-        </w:trPr>
         <w:tc>
           <w:tcPr/>
           <w:p>
@@ -2071,9 +1956,6 @@
         </w:tc>
       </w:tr>
       <w:tr>
-        <w:trPr>
-          <w:cantSplit/>
-        </w:trPr>
         <w:tc>
           <w:tcPr/>
           <w:p>
@@ -2137,9 +2019,6 @@
         </w:tc>
       </w:tr>
       <w:tr>
-        <w:trPr>
-          <w:cantSplit/>
-        </w:trPr>
         <w:tc>
           <w:tcPr/>
           <w:p>
@@ -2227,9 +2106,6 @@
         </w:tc>
       </w:tr>
       <w:tr>
-        <w:trPr>
-          <w:cantSplit/>
-        </w:trPr>
         <w:tc>
           <w:tcPr/>
           <w:p>
@@ -2305,9 +2181,6 @@
         </w:tc>
       </w:tr>
       <w:tr>
-        <w:trPr>
-          <w:cantSplit/>
-        </w:trPr>
         <w:tc>
           <w:tcPr/>
           <w:p>
@@ -2371,9 +2244,6 @@
         </w:tc>
       </w:tr>
       <w:tr>
-        <w:trPr>
-          <w:cantSplit/>
-        </w:trPr>
         <w:tc>
           <w:tcPr/>
           <w:p>
@@ -2437,9 +2307,6 @@
         </w:tc>
       </w:tr>
       <w:tr>
-        <w:trPr>
-          <w:cantSplit/>
-        </w:trPr>
         <w:tc>
           <w:tcPr/>
           <w:p>
@@ -2503,9 +2370,6 @@
         </w:tc>
       </w:tr>
       <w:tr>
-        <w:trPr>
-          <w:cantSplit/>
-        </w:trPr>
         <w:tc>
           <w:tcPr/>
           <w:p>
@@ -2563,7 +2427,7 @@
               <w:pStyle w:val="Compact"/>
             </w:pPr>
             <w:r>
-              <w:t xml:space="preserve">Update only that node's row in the stored results;</w:t>
+              <w:t xml:space="preserve">Update only that node’s row in the stored results;</w:t>
             </w:r>
             <w:r>
               <w:t xml:space="preserve"> </w:t>
@@ -2599,9 +2463,6 @@
         </w:tc>
       </w:tr>
       <w:tr>
-        <w:trPr>
-          <w:cantSplit/>
-        </w:trPr>
         <w:tc>
           <w:tcPr/>
           <w:p>
@@ -2746,7 +2607,7 @@
         <w:t xml:space="preserve"> </w:t>
       </w:r>
       <w:r>
-        <w:t xml:space="preserve">checklist or the approved-name list differs from the stored results', because</w:t>
+        <w:t xml:space="preserve">checklist or the approved-name list differs from the stored results’, because</w:t>
       </w:r>
       <w:r>
         <w:t xml:space="preserve"> </w:t>
@@ -2776,7 +2637,6 @@
       </w:tblGrid>
       <w:tr>
         <w:trPr>
-          <w:cantSplit/>
           <w:tblHeader w:val="on"/>
         </w:trPr>
         <w:tc>
@@ -2819,15 +2679,12 @@
               <w:pStyle w:val="Compact"/>
             </w:pPr>
             <w:r>
-              <w:t xml:space="preserve">The other nodes' rows</w:t>
+              <w:t xml:space="preserve">The other nodes’ rows</w:t>
             </w:r>
           </w:p>
         </w:tc>
       </w:tr>
       <w:tr>
-        <w:trPr>
-          <w:cantSplit/>
-        </w:trPr>
         <w:tc>
           <w:tcPr/>
           <w:p>
@@ -2953,9 +2810,6 @@
         </w:tc>
       </w:tr>
       <w:tr>
-        <w:trPr>
-          <w:cantSplit/>
-        </w:trPr>
         <w:tc>
           <w:tcPr/>
           <w:p>
@@ -3039,9 +2893,6 @@
         </w:tc>
       </w:tr>
       <w:tr>
-        <w:trPr>
-          <w:cantSplit/>
-        </w:trPr>
         <w:tc>
           <w:tcPr/>
           <w:p>
@@ -3053,7 +2904,7 @@
                 <w:b/>
                 <w:bCs/>
               </w:rPr>
-              <w:t xml:space="preserve">Change a node's landing page URL</w:t>
+              <w:t xml:space="preserve">Change a node’s landing page URL</w:t>
             </w:r>
             <w:r>
               <w:t xml:space="preserve"> </w:t>
@@ -3110,9 +2961,6 @@
         </w:tc>
       </w:tr>
       <w:tr>
-        <w:trPr>
-          <w:cantSplit/>
-        </w:trPr>
         <w:tc>
           <w:tcPr/>
           <w:p>
@@ -3211,9 +3059,6 @@
         </w:tc>
       </w:tr>
       <w:tr>
-        <w:trPr>
-          <w:cantSplit/>
-        </w:trPr>
         <w:tc>
           <w:tcPr/>
           <w:p>
@@ -3326,7 +3171,7 @@
         <w:t xml:space="preserve"> </w:t>
       </w:r>
       <w:r>
-        <w:t xml:space="preserve">alone is not enough after a URL change. The node's evidence still</w:t>
+        <w:t xml:space="preserve">alone is not enough after a URL change. The node’s evidence still</w:t>
       </w:r>
       <w:r>
         <w:t xml:space="preserve"> </w:t>
@@ -3546,9 +3391,9 @@
         </w:pict>
       </w:r>
     </w:p>
+    <w:bookmarkEnd w:id="12"/>
     <w:bookmarkEnd w:id="13"/>
-    <w:bookmarkEnd w:id="14"/>
-    <w:bookmarkStart w:id="15" w:name="stage-1-collection"/>
+    <w:bookmarkStart w:id="14" w:name="stage-1-collection"/>
     <w:p>
       <w:pPr>
         <w:pStyle w:val="Heading2"/>
@@ -3634,7 +3479,7 @@
         <w:t xml:space="preserve">httpx</w:t>
       </w:r>
       <w:r>
-        <w:t xml:space="preserve">, not the browser), with the tool's</w:t>
+        <w:t xml:space="preserve">, not the browser), with the tool’s</w:t>
       </w:r>
       <w:r>
         <w:t xml:space="preserve"> </w:t>
@@ -3704,7 +3549,7 @@
         <w:t xml:space="preserve"> </w:t>
       </w:r>
       <w:r>
-        <w:t xml:space="preserve">hypothetical: on a trial run on 25 September 2026, BBMRI-ERIC's new</w:t>
+        <w:t xml:space="preserve">hypothetical: on a trial run on 25 September 2026, BBMRI-ERIC’s new</w:t>
       </w:r>
       <w:r>
         <w:t xml:space="preserve"> </w:t>
@@ -3776,7 +3621,16 @@
         </w:numPr>
       </w:pPr>
       <w:r>
-        <w:t xml:space="preserve">HTTP ≠ 200 → treated as "nothing disallowed", proceed;</w:t>
+        <w:t xml:space="preserve">HTTP ≠ 200 → treated as</w:t>
+      </w:r>
+      <w:r>
+        <w:t xml:space="preserve"> </w:t>
+      </w:r>
+      <w:r>
+        <w:t xml:space="preserve">“nothing disallowed”</w:t>
+      </w:r>
+      <w:r>
+        <w:t xml:space="preserve">, proceed;</w:t>
       </w:r>
     </w:p>
     <w:p>
@@ -4241,7 +4095,7 @@
         <w:t xml:space="preserve">img</w:t>
       </w:r>
       <w:r>
-        <w:t xml:space="preserve">'s</w:t>
+        <w:t xml:space="preserve">’s</w:t>
       </w:r>
       <w:r>
         <w:t xml:space="preserve"> </w:t>
@@ -4532,7 +4386,7 @@
         <w:t xml:space="preserve"> </w:t>
       </w:r>
       <w:r>
-        <w:t xml:space="preserve">element's</w:t>
+        <w:t xml:space="preserve">element’s</w:t>
       </w:r>
       <w:r>
         <w:t xml:space="preserve"> </w:t>
@@ -4670,7 +4524,7 @@
         <w:t xml:space="preserve"> </w:t>
       </w:r>
       <w:r>
-        <w:t xml:space="preserve">extension, is on the node's own host or a related host, and its combined link</w:t>
+        <w:t xml:space="preserve">extension, is on the node’s own host or a related host, and its combined link</w:t>
       </w:r>
       <w:r>
         <w:t xml:space="preserve"> </w:t>
@@ -4739,7 +4593,6 @@
       </w:tblGrid>
       <w:tr>
         <w:trPr>
-          <w:cantSplit/>
           <w:tblHeader w:val="on"/>
         </w:trPr>
         <w:tc>
@@ -4777,9 +4630,6 @@
         </w:tc>
       </w:tr>
       <w:tr>
-        <w:trPr>
-          <w:cantSplit/>
-        </w:trPr>
         <w:tc>
           <w:tcPr/>
           <w:p>
@@ -4815,9 +4665,6 @@
         </w:tc>
       </w:tr>
       <w:tr>
-        <w:trPr>
-          <w:cantSplit/>
-        </w:trPr>
         <w:tc>
           <w:tcPr/>
           <w:p>
@@ -4853,9 +4700,6 @@
         </w:tc>
       </w:tr>
       <w:tr>
-        <w:trPr>
-          <w:cantSplit/>
-        </w:trPr>
         <w:tc>
           <w:tcPr/>
           <w:p>
@@ -4891,9 +4735,6 @@
         </w:tc>
       </w:tr>
       <w:tr>
-        <w:trPr>
-          <w:cantSplit/>
-        </w:trPr>
         <w:tc>
           <w:tcPr/>
           <w:p>
@@ -4929,9 +4770,6 @@
         </w:tc>
       </w:tr>
       <w:tr>
-        <w:trPr>
-          <w:cantSplit/>
-        </w:trPr>
         <w:tc>
           <w:tcPr/>
           <w:p>
@@ -4961,15 +4799,21 @@
               <w:pStyle w:val="Compact"/>
             </w:pPr>
             <w:r>
-              <w:t xml:space="preserve">policy/policies (not privacy, cookie or "policy makers"), legal, terms</w:t>
+              <w:t xml:space="preserve">policy/policies (not privacy, cookie or</w:t>
+            </w:r>
+            <w:r>
+              <w:t xml:space="preserve"> </w:t>
+            </w:r>
+            <w:r>
+              <w:t xml:space="preserve">“policy makers”</w:t>
+            </w:r>
+            <w:r>
+              <w:t xml:space="preserve">), legal, terms</w:t>
             </w:r>
           </w:p>
         </w:tc>
       </w:tr>
       <w:tr>
-        <w:trPr>
-          <w:cantSplit/>
-        </w:trPr>
         <w:tc>
           <w:tcPr/>
           <w:p>
@@ -5019,7 +4863,16 @@
         <w:t xml:space="preserve"> </w:t>
       </w:r>
       <w:r>
-        <w:t xml:space="preserve">the AUP and UAP "via intermediate web pages linked by the NLP": a page</w:t>
+        <w:t xml:space="preserve">the AUP and UAP</w:t>
+      </w:r>
+      <w:r>
+        <w:t xml:space="preserve"> </w:t>
+      </w:r>
+      <w:r>
+        <w:t xml:space="preserve">“via intermediate web pages linked by the NLP”</w:t>
+      </w:r>
+      <w:r>
+        <w:t xml:space="preserve">: a page</w:t>
       </w:r>
       <w:r>
         <w:t xml:space="preserve"> </w:t>
@@ -5166,7 +5019,28 @@
         <w:t xml:space="preserve"> </w:t>
       </w:r>
       <w:r>
-        <w:t xml:space="preserve">list is the difference between "checked and absent" and "never looked".</w:t>
+        <w:t xml:space="preserve">list is the difference between</w:t>
+      </w:r>
+      <w:r>
+        <w:t xml:space="preserve"> </w:t>
+      </w:r>
+      <w:r>
+        <w:t xml:space="preserve">“checked and absent”</w:t>
+      </w:r>
+      <w:r>
+        <w:t xml:space="preserve"> </w:t>
+      </w:r>
+      <w:r>
+        <w:t xml:space="preserve">and</w:t>
+      </w:r>
+      <w:r>
+        <w:t xml:space="preserve"> </w:t>
+      </w:r>
+      <w:r>
+        <w:t xml:space="preserve">“never looked”</w:t>
+      </w:r>
+      <w:r>
+        <w:t xml:space="preserve">.</w:t>
       </w:r>
     </w:p>
     <w:p>
@@ -5373,8 +5247,8 @@
         </w:pict>
       </w:r>
     </w:p>
-    <w:bookmarkEnd w:id="15"/>
-    <w:bookmarkStart w:id="16" w:name="X918652c513cf24a1b30a731e09106c31c6d2955"/>
+    <w:bookmarkEnd w:id="14"/>
+    <w:bookmarkStart w:id="15" w:name="X918652c513cf24a1b30a731e09106c31c6d2955"/>
     <w:p>
       <w:pPr>
         <w:pStyle w:val="Heading2"/>
@@ -6112,7 +5986,7 @@
         <w:t xml:space="preserve"> </w:t>
       </w:r>
       <w:r>
-        <w:t xml:space="preserve">person's address or number. Re-assessing the 24 September evidence after masking</w:t>
+        <w:t xml:space="preserve">person’s address or number. Re-assessing the 24 September evidence after masking</w:t>
       </w:r>
       <w:r>
         <w:t xml:space="preserve"> </w:t>
@@ -6215,8 +6089,8 @@
         </w:pict>
       </w:r>
     </w:p>
-    <w:bookmarkEnd w:id="16"/>
-    <w:bookmarkStart w:id="21" w:name="stage-2-the-assessment-machinery"/>
+    <w:bookmarkEnd w:id="15"/>
+    <w:bookmarkStart w:id="20" w:name="stage-2-the-assessment-machinery"/>
     <w:p>
       <w:pPr>
         <w:pStyle w:val="Heading2"/>
@@ -6385,7 +6259,7 @@
         <w:t xml:space="preserve">.</w:t>
       </w:r>
     </w:p>
-    <w:bookmarkStart w:id="17" w:name="the-verdict-vocabulary"/>
+    <w:bookmarkStart w:id="16" w:name="the-verdict-vocabulary"/>
     <w:p>
       <w:pPr>
         <w:pStyle w:val="Heading3"/>
@@ -6407,7 +6281,6 @@
       </w:tblGrid>
       <w:tr>
         <w:trPr>
-          <w:cantSplit/>
           <w:tblHeader w:val="on"/>
         </w:trPr>
         <w:tc>
@@ -6434,9 +6307,6 @@
         </w:tc>
       </w:tr>
       <w:tr>
-        <w:trPr>
-          <w:cantSplit/>
-        </w:trPr>
         <w:tc>
           <w:tcPr/>
           <w:p>
@@ -6464,9 +6334,6 @@
         </w:tc>
       </w:tr>
       <w:tr>
-        <w:trPr>
-          <w:cantSplit/>
-        </w:trPr>
         <w:tc>
           <w:tcPr/>
           <w:p>
@@ -6494,9 +6361,6 @@
         </w:tc>
       </w:tr>
       <w:tr>
-        <w:trPr>
-          <w:cantSplit/>
-        </w:trPr>
         <w:tc>
           <w:tcPr/>
           <w:p>
@@ -6524,9 +6388,6 @@
         </w:tc>
       </w:tr>
       <w:tr>
-        <w:trPr>
-          <w:cantSplit/>
-        </w:trPr>
         <w:tc>
           <w:tcPr/>
           <w:p>
@@ -6574,13 +6435,31 @@
         <w:t xml:space="preserve"> </w:t>
       </w:r>
       <w:r>
-        <w:t xml:space="preserve">like "clearly state", or quantify over "all Node Exchange research resources</w:t>
-      </w:r>
-      <w:r>
-        <w:t xml:space="preserve"> </w:t>
-      </w:r>
-      <w:r>
-        <w:t xml:space="preserve">offered by the Node". Neither is settleable by inspecting one page, and emitting</w:t>
+        <w:t xml:space="preserve">like</w:t>
+      </w:r>
+      <w:r>
+        <w:t xml:space="preserve"> </w:t>
+      </w:r>
+      <w:r>
+        <w:t xml:space="preserve">“clearly state”</w:t>
+      </w:r>
+      <w:r>
+        <w:t xml:space="preserve">, or quantify over</w:t>
+      </w:r>
+      <w:r>
+        <w:t xml:space="preserve"> </w:t>
+      </w:r>
+      <w:r>
+        <w:t xml:space="preserve">“all Node Exchange research resources</w:t>
+      </w:r>
+      <w:r>
+        <w:t xml:space="preserve"> </w:t>
+      </w:r>
+      <w:r>
+        <w:t xml:space="preserve">offered by the Node”</w:t>
+      </w:r>
+      <w:r>
+        <w:t xml:space="preserve">. Neither is settleable by inspecting one page, and emitting</w:t>
       </w:r>
       <w:r>
         <w:t xml:space="preserve"> </w:t>
@@ -6640,60 +6519,60 @@
         <w:t xml:space="preserve">says so and hands over the evidence.</w:t>
       </w:r>
     </w:p>
+    <w:bookmarkEnd w:id="16"/>
+    <w:bookmarkStart w:id="17" w:name="the-first-step-of-every-check"/>
+    <w:p>
+      <w:pPr>
+        <w:pStyle w:val="Heading3"/>
+      </w:pPr>
+      <w:r>
+        <w:t xml:space="preserve">The first step of every check</w:t>
+      </w:r>
+    </w:p>
+    <w:p>
+      <w:pPr>
+        <w:pStyle w:val="FirstParagraph"/>
+      </w:pPr>
+      <w:r>
+        <w:t xml:space="preserve">Every one of the ten functions begins the same way:</w:t>
+      </w:r>
+    </w:p>
+    <w:p>
+      <w:pPr>
+        <w:pStyle w:val="SourceCode"/>
+      </w:pPr>
+      <w:r>
+        <w:rPr>
+          <w:rStyle w:val="VerbatimChar"/>
+        </w:rPr>
+        <w:t xml:space="preserve">if ev.error:  -&gt;  ERROR</w:t>
+      </w:r>
+    </w:p>
+    <w:p>
+      <w:pPr>
+        <w:pStyle w:val="FirstParagraph"/>
+      </w:pPr>
+      <w:r>
+        <w:t xml:space="preserve">So a node whose landing page could not be fetched at all returns ten</w:t>
+      </w:r>
+      <w:r>
+        <w:t xml:space="preserve"> </w:t>
+      </w:r>
+      <w:r>
+        <w:rPr>
+          <w:rStyle w:val="VerbatimChar"/>
+        </w:rPr>
+        <w:t xml:space="preserve">ERROR</w:t>
+      </w:r>
+      <w:r>
+        <w:t xml:space="preserve"> </w:t>
+      </w:r>
+      <w:r>
+        <w:t xml:space="preserve">cells, never a mix of passes and a failure.</w:t>
+      </w:r>
+    </w:p>
     <w:bookmarkEnd w:id="17"/>
-    <w:bookmarkStart w:id="18" w:name="the-first-step-of-every-check"/>
-    <w:p>
-      <w:pPr>
-        <w:pStyle w:val="Heading3"/>
-      </w:pPr>
-      <w:r>
-        <w:t xml:space="preserve">The first step of every check</w:t>
-      </w:r>
-    </w:p>
-    <w:p>
-      <w:pPr>
-        <w:pStyle w:val="FirstParagraph"/>
-      </w:pPr>
-      <w:r>
-        <w:t xml:space="preserve">Every one of the ten functions begins the same way:</w:t>
-      </w:r>
-    </w:p>
-    <w:p>
-      <w:pPr>
-        <w:pStyle w:val="SourceCode"/>
-      </w:pPr>
-      <w:r>
-        <w:rPr>
-          <w:rStyle w:val="VerbatimChar"/>
-        </w:rPr>
-        <w:t xml:space="preserve">if ev.error:  -&gt;  ERROR</w:t>
-      </w:r>
-    </w:p>
-    <w:p>
-      <w:pPr>
-        <w:pStyle w:val="FirstParagraph"/>
-      </w:pPr>
-      <w:r>
-        <w:t xml:space="preserve">So a node whose landing page could not be fetched at all returns ten</w:t>
-      </w:r>
-      <w:r>
-        <w:t xml:space="preserve"> </w:t>
-      </w:r>
-      <w:r>
-        <w:rPr>
-          <w:rStyle w:val="VerbatimChar"/>
-        </w:rPr>
-        <w:t xml:space="preserve">ERROR</w:t>
-      </w:r>
-      <w:r>
-        <w:t xml:space="preserve"> </w:t>
-      </w:r>
-      <w:r>
-        <w:t xml:space="preserve">cells, never a mix of passes and a failure.</w:t>
-      </w:r>
-    </w:p>
-    <w:bookmarkEnd w:id="18"/>
-    <w:bookmarkStart w:id="19" w:name="shared-helpers"/>
+    <w:bookmarkStart w:id="18" w:name="shared-helpers"/>
     <w:p>
       <w:pPr>
         <w:pStyle w:val="Heading3"/>
@@ -6716,7 +6595,6 @@
       </w:tblGrid>
       <w:tr>
         <w:trPr>
-          <w:cantSplit/>
           <w:tblHeader w:val="on"/>
         </w:trPr>
         <w:tc>
@@ -6754,9 +6632,6 @@
         </w:tc>
       </w:tr>
       <w:tr>
-        <w:trPr>
-          <w:cantSplit/>
-        </w:trPr>
         <w:tc>
           <w:tcPr/>
           <w:p>
@@ -6795,9 +6670,6 @@
         </w:tc>
       </w:tr>
       <w:tr>
-        <w:trPr>
-          <w:cantSplit/>
-        </w:trPr>
         <w:tc>
           <w:tcPr/>
           <w:p>
@@ -6851,9 +6723,6 @@
         </w:tc>
       </w:tr>
       <w:tr>
-        <w:trPr>
-          <w:cantSplit/>
-        </w:trPr>
         <w:tc>
           <w:tcPr/>
           <w:p>
@@ -6907,9 +6776,6 @@
         </w:tc>
       </w:tr>
       <w:tr>
-        <w:trPr>
-          <w:cantSplit/>
-        </w:trPr>
         <w:tc>
           <w:tcPr/>
           <w:p>
@@ -7003,9 +6869,6 @@
         </w:tc>
       </w:tr>
       <w:tr>
-        <w:trPr>
-          <w:cantSplit/>
-        </w:trPr>
         <w:tc>
           <w:tcPr/>
           <w:p>
@@ -7053,9 +6916,6 @@
         </w:tc>
       </w:tr>
       <w:tr>
-        <w:trPr>
-          <w:cantSplit/>
-        </w:trPr>
         <w:tc>
           <w:tcPr/>
           <w:p>
@@ -7109,9 +6969,6 @@
         </w:tc>
       </w:tr>
       <w:tr>
-        <w:trPr>
-          <w:cantSplit/>
-        </w:trPr>
         <w:tc>
           <w:tcPr/>
           <w:p>
@@ -7166,9 +7023,6 @@
         </w:tc>
       </w:tr>
       <w:tr>
-        <w:trPr>
-          <w:cantSplit/>
-        </w:trPr>
         <w:tc>
           <w:tcPr/>
           <w:p>
@@ -7217,8 +7071,8 @@
         </w:tc>
       </w:tr>
     </w:tbl>
-    <w:bookmarkEnd w:id="19"/>
-    <w:bookmarkStart w:id="20" w:name="Xb01f761edf526ca820d10c97270181bdb8dc3d6"/>
+    <w:bookmarkEnd w:id="18"/>
+    <w:bookmarkStart w:id="19" w:name="Xb01f761edf526ca820d10c97270181bdb8dc3d6"/>
     <w:p>
       <w:pPr>
         <w:pStyle w:val="Heading3"/>
@@ -7232,7 +7086,19 @@
         <w:pStyle w:val="FirstParagraph"/>
       </w:pPr>
       <w:r>
-        <w:t xml:space="preserve">Concluding "absent" from an incomplete capture is the most damaging mistake this</w:t>
+        <w:t xml:space="preserve">Concluding</w:t>
+      </w:r>
+      <w:r>
+        <w:t xml:space="preserve"> </w:t>
+      </w:r>
+      <w:r>
+        <w:t xml:space="preserve">“absent”</w:t>
+      </w:r>
+      <w:r>
+        <w:t xml:space="preserve"> </w:t>
+      </w:r>
+      <w:r>
+        <w:t xml:space="preserve">from an incomplete capture is the most damaging mistake this</w:t>
       </w:r>
       <w:r>
         <w:t xml:space="preserve"> </w:t>
@@ -7476,7 +7342,7 @@
         <w:t xml:space="preserve"> </w:t>
       </w:r>
       <w:r>
-        <w:t xml:space="preserve">server's HTML, and 21 in the rendered DOM both before and after accepting</w:t>
+        <w:t xml:space="preserve">server’s HTML, and 21 in the rendered DOM both before and after accepting</w:t>
       </w:r>
       <w:r>
         <w:t xml:space="preserve"> </w:t>
@@ -7503,7 +7369,16 @@
         <w:t xml:space="preserve"> </w:t>
       </w:r>
       <w:r>
-        <w:t xml:space="preserve">absence escape as "cannot conclude". The absence of an</w:t>
+        <w:t xml:space="preserve">absence escape as</w:t>
+      </w:r>
+      <w:r>
+        <w:t xml:space="preserve"> </w:t>
+      </w:r>
+      <w:r>
+        <w:t xml:space="preserve">“cannot conclude”</w:t>
+      </w:r>
+      <w:r>
+        <w:t xml:space="preserve">. The absence of an</w:t>
       </w:r>
       <w:r>
         <w:t xml:space="preserve"> </w:t>
@@ -7584,9 +7459,9 @@
         </w:pict>
       </w:r>
     </w:p>
+    <w:bookmarkEnd w:id="19"/>
     <w:bookmarkEnd w:id="20"/>
-    <w:bookmarkEnd w:id="21"/>
-    <w:bookmarkStart w:id="32" w:name="per-point-decision-procedures"/>
+    <w:bookmarkStart w:id="31" w:name="per-point-decision-procedures"/>
     <w:p>
       <w:pPr>
         <w:pStyle w:val="Heading2"/>
@@ -7616,7 +7491,7 @@
         </w:pict>
       </w:r>
     </w:p>
-    <w:bookmarkStart w:id="22" w:name="Xcae13acec6153e7753360c0a42e9f41f8127de1"/>
+    <w:bookmarkStart w:id="21" w:name="Xcae13acec6153e7753360c0a42e9f41f8127de1"/>
     <w:p>
       <w:pPr>
         <w:pStyle w:val="Heading3"/>
@@ -7740,7 +7615,6 @@
       </w:tblGrid>
       <w:tr>
         <w:trPr>
-          <w:cantSplit/>
           <w:tblHeader w:val="on"/>
         </w:trPr>
         <w:tc>
@@ -7778,9 +7652,6 @@
         </w:tc>
       </w:tr>
       <w:tr>
-        <w:trPr>
-          <w:cantSplit/>
-        </w:trPr>
         <w:tc>
           <w:tcPr/>
           <w:p>
@@ -7828,9 +7699,6 @@
         </w:tc>
       </w:tr>
       <w:tr>
-        <w:trPr>
-          <w:cantSplit/>
-        </w:trPr>
         <w:tc>
           <w:tcPr/>
           <w:p>
@@ -7900,9 +7768,6 @@
         </w:tc>
       </w:tr>
       <w:tr>
-        <w:trPr>
-          <w:cantSplit/>
-        </w:trPr>
         <w:tc>
           <w:tcPr/>
           <w:p>
@@ -7963,9 +7828,6 @@
         </w:tc>
       </w:tr>
       <w:tr>
-        <w:trPr>
-          <w:cantSplit/>
-        </w:trPr>
         <w:tc>
           <w:tcPr/>
           <w:p>
@@ -8004,9 +7866,6 @@
         </w:tc>
       </w:tr>
       <w:tr>
-        <w:trPr>
-          <w:cantSplit/>
-        </w:trPr>
         <w:tc>
           <w:tcPr/>
           <w:p>
@@ -8051,9 +7910,6 @@
         </w:tc>
       </w:tr>
       <w:tr>
-        <w:trPr>
-          <w:cantSplit/>
-        </w:trPr>
         <w:tc>
           <w:tcPr/>
           <w:p>
@@ -8098,9 +7954,6 @@
         </w:tc>
       </w:tr>
       <w:tr>
-        <w:trPr>
-          <w:cantSplit/>
-        </w:trPr>
         <w:tc>
           <w:tcPr/>
           <w:p>
@@ -8139,9 +7992,6 @@
         </w:tc>
       </w:tr>
       <w:tr>
-        <w:trPr>
-          <w:cantSplit/>
-        </w:trPr>
         <w:tc>
           <w:tcPr/>
           <w:p>
@@ -8215,13 +8065,25 @@
         <w:t xml:space="preserve"> </w:t>
       </w:r>
       <w:r>
-        <w:t xml:space="preserve">then 403 once the crawl made a handful more requests. Reporting that as "not</w:t>
-      </w:r>
-      <w:r>
-        <w:t xml:space="preserve"> </w:t>
-      </w:r>
-      <w:r>
-        <w:t xml:space="preserve">publicly accessible" would have been the tool blaming a node for its own request</w:t>
+        <w:t xml:space="preserve">then 403 once the crawl made a handful more requests. Reporting that as</w:t>
+      </w:r>
+      <w:r>
+        <w:t xml:space="preserve"> </w:t>
+      </w:r>
+      <w:r>
+        <w:t xml:space="preserve">“not</w:t>
+      </w:r>
+      <w:r>
+        <w:t xml:space="preserve"> </w:t>
+      </w:r>
+      <w:r>
+        <w:t xml:space="preserve">publicly accessible”</w:t>
+      </w:r>
+      <w:r>
+        <w:t xml:space="preserve"> </w:t>
+      </w:r>
+      <w:r>
+        <w:t xml:space="preserve">would have been the tool blaming a node for its own request</w:t>
       </w:r>
       <w:r>
         <w:t xml:space="preserve"> </w:t>
@@ -8321,8 +8183,8 @@
         </w:pict>
       </w:r>
     </w:p>
-    <w:bookmarkEnd w:id="22"/>
-    <w:bookmarkStart w:id="23" w:name="X65eeb449093892fbb5dff0c5d69deaaa9d5097c"/>
+    <w:bookmarkEnd w:id="21"/>
+    <w:bookmarkStart w:id="22" w:name="X65eeb449093892fbb5dff0c5d69deaaa9d5097c"/>
     <w:p>
       <w:pPr>
         <w:pStyle w:val="Heading3"/>
@@ -8666,8 +8528,8 @@
         </w:pict>
       </w:r>
     </w:p>
-    <w:bookmarkEnd w:id="23"/>
-    <w:bookmarkStart w:id="24" w:name="X02a1476bd519f6d4b30af4c8067ea09411a400c"/>
+    <w:bookmarkEnd w:id="22"/>
+    <w:bookmarkStart w:id="23" w:name="X02a1476bd519f6d4b30af4c8067ea09411a400c"/>
     <w:p>
       <w:pPr>
         <w:pStyle w:val="Heading3"/>
@@ -9112,7 +8974,7 @@
         <w:t xml:space="preserve"> </w:t>
       </w:r>
       <w:r>
-        <w:t xml:space="preserve">on the page's behalf.</w:t>
+        <w:t xml:space="preserve">on the page’s behalf.</w:t>
       </w:r>
     </w:p>
     <w:p>
@@ -9126,7 +8988,7 @@
         <w:t xml:space="preserve"> </w:t>
       </w:r>
       <w:r>
-        <w:t xml:space="preserve">to a researcher is a reading judgement. The check's job is to make that reading</w:t>
+        <w:t xml:space="preserve">to a researcher is a reading judgement. The check’s job is to make that reading</w:t>
       </w:r>
       <w:r>
         <w:t xml:space="preserve"> </w:t>
@@ -9142,8 +9004,8 @@
         </w:pict>
       </w:r>
     </w:p>
-    <w:bookmarkEnd w:id="24"/>
-    <w:bookmarkStart w:id="25" w:name="X0ec2f8dcb622cc700711bf5bc7eecc4efbc502f"/>
+    <w:bookmarkEnd w:id="23"/>
+    <w:bookmarkStart w:id="24" w:name="X0ec2f8dcb622cc700711bf5bc7eecc4efbc502f"/>
     <w:p>
       <w:pPr>
         <w:pStyle w:val="Heading3"/>
@@ -9301,7 +9163,19 @@
         <w:t xml:space="preserve">removed</w:t>
       </w:r>
       <w:r>
-        <w:t xml:space="preserve">, so a node served from a host containing "eosc" does not match</w:t>
+        <w:t xml:space="preserve">, so a node served from a host containing</w:t>
+      </w:r>
+      <w:r>
+        <w:t xml:space="preserve"> </w:t>
+      </w:r>
+      <w:r>
+        <w:t xml:space="preserve">“eosc”</w:t>
+      </w:r>
+      <w:r>
+        <w:t xml:space="preserve"> </w:t>
+      </w:r>
+      <w:r>
+        <w:t xml:space="preserve">does not match</w:t>
       </w:r>
       <w:r>
         <w:t xml:space="preserve"> </w:t>
@@ -9322,7 +9196,19 @@
         <w:t xml:space="preserve"> </w:t>
       </w:r>
       <w:r>
-        <w:t xml:space="preserve">still counts. "eosc" must then appear as a token, not</w:t>
+        <w:t xml:space="preserve">still counts.</w:t>
+      </w:r>
+      <w:r>
+        <w:t xml:space="preserve"> </w:t>
+      </w:r>
+      <w:r>
+        <w:t xml:space="preserve">“eosc”</w:t>
+      </w:r>
+      <w:r>
+        <w:t xml:space="preserve"> </w:t>
+      </w:r>
+      <w:r>
+        <w:t xml:space="preserve">must then appear as a token, not</w:t>
       </w:r>
       <w:r>
         <w:t xml:space="preserve"> </w:t>
@@ -9833,7 +9719,6 @@
       </w:tblGrid>
       <w:tr>
         <w:trPr>
-          <w:cantSplit/>
           <w:tblHeader w:val="on"/>
         </w:trPr>
         <w:tc>
@@ -9871,9 +9756,6 @@
         </w:tc>
       </w:tr>
       <w:tr>
-        <w:trPr>
-          <w:cantSplit/>
-        </w:trPr>
         <w:tc>
           <w:tcPr/>
           <w:p>
@@ -9934,9 +9816,6 @@
         </w:tc>
       </w:tr>
       <w:tr>
-        <w:trPr>
-          <w:cantSplit/>
-        </w:trPr>
         <w:tc>
           <w:tcPr/>
           <w:p>
@@ -10030,7 +9909,13 @@
         <w:t xml:space="preserve"> </w:t>
       </w:r>
       <w:r>
-        <w:t xml:space="preserve">"Clearly and visibly shown" is a question about</w:t>
+        <w:t xml:space="preserve">“Clearly and visibly shown”</w:t>
+      </w:r>
+      <w:r>
+        <w:t xml:space="preserve"> </w:t>
+      </w:r>
+      <w:r>
+        <w:t xml:space="preserve">is a question about</w:t>
       </w:r>
       <w:r>
         <w:t xml:space="preserve"> </w:t>
@@ -10249,7 +10134,7 @@
         <w:t xml:space="preserve"> </w:t>
       </w:r>
       <w:r>
-        <w:t xml:space="preserve">not that it is that node's own name. The evidence line says which of the two</w:t>
+        <w:t xml:space="preserve">not that it is that node’s own name. The evidence line says which of the two</w:t>
       </w:r>
       <w:r>
         <w:t xml:space="preserve"> </w:t>
@@ -10333,14 +10218,14 @@
         </w:pict>
       </w:r>
     </w:p>
-    <w:bookmarkEnd w:id="25"/>
-    <w:bookmarkStart w:id="26" w:name="X1de70407ff9b9199cdda9f82cdc8a13763c9626"/>
+    <w:bookmarkEnd w:id="24"/>
+    <w:bookmarkStart w:id="25" w:name="X1de70407ff9b9199cdda9f82cdc8a13763c9626"/>
     <w:p>
       <w:pPr>
         <w:pStyle w:val="Heading3"/>
       </w:pPr>
       <w:r>
-        <w:t xml:space="preserve">Point 4 — link to the node's own page on</w:t>
+        <w:t xml:space="preserve">Point 4 — link to the node’s own page on</w:t>
       </w:r>
       <w:r>
         <w:t xml:space="preserve"> </w:t>
@@ -10609,7 +10494,6 @@
       </w:tblGrid>
       <w:tr>
         <w:trPr>
-          <w:cantSplit/>
           <w:tblHeader w:val="on"/>
         </w:trPr>
         <w:tc>
@@ -10647,9 +10531,6 @@
         </w:tc>
       </w:tr>
       <w:tr>
-        <w:trPr>
-          <w:cantSplit/>
-        </w:trPr>
         <w:tc>
           <w:tcPr/>
           <w:p>
@@ -10703,9 +10584,6 @@
         </w:tc>
       </w:tr>
       <w:tr>
-        <w:trPr>
-          <w:cantSplit/>
-        </w:trPr>
         <w:tc>
           <w:tcPr/>
           <w:p>
@@ -10759,9 +10637,6 @@
         </w:tc>
       </w:tr>
       <w:tr>
-        <w:trPr>
-          <w:cantSplit/>
-        </w:trPr>
         <w:tc>
           <w:tcPr/>
           <w:p>
@@ -10830,9 +10705,6 @@
         </w:tc>
       </w:tr>
       <w:tr>
-        <w:trPr>
-          <w:cantSplit/>
-        </w:trPr>
         <w:tc>
           <w:tcPr/>
           <w:p>
@@ -10892,9 +10764,6 @@
         </w:tc>
       </w:tr>
       <w:tr>
-        <w:trPr>
-          <w:cantSplit/>
-        </w:trPr>
         <w:tc>
           <w:tcPr/>
           <w:p>
@@ -10974,7 +10843,7 @@
         <w:t xml:space="preserve"> </w:t>
       </w:r>
       <w:r>
-        <w:t xml:space="preserve">records the node's</w:t>
+        <w:t xml:space="preserve">records the node’s</w:t>
       </w:r>
       <w:r>
         <w:t xml:space="preserve"> </w:t>
@@ -11007,13 +10876,28 @@
         <w:t xml:space="preserve"> </w:t>
       </w:r>
       <w:r>
-        <w:t xml:space="preserve">"the node's dedicated page exists at … but is not linked from here". Naming the</w:t>
-      </w:r>
-      <w:r>
-        <w:t xml:space="preserve"> </w:t>
-      </w:r>
-      <w:r>
-        <w:t xml:space="preserve">exact page turns "something is absent" into a one-line fix the node operator can</w:t>
+        <w:t xml:space="preserve">“the node’s dedicated page exists at … but is not linked from here”</w:t>
+      </w:r>
+      <w:r>
+        <w:t xml:space="preserve">. Naming the</w:t>
+      </w:r>
+      <w:r>
+        <w:t xml:space="preserve"> </w:t>
+      </w:r>
+      <w:r>
+        <w:t xml:space="preserve">exact page turns</w:t>
+      </w:r>
+      <w:r>
+        <w:t xml:space="preserve"> </w:t>
+      </w:r>
+      <w:r>
+        <w:t xml:space="preserve">“something is absent”</w:t>
+      </w:r>
+      <w:r>
+        <w:t xml:space="preserve"> </w:t>
+      </w:r>
+      <w:r>
+        <w:t xml:space="preserve">into a one-line fix the node operator can</w:t>
       </w:r>
       <w:r>
         <w:t xml:space="preserve"> </w:t>
@@ -11094,7 +10978,7 @@
         <w:t xml:space="preserve"> </w:t>
       </w:r>
       <w:r>
-        <w:t xml:space="preserve">The check matches the URL's</w:t>
+        <w:t xml:space="preserve">The check matches the URL’s</w:t>
       </w:r>
       <w:r>
         <w:t xml:space="preserve"> </w:t>
@@ -11177,13 +11061,25 @@
         <w:t xml:space="preserve"> </w:t>
       </w:r>
       <w:r>
-        <w:t xml:space="preserve">cannot tell you which you are looking at. EUDAT's link, for instance, is the</w:t>
-      </w:r>
-      <w:r>
-        <w:t xml:space="preserve"> </w:t>
-      </w:r>
-      <w:r>
-        <w:t xml:space="preserve">fourth item in a "Navigation &amp; Legal" footer column, 89% of the way down the</w:t>
+        <w:t xml:space="preserve">cannot tell you which you are looking at. EUDAT’s link, for instance, is the</w:t>
+      </w:r>
+      <w:r>
+        <w:t xml:space="preserve"> </w:t>
+      </w:r>
+      <w:r>
+        <w:t xml:space="preserve">fourth item in a</w:t>
+      </w:r>
+      <w:r>
+        <w:t xml:space="preserve"> </w:t>
+      </w:r>
+      <w:r>
+        <w:t xml:space="preserve">“Navigation &amp; Legal”</w:t>
+      </w:r>
+      <w:r>
+        <w:t xml:space="preserve"> </w:t>
+      </w:r>
+      <w:r>
+        <w:t xml:space="preserve">footer column, 89% of the way down the</w:t>
       </w:r>
       <w:r>
         <w:t xml:space="preserve"> </w:t>
@@ -11278,291 +11174,318 @@
         </w:pict>
       </w:r>
     </w:p>
+    <w:bookmarkEnd w:id="25"/>
+    <w:bookmarkStart w:id="26" w:name="which-item-5-rule-applies"/>
+    <w:p>
+      <w:pPr>
+        <w:pStyle w:val="Heading3"/>
+      </w:pPr>
+      <w:r>
+        <w:t xml:space="preserve">Which item 5 rule applies</w:t>
+      </w:r>
+    </w:p>
+    <w:p>
+      <w:pPr>
+        <w:pStyle w:val="FirstParagraph"/>
+      </w:pPr>
+      <w:r>
+        <w:t xml:space="preserve">Item 5 changed in checklist v3.2 (28 September 2026). Under v3.0 and v3.1 the</w:t>
+      </w:r>
+      <w:r>
+        <w:t xml:space="preserve"> </w:t>
+      </w:r>
+      <w:r>
+        <w:t xml:space="preserve">purpose description, the AUP and the UAP had to be accessible in English</w:t>
+      </w:r>
+      <w:r>
+        <w:t xml:space="preserve"> </w:t>
+      </w:r>
+      <w:r>
+        <w:t xml:space="preserve">“either directly or via the link to the resource’s entry in the EOSC</w:t>
+      </w:r>
+      <w:r>
+        <w:t xml:space="preserve"> </w:t>
+      </w:r>
+      <w:r>
+        <w:t xml:space="preserve">Catalogue”</w:t>
+      </w:r>
+      <w:r>
+        <w:t xml:space="preserve">. Under v3.2 they must be accessible</w:t>
+      </w:r>
+      <w:r>
+        <w:t xml:space="preserve"> </w:t>
+      </w:r>
+      <w:r>
+        <w:t xml:space="preserve">“both on the NLP presenting the</w:t>
+      </w:r>
+      <w:r>
+        <w:t xml:space="preserve"> </w:t>
+      </w:r>
+      <w:r>
+        <w:t xml:space="preserve">resource to the users (directly on the NLP itself or via intermediate web pages</w:t>
+      </w:r>
+      <w:r>
+        <w:t xml:space="preserve"> </w:t>
+      </w:r>
+      <w:r>
+        <w:t xml:space="preserve">linked by the NLP) and via the link to the resource’s entry in the EOSC</w:t>
+      </w:r>
+      <w:r>
+        <w:t xml:space="preserve"> </w:t>
+      </w:r>
+      <w:r>
+        <w:t xml:space="preserve">Catalogue”</w:t>
+      </w:r>
+      <w:r>
+        <w:t xml:space="preserve">, which the document spells out as: present</w:t>
+      </w:r>
+      <w:r>
+        <w:t xml:space="preserve"> </w:t>
+      </w:r>
+      <w:r>
+        <w:t xml:space="preserve">“for each resource in the</w:t>
+      </w:r>
+      <w:r>
+        <w:t xml:space="preserve"> </w:t>
+      </w:r>
+      <w:r>
+        <w:t xml:space="preserve">EOSC Exchange, both on the NLP itself (or on pages linked by the NLP web page)</w:t>
+      </w:r>
+      <w:r>
+        <w:t xml:space="preserve"> </w:t>
+      </w:r>
+      <w:r>
+        <w:t xml:space="preserve">and in the Metadata about the Resource in the Node Catalogue”</w:t>
+      </w:r>
+      <w:r>
+        <w:t xml:space="preserve">. This is the</w:t>
+      </w:r>
+      <w:r>
+        <w:t xml:space="preserve"> </w:t>
+      </w:r>
+      <w:r>
+        <w:t xml:space="preserve">wording of v3.2 as re-issued on 29 September 2026; the first copy said</w:t>
+      </w:r>
+      <w:r>
+        <w:t xml:space="preserve"> </w:t>
+      </w:r>
+      <w:r>
+        <w:t xml:space="preserve">“directly on the NLP”</w:t>
+      </w:r>
+      <w:r>
+        <w:t xml:space="preserve"> </w:t>
+      </w:r>
+      <w:r>
+        <w:t xml:space="preserve">only, and is discarded.</w:t>
+      </w:r>
+    </w:p>
+    <w:p>
+      <w:pPr>
+        <w:pStyle w:val="BodyText"/>
+      </w:pPr>
+      <w:r>
+        <w:rPr>
+          <w:rStyle w:val="VerbatimChar"/>
+        </w:rPr>
+        <w:t xml:space="preserve">check_5a</w:t>
+      </w:r>
+      <w:r>
+        <w:t xml:space="preserve">,</w:t>
+      </w:r>
+      <w:r>
+        <w:t xml:space="preserve"> </w:t>
+      </w:r>
+      <w:r>
+        <w:rPr>
+          <w:rStyle w:val="VerbatimChar"/>
+        </w:rPr>
+        <w:t xml:space="preserve">check_5b</w:t>
+      </w:r>
+      <w:r>
+        <w:t xml:space="preserve"> </w:t>
+      </w:r>
+      <w:r>
+        <w:t xml:space="preserve">and</w:t>
+      </w:r>
+      <w:r>
+        <w:t xml:space="preserve"> </w:t>
+      </w:r>
+      <w:r>
+        <w:rPr>
+          <w:rStyle w:val="VerbatimChar"/>
+        </w:rPr>
+        <w:t xml:space="preserve">check_5c</w:t>
+      </w:r>
+      <w:r>
+        <w:t xml:space="preserve"> </w:t>
+      </w:r>
+      <w:r>
+        <w:t xml:space="preserve">take a switch,</w:t>
+      </w:r>
+      <w:r>
+        <w:t xml:space="preserve"> </w:t>
+      </w:r>
+      <w:r>
+        <w:rPr>
+          <w:rStyle w:val="VerbatimChar"/>
+        </w:rPr>
+        <w:t xml:space="preserve">on_nlp</w:t>
+      </w:r>
+      <w:r>
+        <w:t xml:space="preserve">.</w:t>
+      </w:r>
+      <w:r>
+        <w:t xml:space="preserve"> </w:t>
+      </w:r>
+      <w:r>
+        <w:rPr>
+          <w:rStyle w:val="VerbatimChar"/>
+        </w:rPr>
+        <w:t xml:space="preserve">run_all</w:t>
+      </w:r>
+      <w:r>
+        <w:t xml:space="preserve"> </w:t>
+      </w:r>
+      <w:r>
+        <w:t xml:space="preserve">passes</w:t>
+      </w:r>
+      <w:r>
+        <w:t xml:space="preserve"> </w:t>
+      </w:r>
+      <w:r>
+        <w:t xml:space="preserve">it as</w:t>
+      </w:r>
+      <w:r>
+        <w:t xml:space="preserve"> </w:t>
+      </w:r>
+      <w:r>
+        <w:rPr>
+          <w:rStyle w:val="VerbatimChar"/>
+        </w:rPr>
+        <w:t xml:space="preserve">item5_on_nlp</w:t>
+      </w:r>
+      <w:r>
+        <w:t xml:space="preserve">, and the CLI reads it from the checklist file:</w:t>
+      </w:r>
+      <w:r>
+        <w:t xml:space="preserve"> </w:t>
+      </w:r>
+      <w:r>
+        <w:rPr>
+          <w:rStyle w:val="VerbatimChar"/>
+        </w:rPr>
+        <w:t xml:space="preserve">checklist/v3.2.yaml</w:t>
+      </w:r>
+      <w:r>
+        <w:t xml:space="preserve"> </w:t>
+      </w:r>
+      <w:r>
+        <w:t xml:space="preserve">declares</w:t>
+      </w:r>
+      <w:r>
+        <w:t xml:space="preserve"> </w:t>
+      </w:r>
+      <w:r>
+        <w:rPr>
+          <w:rStyle w:val="VerbatimChar"/>
+        </w:rPr>
+        <w:t xml:space="preserve">item5_on_nlp: true</w:t>
+      </w:r>
+      <w:r>
+        <w:t xml:space="preserve">;</w:t>
+      </w:r>
+      <w:r>
+        <w:t xml:space="preserve"> </w:t>
+      </w:r>
+      <w:r>
+        <w:rPr>
+          <w:rStyle w:val="VerbatimChar"/>
+        </w:rPr>
+        <w:t xml:space="preserve">v3.0.yaml</w:t>
+      </w:r>
+      <w:r>
+        <w:t xml:space="preserve"> </w:t>
+      </w:r>
+      <w:r>
+        <w:t xml:space="preserve">and</w:t>
+      </w:r>
+      <w:r>
+        <w:t xml:space="preserve"> </w:t>
+      </w:r>
+      <w:r>
+        <w:rPr>
+          <w:rStyle w:val="VerbatimChar"/>
+        </w:rPr>
+        <w:t xml:space="preserve">v3.1.yaml</w:t>
+      </w:r>
+      <w:r>
+        <w:t xml:space="preserve"> </w:t>
+      </w:r>
+      <w:r>
+        <w:t xml:space="preserve">do not declare it, which the CLI reads as false. So rebuilding a run</w:t>
+      </w:r>
+      <w:r>
+        <w:t xml:space="preserve"> </w:t>
+      </w:r>
+      <w:r>
+        <w:t xml:space="preserve">with</w:t>
+      </w:r>
+      <w:r>
+        <w:t xml:space="preserve"> </w:t>
+      </w:r>
+      <w:r>
+        <w:rPr>
+          <w:rStyle w:val="VerbatimChar"/>
+        </w:rPr>
+        <w:t xml:space="preserve">-c checklist/v3.1.yaml</w:t>
+      </w:r>
+      <w:r>
+        <w:t xml:space="preserve"> </w:t>
+      </w:r>
+      <w:r>
+        <w:t xml:space="preserve">applies the v3.1 rule, and reproduces that run</w:t>
+      </w:r>
+      <w:r>
+        <w:t xml:space="preserve"> </w:t>
+      </w:r>
+      <w:r>
+        <w:t xml:space="preserve">exactly. The functions default to</w:t>
+      </w:r>
+      <w:r>
+        <w:t xml:space="preserve"> </w:t>
+      </w:r>
+      <w:r>
+        <w:rPr>
+          <w:rStyle w:val="VerbatimChar"/>
+        </w:rPr>
+        <w:t xml:space="preserve">True</w:t>
+      </w:r>
+      <w:r>
+        <w:t xml:space="preserve">, the rule of the default checklist.</w:t>
+      </w:r>
+    </w:p>
+    <w:p>
+      <w:pPr>
+        <w:pStyle w:val="BodyText"/>
+      </w:pPr>
+      <w:r>
+        <w:t xml:space="preserve">The tool reads the landing page and, one level down, the pages it links to. It</w:t>
+      </w:r>
+      <w:r>
+        <w:t xml:space="preserve"> </w:t>
+      </w:r>
+      <w:r>
+        <w:t xml:space="preserve">never reads the EOSC Catalogue. Under v3.2 that means it can check only the NLP</w:t>
+      </w:r>
+      <w:r>
+        <w:t xml:space="preserve"> </w:t>
+      </w:r>
+      <w:r>
+        <w:t xml:space="preserve">half of item 5, and every 5a–5c result says so.</w:t>
+      </w:r>
+    </w:p>
     <w:bookmarkEnd w:id="26"/>
-    <w:bookmarkStart w:id="27" w:name="which-item-5-rule-applies"/>
-    <w:p>
-      <w:pPr>
-        <w:pStyle w:val="Heading3"/>
-      </w:pPr>
-      <w:r>
-        <w:t xml:space="preserve">Which item 5 rule applies</w:t>
-      </w:r>
-    </w:p>
-    <w:p>
-      <w:pPr>
-        <w:pStyle w:val="FirstParagraph"/>
-      </w:pPr>
-      <w:r>
-        <w:t xml:space="preserve">Item 5 changed in checklist v3.2 (28 September 2026). Under v3.0 and v3.1 the</w:t>
-      </w:r>
-      <w:r>
-        <w:t xml:space="preserve"> </w:t>
-      </w:r>
-      <w:r>
-        <w:t xml:space="preserve">purpose description, the AUP and the UAP had to be accessible in English</w:t>
-      </w:r>
-      <w:r>
-        <w:t xml:space="preserve"> </w:t>
-      </w:r>
-      <w:r>
-        <w:t xml:space="preserve">"either directly or via the link to the resource's entry in the EOSC</w:t>
-      </w:r>
-      <w:r>
-        <w:t xml:space="preserve"> </w:t>
-      </w:r>
-      <w:r>
-        <w:t xml:space="preserve">Catalogue". Under v3.2 they must be accessible "both on the NLP presenting the</w:t>
-      </w:r>
-      <w:r>
-        <w:t xml:space="preserve"> </w:t>
-      </w:r>
-      <w:r>
-        <w:t xml:space="preserve">resource to the users (directly on the NLP itself or via intermediate web pages</w:t>
-      </w:r>
-      <w:r>
-        <w:t xml:space="preserve"> </w:t>
-      </w:r>
-      <w:r>
-        <w:t xml:space="preserve">linked by the NLP) and via the link to the resource's entry in the EOSC</w:t>
-      </w:r>
-      <w:r>
-        <w:t xml:space="preserve"> </w:t>
-      </w:r>
-      <w:r>
-        <w:t xml:space="preserve">Catalogue", which the document spells out as: present "for each resource in the</w:t>
-      </w:r>
-      <w:r>
-        <w:t xml:space="preserve"> </w:t>
-      </w:r>
-      <w:r>
-        <w:t xml:space="preserve">EOSC Exchange, both on the NLP itself (or on pages linked by the NLP web page)</w:t>
-      </w:r>
-      <w:r>
-        <w:t xml:space="preserve"> </w:t>
-      </w:r>
-      <w:r>
-        <w:t xml:space="preserve">and in the Metadata about the Resource in the Node Catalogue". This is the</w:t>
-      </w:r>
-      <w:r>
-        <w:t xml:space="preserve"> </w:t>
-      </w:r>
-      <w:r>
-        <w:t xml:space="preserve">wording of v3.2 as re-issued on 29 September 2026; the first copy said</w:t>
-      </w:r>
-      <w:r>
-        <w:t xml:space="preserve"> </w:t>
-      </w:r>
-      <w:r>
-        <w:t xml:space="preserve">"directly on the NLP" only, and is discarded.</w:t>
-      </w:r>
-    </w:p>
-    <w:p>
-      <w:pPr>
-        <w:pStyle w:val="BodyText"/>
-      </w:pPr>
-      <w:r>
-        <w:rPr>
-          <w:rStyle w:val="VerbatimChar"/>
-        </w:rPr>
-        <w:t xml:space="preserve">check_5a</w:t>
-      </w:r>
-      <w:r>
-        <w:t xml:space="preserve">,</w:t>
-      </w:r>
-      <w:r>
-        <w:t xml:space="preserve"> </w:t>
-      </w:r>
-      <w:r>
-        <w:rPr>
-          <w:rStyle w:val="VerbatimChar"/>
-        </w:rPr>
-        <w:t xml:space="preserve">check_5b</w:t>
-      </w:r>
-      <w:r>
-        <w:t xml:space="preserve"> </w:t>
-      </w:r>
-      <w:r>
-        <w:t xml:space="preserve">and</w:t>
-      </w:r>
-      <w:r>
-        <w:t xml:space="preserve"> </w:t>
-      </w:r>
-      <w:r>
-        <w:rPr>
-          <w:rStyle w:val="VerbatimChar"/>
-        </w:rPr>
-        <w:t xml:space="preserve">check_5c</w:t>
-      </w:r>
-      <w:r>
-        <w:t xml:space="preserve"> </w:t>
-      </w:r>
-      <w:r>
-        <w:t xml:space="preserve">take a switch,</w:t>
-      </w:r>
-      <w:r>
-        <w:t xml:space="preserve"> </w:t>
-      </w:r>
-      <w:r>
-        <w:rPr>
-          <w:rStyle w:val="VerbatimChar"/>
-        </w:rPr>
-        <w:t xml:space="preserve">on_nlp</w:t>
-      </w:r>
-      <w:r>
-        <w:t xml:space="preserve">.</w:t>
-      </w:r>
-      <w:r>
-        <w:t xml:space="preserve"> </w:t>
-      </w:r>
-      <w:r>
-        <w:rPr>
-          <w:rStyle w:val="VerbatimChar"/>
-        </w:rPr>
-        <w:t xml:space="preserve">run_all</w:t>
-      </w:r>
-      <w:r>
-        <w:t xml:space="preserve"> </w:t>
-      </w:r>
-      <w:r>
-        <w:t xml:space="preserve">passes</w:t>
-      </w:r>
-      <w:r>
-        <w:t xml:space="preserve"> </w:t>
-      </w:r>
-      <w:r>
-        <w:t xml:space="preserve">it as</w:t>
-      </w:r>
-      <w:r>
-        <w:t xml:space="preserve"> </w:t>
-      </w:r>
-      <w:r>
-        <w:rPr>
-          <w:rStyle w:val="VerbatimChar"/>
-        </w:rPr>
-        <w:t xml:space="preserve">item5_on_nlp</w:t>
-      </w:r>
-      <w:r>
-        <w:t xml:space="preserve">, and the CLI reads it from the checklist file:</w:t>
-      </w:r>
-      <w:r>
-        <w:t xml:space="preserve"> </w:t>
-      </w:r>
-      <w:r>
-        <w:rPr>
-          <w:rStyle w:val="VerbatimChar"/>
-        </w:rPr>
-        <w:t xml:space="preserve">checklist/v3.2.yaml</w:t>
-      </w:r>
-      <w:r>
-        <w:t xml:space="preserve"> </w:t>
-      </w:r>
-      <w:r>
-        <w:t xml:space="preserve">declares</w:t>
-      </w:r>
-      <w:r>
-        <w:t xml:space="preserve"> </w:t>
-      </w:r>
-      <w:r>
-        <w:rPr>
-          <w:rStyle w:val="VerbatimChar"/>
-        </w:rPr>
-        <w:t xml:space="preserve">item5_on_nlp: true</w:t>
-      </w:r>
-      <w:r>
-        <w:t xml:space="preserve">;</w:t>
-      </w:r>
-      <w:r>
-        <w:t xml:space="preserve"> </w:t>
-      </w:r>
-      <w:r>
-        <w:rPr>
-          <w:rStyle w:val="VerbatimChar"/>
-        </w:rPr>
-        <w:t xml:space="preserve">v3.0.yaml</w:t>
-      </w:r>
-      <w:r>
-        <w:t xml:space="preserve"> </w:t>
-      </w:r>
-      <w:r>
-        <w:t xml:space="preserve">and</w:t>
-      </w:r>
-      <w:r>
-        <w:t xml:space="preserve"> </w:t>
-      </w:r>
-      <w:r>
-        <w:rPr>
-          <w:rStyle w:val="VerbatimChar"/>
-        </w:rPr>
-        <w:t xml:space="preserve">v3.1.yaml</w:t>
-      </w:r>
-      <w:r>
-        <w:t xml:space="preserve"> </w:t>
-      </w:r>
-      <w:r>
-        <w:t xml:space="preserve">do not declare it, which the CLI reads as false. So rebuilding a run</w:t>
-      </w:r>
-      <w:r>
-        <w:t xml:space="preserve"> </w:t>
-      </w:r>
-      <w:r>
-        <w:t xml:space="preserve">with</w:t>
-      </w:r>
-      <w:r>
-        <w:t xml:space="preserve"> </w:t>
-      </w:r>
-      <w:r>
-        <w:rPr>
-          <w:rStyle w:val="VerbatimChar"/>
-        </w:rPr>
-        <w:t xml:space="preserve">-c checklist/v3.1.yaml</w:t>
-      </w:r>
-      <w:r>
-        <w:t xml:space="preserve"> </w:t>
-      </w:r>
-      <w:r>
-        <w:t xml:space="preserve">applies the v3.1 rule, and reproduces that run</w:t>
-      </w:r>
-      <w:r>
-        <w:t xml:space="preserve"> </w:t>
-      </w:r>
-      <w:r>
-        <w:t xml:space="preserve">exactly. The functions default to</w:t>
-      </w:r>
-      <w:r>
-        <w:t xml:space="preserve"> </w:t>
-      </w:r>
-      <w:r>
-        <w:rPr>
-          <w:rStyle w:val="VerbatimChar"/>
-        </w:rPr>
-        <w:t xml:space="preserve">True</w:t>
-      </w:r>
-      <w:r>
-        <w:t xml:space="preserve">, the rule of the default checklist.</w:t>
-      </w:r>
-    </w:p>
-    <w:p>
-      <w:pPr>
-        <w:pStyle w:val="BodyText"/>
-      </w:pPr>
-      <w:r>
-        <w:t xml:space="preserve">The tool reads the landing page and, one level down, the pages it links to. It</w:t>
-      </w:r>
-      <w:r>
-        <w:t xml:space="preserve"> </w:t>
-      </w:r>
-      <w:r>
-        <w:t xml:space="preserve">never reads the EOSC Catalogue. Under v3.2 that means it can check only the NLP</w:t>
-      </w:r>
-      <w:r>
-        <w:t xml:space="preserve"> </w:t>
-      </w:r>
-      <w:r>
-        <w:t xml:space="preserve">half of item 5, and every 5a–5c result says so.</w:t>
-      </w:r>
-    </w:p>
-    <w:bookmarkEnd w:id="27"/>
-    <w:bookmarkStart w:id="28" w:name="Xaecf80c799f590b4c6844140320ac9f3fbf5dc2"/>
+    <w:bookmarkStart w:id="27" w:name="Xaecf80c799f590b4c6844140320ac9f3fbf5dc2"/>
     <w:p>
       <w:pPr>
         <w:pStyle w:val="Heading3"/>
@@ -11665,13 +11588,22 @@
         <w:t xml:space="preserve">main_text</w:t>
       </w:r>
       <w:r>
-        <w:t xml:space="preserve">. The point quantifies over "all Node Exchange research resources</w:t>
-      </w:r>
-      <w:r>
-        <w:t xml:space="preserve"> </w:t>
-      </w:r>
-      <w:r>
-        <w:t xml:space="preserve">offered by the Node", which cannot be enumerated from the landing page, and</w:t>
+        <w:t xml:space="preserve">. The point quantifies over</w:t>
+      </w:r>
+      <w:r>
+        <w:t xml:space="preserve"> </w:t>
+      </w:r>
+      <w:r>
+        <w:t xml:space="preserve">“all Node Exchange research resources</w:t>
+      </w:r>
+      <w:r>
+        <w:t xml:space="preserve"> </w:t>
+      </w:r>
+      <w:r>
+        <w:t xml:space="preserve">offered by the Node”</w:t>
+      </w:r>
+      <w:r>
+        <w:t xml:space="preserve">, which cannot be enumerated from the landing page, and</w:t>
       </w:r>
       <w:r>
         <w:t xml:space="preserve"> </w:t>
@@ -11711,8 +11643,8 @@
         </w:pict>
       </w:r>
     </w:p>
-    <w:bookmarkEnd w:id="28"/>
-    <w:bookmarkStart w:id="29" w:name="points-5b-and-5c-aup-and-uap-accessible"/>
+    <w:bookmarkEnd w:id="27"/>
+    <w:bookmarkStart w:id="28" w:name="points-5b-and-5c-aup-and-uap-accessible"/>
     <w:p>
       <w:pPr>
         <w:pStyle w:val="Heading3"/>
@@ -11793,7 +11725,7 @@
         <w:t xml:space="preserve"> </w:t>
       </w:r>
       <w:r>
-        <w:t xml:space="preserve">point's vocabulary, which the v3.2 rule uses: 5b looks for a UAP</w:t>
+        <w:t xml:space="preserve">point’s vocabulary, which the v3.2 rule uses: 5b looks for a UAP</w:t>
       </w:r>
       <w:r>
         <w:t xml:space="preserve"> </w:t>
@@ -11953,7 +11885,6 @@
       </w:tblGrid>
       <w:tr>
         <w:trPr>
-          <w:cantSplit/>
           <w:tblHeader w:val="on"/>
         </w:trPr>
         <w:tc>
@@ -11991,9 +11922,6 @@
         </w:tc>
       </w:tr>
       <w:tr>
-        <w:trPr>
-          <w:cantSplit/>
-        </w:trPr>
         <w:tc>
           <w:tcPr/>
           <w:p>
@@ -12039,15 +11967,21 @@
               <w:t xml:space="preserve">PASS</w:t>
             </w:r>
             <w:r>
-              <w:t xml:space="preserve">, stated as "a pointer, not a verified document", with the reason: depth 0, a PDF or other document, a cap reached, another site, or not selected at collection</w:t>
+              <w:t xml:space="preserve">, stated as</w:t>
+            </w:r>
+            <w:r>
+              <w:t xml:space="preserve"> </w:t>
+            </w:r>
+            <w:r>
+              <w:t xml:space="preserve">“a pointer, not a verified document”</w:t>
+            </w:r>
+            <w:r>
+              <w:t xml:space="preserve">, with the reason: depth 0, a PDF or other document, a cap reached, another site, or not selected at collection</w:t>
             </w:r>
           </w:p>
         </w:tc>
       </w:tr>
       <w:tr>
-        <w:trPr>
-          <w:cantSplit/>
-        </w:trPr>
         <w:tc>
           <w:tcPr/>
           <w:p>
@@ -12092,9 +12026,6 @@
         </w:tc>
       </w:tr>
       <w:tr>
-        <w:trPr>
-          <w:cantSplit/>
-        </w:trPr>
         <w:tc>
           <w:tcPr/>
           <w:p>
@@ -12154,9 +12085,6 @@
         </w:tc>
       </w:tr>
       <w:tr>
-        <w:trPr>
-          <w:cantSplit/>
-        </w:trPr>
         <w:tc>
           <w:tcPr/>
           <w:p>
@@ -12232,9 +12160,6 @@
         </w:tc>
       </w:tr>
       <w:tr>
-        <w:trPr>
-          <w:cantSplit/>
-        </w:trPr>
         <w:tc>
           <w:tcPr/>
           <w:p>
@@ -12299,7 +12224,7 @@
         <w:t xml:space="preserve"> </w:t>
       </w:r>
       <w:r>
-        <w:t xml:space="preserve">policy must also be in each resource's Catalogue metadata, which the tool does</w:t>
+        <w:t xml:space="preserve">policy must also be in each resource’s Catalogue metadata, which the tool does</w:t>
       </w:r>
       <w:r>
         <w:t xml:space="preserve"> </w:t>
@@ -12328,7 +12253,7 @@
         <w:pStyle w:val="BodyText"/>
       </w:pPr>
       <w:r>
-        <w:t xml:space="preserve">When no link to the point's own policy was found, the rules differ.</w:t>
+        <w:t xml:space="preserve">When no link to the point’s own policy was found, the rules differ.</w:t>
       </w:r>
     </w:p>
     <w:p>
@@ -12375,7 +12300,6 @@
       </w:tblGrid>
       <w:tr>
         <w:trPr>
-          <w:cantSplit/>
           <w:tblHeader w:val="on"/>
         </w:trPr>
         <w:tc>
@@ -12413,9 +12337,6 @@
         </w:tc>
       </w:tr>
       <w:tr>
-        <w:trPr>
-          <w:cantSplit/>
-        </w:trPr>
         <w:tc>
           <w:tcPr/>
           <w:p>
@@ -12460,9 +12381,6 @@
         </w:tc>
       </w:tr>
       <w:tr>
-        <w:trPr>
-          <w:cantSplit/>
-        </w:trPr>
         <w:tc>
           <w:tcPr/>
           <w:p>
@@ -12562,7 +12480,19 @@
         <w:t xml:space="preserve"> </w:t>
       </w:r>
       <w:r>
-        <w:t xml:space="preserve">true), in this order. "Linked pages read" are the</w:t>
+        <w:t xml:space="preserve">true), in this order.</w:t>
+      </w:r>
+      <w:r>
+        <w:t xml:space="preserve"> </w:t>
+      </w:r>
+      <w:r>
+        <w:t xml:space="preserve">“Linked pages read”</w:t>
+      </w:r>
+      <w:r>
+        <w:t xml:space="preserve"> </w:t>
+      </w:r>
+      <w:r>
+        <w:t xml:space="preserve">are the</w:t>
       </w:r>
       <w:r>
         <w:t xml:space="preserve"> </w:t>
@@ -12591,7 +12521,6 @@
       </w:tblGrid>
       <w:tr>
         <w:trPr>
-          <w:cantSplit/>
           <w:tblHeader w:val="on"/>
         </w:trPr>
         <w:tc>
@@ -12629,9 +12558,6 @@
         </w:tc>
       </w:tr>
       <w:tr>
-        <w:trPr>
-          <w:cantSplit/>
-        </w:trPr>
         <w:tc>
           <w:tcPr/>
           <w:p>
@@ -12676,9 +12602,6 @@
         </w:tc>
       </w:tr>
       <w:tr>
-        <w:trPr>
-          <w:cantSplit/>
-        </w:trPr>
         <w:tc>
           <w:tcPr/>
           <w:p>
@@ -12717,15 +12640,21 @@
               <w:t xml:space="preserve"> </w:t>
             </w:r>
             <w:r>
-              <w:t xml:space="preserve">— "via intermediate web pages linked by the NLP"; the evidence names the intermediate page, and the message says whether the policy page itself was fetched</w:t>
+              <w:t xml:space="preserve">—</w:t>
+            </w:r>
+            <w:r>
+              <w:t xml:space="preserve"> </w:t>
+            </w:r>
+            <w:r>
+              <w:t xml:space="preserve">“via intermediate web pages linked by the NLP”</w:t>
+            </w:r>
+            <w:r>
+              <w:t xml:space="preserve">; the evidence names the intermediate page, and the message says whether the policy page itself was fetched</w:t>
             </w:r>
           </w:p>
         </w:tc>
       </w:tr>
       <w:tr>
-        <w:trPr>
-          <w:cantSplit/>
-        </w:trPr>
         <w:tc>
           <w:tcPr/>
           <w:p>
@@ -12780,15 +12709,18 @@
               <w:t xml:space="preserve"> </w:t>
             </w:r>
             <w:r>
-              <w:t xml:space="preserve">— "AUP and UAP can be provided through the same, single document"</w:t>
+              <w:t xml:space="preserve">—</w:t>
+            </w:r>
+            <w:r>
+              <w:t xml:space="preserve"> </w:t>
+            </w:r>
+            <w:r>
+              <w:t xml:space="preserve">“AUP and UAP can be provided through the same, single document”</w:t>
             </w:r>
           </w:p>
         </w:tc>
       </w:tr>
       <w:tr>
-        <w:trPr>
-          <w:cantSplit/>
-        </w:trPr>
         <w:tc>
           <w:tcPr/>
           <w:p>
@@ -12852,15 +12784,18 @@
               <w:t xml:space="preserve"> </w:t>
             </w:r>
             <w:r>
-              <w:t xml:space="preserve">— "AUP/UAP can be provided via specific product licenses in the case of datasets, archives, software"</w:t>
+              <w:t xml:space="preserve">—</w:t>
+            </w:r>
+            <w:r>
+              <w:t xml:space="preserve"> </w:t>
+            </w:r>
+            <w:r>
+              <w:t xml:space="preserve">“AUP/UAP can be provided via specific product licenses in the case of datasets, archives, software”</w:t>
             </w:r>
           </w:p>
         </w:tc>
       </w:tr>
       <w:tr>
-        <w:trPr>
-          <w:cantSplit/>
-        </w:trPr>
         <w:tc>
           <w:tcPr/>
           <w:p>
@@ -12914,9 +12849,6 @@
         </w:tc>
       </w:tr>
       <w:tr>
-        <w:trPr>
-          <w:cantSplit/>
-        </w:trPr>
         <w:tc>
           <w:tcPr/>
           <w:p>
@@ -12986,15 +12918,18 @@
               <w:t xml:space="preserve"> </w:t>
             </w:r>
             <w:r>
-              <w:t xml:space="preserve">— the pointers may be there; the evidence lists up to three such links as "not read"</w:t>
+              <w:t xml:space="preserve">— the pointers may be there; the evidence lists up to three such links as</w:t>
+            </w:r>
+            <w:r>
+              <w:t xml:space="preserve"> </w:t>
+            </w:r>
+            <w:r>
+              <w:t xml:space="preserve">“not read”</w:t>
             </w:r>
           </w:p>
         </w:tc>
       </w:tr>
       <w:tr>
-        <w:trPr>
-          <w:cantSplit/>
-        </w:trPr>
         <w:tc>
           <w:tcPr/>
           <w:p>
@@ -13111,7 +13046,25 @@
         <w:t xml:space="preserve"> </w:t>
       </w:r>
       <w:r>
-        <w:t xml:space="preserve">"Acceptable Use Policy" pointing at a 404 satisfies "there is a link" while</w:t>
+        <w:t xml:space="preserve">“Acceptable Use Policy”</w:t>
+      </w:r>
+      <w:r>
+        <w:t xml:space="preserve"> </w:t>
+      </w:r>
+      <w:r>
+        <w:t xml:space="preserve">pointing at a 404 satisfies</w:t>
+      </w:r>
+      <w:r>
+        <w:t xml:space="preserve"> </w:t>
+      </w:r>
+      <w:r>
+        <w:t xml:space="preserve">“there is a link”</w:t>
+      </w:r>
+      <w:r>
+        <w:t xml:space="preserve"> </w:t>
+      </w:r>
+      <w:r>
+        <w:t xml:space="preserve">while</w:t>
       </w:r>
       <w:r>
         <w:t xml:space="preserve"> </w:t>
@@ -13157,7 +13110,7 @@
         <w:t xml:space="preserve"> </w:t>
       </w:r>
       <w:r>
-        <w:t xml:space="preserve">the node's own site. It cannot do so for a PDF or a page on another site, and</w:t>
+        <w:t xml:space="preserve">the node’s own site. It cannot do so for a PDF or a page on another site, and</w:t>
       </w:r>
       <w:r>
         <w:t xml:space="preserve"> </w:t>
@@ -13189,13 +13142,37 @@
         <w:t xml:space="preserve">1418f05</w:t>
       </w:r>
       <w:r>
-        <w:t xml:space="preserve">). EOSC Node Italy linked "Infrastructure</w:t>
-      </w:r>
-      <w:r>
-        <w:t xml:space="preserve"> </w:t>
-      </w:r>
-      <w:r>
-        <w:t xml:space="preserve">AUP/UAP" to a working policy page and "Review resource access conditions" to a</w:t>
+        <w:t xml:space="preserve">). EOSC Node Italy linked</w:t>
+      </w:r>
+      <w:r>
+        <w:t xml:space="preserve"> </w:t>
+      </w:r>
+      <w:r>
+        <w:t xml:space="preserve">“Infrastructure</w:t>
+      </w:r>
+      <w:r>
+        <w:t xml:space="preserve"> </w:t>
+      </w:r>
+      <w:r>
+        <w:t xml:space="preserve">AUP/UAP”</w:t>
+      </w:r>
+      <w:r>
+        <w:t xml:space="preserve"> </w:t>
+      </w:r>
+      <w:r>
+        <w:t xml:space="preserve">to a working policy page and</w:t>
+      </w:r>
+      <w:r>
+        <w:t xml:space="preserve"> </w:t>
+      </w:r>
+      <w:r>
+        <w:t xml:space="preserve">“Review resource access conditions”</w:t>
+      </w:r>
+      <w:r>
+        <w:t xml:space="preserve"> </w:t>
+      </w:r>
+      <w:r>
+        <w:t xml:space="preserve">to a</w:t>
       </w:r>
       <w:r>
         <w:t xml:space="preserve"> </w:t>
@@ -13221,7 +13198,19 @@
         <w:pStyle w:val="BodyText"/>
       </w:pPr>
       <w:r>
-        <w:t xml:space="preserve">Branch 4's "policy wording" test is</w:t>
+        <w:t xml:space="preserve">Branch 4’s</w:t>
+      </w:r>
+      <w:r>
+        <w:t xml:space="preserve"> </w:t>
+      </w:r>
+      <w:r>
+        <w:t xml:space="preserve">“policy wording”</w:t>
+      </w:r>
+      <w:r>
+        <w:t xml:space="preserve"> </w:t>
+      </w:r>
+      <w:r>
+        <w:t xml:space="preserve">test is</w:t>
       </w:r>
       <w:r>
         <w:t xml:space="preserve"> </w:t>
@@ -13377,7 +13366,13 @@
         <w:t xml:space="preserve"> </w:t>
       </w:r>
       <w:r>
-        <w:t xml:space="preserve">"policy" in its link text.</w:t>
+        <w:t xml:space="preserve">“policy”</w:t>
+      </w:r>
+      <w:r>
+        <w:t xml:space="preserve"> </w:t>
+      </w:r>
+      <w:r>
+        <w:t xml:space="preserve">in its link text.</w:t>
       </w:r>
     </w:p>
     <w:p>
@@ -13406,7 +13401,7 @@
         <w:t xml:space="preserve"> </w:t>
       </w:r>
       <w:r>
-        <w:t xml:space="preserve">to be reached via each resource's entry in the EOSC Catalogue alone. v3.2</w:t>
+        <w:t xml:space="preserve">to be reached via each resource’s entry in the EOSC Catalogue alone. v3.2</w:t>
       </w:r>
       <w:r>
         <w:t xml:space="preserve"> </w:t>
@@ -13433,7 +13428,7 @@
         <w:t xml:space="preserve"> </w:t>
       </w:r>
       <w:r>
-        <w:t xml:space="preserve">The exceptions in v3.2 branches 7 and 8 come from the checklist's own notes; they</w:t>
+        <w:t xml:space="preserve">The exceptions in v3.2 branches 7 and 8 come from the checklist’s own notes; they</w:t>
       </w:r>
       <w:r>
         <w:t xml:space="preserve"> </w:t>
@@ -13457,13 +13452,25 @@
         <w:t xml:space="preserve"> </w:t>
       </w:r>
       <w:r>
-        <w:t xml:space="preserve">licence is not proof of either. "AUP and UAP do not necessarily need to be</w:t>
-      </w:r>
-      <w:r>
-        <w:t xml:space="preserve"> </w:t>
-      </w:r>
-      <w:r>
-        <w:t xml:space="preserve">unique per service" is why a single policy linked from the NLP, or from a page it</w:t>
+        <w:t xml:space="preserve">licence is not proof of either.</w:t>
+      </w:r>
+      <w:r>
+        <w:t xml:space="preserve"> </w:t>
+      </w:r>
+      <w:r>
+        <w:t xml:space="preserve">“AUP and UAP do not necessarily need to be</w:t>
+      </w:r>
+      <w:r>
+        <w:t xml:space="preserve"> </w:t>
+      </w:r>
+      <w:r>
+        <w:t xml:space="preserve">unique per service”</w:t>
+      </w:r>
+      <w:r>
+        <w:t xml:space="preserve"> </w:t>
+      </w:r>
+      <w:r>
+        <w:t xml:space="preserve">is why a single policy linked from the NLP, or from a page it</w:t>
       </w:r>
       <w:r>
         <w:t xml:space="preserve"> </w:t>
@@ -13483,7 +13490,13 @@
         <w:t xml:space="preserve"> </w:t>
       </w:r>
       <w:r>
-        <w:t xml:space="preserve">("directly on the NLP"), 5b and 5c moved from</w:t>
+        <w:t xml:space="preserve">(</w:t>
+      </w:r>
+      <w:r>
+        <w:t xml:space="preserve">“directly on the NLP”</w:t>
+      </w:r>
+      <w:r>
+        <w:t xml:space="preserve">), 5b and 5c moved from</w:t>
       </w:r>
       <w:r>
         <w:t xml:space="preserve"> </w:t>
@@ -13612,13 +13625,28 @@
         <w:t xml:space="preserve"> </w:t>
       </w:r>
       <w:r>
-        <w:t xml:space="preserve">did not read (CERN's "Services" and</w:t>
-      </w:r>
-      <w:r>
-        <w:t xml:space="preserve"> </w:t>
-      </w:r>
-      <w:r>
-        <w:t xml:space="preserve">"Policies", for instance). BBMRI-ERIC's 5b moved from review to</w:t>
+        <w:t xml:space="preserve">did not read (CERN’s</w:t>
+      </w:r>
+      <w:r>
+        <w:t xml:space="preserve"> </w:t>
+      </w:r>
+      <w:r>
+        <w:t xml:space="preserve">“Services”</w:t>
+      </w:r>
+      <w:r>
+        <w:t xml:space="preserve"> </w:t>
+      </w:r>
+      <w:r>
+        <w:t xml:space="preserve">and</w:t>
+      </w:r>
+      <w:r>
+        <w:t xml:space="preserve"> </w:t>
+      </w:r>
+      <w:r>
+        <w:t xml:space="preserve">“Policies”</w:t>
+      </w:r>
+      <w:r>
+        <w:t xml:space="preserve">, for instance). BBMRI-ERIC’s 5b moved from review to</w:t>
       </w:r>
       <w:r>
         <w:t xml:space="preserve"> </w:t>
@@ -13639,13 +13667,22 @@
         <w:t xml:space="preserve"> </w:t>
       </w:r>
       <w:r>
-        <w:t xml:space="preserve">6b: its Access Policies page links the "Acceptable Use Policy of BBMRI-ERIC</w:t>
-      </w:r>
-      <w:r>
-        <w:t xml:space="preserve"> </w:t>
-      </w:r>
-      <w:r>
-        <w:t xml:space="preserve">Services". Every other cell is unchanged: seven nodes link one of the two</w:t>
+        <w:t xml:space="preserve">6b: its Access Policies page links the</w:t>
+      </w:r>
+      <w:r>
+        <w:t xml:space="preserve"> </w:t>
+      </w:r>
+      <w:r>
+        <w:t xml:space="preserve">“Acceptable Use Policy of BBMRI-ERIC</w:t>
+      </w:r>
+      <w:r>
+        <w:t xml:space="preserve"> </w:t>
+      </w:r>
+      <w:r>
+        <w:t xml:space="preserve">Services”</w:t>
+      </w:r>
+      <w:r>
+        <w:t xml:space="preserve">. Every other cell is unchanged: seven nodes link one of the two</w:t>
       </w:r>
       <w:r>
         <w:t xml:space="preserve"> </w:t>
@@ -13657,7 +13694,7 @@
         <w:t xml:space="preserve"> </w:t>
       </w:r>
       <w:r>
-        <w:t xml:space="preserve">labelled as both, and GÉANT's page was not served (branch 9). Run</w:t>
+        <w:t xml:space="preserve">labelled as both, and GÉANT’s page was not served (branch 9). Run</w:t>
       </w:r>
       <w:r>
         <w:t xml:space="preserve"> </w:t>
@@ -13675,19 +13712,31 @@
         <w:t xml:space="preserve"> </w:t>
       </w:r>
       <w:r>
-        <w:t xml:space="preserve">the first collection under the re-issued v3.2, read those pages: CERN's 5b and</w:t>
-      </w:r>
-      <w:r>
-        <w:t xml:space="preserve"> </w:t>
-      </w:r>
-      <w:r>
-        <w:t xml:space="preserve">5c pass by branch 6b (its "Policies" page links both policies, which were</w:t>
-      </w:r>
-      <w:r>
-        <w:t xml:space="preserve"> </w:t>
-      </w:r>
-      <w:r>
-        <w:t xml:space="preserve">fetched), Data Terra's fail by branch 11 (its two services pages were read and</w:t>
+        <w:t xml:space="preserve">the first collection under the re-issued v3.2, read those pages: CERN’s 5b and</w:t>
+      </w:r>
+      <w:r>
+        <w:t xml:space="preserve"> </w:t>
+      </w:r>
+      <w:r>
+        <w:t xml:space="preserve">5c pass by branch 6b (its</w:t>
+      </w:r>
+      <w:r>
+        <w:t xml:space="preserve"> </w:t>
+      </w:r>
+      <w:r>
+        <w:t xml:space="preserve">“Policies”</w:t>
+      </w:r>
+      <w:r>
+        <w:t xml:space="preserve"> </w:t>
+      </w:r>
+      <w:r>
+        <w:t xml:space="preserve">page links both policies, which were</w:t>
+      </w:r>
+      <w:r>
+        <w:t xml:space="preserve"> </w:t>
+      </w:r>
+      <w:r>
+        <w:t xml:space="preserve">fetched), Data Terra’s fail by branch 11 (its two services pages were read and</w:t>
       </w:r>
       <w:r>
         <w:t xml:space="preserve"> </w:t>
@@ -13699,7 +13748,7 @@
         <w:t xml:space="preserve"> </w:t>
       </w:r>
       <w:r>
-        <w:t xml:space="preserve">cover), and PaNOSC's stay review by branch 10 (its services site was not</w:t>
+        <w:t xml:space="preserve">cover), and PaNOSC’s stay review by branch 10 (its services site was not</w:t>
       </w:r>
       <w:r>
         <w:t xml:space="preserve"> </w:t>
@@ -13792,7 +13841,31 @@
         <w:t xml:space="preserve"> </w:t>
       </w:r>
       <w:r>
-        <w:t xml:space="preserve">PaNOSC links "Acceptable User Policy and User Access Policy" to a user-policies page: 5c passes by branch 5, and 5b is review by branch 7, because "Acceptable User Policy" does not match the AUP vocabulary.</w:t>
+        <w:t xml:space="preserve">PaNOSC links</w:t>
+      </w:r>
+      <w:r>
+        <w:t xml:space="preserve"> </w:t>
+      </w:r>
+      <w:r>
+        <w:t xml:space="preserve">“Acceptable User Policy and User Access Policy”</w:t>
+      </w:r>
+      <w:r>
+        <w:t xml:space="preserve"> </w:t>
+      </w:r>
+      <w:r>
+        <w:t xml:space="preserve">to a user-policies page: 5c passes by branch 5, and 5b is review by branch 7, because</w:t>
+      </w:r>
+      <w:r>
+        <w:t xml:space="preserve"> </w:t>
+      </w:r>
+      <w:r>
+        <w:t xml:space="preserve">“Acceptable User Policy”</w:t>
+      </w:r>
+      <w:r>
+        <w:t xml:space="preserve"> </w:t>
+      </w:r>
+      <w:r>
+        <w:t xml:space="preserve">does not match the AUP vocabulary.</w:t>
       </w:r>
     </w:p>
     <w:p>
@@ -13802,8 +13875,8 @@
         </w:pict>
       </w:r>
     </w:p>
-    <w:bookmarkEnd w:id="29"/>
-    <w:bookmarkStart w:id="30" w:name="X0ae168f20938494fe77fb5723f6a69e35f983f8"/>
+    <w:bookmarkEnd w:id="28"/>
+    <w:bookmarkStart w:id="29" w:name="X0ae168f20938494fe77fb5723f6a69e35f983f8"/>
     <w:p>
       <w:pPr>
         <w:pStyle w:val="Heading3"/>
@@ -13829,7 +13902,19 @@
         <w:t xml:space="preserve"> </w:t>
       </w:r>
       <w:r>
-        <w:t xml:space="preserve">vocabulary. The word "support" on its own is only a reason to follow a link. On</w:t>
+        <w:t xml:space="preserve">vocabulary. The word</w:t>
+      </w:r>
+      <w:r>
+        <w:t xml:space="preserve"> </w:t>
+      </w:r>
+      <w:r>
+        <w:t xml:space="preserve">“support”</w:t>
+      </w:r>
+      <w:r>
+        <w:t xml:space="preserve"> </w:t>
+      </w:r>
+      <w:r>
+        <w:t xml:space="preserve">on its own is only a reason to follow a link. On</w:t>
       </w:r>
       <w:r>
         <w:t xml:space="preserve"> </w:t>
@@ -14155,7 +14240,13 @@
         <w:t xml:space="preserve"> </w:t>
       </w:r>
       <w:r>
-        <w:t xml:space="preserve">"support" phrases are strong in a link label, but not in page prose: they</w:t>
+        <w:t xml:space="preserve">“support”</w:t>
+      </w:r>
+      <w:r>
+        <w:t xml:space="preserve"> </w:t>
+      </w:r>
+      <w:r>
+        <w:t xml:space="preserve">phrases are strong in a link label, but not in page prose: they</w:t>
       </w:r>
       <w:r>
         <w:t xml:space="preserve"> </w:t>
@@ -14178,7 +14269,6 @@
       </w:tblGrid>
       <w:tr>
         <w:trPr>
-          <w:cantSplit/>
           <w:tblHeader w:val="on"/>
         </w:trPr>
         <w:tc>
@@ -14216,9 +14306,6 @@
         </w:tc>
       </w:tr>
       <w:tr>
-        <w:trPr>
-          <w:cantSplit/>
-        </w:trPr>
         <w:tc>
           <w:tcPr/>
           <w:p>
@@ -14257,9 +14344,6 @@
         </w:tc>
       </w:tr>
       <w:tr>
-        <w:trPr>
-          <w:cantSplit/>
-        </w:trPr>
         <w:tc>
           <w:tcPr/>
           <w:p>
@@ -14278,7 +14362,19 @@
               <w:pStyle w:val="Compact"/>
             </w:pPr>
             <w:r>
-              <w:t xml:space="preserve">Contact or bare "support" link, a followed page names a helpdesk or gives a helpdesk mailbox</w:t>
+              <w:t xml:space="preserve">Contact or bare</w:t>
+            </w:r>
+            <w:r>
+              <w:t xml:space="preserve"> </w:t>
+            </w:r>
+            <w:r>
+              <w:t xml:space="preserve">“support”</w:t>
+            </w:r>
+            <w:r>
+              <w:t xml:space="preserve"> </w:t>
+            </w:r>
+            <w:r>
+              <w:t xml:space="preserve">link, a followed page names a helpdesk or gives a helpdesk mailbox</w:t>
             </w:r>
           </w:p>
         </w:tc>
@@ -14304,9 +14400,6 @@
         </w:tc>
       </w:tr>
       <w:tr>
-        <w:trPr>
-          <w:cantSplit/>
-        </w:trPr>
         <w:tc>
           <w:tcPr/>
           <w:p>
@@ -14325,7 +14418,19 @@
               <w:pStyle w:val="Compact"/>
             </w:pPr>
             <w:r>
-              <w:t xml:space="preserve">Contact or bare "support" link, followed pages</w:t>
+              <w:t xml:space="preserve">Contact or bare</w:t>
+            </w:r>
+            <w:r>
+              <w:t xml:space="preserve"> </w:t>
+            </w:r>
+            <w:r>
+              <w:t xml:space="preserve">“support”</w:t>
+            </w:r>
+            <w:r>
+              <w:t xml:space="preserve"> </w:t>
+            </w:r>
+            <w:r>
+              <w:t xml:space="preserve">link, followed pages</w:t>
             </w:r>
             <w:r>
               <w:t xml:space="preserve"> </w:t>
@@ -14357,15 +14462,24 @@
               <w:t xml:space="preserve"> </w:t>
             </w:r>
             <w:r>
-              <w:t xml:space="preserve">— says when a "support" label was the only lead, and lists addresses and links not followed</w:t>
+              <w:t xml:space="preserve">— says when a</w:t>
+            </w:r>
+            <w:r>
+              <w:t xml:space="preserve"> </w:t>
+            </w:r>
+            <w:r>
+              <w:t xml:space="preserve">“support”</w:t>
+            </w:r>
+            <w:r>
+              <w:t xml:space="preserve"> </w:t>
+            </w:r>
+            <w:r>
+              <w:t xml:space="preserve">label was the only lead, and lists addresses and links not followed</w:t>
             </w:r>
           </w:p>
         </w:tc>
       </w:tr>
       <w:tr>
-        <w:trPr>
-          <w:cantSplit/>
-        </w:trPr>
         <w:tc>
           <w:tcPr/>
           <w:p>
@@ -14410,9 +14524,6 @@
         </w:tc>
       </w:tr>
       <w:tr>
-        <w:trPr>
-          <w:cantSplit/>
-        </w:trPr>
         <w:tc>
           <w:tcPr/>
           <w:p>
@@ -14451,9 +14562,6 @@
         </w:tc>
       </w:tr>
       <w:tr>
-        <w:trPr>
-          <w:cantSplit/>
-        </w:trPr>
         <w:tc>
           <w:tcPr/>
           <w:p>
@@ -14507,9 +14615,6 @@
         </w:tc>
       </w:tr>
       <w:tr>
-        <w:trPr>
-          <w:cantSplit/>
-        </w:trPr>
         <w:tc>
           <w:tcPr/>
           <w:p>
@@ -14571,7 +14676,19 @@
         <w:pStyle w:val="BodyText"/>
       </w:pPr>
       <w:r>
-        <w:t xml:space="preserve">Branches 2 and 3 are why depth 1 is worth the requests here. A "Contact" link is</w:t>
+        <w:t xml:space="preserve">Branches 2 and 3 are why depth 1 is worth the requests here. A</w:t>
+      </w:r>
+      <w:r>
+        <w:t xml:space="preserve"> </w:t>
+      </w:r>
+      <w:r>
+        <w:t xml:space="preserve">“Contact”</w:t>
+      </w:r>
+      <w:r>
+        <w:t xml:space="preserve"> </w:t>
+      </w:r>
+      <w:r>
+        <w:t xml:space="preserve">link is</w:t>
       </w:r>
       <w:r>
         <w:t xml:space="preserve"> </w:t>
@@ -14599,8 +14716,8 @@
         </w:pict>
       </w:r>
     </w:p>
-    <w:bookmarkEnd w:id="30"/>
-    <w:bookmarkStart w:id="31" w:name="point-7-the-page-is-in-english"/>
+    <w:bookmarkEnd w:id="29"/>
+    <w:bookmarkStart w:id="30" w:name="point-7-the-page-is-in-english"/>
     <w:p>
       <w:pPr>
         <w:pStyle w:val="Heading3"/>
@@ -14764,7 +14881,6 @@
       </w:tblGrid>
       <w:tr>
         <w:trPr>
-          <w:cantSplit/>
           <w:tblHeader w:val="on"/>
         </w:trPr>
         <w:tc>
@@ -14813,9 +14929,6 @@
         </w:tc>
       </w:tr>
       <w:tr>
-        <w:trPr>
-          <w:cantSplit/>
-        </w:trPr>
         <w:tc>
           <w:tcPr/>
           <w:p>
@@ -14868,9 +14981,6 @@
         </w:tc>
       </w:tr>
       <w:tr>
-        <w:trPr>
-          <w:cantSplit/>
-        </w:trPr>
         <w:tc>
           <w:tcPr/>
           <w:p>
@@ -14926,9 +15036,6 @@
         </w:tc>
       </w:tr>
       <w:tr>
-        <w:trPr>
-          <w:cantSplit/>
-        </w:trPr>
         <w:tc>
           <w:tcPr/>
           <w:p>
@@ -14987,9 +15094,6 @@
         </w:tc>
       </w:tr>
       <w:tr>
-        <w:trPr>
-          <w:cantSplit/>
-        </w:trPr>
         <w:tc>
           <w:tcPr/>
           <w:p>
@@ -15170,9 +15274,9 @@
         </w:pict>
       </w:r>
     </w:p>
+    <w:bookmarkEnd w:id="30"/>
     <w:bookmarkEnd w:id="31"/>
-    <w:bookmarkEnd w:id="32"/>
-    <w:bookmarkStart w:id="33" w:name="where-this-workflow-is-known-to-be-wrong"/>
+    <w:bookmarkStart w:id="32" w:name="where-this-workflow-is-known-to-be-wrong"/>
     <w:p>
       <w:pPr>
         <w:pStyle w:val="Heading2"/>
@@ -15204,7 +15308,7 @@
           <w:b/>
           <w:bCs/>
         </w:rPr>
-        <w:t xml:space="preserve">Point 3 over-matched on the page's own hostname — fixed, and the first</w:t>
+        <w:t xml:space="preserve">Point 3 over-matched on the page’s own hostname — fixed, and the first</w:t>
       </w:r>
       <w:r>
         <w:rPr>
@@ -15245,7 +15349,19 @@
         <w:t xml:space="preserve"> </w:t>
       </w:r>
       <w:r>
-        <w:t xml:space="preserve">node served from a host containing "eosc" the regex matched the</w:t>
+        <w:t xml:space="preserve">node served from a host containing</w:t>
+      </w:r>
+      <w:r>
+        <w:t xml:space="preserve"> </w:t>
+      </w:r>
+      <w:r>
+        <w:t xml:space="preserve">“eosc”</w:t>
+      </w:r>
+      <w:r>
+        <w:t xml:space="preserve"> </w:t>
+      </w:r>
+      <w:r>
+        <w:t xml:space="preserve">the regex matched the</w:t>
       </w:r>
       <w:r>
         <w:t xml:space="preserve"> </w:t>
@@ -15278,7 +15394,13 @@
         <w:t xml:space="preserve"> </w:t>
       </w:r>
       <w:r>
-        <w:t xml:space="preserve">"EOSC-referencing image assets" for that node; probing the captured evidence</w:t>
+        <w:t xml:space="preserve">“EOSC-referencing image assets”</w:t>
+      </w:r>
+      <w:r>
+        <w:t xml:space="preserve"> </w:t>
+      </w:r>
+      <w:r>
+        <w:t xml:space="preserve">for that node; probing the captured evidence</w:t>
       </w:r>
       <w:r>
         <w:t xml:space="preserve"> </w:t>
@@ -15401,7 +15523,7 @@
         <w:t xml:space="preserve"> </w:t>
       </w:r>
       <w:r>
-        <w:t xml:space="preserve">genuine logos. The defect was never cross-host loading; it was the node's</w:t>
+        <w:t xml:space="preserve">genuine logos. The defect was never cross-host loading; it was the node’s</w:t>
       </w:r>
       <w:r>
         <w:t xml:space="preserve"> </w:t>
@@ -15440,7 +15562,19 @@
         <w:t xml:space="preserve"> </w:t>
       </w:r>
       <w:r>
-        <w:t xml:space="preserve">and requires "eosc" to be a token rather than</w:t>
+        <w:t xml:space="preserve">and requires</w:t>
+      </w:r>
+      <w:r>
+        <w:t xml:space="preserve"> </w:t>
+      </w:r>
+      <w:r>
+        <w:t xml:space="preserve">“eosc”</w:t>
+      </w:r>
+      <w:r>
+        <w:t xml:space="preserve"> </w:t>
+      </w:r>
+      <w:r>
+        <w:t xml:space="preserve">to be a token rather than</w:t>
       </w:r>
       <w:r>
         <w:t xml:space="preserve"> </w:t>
@@ -15543,7 +15677,7 @@
         <w:t xml:space="preserve"> </w:t>
       </w:r>
       <w:r>
-        <w:t xml:space="preserve">"eosc"</w:t>
+        <w:t xml:space="preserve">“eosc”</w:t>
       </w:r>
       <w:r>
         <w:t xml:space="preserve"> </w:t>
@@ -15573,7 +15707,22 @@
         <w:t xml:space="preserve"> </w:t>
       </w:r>
       <w:r>
-        <w:t xml:space="preserve">"asset present" to "none found". An uppercase letter is now accepted as a word</w:t>
+        <w:t xml:space="preserve">“asset present”</w:t>
+      </w:r>
+      <w:r>
+        <w:t xml:space="preserve"> </w:t>
+      </w:r>
+      <w:r>
+        <w:t xml:space="preserve">to</w:t>
+      </w:r>
+      <w:r>
+        <w:t xml:space="preserve"> </w:t>
+      </w:r>
+      <w:r>
+        <w:t xml:space="preserve">“none found”</w:t>
+      </w:r>
+      <w:r>
+        <w:t xml:space="preserve">. An uppercase letter is now accepted as a word</w:t>
       </w:r>
       <w:r>
         <w:t xml:space="preserve"> </w:t>
@@ -15660,7 +15809,13 @@
         <w:t xml:space="preserve"> </w:t>
       </w:r>
       <w:r>
-        <w:t xml:space="preserve">reported a match on the BBMRI-ERIC page (inside "strat</w:t>
+        <w:t xml:space="preserve">reported a match on the BBMRI-ERIC page (inside</w:t>
+      </w:r>
+      <w:r>
+        <w:t xml:space="preserve"> </w:t>
+      </w:r>
+      <w:r>
+        <w:t xml:space="preserve">“strat</w:t>
       </w:r>
       <w:r>
         <w:rPr>
@@ -15670,13 +15825,22 @@
         <w:t xml:space="preserve">egi</w:t>
       </w:r>
       <w:r>
-        <w:t xml:space="preserve">c") and on Data</w:t>
-      </w:r>
-      <w:r>
-        <w:t xml:space="preserve"> </w:t>
-      </w:r>
-      <w:r>
-        <w:t xml:space="preserve">Terra (inside "Norw</w:t>
+        <w:t xml:space="preserve">c”</w:t>
+      </w:r>
+      <w:r>
+        <w:t xml:space="preserve">) and on Data</w:t>
+      </w:r>
+      <w:r>
+        <w:t xml:space="preserve"> </w:t>
+      </w:r>
+      <w:r>
+        <w:t xml:space="preserve">Terra (inside</w:t>
+      </w:r>
+      <w:r>
+        <w:t xml:space="preserve"> </w:t>
+      </w:r>
+      <w:r>
+        <w:t xml:space="preserve">“Norw</w:t>
       </w:r>
       <w:r>
         <w:rPr>
@@ -15686,13 +15850,16 @@
         <w:t xml:space="preserve">egi</w:t>
       </w:r>
       <w:r>
-        <w:t xml:space="preserve">an"), neither of which names the EGI node. The list</w:t>
-      </w:r>
-      <w:r>
-        <w:t xml:space="preserve"> </w:t>
-      </w:r>
-      <w:r>
-        <w:t xml:space="preserve">was also matched as a whole, so any name matching any page satisfied that page's</w:t>
+        <w:t xml:space="preserve">an”</w:t>
+      </w:r>
+      <w:r>
+        <w:t xml:space="preserve">), neither of which names the EGI node. The list</w:t>
+      </w:r>
+      <w:r>
+        <w:t xml:space="preserve"> </w:t>
+      </w:r>
+      <w:r>
+        <w:t xml:space="preserve">was also matched as a whole, so any name matching any page satisfied that page’s</w:t>
       </w:r>
       <w:r>
         <w:t xml:space="preserve"> </w:t>
@@ -15839,7 +16006,7 @@
         <w:t xml:space="preserve"> </w:t>
       </w:r>
       <w:r>
-        <w:t xml:space="preserve">unscoped, so a match says the string is on the page, not that it is that page's</w:t>
+        <w:t xml:space="preserve">unscoped, so a match says the string is on the page, not that it is that page’s</w:t>
       </w:r>
       <w:r>
         <w:t xml:space="preserve"> </w:t>
@@ -15861,7 +16028,7 @@
         <w:t xml:space="preserve"> </w:t>
       </w:r>
       <w:r>
-        <w:t xml:space="preserve">node's approved name would satisfy its own evidence line. The line says which</w:t>
+        <w:t xml:space="preserve">node’s approved name would satisfy its own evidence line. The line says which</w:t>
       </w:r>
       <w:r>
         <w:t xml:space="preserve"> </w:t>
@@ -15933,7 +16100,7 @@
         <w:t xml:space="preserve"> </w:t>
       </w:r>
       <w:r>
-        <w:t xml:space="preserve">the same agreement on thirteen: both lists match four (GÉANT's page was blocked</w:t>
+        <w:t xml:space="preserve">the same agreement on thirteen: both lists match four (GÉANT’s page was blocked</w:t>
       </w:r>
       <w:r>
         <w:t xml:space="preserve"> </w:t>
@@ -16145,7 +16312,7 @@
         <w:t xml:space="preserve">_policy_check</w:t>
       </w:r>
       <w:r>
-        <w:t xml:space="preserve">) and never verified. The checklist's requirement is</w:t>
+        <w:t xml:space="preserve">) and never verified. The checklist’s requirement is</w:t>
       </w:r>
       <w:r>
         <w:t xml:space="preserve"> </w:t>
@@ -16383,7 +16550,7 @@
         <w:t xml:space="preserve"> </w:t>
       </w:r>
       <w:r>
-        <w:t xml:space="preserve">the evidence captured then. After BBMRI-ERIC's URL changed on 25 September, a</w:t>
+        <w:t xml:space="preserve">the evidence captured then. After BBMRI-ERIC’s URL changed on 25 September, a</w:t>
       </w:r>
       <w:r>
         <w:t xml:space="preserve"> </w:t>
@@ -16569,7 +16736,7 @@
         <w:t xml:space="preserve"> </w:t>
       </w:r>
       <w:r>
-        <w:t xml:space="preserve">is produced automatically from an unreviewed run and carries the repository's</w:t>
+        <w:t xml:space="preserve">is produced automatically from an unreviewed run and carries the repository’s</w:t>
       </w:r>
       <w:r>
         <w:t xml:space="preserve"> </w:t>
@@ -16620,7 +16787,7 @@
         <w:t xml:space="preserve"> </w:t>
       </w:r>
       <w:r>
-        <w:t xml:space="preserve">were this run's result.</w:t>
+        <w:t xml:space="preserve">were this run’s result.</w:t>
       </w:r>
     </w:p>
     <w:p>
@@ -16630,8 +16797,8 @@
         </w:pict>
       </w:r>
     </w:p>
-    <w:bookmarkEnd w:id="33"/>
-    <w:bookmarkStart w:id="34" w:name="reading-the-output"/>
+    <w:bookmarkEnd w:id="32"/>
+    <w:bookmarkStart w:id="33" w:name="reading-the-output"/>
     <w:p>
       <w:pPr>
         <w:pStyle w:val="Heading2"/>
@@ -16843,7 +17010,7 @@
         <w:t xml:space="preserve"> </w:t>
       </w:r>
       <w:r>
-        <w:t xml:space="preserve">(present only when some node's evidence was collected from a URL</w:t>
+        <w:t xml:space="preserve">(present only when some node’s evidence was collected from a URL</w:t>
       </w:r>
       <w:r>
         <w:t xml:space="preserve"> </w:t>
@@ -16897,7 +17064,13 @@
         <w:t xml:space="preserve">fetched_at</w:t>
       </w:r>
       <w:r>
-        <w:t xml:space="preserve">; the reports then carry an "Evidence from a different URL"</w:t>
+        <w:t xml:space="preserve">; the reports then carry an</w:t>
+      </w:r>
+      <w:r>
+        <w:t xml:space="preserve"> </w:t>
+      </w:r>
+      <w:r>
+        <w:t xml:space="preserve">“Evidence from a different URL”</w:t>
       </w:r>
       <w:r>
         <w:t xml:space="preserve"> </w:t>
@@ -17219,7 +17392,7 @@
         <w:t xml:space="preserve"> </w:t>
       </w:r>
       <w:r>
-        <w:t xml:space="preserve">mixed-language branch) end in a human's hands by design. A tool that returned</w:t>
+        <w:t xml:space="preserve">mixed-language branch) end in a human’s hands by design. A tool that returned</w:t>
       </w:r>
       <w:r>
         <w:t xml:space="preserve"> </w:t>
@@ -17228,8 +17401,8 @@
         <w:t xml:space="preserve">PASS or FAIL on every line would look more useful and be worth considerably less.</w:t>
       </w:r>
     </w:p>
-    <w:bookmarkEnd w:id="34"/>
-    <w:bookmarkStart w:id="41" w:name="worked-examples"/>
+    <w:bookmarkEnd w:id="33"/>
+    <w:bookmarkStart w:id="40" w:name="worked-examples"/>
     <w:p>
       <w:pPr>
         <w:pStyle w:val="Heading2"/>
@@ -17249,7 +17422,7 @@
         <w:t xml:space="preserve"> </w:t>
       </w:r>
       <w:r>
-        <w:t xml:space="preserve">adding a node, changing a node's URL, and adopting a new revision of the</w:t>
+        <w:t xml:space="preserve">adding a node, changing a node’s URL, and adopting a new revision of the</w:t>
       </w:r>
       <w:r>
         <w:t xml:space="preserve"> </w:t>
@@ -17485,7 +17658,19 @@
         <w:t xml:space="preserve"> </w:t>
       </w:r>
       <w:r>
-        <w:t xml:space="preserve">tool's verdicts are not a compliance statement (see "Reading the output" in</w:t>
+        <w:t xml:space="preserve">tool’s verdicts are not a compliance statement (see</w:t>
+      </w:r>
+      <w:r>
+        <w:t xml:space="preserve"> </w:t>
+      </w:r>
+      <w:r>
+        <w:t xml:space="preserve">“Reading the output”</w:t>
+      </w:r>
+      <w:r>
+        <w:t xml:space="preserve"> </w:t>
+      </w:r>
+      <w:r>
+        <w:t xml:space="preserve">in</w:t>
       </w:r>
       <w:r>
         <w:t xml:space="preserve"> </w:t>
@@ -17496,7 +17681,7 @@
       <w:r>
         <w:t xml:space="preserve"> </w:t>
       </w:r>
-      <w:hyperlink r:id="rId35">
+      <w:hyperlink r:id="rId34">
         <w:r>
           <w:rPr>
             <w:rStyle w:val="Hyperlink"/>
@@ -17604,7 +17789,7 @@
         <w:t xml:space="preserve">own run.</w:t>
       </w:r>
     </w:p>
-    <w:bookmarkStart w:id="37" w:name="X6b9c9d2e59e13da41f347184ca67a475fa8b7ce"/>
+    <w:bookmarkStart w:id="36" w:name="X6b9c9d2e59e13da41f347184ca67a475fa8b7ce"/>
     <w:p>
       <w:pPr>
         <w:pStyle w:val="Heading3"/>
@@ -17701,7 +17886,13 @@
         <w:t xml:space="preserve"> </w:t>
       </w:r>
       <w:r>
-        <w:t xml:space="preserve">EOSC EU Node Contributors Dashboard ("Website address", section 1.2, field 6).</w:t>
+        <w:t xml:space="preserve">EOSC EU Node Contributors Dashboard (</w:t>
+      </w:r>
+      <w:r>
+        <w:t xml:space="preserve">“Website address”</w:t>
+      </w:r>
+      <w:r>
+        <w:t xml:space="preserve">, section 1.2, field 6).</w:t>
       </w:r>
       <w:r>
         <w:t xml:space="preserve"> </w:t>
@@ -17727,7 +17918,7 @@
       <w:r>
         <w:t xml:space="preserve"> </w:t>
       </w:r>
-      <w:hyperlink r:id="rId36">
+      <w:hyperlink r:id="rId35">
         <w:r>
           <w:rPr>
             <w:rStyle w:val="Hyperlink"/>
@@ -17970,7 +18161,13 @@
         <w:t xml:space="preserve"> </w:t>
       </w:r>
       <w:r>
-        <w:t xml:space="preserve">(see "Checking a page not in</w:t>
+        <w:t xml:space="preserve">(see</w:t>
+      </w:r>
+      <w:r>
+        <w:t xml:space="preserve"> </w:t>
+      </w:r>
+      <w:r>
+        <w:t xml:space="preserve">“Checking a page not in</w:t>
       </w:r>
       <w:r>
         <w:t xml:space="preserve"> </w:t>
@@ -17982,12 +18179,18 @@
         <w:t xml:space="preserve">nodes.yaml</w:t>
       </w:r>
       <w:r>
-        <w:t xml:space="preserve">" in the</w:t>
-      </w:r>
-      <w:r>
-        <w:t xml:space="preserve"> </w:t>
-      </w:r>
-      <w:hyperlink r:id="rId35">
+        <w:t xml:space="preserve">”</w:t>
+      </w:r>
+      <w:r>
+        <w:t xml:space="preserve"> </w:t>
+      </w:r>
+      <w:r>
+        <w:t xml:space="preserve">in the</w:t>
+      </w:r>
+      <w:r>
+        <w:t xml:space="preserve"> </w:t>
+      </w:r>
+      <w:hyperlink r:id="rId34">
         <w:r>
           <w:rPr>
             <w:rStyle w:val="Hyperlink"/>
@@ -18824,13 +19027,34 @@
           <w:b/>
           <w:bCs/>
         </w:rPr>
-        <w:t xml:space="preserve">warns "Evidence from a different URL".</w:t>
-      </w:r>
-      <w:r>
-        <w:t xml:space="preserve"> </w:t>
-      </w:r>
-      <w:r>
-        <w:t xml:space="preserve">It means a node's URL</w:t>
+        <w:t xml:space="preserve">warns</w:t>
+      </w:r>
+      <w:r>
+        <w:rPr>
+          <w:b/>
+          <w:bCs/>
+        </w:rPr>
+        <w:t xml:space="preserve"> </w:t>
+      </w:r>
+      <w:r>
+        <w:rPr>
+          <w:b/>
+          <w:bCs/>
+        </w:rPr>
+        <w:t xml:space="preserve">“Evidence from a different URL”</w:t>
+      </w:r>
+      <w:r>
+        <w:rPr>
+          <w:b/>
+          <w:bCs/>
+        </w:rPr>
+        <w:t xml:space="preserve">.</w:t>
+      </w:r>
+      <w:r>
+        <w:t xml:space="preserve"> </w:t>
+      </w:r>
+      <w:r>
+        <w:t xml:space="preserve">It means a node’s URL</w:t>
       </w:r>
       <w:r>
         <w:t xml:space="preserve"> </w:t>
@@ -19145,7 +19369,7 @@
         <w:t xml:space="preserve"> </w:t>
       </w:r>
       <w:r>
-        <w:t xml:space="preserve">on 24 September, when GÉANT's page was served). If the new page shows its</w:t>
+        <w:t xml:space="preserve">on 24 September, when GÉANT’s page was served). If the new page shows its</w:t>
       </w:r>
       <w:r>
         <w:t xml:space="preserve"> </w:t>
@@ -19190,7 +19414,7 @@
         <w:t xml:space="preserve">web-13</w:t>
       </w:r>
       <w:r>
-        <w:t xml:space="preserve">). Update it to the new run's shape.</w:t>
+        <w:t xml:space="preserve">). Update it to the new run’s shape.</w:t>
       </w:r>
     </w:p>
     <w:p>
@@ -19268,7 +19492,13 @@
         <w:t xml:space="preserve"> </w:t>
       </w:r>
       <w:r>
-        <w:t xml:space="preserve">("130 cells: 66 PASS · 1 FAIL · 63 review");</w:t>
+        <w:t xml:space="preserve">(</w:t>
+      </w:r>
+      <w:r>
+        <w:t xml:space="preserve">“130 cells: 60 PASS · 1 FAIL · 59 review · 10 ERROR”</w:t>
+      </w:r>
+      <w:r>
+        <w:t xml:space="preserve">);</w:t>
       </w:r>
     </w:p>
     <w:p>
@@ -19280,7 +19510,13 @@
         </w:numPr>
       </w:pPr>
       <w:r>
-        <w:t xml:space="preserve">"The published figures" in</w:t>
+        <w:t xml:space="preserve">“The published figures”</w:t>
+      </w:r>
+      <w:r>
+        <w:t xml:space="preserve"> </w:t>
+      </w:r>
+      <w:r>
+        <w:t xml:space="preserve">in</w:t>
       </w:r>
       <w:r>
         <w:t xml:space="preserve"> </w:t>
@@ -19298,7 +19534,13 @@
         <w:t xml:space="preserve"> </w:t>
       </w:r>
       <w:r>
-        <w:t xml:space="preserve">"The node list — a YAML file" in the same file.</w:t>
+        <w:t xml:space="preserve">“The node list — a YAML file”</w:t>
+      </w:r>
+      <w:r>
+        <w:t xml:space="preserve"> </w:t>
+      </w:r>
+      <w:r>
+        <w:t xml:space="preserve">in the same file.</w:t>
       </w:r>
     </w:p>
     <w:p>
@@ -19396,14 +19638,14 @@
         <w:t xml:space="preserve"> push</w:t>
       </w:r>
     </w:p>
-    <w:bookmarkEnd w:id="37"/>
-    <w:bookmarkStart w:id="38" w:name="X5431a82e20a06edfb102374e037ce7ea9ce6896"/>
+    <w:bookmarkEnd w:id="36"/>
+    <w:bookmarkStart w:id="37" w:name="X5431a82e20a06edfb102374e037ce7ea9ce6896"/>
     <w:p>
       <w:pPr>
         <w:pStyle w:val="Heading3"/>
       </w:pPr>
       <w:r>
-        <w:t xml:space="preserve">Example 2 — changing a node's landing page URL</w:t>
+        <w:t xml:space="preserve">Example 2 — changing a node’s landing page URL</w:t>
       </w:r>
     </w:p>
     <w:p>
@@ -19465,7 +19707,7 @@
         <w:t xml:space="preserve"> </w:t>
       </w:r>
       <w:r>
-        <w:t xml:space="preserve">host's</w:t>
+        <w:t xml:space="preserve">host’s</w:t>
       </w:r>
       <w:r>
         <w:t xml:space="preserve"> </w:t>
@@ -19555,7 +19797,7 @@
         <w:t xml:space="preserve">nodes.yaml</w:t>
       </w:r>
       <w:r>
-        <w:t xml:space="preserve">. Nothing else in the repository stores a node's URL. Add a comment</w:t>
+        <w:t xml:space="preserve">. Nothing else in the repository stores a node’s URL. Add a comment</w:t>
       </w:r>
       <w:r>
         <w:t xml:space="preserve"> </w:t>
@@ -19844,7 +20086,7 @@
         <w:t xml:space="preserve"> </w:t>
       </w:r>
       <w:r>
-        <w:t xml:space="preserve">as well only if the node's own entry on</w:t>
+        <w:t xml:space="preserve">as well only if the node’s own entry on</w:t>
       </w:r>
       <w:r>
         <w:t xml:space="preserve"> </w:t>
@@ -19886,7 +20128,7 @@
         <w:t xml:space="preserve"> </w:t>
       </w:r>
       <w:r>
-        <w:t xml:space="preserve">change only if the node's approved name changed. Keep the</w:t>
+        <w:t xml:space="preserve">change only if the node’s approved name changed. Keep the</w:t>
       </w:r>
       <w:r>
         <w:t xml:space="preserve"> </w:t>
@@ -20087,7 +20329,7 @@
         <w:t xml:space="preserve"> </w:t>
       </w:r>
       <w:r>
-        <w:t xml:space="preserve">host's</w:t>
+        <w:t xml:space="preserve">host’s</w:t>
       </w:r>
       <w:r>
         <w:t xml:space="preserve"> </w:t>
@@ -20138,7 +20380,7 @@
           <w:b/>
           <w:bCs/>
         </w:rPr>
-        <w:t xml:space="preserve">Step 3: update that node's row in the published run.</w:t>
+        <w:t xml:space="preserve">Step 3: update that node’s row in the published run.</w:t>
       </w:r>
       <w:r>
         <w:t xml:space="preserve"> </w:t>
@@ -20226,7 +20468,7 @@
         <w:t xml:space="preserve">bbmri-eric</w:t>
       </w:r>
       <w:r>
-        <w:t xml:space="preserve">'s evidence, screenshot and row, then rebuild</w:t>
+        <w:t xml:space="preserve">’s evidence, screenshot and row, then rebuild</w:t>
       </w:r>
       <w:r>
         <w:t xml:space="preserve"> </w:t>
@@ -20295,7 +20537,7 @@
         <w:t xml:space="preserve"> </w:t>
       </w:r>
       <w:r>
-        <w:t xml:space="preserve">point's old and new verdict, and both reports gain an</w:t>
+        <w:t xml:space="preserve">point’s old and new verdict, and both reports gain an</w:t>
       </w:r>
       <w:r>
         <w:t xml:space="preserve"> </w:t>
@@ -20768,8 +21010,8 @@
         <w:t xml:space="preserve">the documents together.</w:t>
       </w:r>
     </w:p>
-    <w:bookmarkEnd w:id="38"/>
-    <w:bookmarkStart w:id="40" w:name="Xbb3e2d317a0d811066009804bfa0a222a6197de"/>
+    <w:bookmarkEnd w:id="37"/>
+    <w:bookmarkStart w:id="39" w:name="Xbb3e2d317a0d811066009804bfa0a222a6197de"/>
     <w:p>
       <w:pPr>
         <w:pStyle w:val="Heading3"/>
@@ -20833,7 +21075,6 @@
       </w:tblGrid>
       <w:tr>
         <w:trPr>
-          <w:cantSplit/>
           <w:tblHeader w:val="on"/>
         </w:trPr>
         <w:tc>
@@ -20860,9 +21101,6 @@
         </w:tc>
       </w:tr>
       <w:tr>
-        <w:trPr>
-          <w:cantSplit/>
-        </w:trPr>
         <w:tc>
           <w:tcPr/>
           <w:p>
@@ -20933,9 +21171,6 @@
         </w:tc>
       </w:tr>
       <w:tr>
-        <w:trPr>
-          <w:cantSplit/>
-        </w:trPr>
         <w:tc>
           <w:tcPr/>
           <w:p>
@@ -21023,9 +21258,6 @@
         </w:tc>
       </w:tr>
       <w:tr>
-        <w:trPr>
-          <w:cantSplit/>
-        </w:trPr>
         <w:tc>
           <w:tcPr/>
           <w:p>
@@ -21310,7 +21542,7 @@
           <w:b/>
           <w:bCs/>
         </w:rPr>
-        <w:t xml:space="preserve">Step 2: create the new revision's file from the old one.</w:t>
+        <w:t xml:space="preserve">Step 2: create the new revision’s file from the old one.</w:t>
       </w:r>
     </w:p>
     <w:p>
@@ -21681,7 +21913,7 @@
         </w:numPr>
       </w:pPr>
       <w:r>
-        <w:t xml:space="preserve">Where a rule changed, update that point's decision procedure in section 5, so</w:t>
+        <w:t xml:space="preserve">Where a rule changed, update that point’s decision procedure in section 5, so</w:t>
       </w:r>
       <w:r>
         <w:t xml:space="preserve"> </w:t>
@@ -21760,7 +21992,7 @@
         <w:t xml:space="preserve"> </w:t>
       </w:r>
       <w:r>
-        <w:t xml:space="preserve">in checklist order, name it in the point's</w:t>
+        <w:t xml:space="preserve">in checklist order, name it in the point’s</w:t>
       </w:r>
       <w:r>
         <w:t xml:space="preserve"> </w:t>
@@ -21945,13 +22177,22 @@
         <w:t xml:space="preserve">v3.1.yaml</w:t>
       </w:r>
       <w:r>
-        <w:t xml:space="preserve">, which lack the key, keep "on the NLP or in the</w:t>
-      </w:r>
-      <w:r>
-        <w:t xml:space="preserve"> </w:t>
-      </w:r>
-      <w:r>
-        <w:t xml:space="preserve">Catalogue". Add tests for both rules, and rebuild the published run with the</w:t>
+        <w:t xml:space="preserve">, which lack the key, keep</w:t>
+      </w:r>
+      <w:r>
+        <w:t xml:space="preserve"> </w:t>
+      </w:r>
+      <w:r>
+        <w:t xml:space="preserve">“on the NLP or in the</w:t>
+      </w:r>
+      <w:r>
+        <w:t xml:space="preserve"> </w:t>
+      </w:r>
+      <w:r>
+        <w:t xml:space="preserve">Catalogue”</w:t>
+      </w:r>
+      <w:r>
+        <w:t xml:space="preserve">. Add tests for both rules, and rebuild the published run with the</w:t>
       </w:r>
       <w:r>
         <w:t xml:space="preserve"> </w:t>
@@ -22381,7 +22622,7 @@
         <w:pStyle w:val="FirstParagraph"/>
       </w:pPr>
       <w:r>
-        <w:t xml:space="preserve">The tests check the new file's hash, that its version matches its filename,</w:t>
+        <w:t xml:space="preserve">The tests check the new file’s hash, that its version matches its filename,</w:t>
       </w:r>
       <w:r>
         <w:t xml:space="preserve"> </w:t>
@@ -22859,7 +23100,7 @@
         <w:t xml:space="preserve"> </w:t>
       </w:r>
       <w:r>
-        <w:t xml:space="preserve">point's rule branch by branch. Commit the new document,</w:t>
+        <w:t xml:space="preserve">point’s rule branch by branch. Commit the new document,</w:t>
       </w:r>
       <w:r>
         <w:t xml:space="preserve"> </w:t>
@@ -23025,7 +23266,7 @@
         </w:rPr>
         <w:t xml:space="preserve"> </w:t>
       </w:r>
-      <w:hyperlink r:id="rId39">
+      <w:hyperlink r:id="rId38">
         <w:r>
           <w:rPr>
             <w:rStyle w:val="Hyperlink"/>
@@ -23043,10 +23284,10 @@
         <w:t xml:space="preserve">.</w:t>
       </w:r>
     </w:p>
+    <w:bookmarkEnd w:id="39"/>
     <w:bookmarkEnd w:id="40"/>
-    <w:bookmarkEnd w:id="41"/>
     <w:sectPr>
-      <w:footerReference w:type="default" r:id="rId9"/>
+      <w:footerReference w:type="default" r:id="rId10"/>
       <w:footnotePr>
         <w:numRestart w:val="eachSect"/>
       </w:footnotePr>

</xml_diff>

<commit_message>
Publish run web-28 (depth 2, re-issued checklist v3.2, 15 nodes, 129 requests): 78/4/68 at depth 2, 77/4/69 at depth 1 (EBRAINS-RI point 6); first run with EBRAINS-RI (point 4 FAIL: no eosc.eu link) and Life Sciences Connect (5b, 5c, 6 FAIL; its menu links have no href, and 6 is a false negative: a hand check found its helpdesk address on its Contact page); EUDAT 6 review to PASS; GÉANT behind the Cloudflare challenge; names masked as before plus eight on EBRAINS-RI's pages and the coordinator in Life Sciences Connect's screenshot, CERN screenshot masked again; update-row test expects fifteen nodes; docs and Word/PDF guides updated
</commit_message>
<xml_diff>
--- a/docs/eosc-basic-compliance-analysis-workflow.docx
+++ b/docs/eosc-basic-compliance-analysis-workflow.docx
@@ -207,7 +207,7 @@
         </w:pict>
       </w:r>
     </w:p>
-    <w:bookmarkStart w:id="13" w:name="the-three-stages"/>
+    <w:bookmarkStart w:id="23" w:name="the-three-stages"/>
     <w:p>
       <w:pPr>
         <w:pStyle w:val="Heading2"/>
@@ -753,7 +753,7 @@
         <w:t xml:space="preserve">, no check can use it — see section 3.</w:t>
       </w:r>
     </w:p>
-    <w:bookmarkStart w:id="12" w:name="Xfc66290f0c5177f1908cc0639df18c8282368f6"/>
+    <w:bookmarkStart w:id="22" w:name="Xfc66290f0c5177f1908cc0639df18c8282368f6"/>
     <w:p>
       <w:pPr>
         <w:pStyle w:val="Heading3"/>
@@ -769,20 +769,20 @@
       <w:r>
         <w:drawing>
           <wp:inline>
-            <wp:extent cx="4846320" cy="6057899"/>
+            <wp:extent cx="5334000" cy="6667500"/>
             <wp:effectExtent b="0" l="0" r="0" t="0"/>
-            <wp:docPr descr="Figure 1. The three phases in execution order: collect contacts the nodes, assess and report work offline, and run performs all three." title="" id="10" name="Picture"/>
+            <wp:docPr descr="Figure 1. The three phases in execution order: collect contacts the nodes, assess and report work offline, and run performs all three." title="" id="20" name="Picture"/>
             <a:graphic>
               <a:graphicData uri="http://schemas.openxmlformats.org/drawingml/2006/picture">
                 <pic:pic>
                   <pic:nvPicPr>
-                    <pic:cNvPr descr="/home/user/workspace/eosc-basic-compliance/docs/img/phases.png" id="11" name="Picture"/>
+                    <pic:cNvPr descr="img/phases.png" id="21" name="Picture"/>
                     <pic:cNvPicPr>
                       <a:picLocks noChangeArrowheads="1" noChangeAspect="1"/>
                     </pic:cNvPicPr>
                   </pic:nvPicPr>
                   <pic:blipFill>
-                    <a:blip r:embed="rId9"/>
+                    <a:blip r:embed="rId19"/>
                     <a:stretch>
                       <a:fillRect/>
                     </a:stretch>
@@ -790,7 +790,7 @@
                   <pic:spPr bwMode="auto">
                     <a:xfrm>
                       <a:off x="0" y="0"/>
-                      <a:ext cx="4846320" cy="6057899"/>
+                      <a:ext cx="5334000" cy="6667500"/>
                     </a:xfrm>
                     <a:prstGeom prst="rect">
                       <a:avLst/>
@@ -3306,7 +3306,7 @@
         <w:t xml:space="preserve"> </w:t>
       </w:r>
       <w:r>
-        <w:t xml:space="preserve">a copy first. The published run covers all thirteen nodes, so no</w:t>
+        <w:t xml:space="preserve">a copy first. The published run covers all fifteen nodes, so no</w:t>
       </w:r>
       <w:r>
         <w:t xml:space="preserve"> </w:t>
@@ -3391,9 +3391,9 @@
         </w:pict>
       </w:r>
     </w:p>
-    <w:bookmarkEnd w:id="12"/>
-    <w:bookmarkEnd w:id="13"/>
-    <w:bookmarkStart w:id="14" w:name="stage-1-collection"/>
+    <w:bookmarkEnd w:id="22"/>
+    <w:bookmarkEnd w:id="23"/>
+    <w:bookmarkStart w:id="24" w:name="stage-1-collection"/>
     <w:p>
       <w:pPr>
         <w:pStyle w:val="Heading2"/>
@@ -5247,8 +5247,8 @@
         </w:pict>
       </w:r>
     </w:p>
-    <w:bookmarkEnd w:id="14"/>
-    <w:bookmarkStart w:id="15" w:name="X918652c513cf24a1b30a731e09106c31c6d2955"/>
+    <w:bookmarkEnd w:id="24"/>
+    <w:bookmarkStart w:id="25" w:name="X918652c513cf24a1b30a731e09106c31c6d2955"/>
     <w:p>
       <w:pPr>
         <w:pStyle w:val="Heading2"/>
@@ -6089,8 +6089,8 @@
         </w:pict>
       </w:r>
     </w:p>
-    <w:bookmarkEnd w:id="15"/>
-    <w:bookmarkStart w:id="20" w:name="stage-2-the-assessment-machinery"/>
+    <w:bookmarkEnd w:id="25"/>
+    <w:bookmarkStart w:id="30" w:name="stage-2-the-assessment-machinery"/>
     <w:p>
       <w:pPr>
         <w:pStyle w:val="Heading2"/>
@@ -6259,7 +6259,7 @@
         <w:t xml:space="preserve">.</w:t>
       </w:r>
     </w:p>
-    <w:bookmarkStart w:id="16" w:name="the-verdict-vocabulary"/>
+    <w:bookmarkStart w:id="26" w:name="the-verdict-vocabulary"/>
     <w:p>
       <w:pPr>
         <w:pStyle w:val="Heading3"/>
@@ -6519,8 +6519,8 @@
         <w:t xml:space="preserve">says so and hands over the evidence.</w:t>
       </w:r>
     </w:p>
-    <w:bookmarkEnd w:id="16"/>
-    <w:bookmarkStart w:id="17" w:name="the-first-step-of-every-check"/>
+    <w:bookmarkEnd w:id="26"/>
+    <w:bookmarkStart w:id="27" w:name="the-first-step-of-every-check"/>
     <w:p>
       <w:pPr>
         <w:pStyle w:val="Heading3"/>
@@ -6571,8 +6571,8 @@
         <w:t xml:space="preserve">cells, never a mix of passes and a failure.</w:t>
       </w:r>
     </w:p>
-    <w:bookmarkEnd w:id="17"/>
-    <w:bookmarkStart w:id="18" w:name="shared-helpers"/>
+    <w:bookmarkEnd w:id="27"/>
+    <w:bookmarkStart w:id="28" w:name="shared-helpers"/>
     <w:p>
       <w:pPr>
         <w:pStyle w:val="Heading3"/>
@@ -7071,8 +7071,8 @@
         </w:tc>
       </w:tr>
     </w:tbl>
-    <w:bookmarkEnd w:id="18"/>
-    <w:bookmarkStart w:id="19" w:name="Xb01f761edf526ca820d10c97270181bdb8dc3d6"/>
+    <w:bookmarkEnd w:id="28"/>
+    <w:bookmarkStart w:id="29" w:name="Xb01f761edf526ca820d10c97270181bdb8dc3d6"/>
     <w:p>
       <w:pPr>
         <w:pStyle w:val="Heading3"/>
@@ -7459,9 +7459,9 @@
         </w:pict>
       </w:r>
     </w:p>
-    <w:bookmarkEnd w:id="19"/>
-    <w:bookmarkEnd w:id="20"/>
-    <w:bookmarkStart w:id="31" w:name="per-point-decision-procedures"/>
+    <w:bookmarkEnd w:id="29"/>
+    <w:bookmarkEnd w:id="30"/>
+    <w:bookmarkStart w:id="41" w:name="per-point-decision-procedures"/>
     <w:p>
       <w:pPr>
         <w:pStyle w:val="Heading2"/>
@@ -7491,7 +7491,7 @@
         </w:pict>
       </w:r>
     </w:p>
-    <w:bookmarkStart w:id="21" w:name="Xcae13acec6153e7753360c0a42e9f41f8127de1"/>
+    <w:bookmarkStart w:id="31" w:name="Xcae13acec6153e7753360c0a42e9f41f8127de1"/>
     <w:p>
       <w:pPr>
         <w:pStyle w:val="Heading3"/>
@@ -8183,8 +8183,8 @@
         </w:pict>
       </w:r>
     </w:p>
-    <w:bookmarkEnd w:id="21"/>
-    <w:bookmarkStart w:id="22" w:name="X65eeb449093892fbb5dff0c5d69deaaa9d5097c"/>
+    <w:bookmarkEnd w:id="31"/>
+    <w:bookmarkStart w:id="32" w:name="X65eeb449093892fbb5dff0c5d69deaaa9d5097c"/>
     <w:p>
       <w:pPr>
         <w:pStyle w:val="Heading3"/>
@@ -8528,8 +8528,8 @@
         </w:pict>
       </w:r>
     </w:p>
-    <w:bookmarkEnd w:id="22"/>
-    <w:bookmarkStart w:id="23" w:name="X02a1476bd519f6d4b30af4c8067ea09411a400c"/>
+    <w:bookmarkEnd w:id="32"/>
+    <w:bookmarkStart w:id="33" w:name="X02a1476bd519f6d4b30af4c8067ea09411a400c"/>
     <w:p>
       <w:pPr>
         <w:pStyle w:val="Heading3"/>
@@ -9004,8 +9004,8 @@
         </w:pict>
       </w:r>
     </w:p>
-    <w:bookmarkEnd w:id="23"/>
-    <w:bookmarkStart w:id="24" w:name="X0ec2f8dcb622cc700711bf5bc7eecc4efbc502f"/>
+    <w:bookmarkEnd w:id="33"/>
+    <w:bookmarkStart w:id="34" w:name="X0ec2f8dcb622cc700711bf5bc7eecc4efbc502f"/>
     <w:p>
       <w:pPr>
         <w:pStyle w:val="Heading3"/>
@@ -10218,8 +10218,8 @@
         </w:pict>
       </w:r>
     </w:p>
-    <w:bookmarkEnd w:id="24"/>
-    <w:bookmarkStart w:id="25" w:name="X1de70407ff9b9199cdda9f82cdc8a13763c9626"/>
+    <w:bookmarkEnd w:id="34"/>
+    <w:bookmarkStart w:id="35" w:name="X1de70407ff9b9199cdda9f82cdc8a13763c9626"/>
     <w:p>
       <w:pPr>
         <w:pStyle w:val="Heading3"/>
@@ -11174,8 +11174,8 @@
         </w:pict>
       </w:r>
     </w:p>
-    <w:bookmarkEnd w:id="25"/>
-    <w:bookmarkStart w:id="26" w:name="which-item-5-rule-applies"/>
+    <w:bookmarkEnd w:id="35"/>
+    <w:bookmarkStart w:id="36" w:name="which-item-5-rule-applies"/>
     <w:p>
       <w:pPr>
         <w:pStyle w:val="Heading3"/>
@@ -11484,8 +11484,8 @@
         <w:t xml:space="preserve">half of item 5, and every 5a–5c result says so.</w:t>
       </w:r>
     </w:p>
-    <w:bookmarkEnd w:id="26"/>
-    <w:bookmarkStart w:id="27" w:name="Xaecf80c799f590b4c6844140320ac9f3fbf5dc2"/>
+    <w:bookmarkEnd w:id="36"/>
+    <w:bookmarkStart w:id="37" w:name="Xaecf80c799f590b4c6844140320ac9f3fbf5dc2"/>
     <w:p>
       <w:pPr>
         <w:pStyle w:val="Heading3"/>
@@ -11643,8 +11643,8 @@
         </w:pict>
       </w:r>
     </w:p>
-    <w:bookmarkEnd w:id="27"/>
-    <w:bookmarkStart w:id="28" w:name="points-5b-and-5c-aup-and-uap-accessible"/>
+    <w:bookmarkEnd w:id="37"/>
+    <w:bookmarkStart w:id="38" w:name="points-5b-and-5c-aup-and-uap-accessible"/>
     <w:p>
       <w:pPr>
         <w:pStyle w:val="Heading3"/>
@@ -13875,8 +13875,8 @@
         </w:pict>
       </w:r>
     </w:p>
-    <w:bookmarkEnd w:id="28"/>
-    <w:bookmarkStart w:id="29" w:name="X0ae168f20938494fe77fb5723f6a69e35f983f8"/>
+    <w:bookmarkEnd w:id="38"/>
+    <w:bookmarkStart w:id="39" w:name="X0ae168f20938494fe77fb5723f6a69e35f983f8"/>
     <w:p>
       <w:pPr>
         <w:pStyle w:val="Heading3"/>
@@ -14716,8 +14716,8 @@
         </w:pict>
       </w:r>
     </w:p>
-    <w:bookmarkEnd w:id="29"/>
-    <w:bookmarkStart w:id="30" w:name="point-7-the-page-is-in-english"/>
+    <w:bookmarkEnd w:id="39"/>
+    <w:bookmarkStart w:id="40" w:name="point-7-the-page-is-in-english"/>
     <w:p>
       <w:pPr>
         <w:pStyle w:val="Heading3"/>
@@ -15274,9 +15274,9 @@
         </w:pict>
       </w:r>
     </w:p>
-    <w:bookmarkEnd w:id="30"/>
-    <w:bookmarkEnd w:id="31"/>
-    <w:bookmarkStart w:id="32" w:name="where-this-workflow-is-known-to-be-wrong"/>
+    <w:bookmarkEnd w:id="40"/>
+    <w:bookmarkEnd w:id="41"/>
+    <w:bookmarkStart w:id="42" w:name="where-this-workflow-is-known-to-be-wrong"/>
     <w:p>
       <w:pPr>
         <w:pStyle w:val="Heading2"/>
@@ -16797,8 +16797,8 @@
         </w:pict>
       </w:r>
     </w:p>
-    <w:bookmarkEnd w:id="32"/>
-    <w:bookmarkStart w:id="33" w:name="reading-the-output"/>
+    <w:bookmarkEnd w:id="42"/>
+    <w:bookmarkStart w:id="43" w:name="reading-the-output"/>
     <w:p>
       <w:pPr>
         <w:pStyle w:val="Heading2"/>
@@ -17401,8 +17401,8 @@
         <w:t xml:space="preserve">PASS or FAIL on every line would look more useful and be worth considerably less.</w:t>
       </w:r>
     </w:p>
-    <w:bookmarkEnd w:id="33"/>
-    <w:bookmarkStart w:id="40" w:name="worked-examples"/>
+    <w:bookmarkEnd w:id="43"/>
+    <w:bookmarkStart w:id="50" w:name="worked-examples"/>
     <w:p>
       <w:pPr>
         <w:pStyle w:val="Heading2"/>
@@ -17681,7 +17681,7 @@
       <w:r>
         <w:t xml:space="preserve"> </w:t>
       </w:r>
-      <w:hyperlink r:id="rId34">
+      <w:hyperlink r:id="rId44">
         <w:r>
           <w:rPr>
             <w:rStyle w:val="Hyperlink"/>
@@ -17789,7 +17789,7 @@
         <w:t xml:space="preserve">own run.</w:t>
       </w:r>
     </w:p>
-    <w:bookmarkStart w:id="36" w:name="X6b9c9d2e59e13da41f347184ca67a475fa8b7ce"/>
+    <w:bookmarkStart w:id="46" w:name="X6b9c9d2e59e13da41f347184ca67a475fa8b7ce"/>
     <w:p>
       <w:pPr>
         <w:pStyle w:val="Heading3"/>
@@ -17918,7 +17918,7 @@
       <w:r>
         <w:t xml:space="preserve"> </w:t>
       </w:r>
-      <w:hyperlink r:id="rId35">
+      <w:hyperlink r:id="rId45">
         <w:r>
           <w:rPr>
             <w:rStyle w:val="Hyperlink"/>
@@ -18190,7 +18190,7 @@
       <w:r>
         <w:t xml:space="preserve"> </w:t>
       </w:r>
-      <w:hyperlink r:id="rId34">
+      <w:hyperlink r:id="rId44">
         <w:r>
           <w:rPr>
             <w:rStyle w:val="Hyperlink"/>
@@ -19638,8 +19638,8 @@
         <w:t xml:space="preserve"> push</w:t>
       </w:r>
     </w:p>
-    <w:bookmarkEnd w:id="36"/>
-    <w:bookmarkStart w:id="37" w:name="X5431a82e20a06edfb102374e037ce7ea9ce6896"/>
+    <w:bookmarkEnd w:id="46"/>
+    <w:bookmarkStart w:id="47" w:name="X5431a82e20a06edfb102374e037ce7ea9ce6896"/>
     <w:p>
       <w:pPr>
         <w:pStyle w:val="Heading3"/>
@@ -21010,8 +21010,8 @@
         <w:t xml:space="preserve">the documents together.</w:t>
       </w:r>
     </w:p>
-    <w:bookmarkEnd w:id="37"/>
-    <w:bookmarkStart w:id="39" w:name="Xbb3e2d317a0d811066009804bfa0a222a6197de"/>
+    <w:bookmarkEnd w:id="47"/>
+    <w:bookmarkStart w:id="49" w:name="Xbb3e2d317a0d811066009804bfa0a222a6197de"/>
     <w:p>
       <w:pPr>
         <w:pStyle w:val="Heading3"/>
@@ -23266,7 +23266,7 @@
         </w:rPr>
         <w:t xml:space="preserve"> </w:t>
       </w:r>
-      <w:hyperlink r:id="rId38">
+      <w:hyperlink r:id="rId48">
         <w:r>
           <w:rPr>
             <w:rStyle w:val="Hyperlink"/>
@@ -23284,10 +23284,10 @@
         <w:t xml:space="preserve">.</w:t>
       </w:r>
     </w:p>
-    <w:bookmarkEnd w:id="39"/>
-    <w:bookmarkEnd w:id="40"/>
+    <w:bookmarkEnd w:id="49"/>
+    <w:bookmarkEnd w:id="50"/>
     <w:sectPr>
-      <w:footerReference w:type="default" r:id="rId10"/>
+      <w:footerReference r:id="rId10" w:type="default"/>
       <w:footnotePr>
         <w:numRestart w:val="eachSect"/>
       </w:footnotePr>
@@ -24637,7 +24637,7 @@
       <w:szCs w:val="17"/>
     </w:rPr>
   </w:style>
-  <w:style w:type="character" w:customStyle="1" w:styleId="KeywordTok">
+  <w:style w:customStyle="1" w:styleId="KeywordTok" w:type="character">
     <w:name w:val="KeywordTok"/>
     <w:basedOn w:val="VerbatimChar"/>
     <w:rPr>
@@ -24645,77 +24645,77 @@
       <w:color w:val="007020"/>
     </w:rPr>
   </w:style>
-  <w:style w:type="character" w:customStyle="1" w:styleId="DataTypeTok">
+  <w:style w:customStyle="1" w:styleId="DataTypeTok" w:type="character">
     <w:name w:val="DataTypeTok"/>
     <w:basedOn w:val="VerbatimChar"/>
     <w:rPr>
       <w:color w:val="902000"/>
     </w:rPr>
   </w:style>
-  <w:style w:type="character" w:customStyle="1" w:styleId="DecValTok">
+  <w:style w:customStyle="1" w:styleId="DecValTok" w:type="character">
     <w:name w:val="DecValTok"/>
     <w:basedOn w:val="VerbatimChar"/>
     <w:rPr>
       <w:color w:val="40a070"/>
     </w:rPr>
   </w:style>
-  <w:style w:type="character" w:customStyle="1" w:styleId="BaseNTok">
+  <w:style w:customStyle="1" w:styleId="BaseNTok" w:type="character">
     <w:name w:val="BaseNTok"/>
     <w:basedOn w:val="VerbatimChar"/>
     <w:rPr>
       <w:color w:val="40a070"/>
     </w:rPr>
   </w:style>
-  <w:style w:type="character" w:customStyle="1" w:styleId="FloatTok">
+  <w:style w:customStyle="1" w:styleId="FloatTok" w:type="character">
     <w:name w:val="FloatTok"/>
     <w:basedOn w:val="VerbatimChar"/>
     <w:rPr>
       <w:color w:val="40a070"/>
     </w:rPr>
   </w:style>
-  <w:style w:type="character" w:customStyle="1" w:styleId="ConstantTok">
+  <w:style w:customStyle="1" w:styleId="ConstantTok" w:type="character">
     <w:name w:val="ConstantTok"/>
     <w:basedOn w:val="VerbatimChar"/>
     <w:rPr>
       <w:color w:val="880000"/>
     </w:rPr>
   </w:style>
-  <w:style w:type="character" w:customStyle="1" w:styleId="CharTok">
+  <w:style w:customStyle="1" w:styleId="CharTok" w:type="character">
     <w:name w:val="CharTok"/>
     <w:basedOn w:val="VerbatimChar"/>
     <w:rPr>
       <w:color w:val="4070a0"/>
     </w:rPr>
   </w:style>
-  <w:style w:type="character" w:customStyle="1" w:styleId="SpecialCharTok">
+  <w:style w:customStyle="1" w:styleId="SpecialCharTok" w:type="character">
     <w:name w:val="SpecialCharTok"/>
     <w:basedOn w:val="VerbatimChar"/>
     <w:rPr>
       <w:color w:val="4070a0"/>
     </w:rPr>
   </w:style>
-  <w:style w:type="character" w:customStyle="1" w:styleId="StringTok">
+  <w:style w:customStyle="1" w:styleId="StringTok" w:type="character">
     <w:name w:val="StringTok"/>
     <w:basedOn w:val="VerbatimChar"/>
     <w:rPr>
       <w:color w:val="4070a0"/>
     </w:rPr>
   </w:style>
-  <w:style w:type="character" w:customStyle="1" w:styleId="VerbatimStringTok">
+  <w:style w:customStyle="1" w:styleId="VerbatimStringTok" w:type="character">
     <w:name w:val="VerbatimStringTok"/>
     <w:basedOn w:val="VerbatimChar"/>
     <w:rPr>
       <w:color w:val="4070a0"/>
     </w:rPr>
   </w:style>
-  <w:style w:type="character" w:customStyle="1" w:styleId="SpecialStringTok">
+  <w:style w:customStyle="1" w:styleId="SpecialStringTok" w:type="character">
     <w:name w:val="SpecialStringTok"/>
     <w:basedOn w:val="VerbatimChar"/>
     <w:rPr>
       <w:color w:val="bb6688"/>
     </w:rPr>
   </w:style>
-  <w:style w:type="character" w:customStyle="1" w:styleId="ImportTok">
+  <w:style w:customStyle="1" w:styleId="ImportTok" w:type="character">
     <w:name w:val="ImportTok"/>
     <w:basedOn w:val="VerbatimChar"/>
     <w:rPr>
@@ -24723,7 +24723,7 @@
       <w:color w:val="008000"/>
     </w:rPr>
   </w:style>
-  <w:style w:type="character" w:customStyle="1" w:styleId="CommentTok">
+  <w:style w:customStyle="1" w:styleId="CommentTok" w:type="character">
     <w:name w:val="CommentTok"/>
     <w:basedOn w:val="VerbatimChar"/>
     <w:rPr>
@@ -24731,7 +24731,7 @@
       <w:color w:val="60a0b0"/>
     </w:rPr>
   </w:style>
-  <w:style w:type="character" w:customStyle="1" w:styleId="DocumentationTok">
+  <w:style w:customStyle="1" w:styleId="DocumentationTok" w:type="character">
     <w:name w:val="DocumentationTok"/>
     <w:basedOn w:val="VerbatimChar"/>
     <w:rPr>
@@ -24739,7 +24739,7 @@
       <w:color w:val="ba2121"/>
     </w:rPr>
   </w:style>
-  <w:style w:type="character" w:customStyle="1" w:styleId="AnnotationTok">
+  <w:style w:customStyle="1" w:styleId="AnnotationTok" w:type="character">
     <w:name w:val="AnnotationTok"/>
     <w:basedOn w:val="VerbatimChar"/>
     <w:rPr>
@@ -24748,7 +24748,7 @@
       <w:color w:val="60a0b0"/>
     </w:rPr>
   </w:style>
-  <w:style w:type="character" w:customStyle="1" w:styleId="CommentVarTok">
+  <w:style w:customStyle="1" w:styleId="CommentVarTok" w:type="character">
     <w:name w:val="CommentVarTok"/>
     <w:basedOn w:val="VerbatimChar"/>
     <w:rPr>
@@ -24757,28 +24757,28 @@
       <w:color w:val="60a0b0"/>
     </w:rPr>
   </w:style>
-  <w:style w:type="character" w:customStyle="1" w:styleId="OtherTok">
+  <w:style w:customStyle="1" w:styleId="OtherTok" w:type="character">
     <w:name w:val="OtherTok"/>
     <w:basedOn w:val="VerbatimChar"/>
     <w:rPr>
       <w:color w:val="007020"/>
     </w:rPr>
   </w:style>
-  <w:style w:type="character" w:customStyle="1" w:styleId="FunctionTok">
+  <w:style w:customStyle="1" w:styleId="FunctionTok" w:type="character">
     <w:name w:val="FunctionTok"/>
     <w:basedOn w:val="VerbatimChar"/>
     <w:rPr>
       <w:color w:val="06287e"/>
     </w:rPr>
   </w:style>
-  <w:style w:type="character" w:customStyle="1" w:styleId="VariableTok">
+  <w:style w:customStyle="1" w:styleId="VariableTok" w:type="character">
     <w:name w:val="VariableTok"/>
     <w:basedOn w:val="VerbatimChar"/>
     <w:rPr>
       <w:color w:val="19177c"/>
     </w:rPr>
   </w:style>
-  <w:style w:type="character" w:customStyle="1" w:styleId="ControlFlowTok">
+  <w:style w:customStyle="1" w:styleId="ControlFlowTok" w:type="character">
     <w:name w:val="ControlFlowTok"/>
     <w:basedOn w:val="VerbatimChar"/>
     <w:rPr>
@@ -24786,45 +24786,45 @@
       <w:color w:val="007020"/>
     </w:rPr>
   </w:style>
-  <w:style w:type="character" w:customStyle="1" w:styleId="OperatorTok">
+  <w:style w:customStyle="1" w:styleId="OperatorTok" w:type="character">
     <w:name w:val="OperatorTok"/>
     <w:basedOn w:val="VerbatimChar"/>
     <w:rPr>
       <w:color w:val="666666"/>
     </w:rPr>
   </w:style>
-  <w:style w:type="character" w:customStyle="1" w:styleId="BuiltInTok">
+  <w:style w:customStyle="1" w:styleId="BuiltInTok" w:type="character">
     <w:name w:val="BuiltInTok"/>
     <w:basedOn w:val="VerbatimChar"/>
     <w:rPr>
       <w:color w:val="008000"/>
     </w:rPr>
   </w:style>
-  <w:style w:type="character" w:customStyle="1" w:styleId="ExtensionTok">
+  <w:style w:customStyle="1" w:styleId="ExtensionTok" w:type="character">
     <w:name w:val="ExtensionTok"/>
     <w:basedOn w:val="VerbatimChar"/>
     <w:rPr/>
   </w:style>
-  <w:style w:type="character" w:customStyle="1" w:styleId="PreprocessorTok">
+  <w:style w:customStyle="1" w:styleId="PreprocessorTok" w:type="character">
     <w:name w:val="PreprocessorTok"/>
     <w:basedOn w:val="VerbatimChar"/>
     <w:rPr>
       <w:color w:val="bc7a00"/>
     </w:rPr>
   </w:style>
-  <w:style w:type="character" w:customStyle="1" w:styleId="AttributeTok">
+  <w:style w:customStyle="1" w:styleId="AttributeTok" w:type="character">
     <w:name w:val="AttributeTok"/>
     <w:basedOn w:val="VerbatimChar"/>
     <w:rPr>
       <w:color w:val="7d9029"/>
     </w:rPr>
   </w:style>
-  <w:style w:type="character" w:customStyle="1" w:styleId="RegionMarkerTok">
+  <w:style w:customStyle="1" w:styleId="RegionMarkerTok" w:type="character">
     <w:name w:val="RegionMarkerTok"/>
     <w:basedOn w:val="VerbatimChar"/>
     <w:rPr/>
   </w:style>
-  <w:style w:type="character" w:customStyle="1" w:styleId="InformationTok">
+  <w:style w:customStyle="1" w:styleId="InformationTok" w:type="character">
     <w:name w:val="InformationTok"/>
     <w:basedOn w:val="VerbatimChar"/>
     <w:rPr>
@@ -24833,7 +24833,7 @@
       <w:color w:val="60a0b0"/>
     </w:rPr>
   </w:style>
-  <w:style w:type="character" w:customStyle="1" w:styleId="WarningTok">
+  <w:style w:customStyle="1" w:styleId="WarningTok" w:type="character">
     <w:name w:val="WarningTok"/>
     <w:basedOn w:val="VerbatimChar"/>
     <w:rPr>
@@ -24842,7 +24842,7 @@
       <w:color w:val="60a0b0"/>
     </w:rPr>
   </w:style>
-  <w:style w:type="character" w:customStyle="1" w:styleId="AlertTok">
+  <w:style w:customStyle="1" w:styleId="AlertTok" w:type="character">
     <w:name w:val="AlertTok"/>
     <w:basedOn w:val="VerbatimChar"/>
     <w:rPr>
@@ -24850,7 +24850,7 @@
       <w:color w:val="ff0000"/>
     </w:rPr>
   </w:style>
-  <w:style w:type="character" w:customStyle="1" w:styleId="ErrorTok">
+  <w:style w:customStyle="1" w:styleId="ErrorTok" w:type="character">
     <w:name w:val="ErrorTok"/>
     <w:basedOn w:val="VerbatimChar"/>
     <w:rPr>
@@ -24858,7 +24858,7 @@
       <w:color w:val="ff0000"/>
     </w:rPr>
   </w:style>
-  <w:style w:type="character" w:customStyle="1" w:styleId="NormalTok">
+  <w:style w:customStyle="1" w:styleId="NormalTok" w:type="character">
     <w:name w:val="NormalTok"/>
     <w:basedOn w:val="VerbatimChar"/>
     <w:rPr/>

</xml_diff>

<commit_message>
Publish run web-33 (depth 2, 16 nodes, 81 PASS / 7 FAIL / 72 review; EOSC Node Germany added: 3 PASS, 4 review, 3 FAIL on a 'Coming soon' page); tests pinned to 16 nodes and 9 name matches; README, guides, Word and PDF updated
</commit_message>
<xml_diff>
--- a/docs/eosc-basic-compliance-analysis-workflow.docx
+++ b/docs/eosc-basic-compliance-analysis-workflow.docx
@@ -31,7 +31,7 @@
         <w:pStyle w:val="Date"/>
       </w:pPr>
       <w:r>
-        <w:t xml:space="preserve">20 October 2026 (checklist v3.2, per-node time limit) — built from the Markdown guides in the same commit</w:t>
+        <w:t xml:space="preserve">20 October 2026 (checklist v3.2, per-node time limit, sixteen nodes) — built from the Markdown guides in the same commit</w:t>
       </w:r>
     </w:p>
     <w:p>
@@ -3399,7 +3399,7 @@
         <w:t xml:space="preserve"> </w:t>
       </w:r>
       <w:r>
-        <w:t xml:space="preserve">a copy first. The published run covers all fifteen nodes, so no</w:t>
+        <w:t xml:space="preserve">a copy first. The published run covers all sixteen nodes, so no</w:t>
       </w:r>
       <w:r>
         <w:t xml:space="preserve"> </w:t>

</xml_diff>